<commit_message>
korrektur på kravspec og update af proceslog
</commit_message>
<xml_diff>
--- a/documentation/KravSpec/H5AffugterKravspecifikation.docx
+++ b/documentation/KravSpec/H5AffugterKravspecifikation.docx
@@ -1,6 +1,6 @@
 
 <file path=word/document.xml><?xml version="1.0" encoding="utf-8"?>
-<w:document xmlns:o="urn:schemas-microsoft-com:office:office" xmlns:r="http://schemas.openxmlformats.org/officeDocument/2006/relationships" xmlns:v="urn:schemas-microsoft-com:vml" xmlns:w="http://schemas.openxmlformats.org/wordprocessingml/2006/main" xmlns:w10="urn:schemas-microsoft-com:office:word" xmlns:wp="http://schemas.openxmlformats.org/drawingml/2006/wordprocessingDrawing" xmlns:pic="http://schemas.openxmlformats.org/drawingml/2006/picture" xmlns:wps="http://schemas.microsoft.com/office/word/2010/wordprocessingShape" xmlns:wpg="http://schemas.microsoft.com/office/word/2010/wordprocessingGroup" xmlns:mc="http://schemas.openxmlformats.org/markup-compatibility/2006" xmlns:wp14="http://schemas.microsoft.com/office/word/2010/wordprocessingDrawing" xmlns:w14="http://schemas.microsoft.com/office/word/2010/wordml" xmlns:w15="http://schemas.microsoft.com/office/word/2012/wordml" mc:Ignorable="w14 wp14 w15">
+<w:document xmlns:o="urn:schemas-microsoft-com:office:office" xmlns:r="http://schemas.openxmlformats.org/officeDocument/2006/relationships" xmlns:v="urn:schemas-microsoft-com:vml" xmlns:w="http://schemas.openxmlformats.org/wordprocessingml/2006/main" xmlns:w10="urn:schemas-microsoft-com:office:word" xmlns:wp="http://schemas.openxmlformats.org/drawingml/2006/wordprocessingDrawing" xmlns:wps="http://schemas.microsoft.com/office/word/2010/wordprocessingShape" xmlns:wpg="http://schemas.microsoft.com/office/word/2010/wordprocessingGroup" xmlns:mc="http://schemas.openxmlformats.org/markup-compatibility/2006" xmlns:wp14="http://schemas.microsoft.com/office/word/2010/wordprocessingDrawing" xmlns:w14="http://schemas.microsoft.com/office/word/2010/wordml" xmlns:w15="http://schemas.microsoft.com/office/word/2012/wordml" mc:Ignorable="w14 wp14 w15">
   <w:body>
     <w:p>
       <w:pPr>
@@ -155,7 +155,11 @@
         </w:rPr>
       </w:pPr>
       <w:r>
-        <w:rPr/>
+        <w:rPr>
+          <w:rFonts w:ascii="Nimbus Sans" w:hAnsi="Nimbus Sans"/>
+          <w:sz w:val="24"/>
+          <w:szCs w:val="24"/>
+        </w:rPr>
       </w:r>
     </w:p>
     <w:p>
@@ -211,7 +215,61 @@
           <w:sz w:val="24"/>
           <w:szCs w:val="24"/>
         </w:rPr>
-        <w:t>Brugeren ønsker at undgår skimmel i værelset ved at hodle luftfugtigheden nede og samtidigt reducere udgiften til at drive affugteren. Idag kører affugteren typiske i de timer efter kl.17.00, hvor elprisen er højest, og som er mindst to til tre gange dyrere end døgnets billigste timer. Målet er derfor at flytte auffugterens drift til døgnets billigste periode uden at gå på kompromise med luftfugtigheden.</w:t>
+        <w:t>Brugeren ønsker at undgå skimmel i værelset ved at ho</w:t>
+      </w:r>
+      <w:r>
+        <w:rPr>
+          <w:rStyle w:val="SourceText"/>
+          <w:rFonts w:ascii="Nimbus Sans" w:hAnsi="Nimbus Sans"/>
+          <w:sz w:val="24"/>
+          <w:szCs w:val="24"/>
+        </w:rPr>
+        <w:t>ld</w:t>
+      </w:r>
+      <w:r>
+        <w:rPr>
+          <w:rStyle w:val="SourceText"/>
+          <w:rFonts w:ascii="Nimbus Sans" w:hAnsi="Nimbus Sans"/>
+          <w:sz w:val="24"/>
+          <w:szCs w:val="24"/>
+        </w:rPr>
+        <w:t>e luftfugtigheden nede og samtidigt reducere udgiften til at drive affugteren. I dag kører affugteren typis</w:t>
+      </w:r>
+      <w:r>
+        <w:rPr>
+          <w:rStyle w:val="SourceText"/>
+          <w:rFonts w:ascii="Nimbus Sans" w:hAnsi="Nimbus Sans"/>
+          <w:sz w:val="24"/>
+          <w:szCs w:val="24"/>
+        </w:rPr>
+        <w:t>k</w:t>
+      </w:r>
+      <w:r>
+        <w:rPr>
+          <w:rStyle w:val="SourceText"/>
+          <w:rFonts w:ascii="Nimbus Sans" w:hAnsi="Nimbus Sans"/>
+          <w:sz w:val="24"/>
+          <w:szCs w:val="24"/>
+        </w:rPr>
+        <w:t xml:space="preserve"> i </w:t>
+      </w:r>
+      <w:r>
+        <w:rPr>
+          <w:rStyle w:val="SourceText"/>
+          <w:rFonts w:ascii="Nimbus Sans" w:hAnsi="Nimbus Sans"/>
+          <w:sz w:val="24"/>
+          <w:szCs w:val="24"/>
+        </w:rPr>
+        <w:t>timerne</w:t>
+      </w:r>
+      <w:r>
+        <w:rPr>
+          <w:rStyle w:val="SourceText"/>
+          <w:rFonts w:ascii="Nimbus Sans" w:hAnsi="Nimbus Sans"/>
+          <w:sz w:val="24"/>
+          <w:szCs w:val="24"/>
+        </w:rPr>
+        <w:t xml:space="preserve"> efter kl.17.00, hvor elprisen er højest, og som er mindst to til tre gange dyrere end døgnets billigste timer. Målet er derfor at flytte affugterens drift til døgnets billigste periode uden at gå på kompromis med luftfugtigheden.</w:t>
       </w:r>
     </w:p>
     <w:p>
@@ -373,7 +431,11 @@
         </w:rPr>
       </w:pPr>
       <w:r>
-        <w:rPr/>
+        <w:rPr>
+          <w:rFonts w:ascii="Nimbus Sans" w:hAnsi="Nimbus Sans"/>
+          <w:sz w:val="24"/>
+          <w:szCs w:val="24"/>
+        </w:rPr>
       </w:r>
     </w:p>
     <w:p>
@@ -382,7 +444,7 @@
         <w:bidi w:val="0"/>
         <w:rPr>
           <w:rStyle w:val="SourceText"/>
-          <w:rFonts w:ascii="Nimbus Sans" w:hAnsi="Nimbus Sans" w:cstheme="minorBidi"/>
+          <w:rFonts w:ascii="Nimbus Sans" w:hAnsi="Nimbus Sans" w:cs="" w:cstheme="minorBidi"/>
           <w:b/>
           <w:bCs/>
           <w:color w:val="auto"/>
@@ -394,7 +456,17 @@
         </w:rPr>
       </w:pPr>
       <w:r>
-        <w:rPr/>
+        <w:rPr>
+          <w:rFonts w:cs="" w:cstheme="minorBidi" w:ascii="Nimbus Sans" w:hAnsi="Nimbus Sans"/>
+          <w:b/>
+          <w:bCs/>
+          <w:color w:val="auto"/>
+          <w:kern w:val="2"/>
+          <w:sz w:val="24"/>
+          <w:szCs w:val="24"/>
+          <w:lang w:val="da-DK" w:eastAsia="en-US" w:bidi="ar-SA"/>
+          <w14:ligatures w14:val="standardContextual"/>
+        </w:rPr>
       </w:r>
     </w:p>
     <w:p>
@@ -432,7 +504,61 @@
           <w:sz w:val="24"/>
           <w:szCs w:val="24"/>
         </w:rPr>
-        <w:t>Forudsætning: Affugteren (eeese Emil 2508) har igen netværksfunktion og syres derfor udelukkende ved at afbryde of genetablere strømmen via smart plug’en. Løsning forudsætter, at affugeren automatisk genoptager driften, når strømmen tilsluttes iegen. Denne egenskab er afprøvet af gruppen.</w:t>
+        <w:t>Forudsætning: Affugteren (eeese Emil 2508) har i</w:t>
+      </w:r>
+      <w:r>
+        <w:rPr>
+          <w:rStyle w:val="SourceText"/>
+          <w:rFonts w:ascii="Nimbus Sans" w:hAnsi="Nimbus Sans"/>
+          <w:sz w:val="24"/>
+          <w:szCs w:val="24"/>
+        </w:rPr>
+        <w:t>n</w:t>
+      </w:r>
+      <w:r>
+        <w:rPr>
+          <w:rStyle w:val="SourceText"/>
+          <w:rFonts w:ascii="Nimbus Sans" w:hAnsi="Nimbus Sans"/>
+          <w:sz w:val="24"/>
+          <w:szCs w:val="24"/>
+        </w:rPr>
+        <w:t>gen netværksfunktion og s</w:t>
+      </w:r>
+      <w:r>
+        <w:rPr>
+          <w:rStyle w:val="SourceText"/>
+          <w:rFonts w:ascii="Nimbus Sans" w:hAnsi="Nimbus Sans"/>
+          <w:sz w:val="24"/>
+          <w:szCs w:val="24"/>
+        </w:rPr>
+        <w:t>t</w:t>
+      </w:r>
+      <w:r>
+        <w:rPr>
+          <w:rStyle w:val="SourceText"/>
+          <w:rFonts w:ascii="Nimbus Sans" w:hAnsi="Nimbus Sans"/>
+          <w:sz w:val="24"/>
+          <w:szCs w:val="24"/>
+        </w:rPr>
+        <w:t>yres derfor udelukkende ved at afbryde of genetablere strømmen via smart plug’en. Løsning</w:t>
+      </w:r>
+      <w:r>
+        <w:rPr>
+          <w:rStyle w:val="SourceText"/>
+          <w:rFonts w:ascii="Nimbus Sans" w:hAnsi="Nimbus Sans"/>
+          <w:sz w:val="24"/>
+          <w:szCs w:val="24"/>
+        </w:rPr>
+        <w:t>en</w:t>
+      </w:r>
+      <w:r>
+        <w:rPr>
+          <w:rStyle w:val="SourceText"/>
+          <w:rFonts w:ascii="Nimbus Sans" w:hAnsi="Nimbus Sans"/>
+          <w:sz w:val="24"/>
+          <w:szCs w:val="24"/>
+        </w:rPr>
+        <w:t xml:space="preserve"> forudsætter, at affugeren automatisk genoptager driften, når strømmen tilsluttes igen. Denne egenskab er afprøvet af gruppen.</w:t>
       </w:r>
     </w:p>
     <w:p>
@@ -447,7 +573,11 @@
         </w:rPr>
       </w:pPr>
       <w:r>
-        <w:rPr/>
+        <w:rPr>
+          <w:rFonts w:ascii="Nimbus Sans" w:hAnsi="Nimbus Sans"/>
+          <w:sz w:val="24"/>
+          <w:szCs w:val="24"/>
+        </w:rPr>
       </w:r>
     </w:p>
     <w:p>
@@ -909,7 +1039,11 @@
         </w:rPr>
       </w:pPr>
       <w:r>
-        <w:rPr/>
+        <w:rPr>
+          <w:rFonts w:ascii="Nimbus Sans" w:hAnsi="Nimbus Sans"/>
+          <w:sz w:val="24"/>
+          <w:szCs w:val="24"/>
+        </w:rPr>
       </w:r>
     </w:p>
     <w:p>
@@ -961,9 +1095,9 @@
         </w:tblCellMar>
       </w:tblPr>
       <w:tblGrid>
-        <w:gridCol w:w="2160"/>
+        <w:gridCol w:w="2159"/>
         <w:gridCol w:w="1890"/>
-        <w:gridCol w:w="4976"/>
+        <w:gridCol w:w="4977"/>
       </w:tblGrid>
       <w:tr>
         <w:trPr>
@@ -971,7 +1105,7 @@
         </w:trPr>
         <w:tc>
           <w:tcPr>
-            <w:tcW w:w="2160" w:type="dxa"/>
+            <w:tcW w:w="2159" w:type="dxa"/>
             <w:tcBorders>
               <w:top w:val="single" w:sz="12" w:space="0" w:color="000000"/>
               <w:bottom w:val="single" w:sz="6" w:space="0" w:color="000000"/>
@@ -1033,7 +1167,7 @@
         </w:tc>
         <w:tc>
           <w:tcPr>
-            <w:tcW w:w="4976" w:type="dxa"/>
+            <w:tcW w:w="4977" w:type="dxa"/>
             <w:tcBorders>
               <w:top w:val="single" w:sz="12" w:space="0" w:color="000000"/>
               <w:bottom w:val="single" w:sz="6" w:space="0" w:color="000000"/>
@@ -1067,7 +1201,7 @@
         <w:trPr/>
         <w:tc>
           <w:tcPr>
-            <w:tcW w:w="2160" w:type="dxa"/>
+            <w:tcW w:w="2159" w:type="dxa"/>
             <w:tcBorders>
               <w:bottom w:val="single" w:sz="4" w:space="0" w:color="999999"/>
             </w:tcBorders>
@@ -1123,7 +1257,7 @@
         </w:tc>
         <w:tc>
           <w:tcPr>
-            <w:tcW w:w="4976" w:type="dxa"/>
+            <w:tcW w:w="4977" w:type="dxa"/>
             <w:tcBorders>
               <w:bottom w:val="single" w:sz="4" w:space="0" w:color="999999"/>
             </w:tcBorders>
@@ -1154,7 +1288,7 @@
         <w:trPr/>
         <w:tc>
           <w:tcPr>
-            <w:tcW w:w="2160" w:type="dxa"/>
+            <w:tcW w:w="2159" w:type="dxa"/>
             <w:tcBorders>
               <w:bottom w:val="single" w:sz="4" w:space="0" w:color="999999"/>
             </w:tcBorders>
@@ -1210,7 +1344,7 @@
         </w:tc>
         <w:tc>
           <w:tcPr>
-            <w:tcW w:w="4976" w:type="dxa"/>
+            <w:tcW w:w="4977" w:type="dxa"/>
             <w:tcBorders>
               <w:bottom w:val="single" w:sz="4" w:space="0" w:color="999999"/>
             </w:tcBorders>
@@ -1241,7 +1375,7 @@
         <w:trPr/>
         <w:tc>
           <w:tcPr>
-            <w:tcW w:w="2160" w:type="dxa"/>
+            <w:tcW w:w="2159" w:type="dxa"/>
             <w:tcBorders>
               <w:bottom w:val="single" w:sz="4" w:space="0" w:color="999999"/>
             </w:tcBorders>
@@ -1297,7 +1431,7 @@
         </w:tc>
         <w:tc>
           <w:tcPr>
-            <w:tcW w:w="4976" w:type="dxa"/>
+            <w:tcW w:w="4977" w:type="dxa"/>
             <w:tcBorders>
               <w:bottom w:val="single" w:sz="4" w:space="0" w:color="999999"/>
             </w:tcBorders>
@@ -1328,7 +1462,7 @@
         <w:trPr/>
         <w:tc>
           <w:tcPr>
-            <w:tcW w:w="2160" w:type="dxa"/>
+            <w:tcW w:w="2159" w:type="dxa"/>
             <w:tcBorders>
               <w:bottom w:val="single" w:sz="4" w:space="0" w:color="999999"/>
             </w:tcBorders>
@@ -1384,7 +1518,7 @@
         </w:tc>
         <w:tc>
           <w:tcPr>
-            <w:tcW w:w="4976" w:type="dxa"/>
+            <w:tcW w:w="4977" w:type="dxa"/>
             <w:tcBorders>
               <w:bottom w:val="single" w:sz="4" w:space="0" w:color="999999"/>
             </w:tcBorders>
@@ -1415,7 +1549,7 @@
         <w:trPr/>
         <w:tc>
           <w:tcPr>
-            <w:tcW w:w="2160" w:type="dxa"/>
+            <w:tcW w:w="2159" w:type="dxa"/>
             <w:tcBorders>
               <w:bottom w:val="single" w:sz="4" w:space="0" w:color="999999"/>
             </w:tcBorders>
@@ -1465,13 +1599,13 @@
                 <w:sz w:val="22"/>
                 <w:szCs w:val="22"/>
               </w:rPr>
-              <w:t xml:space="preserve">Apparat </w:t>
-            </w:r>
-          </w:p>
-        </w:tc>
-        <w:tc>
-          <w:tcPr>
-            <w:tcW w:w="4976" w:type="dxa"/>
+              <w:t>Apparat</w:t>
+            </w:r>
+          </w:p>
+        </w:tc>
+        <w:tc>
+          <w:tcPr>
+            <w:tcW w:w="4977" w:type="dxa"/>
             <w:tcBorders>
               <w:bottom w:val="single" w:sz="4" w:space="0" w:color="999999"/>
             </w:tcBorders>
@@ -1502,7 +1636,7 @@
         <w:trPr/>
         <w:tc>
           <w:tcPr>
-            <w:tcW w:w="2160" w:type="dxa"/>
+            <w:tcW w:w="2159" w:type="dxa"/>
             <w:tcBorders>
               <w:bottom w:val="single" w:sz="12" w:space="0" w:color="000000"/>
             </w:tcBorders>
@@ -1548,7 +1682,7 @@
         </w:tc>
         <w:tc>
           <w:tcPr>
-            <w:tcW w:w="4976" w:type="dxa"/>
+            <w:tcW w:w="4977" w:type="dxa"/>
             <w:tcBorders>
               <w:bottom w:val="single" w:sz="12" w:space="0" w:color="000000"/>
             </w:tcBorders>
@@ -1583,7 +1717,11 @@
         </w:rPr>
       </w:pPr>
       <w:r>
-        <w:rPr/>
+        <w:rPr>
+          <w:rFonts w:ascii="Nimbus Sans" w:hAnsi="Nimbus Sans"/>
+          <w:sz w:val="24"/>
+          <w:szCs w:val="24"/>
+        </w:rPr>
       </w:r>
     </w:p>
     <w:p>
@@ -1598,7 +1736,11 @@
         </w:rPr>
       </w:pPr>
       <w:r>
-        <w:rPr/>
+        <w:rPr>
+          <w:rFonts w:ascii="Nimbus Sans" w:hAnsi="Nimbus Sans"/>
+          <w:sz w:val="24"/>
+          <w:szCs w:val="24"/>
+        </w:rPr>
       </w:r>
     </w:p>
     <w:p>
@@ -1650,7 +1792,25 @@
           <w:sz w:val="24"/>
           <w:szCs w:val="24"/>
         </w:rPr>
-        <w:t>Systemet styrer affugteren automatisk og sørger for, at strømforbruget så vidt muligt placeres i døgnets billigste perioder. Styringsmodellen anvender både den aktuelle luftfugtighed i lokalet og elprisen for at afgøre, om smart plug’en skal være tændt eller slukket, og styrer på denne måde affugteren.</w:t>
+        <w:t xml:space="preserve">Systemet styrer affugteren automatisk og sørger for, at strømforbruget så vidt muligt placeres i døgnets billigste perioder. Styringsmodellen anvender både den aktuelle luftfugtighed i lokalet og </w:t>
+      </w:r>
+      <w:r>
+        <w:rPr>
+          <w:rStyle w:val="SourceText"/>
+          <w:rFonts w:ascii="Nimbus Sans" w:hAnsi="Nimbus Sans"/>
+          <w:sz w:val="24"/>
+          <w:szCs w:val="24"/>
+        </w:rPr>
+        <w:t xml:space="preserve">den aktuelle </w:t>
+      </w:r>
+      <w:r>
+        <w:rPr>
+          <w:rStyle w:val="SourceText"/>
+          <w:rFonts w:ascii="Nimbus Sans" w:hAnsi="Nimbus Sans"/>
+          <w:sz w:val="24"/>
+          <w:szCs w:val="24"/>
+        </w:rPr>
+        <w:t>elpris for at afgøre, om smart plug’en skal være tændt eller slukket, og styrer på denne måde affugteren.</w:t>
       </w:r>
     </w:p>
     <w:p>
@@ -1666,7 +1826,97 @@
           <w:sz w:val="24"/>
           <w:szCs w:val="24"/>
         </w:rPr>
-        <w:t>Når lustfugtigheden overstiger tændgrænsen, og den aktuelle time ligger i den billigste periode, tændes affugtrten. Den kører, indtil luftfugtigheden er under slukgrænsen. Hvis luftfugtigheden overstiger den kritisk grænse, kører affugteren uanset elpris, indtil luftfugtigheden er under slukgrænsen.</w:t>
+        <w:t>Når lu</w:t>
+      </w:r>
+      <w:r>
+        <w:rPr>
+          <w:rStyle w:val="SourceText"/>
+          <w:rFonts w:ascii="Nimbus Sans" w:hAnsi="Nimbus Sans"/>
+          <w:sz w:val="24"/>
+          <w:szCs w:val="24"/>
+        </w:rPr>
+        <w:t>ft</w:t>
+      </w:r>
+      <w:r>
+        <w:rPr>
+          <w:rStyle w:val="SourceText"/>
+          <w:rFonts w:ascii="Nimbus Sans" w:hAnsi="Nimbus Sans"/>
+          <w:sz w:val="24"/>
+          <w:szCs w:val="24"/>
+        </w:rPr>
+        <w:t>fugtigheden overstiger tændgrænsen, og de</w:t>
+      </w:r>
+      <w:r>
+        <w:rPr>
+          <w:rStyle w:val="SourceText"/>
+          <w:rFonts w:ascii="Nimbus Sans" w:hAnsi="Nimbus Sans"/>
+          <w:sz w:val="24"/>
+          <w:szCs w:val="24"/>
+        </w:rPr>
+        <w:t>t</w:t>
+      </w:r>
+      <w:r>
+        <w:rPr>
+          <w:rStyle w:val="SourceText"/>
+          <w:rFonts w:ascii="Nimbus Sans" w:hAnsi="Nimbus Sans"/>
+          <w:sz w:val="24"/>
+          <w:szCs w:val="24"/>
+        </w:rPr>
+        <w:t xml:space="preserve"> aktuelle </w:t>
+      </w:r>
+      <w:r>
+        <w:rPr>
+          <w:rStyle w:val="SourceText"/>
+          <w:rFonts w:ascii="Nimbus Sans" w:hAnsi="Nimbus Sans"/>
+          <w:sz w:val="24"/>
+          <w:szCs w:val="24"/>
+        </w:rPr>
+        <w:t xml:space="preserve">kvarter </w:t>
+      </w:r>
+      <w:r>
+        <w:rPr>
+          <w:rStyle w:val="SourceText"/>
+          <w:rFonts w:ascii="Nimbus Sans" w:hAnsi="Nimbus Sans"/>
+          <w:sz w:val="24"/>
+          <w:szCs w:val="24"/>
+        </w:rPr>
+        <w:t>ligger i den billigste periode, tændes affugt</w:t>
+      </w:r>
+      <w:r>
+        <w:rPr>
+          <w:rStyle w:val="SourceText"/>
+          <w:rFonts w:ascii="Nimbus Sans" w:hAnsi="Nimbus Sans"/>
+          <w:sz w:val="24"/>
+          <w:szCs w:val="24"/>
+        </w:rPr>
+        <w:t>e</w:t>
+      </w:r>
+      <w:r>
+        <w:rPr>
+          <w:rStyle w:val="SourceText"/>
+          <w:rFonts w:ascii="Nimbus Sans" w:hAnsi="Nimbus Sans"/>
+          <w:sz w:val="24"/>
+          <w:szCs w:val="24"/>
+        </w:rPr>
+        <w:t>ren. Den kører, indtil luftfugtigheden er under slukgrænsen. Hvis luftfugtigheden overstiger den kritisk</w:t>
+      </w:r>
+      <w:r>
+        <w:rPr>
+          <w:rStyle w:val="SourceText"/>
+          <w:rFonts w:ascii="Nimbus Sans" w:hAnsi="Nimbus Sans"/>
+          <w:sz w:val="24"/>
+          <w:szCs w:val="24"/>
+        </w:rPr>
+        <w:t>e</w:t>
+      </w:r>
+      <w:r>
+        <w:rPr>
+          <w:rStyle w:val="SourceText"/>
+          <w:rFonts w:ascii="Nimbus Sans" w:hAnsi="Nimbus Sans"/>
+          <w:sz w:val="24"/>
+          <w:szCs w:val="24"/>
+        </w:rPr>
+        <w:t xml:space="preserve"> grænse, kører affugteren uanset elpris, indtil luftfugtigheden er under slukgrænsen.</w:t>
       </w:r>
     </w:p>
     <w:p>
@@ -1682,7 +1932,7 @@
           <w:sz w:val="24"/>
           <w:szCs w:val="24"/>
         </w:rPr>
-        <w:t>For at beskytte kompressor s</w:t>
+        <w:t>For at beskytte kompressor</w:t>
       </w:r>
       <w:r>
         <w:rPr>
@@ -1691,7 +1941,7 @@
           <w:sz w:val="24"/>
           <w:szCs w:val="24"/>
         </w:rPr>
-        <w:t>må den tidligst tændes 15 minutter efter sidste slukning</w:t>
+        <w:t xml:space="preserve">ens </w:t>
       </w:r>
       <w:r>
         <w:rPr>
@@ -1700,7 +1950,7 @@
           <w:sz w:val="24"/>
           <w:szCs w:val="24"/>
         </w:rPr>
-        <w:t xml:space="preserve"> (se K-006). </w:t>
+        <w:t>må den tidligst tændes 15 minutter efter sidste slukning (se K-006). Ved normal slukning på tænd/sluk-knappen kører blæseren videre i nogle sekunder for at fjerne den varme luft inde in enheden (bilag 2, s. 9). Når strømmen afbr</w:t>
       </w:r>
       <w:r>
         <w:rPr>
@@ -1709,7 +1959,7 @@
           <w:sz w:val="24"/>
           <w:szCs w:val="24"/>
         </w:rPr>
-        <w:t xml:space="preserve">Ved normal slukning på tænd/sluk-knappen kører blæseren videre i nogle sekunder for at fjerne den varme luft inde in enheden (bilag 2, s. 9). Når strømmen afbrudes via samrt plug’en, sker dette ikke. Brugsanvisningen angiver ikke et minimumsinterval, mens andre eeese-affugtere angiver ca. 3 minutter, før kompressoren arbejder igen. Gruppen har derfor valgt 15 munutter som sikkerhedsmargin. </w:t>
+        <w:t>yd</w:t>
       </w:r>
       <w:r>
         <w:rPr>
@@ -1718,7 +1968,43 @@
           <w:sz w:val="24"/>
           <w:szCs w:val="24"/>
         </w:rPr>
-        <w:t>Minimumsintervallet gælder i alle driftstilstande, også ved kritisk luftfugtighed og ved fejl.</w:t>
+        <w:t xml:space="preserve">es via </w:t>
+      </w:r>
+      <w:r>
+        <w:rPr>
+          <w:rStyle w:val="SourceText"/>
+          <w:rFonts w:ascii="Nimbus Sans" w:hAnsi="Nimbus Sans"/>
+          <w:sz w:val="24"/>
+          <w:szCs w:val="24"/>
+        </w:rPr>
+        <w:t>smart</w:t>
+      </w:r>
+      <w:r>
+        <w:rPr>
+          <w:rStyle w:val="SourceText"/>
+          <w:rFonts w:ascii="Nimbus Sans" w:hAnsi="Nimbus Sans"/>
+          <w:sz w:val="24"/>
+          <w:szCs w:val="24"/>
+        </w:rPr>
+        <w:t xml:space="preserve"> plug’en, sker dette ikke. Brugsanvisningen angiver ikke et minimumsinterval, mens andre eeese-affugtere angiver ca. 3 minutter, før kompressoren arbejder igen. Gruppen har derfor valgt 15 m</w:t>
+      </w:r>
+      <w:r>
+        <w:rPr>
+          <w:rStyle w:val="SourceText"/>
+          <w:rFonts w:ascii="Nimbus Sans" w:hAnsi="Nimbus Sans"/>
+          <w:sz w:val="24"/>
+          <w:szCs w:val="24"/>
+        </w:rPr>
+        <w:t>i</w:t>
+      </w:r>
+      <w:r>
+        <w:rPr>
+          <w:rStyle w:val="SourceText"/>
+          <w:rFonts w:ascii="Nimbus Sans" w:hAnsi="Nimbus Sans"/>
+          <w:sz w:val="24"/>
+          <w:szCs w:val="24"/>
+        </w:rPr>
+        <w:t>nutter som sikkerhedsmargin. Minimumsintervallet gælder i alle driftstilstande, også ved kritisk luftfugtighed og ved fejl.</w:t>
       </w:r>
     </w:p>
     <w:p>
@@ -1754,15 +2040,15 @@
         </w:tblCellMar>
       </w:tblPr>
       <w:tblGrid>
-        <w:gridCol w:w="898"/>
+        <w:gridCol w:w="897"/>
         <w:gridCol w:w="4950"/>
-        <w:gridCol w:w="3178"/>
+        <w:gridCol w:w="3179"/>
       </w:tblGrid>
       <w:tr>
         <w:trPr/>
         <w:tc>
           <w:tcPr>
-            <w:tcW w:w="898" w:type="dxa"/>
+            <w:tcW w:w="897" w:type="dxa"/>
             <w:tcBorders>
               <w:top w:val="single" w:sz="12" w:space="0" w:color="000000"/>
               <w:bottom w:val="single" w:sz="6" w:space="0" w:color="000000"/>
@@ -1818,7 +2104,7 @@
         </w:tc>
         <w:tc>
           <w:tcPr>
-            <w:tcW w:w="3178" w:type="dxa"/>
+            <w:tcW w:w="3179" w:type="dxa"/>
             <w:tcBorders>
               <w:top w:val="single" w:sz="12" w:space="0" w:color="000000"/>
               <w:bottom w:val="single" w:sz="6" w:space="0" w:color="000000"/>
@@ -1849,7 +2135,7 @@
         <w:trPr/>
         <w:tc>
           <w:tcPr>
-            <w:tcW w:w="898" w:type="dxa"/>
+            <w:tcW w:w="897" w:type="dxa"/>
             <w:tcBorders>
               <w:bottom w:val="single" w:sz="4" w:space="0" w:color="999999"/>
             </w:tcBorders>
@@ -1899,7 +2185,7 @@
         </w:tc>
         <w:tc>
           <w:tcPr>
-            <w:tcW w:w="3178" w:type="dxa"/>
+            <w:tcW w:w="3179" w:type="dxa"/>
             <w:tcBorders>
               <w:bottom w:val="single" w:sz="4" w:space="0" w:color="999999"/>
             </w:tcBorders>
@@ -1927,7 +2213,7 @@
         <w:trPr/>
         <w:tc>
           <w:tcPr>
-            <w:tcW w:w="898" w:type="dxa"/>
+            <w:tcW w:w="897" w:type="dxa"/>
             <w:tcBorders>
               <w:bottom w:val="single" w:sz="4" w:space="0" w:color="999999"/>
             </w:tcBorders>
@@ -1977,7 +2263,7 @@
         </w:tc>
         <w:tc>
           <w:tcPr>
-            <w:tcW w:w="3178" w:type="dxa"/>
+            <w:tcW w:w="3179" w:type="dxa"/>
             <w:tcBorders>
               <w:bottom w:val="single" w:sz="4" w:space="0" w:color="999999"/>
             </w:tcBorders>
@@ -2005,7 +2291,7 @@
         <w:trPr/>
         <w:tc>
           <w:tcPr>
-            <w:tcW w:w="898" w:type="dxa"/>
+            <w:tcW w:w="897" w:type="dxa"/>
             <w:tcBorders>
               <w:bottom w:val="single" w:sz="4" w:space="0" w:color="999999"/>
             </w:tcBorders>
@@ -2055,7 +2341,7 @@
         </w:tc>
         <w:tc>
           <w:tcPr>
-            <w:tcW w:w="3178" w:type="dxa"/>
+            <w:tcW w:w="3179" w:type="dxa"/>
             <w:tcBorders>
               <w:bottom w:val="single" w:sz="4" w:space="0" w:color="999999"/>
             </w:tcBorders>
@@ -2083,7 +2369,7 @@
         <w:trPr/>
         <w:tc>
           <w:tcPr>
-            <w:tcW w:w="898" w:type="dxa"/>
+            <w:tcW w:w="897" w:type="dxa"/>
             <w:tcBorders>
               <w:bottom w:val="single" w:sz="4" w:space="0" w:color="999999"/>
             </w:tcBorders>
@@ -2133,7 +2419,7 @@
         </w:tc>
         <w:tc>
           <w:tcPr>
-            <w:tcW w:w="3178" w:type="dxa"/>
+            <w:tcW w:w="3179" w:type="dxa"/>
             <w:tcBorders>
               <w:bottom w:val="single" w:sz="4" w:space="0" w:color="999999"/>
             </w:tcBorders>
@@ -2163,7 +2449,7 @@
         </w:trPr>
         <w:tc>
           <w:tcPr>
-            <w:tcW w:w="898" w:type="dxa"/>
+            <w:tcW w:w="897" w:type="dxa"/>
             <w:tcBorders>
               <w:bottom w:val="single" w:sz="4" w:space="0" w:color="999999"/>
             </w:tcBorders>
@@ -2213,7 +2499,7 @@
         </w:tc>
         <w:tc>
           <w:tcPr>
-            <w:tcW w:w="3178" w:type="dxa"/>
+            <w:tcW w:w="3179" w:type="dxa"/>
             <w:tcBorders>
               <w:bottom w:val="single" w:sz="4" w:space="0" w:color="999999"/>
             </w:tcBorders>
@@ -2243,7 +2529,7 @@
         <w:trPr/>
         <w:tc>
           <w:tcPr>
-            <w:tcW w:w="898" w:type="dxa"/>
+            <w:tcW w:w="897" w:type="dxa"/>
             <w:tcBorders>
               <w:bottom w:val="single" w:sz="4" w:space="0" w:color="999999"/>
             </w:tcBorders>
@@ -2293,7 +2579,7 @@
         </w:tc>
         <w:tc>
           <w:tcPr>
-            <w:tcW w:w="3178" w:type="dxa"/>
+            <w:tcW w:w="3179" w:type="dxa"/>
             <w:tcBorders>
               <w:bottom w:val="single" w:sz="4" w:space="0" w:color="999999"/>
             </w:tcBorders>
@@ -2321,7 +2607,7 @@
         <w:trPr/>
         <w:tc>
           <w:tcPr>
-            <w:tcW w:w="898" w:type="dxa"/>
+            <w:tcW w:w="897" w:type="dxa"/>
             <w:tcBorders>
               <w:bottom w:val="single" w:sz="12" w:space="0" w:color="000000"/>
             </w:tcBorders>
@@ -2339,7 +2625,11 @@
               </w:rPr>
             </w:pPr>
             <w:r>
-              <w:rPr/>
+              <w:rPr>
+                <w:rFonts w:ascii="Nimbus Sans" w:hAnsi="Nimbus Sans"/>
+                <w:sz w:val="22"/>
+                <w:szCs w:val="22"/>
+              </w:rPr>
             </w:r>
           </w:p>
         </w:tc>
@@ -2363,13 +2653,17 @@
               </w:rPr>
             </w:pPr>
             <w:r>
-              <w:rPr/>
-            </w:r>
-          </w:p>
-        </w:tc>
-        <w:tc>
-          <w:tcPr>
-            <w:tcW w:w="3178" w:type="dxa"/>
+              <w:rPr>
+                <w:rFonts w:ascii="Nimbus Sans" w:hAnsi="Nimbus Sans"/>
+                <w:sz w:val="22"/>
+                <w:szCs w:val="22"/>
+              </w:rPr>
+            </w:r>
+          </w:p>
+        </w:tc>
+        <w:tc>
+          <w:tcPr>
+            <w:tcW w:w="3179" w:type="dxa"/>
             <w:tcBorders>
               <w:bottom w:val="single" w:sz="12" w:space="0" w:color="000000"/>
             </w:tcBorders>
@@ -2387,7 +2681,11 @@
               </w:rPr>
             </w:pPr>
             <w:r>
-              <w:rPr/>
+              <w:rPr>
+                <w:rFonts w:ascii="Nimbus Sans" w:hAnsi="Nimbus Sans"/>
+                <w:sz w:val="22"/>
+                <w:szCs w:val="22"/>
+              </w:rPr>
             </w:r>
           </w:p>
         </w:tc>
@@ -2405,7 +2703,11 @@
         </w:rPr>
       </w:pPr>
       <w:r>
-        <w:rPr/>
+        <w:rPr>
+          <w:rFonts w:ascii="Nimbus Sans" w:hAnsi="Nimbus Sans"/>
+          <w:sz w:val="24"/>
+          <w:szCs w:val="24"/>
+        </w:rPr>
       </w:r>
     </w:p>
     <w:p>
@@ -2426,7 +2728,7 @@
       <w:r>
         <w:rPr>
           <w:rStyle w:val="SourceText"/>
-          <w:rFonts w:ascii="Nimbus Sans" w:hAnsi="Nimbus Sans" w:cstheme="minorBidi"/>
+          <w:rFonts w:cs="" w:ascii="Nimbus Sans" w:hAnsi="Nimbus Sans" w:cstheme="minorBidi"/>
           <w:b/>
           <w:bCs/>
           <w:color w:val="auto"/>
@@ -2448,7 +2750,7 @@
       <w:r>
         <w:rPr>
           <w:rStyle w:val="SourceText"/>
-          <w:rFonts w:ascii="Nimbus Sans" w:hAnsi="Nimbus Sans" w:cstheme="minorBidi"/>
+          <w:rFonts w:cs="" w:ascii="Nimbus Sans" w:hAnsi="Nimbus Sans" w:cstheme="minorBidi"/>
           <w:b/>
           <w:bCs/>
           <w:color w:val="auto"/>
@@ -2569,7 +2871,11 @@
         </w:rPr>
       </w:pPr>
       <w:r>
-        <w:rPr/>
+        <w:rPr>
+          <w:rFonts w:ascii="Nimbus Sans" w:hAnsi="Nimbus Sans"/>
+          <w:sz w:val="24"/>
+          <w:szCs w:val="24"/>
+        </w:rPr>
       </w:r>
     </w:p>
     <w:p>
@@ -2581,7 +2887,7 @@
       <w:r>
         <w:rPr>
           <w:rStyle w:val="SourceText"/>
-          <w:rFonts w:ascii="Nimbus Sans" w:hAnsi="Nimbus Sans" w:cstheme="minorBidi"/>
+          <w:rFonts w:cs="" w:ascii="Nimbus Sans" w:hAnsi="Nimbus Sans" w:cstheme="minorBidi"/>
           <w:b/>
           <w:bCs/>
           <w:color w:val="auto"/>
@@ -2702,7 +3008,11 @@
         </w:rPr>
       </w:pPr>
       <w:r>
-        <w:rPr/>
+        <w:rPr>
+          <w:rFonts w:ascii="Nimbus Sans" w:hAnsi="Nimbus Sans"/>
+          <w:sz w:val="24"/>
+          <w:szCs w:val="24"/>
+        </w:rPr>
       </w:r>
     </w:p>
     <w:p>
@@ -2737,16 +3047,16 @@
         </w:tblCellMar>
       </w:tblPr>
       <w:tblGrid>
-        <w:gridCol w:w="1798"/>
-        <w:gridCol w:w="812"/>
+        <w:gridCol w:w="1797"/>
+        <w:gridCol w:w="813"/>
         <w:gridCol w:w="5040"/>
-        <w:gridCol w:w="1286"/>
+        <w:gridCol w:w="1285"/>
       </w:tblGrid>
       <w:tr>
         <w:trPr/>
         <w:tc>
           <w:tcPr>
-            <w:tcW w:w="1798" w:type="dxa"/>
+            <w:tcW w:w="1797" w:type="dxa"/>
             <w:tcBorders>
               <w:top w:val="single" w:sz="12" w:space="0" w:color="000000"/>
               <w:bottom w:val="single" w:sz="6" w:space="0" w:color="000000"/>
@@ -2774,7 +3084,7 @@
         </w:tc>
         <w:tc>
           <w:tcPr>
-            <w:tcW w:w="812" w:type="dxa"/>
+            <w:tcW w:w="813" w:type="dxa"/>
             <w:tcBorders>
               <w:top w:val="single" w:sz="12" w:space="0" w:color="000000"/>
               <w:bottom w:val="single" w:sz="6" w:space="0" w:color="000000"/>
@@ -2830,7 +3140,7 @@
         </w:tc>
         <w:tc>
           <w:tcPr>
-            <w:tcW w:w="1286" w:type="dxa"/>
+            <w:tcW w:w="1285" w:type="dxa"/>
             <w:tcBorders>
               <w:top w:val="single" w:sz="12" w:space="0" w:color="000000"/>
               <w:bottom w:val="single" w:sz="6" w:space="0" w:color="000000"/>
@@ -2861,7 +3171,7 @@
         <w:trPr/>
         <w:tc>
           <w:tcPr>
-            <w:tcW w:w="1798" w:type="dxa"/>
+            <w:tcW w:w="1797" w:type="dxa"/>
             <w:tcBorders>
               <w:bottom w:val="single" w:sz="4" w:space="0" w:color="999999"/>
             </w:tcBorders>
@@ -2886,7 +3196,7 @@
         </w:tc>
         <w:tc>
           <w:tcPr>
-            <w:tcW w:w="812" w:type="dxa"/>
+            <w:tcW w:w="813" w:type="dxa"/>
             <w:tcBorders>
               <w:bottom w:val="single" w:sz="4" w:space="0" w:color="999999"/>
             </w:tcBorders>
@@ -2936,7 +3246,7 @@
         </w:tc>
         <w:tc>
           <w:tcPr>
-            <w:tcW w:w="1286" w:type="dxa"/>
+            <w:tcW w:w="1285" w:type="dxa"/>
             <w:tcBorders>
               <w:bottom w:val="single" w:sz="4" w:space="0" w:color="999999"/>
             </w:tcBorders>
@@ -2964,7 +3274,7 @@
         <w:trPr/>
         <w:tc>
           <w:tcPr>
-            <w:tcW w:w="1798" w:type="dxa"/>
+            <w:tcW w:w="1797" w:type="dxa"/>
             <w:tcBorders>
               <w:bottom w:val="single" w:sz="4" w:space="0" w:color="999999"/>
             </w:tcBorders>
@@ -2989,7 +3299,7 @@
         </w:tc>
         <w:tc>
           <w:tcPr>
-            <w:tcW w:w="812" w:type="dxa"/>
+            <w:tcW w:w="813" w:type="dxa"/>
             <w:tcBorders>
               <w:bottom w:val="single" w:sz="4" w:space="0" w:color="999999"/>
             </w:tcBorders>
@@ -3039,7 +3349,7 @@
         </w:tc>
         <w:tc>
           <w:tcPr>
-            <w:tcW w:w="1286" w:type="dxa"/>
+            <w:tcW w:w="1285" w:type="dxa"/>
             <w:tcBorders>
               <w:bottom w:val="single" w:sz="4" w:space="0" w:color="999999"/>
             </w:tcBorders>
@@ -3067,7 +3377,7 @@
         <w:trPr/>
         <w:tc>
           <w:tcPr>
-            <w:tcW w:w="1798" w:type="dxa"/>
+            <w:tcW w:w="1797" w:type="dxa"/>
             <w:tcBorders>
               <w:bottom w:val="single" w:sz="4" w:space="0" w:color="999999"/>
             </w:tcBorders>
@@ -3092,7 +3402,7 @@
         </w:tc>
         <w:tc>
           <w:tcPr>
-            <w:tcW w:w="812" w:type="dxa"/>
+            <w:tcW w:w="813" w:type="dxa"/>
             <w:tcBorders>
               <w:bottom w:val="single" w:sz="4" w:space="0" w:color="999999"/>
             </w:tcBorders>
@@ -3142,25 +3452,29 @@
         </w:tc>
         <w:tc>
           <w:tcPr>
-            <w:tcW w:w="1286" w:type="dxa"/>
-            <w:tcBorders>
-              <w:bottom w:val="single" w:sz="4" w:space="0" w:color="999999"/>
-            </w:tcBorders>
-            <w:shd w:fill="EEEEEE" w:val="clear"/>
-          </w:tcPr>
-          <w:p>
-            <w:pPr>
-              <w:pStyle w:val="Normal"/>
-              <w:spacing w:before="0" w:after="160"/>
-              <w:rPr>
-                <w:rStyle w:val="SourceText"/>
-                <w:rFonts w:ascii="Nimbus Sans" w:hAnsi="Nimbus Sans"/>
-                <w:sz w:val="22"/>
-                <w:szCs w:val="22"/>
-              </w:rPr>
-            </w:pPr>
-            <w:r>
-              <w:rPr/>
+            <w:tcW w:w="1285" w:type="dxa"/>
+            <w:tcBorders>
+              <w:bottom w:val="single" w:sz="4" w:space="0" w:color="999999"/>
+            </w:tcBorders>
+            <w:shd w:fill="EEEEEE" w:val="clear"/>
+          </w:tcPr>
+          <w:p>
+            <w:pPr>
+              <w:pStyle w:val="Normal"/>
+              <w:spacing w:before="0" w:after="160"/>
+              <w:rPr>
+                <w:rStyle w:val="SourceText"/>
+                <w:rFonts w:ascii="Nimbus Sans" w:hAnsi="Nimbus Sans"/>
+                <w:sz w:val="22"/>
+                <w:szCs w:val="22"/>
+              </w:rPr>
+            </w:pPr>
+            <w:r>
+              <w:rPr>
+                <w:rFonts w:ascii="Nimbus Sans" w:hAnsi="Nimbus Sans"/>
+                <w:sz w:val="22"/>
+                <w:szCs w:val="22"/>
+              </w:rPr>
             </w:r>
           </w:p>
         </w:tc>
@@ -3169,31 +3483,35 @@
         <w:trPr/>
         <w:tc>
           <w:tcPr>
-            <w:tcW w:w="1798" w:type="dxa"/>
-            <w:tcBorders>
-              <w:bottom w:val="single" w:sz="4" w:space="0" w:color="999999"/>
-            </w:tcBorders>
-            <w:shd w:fill="EEEEEE" w:val="clear"/>
-          </w:tcPr>
-          <w:p>
-            <w:pPr>
-              <w:pStyle w:val="Normal"/>
-              <w:spacing w:before="0" w:after="160"/>
-              <w:rPr>
-                <w:rStyle w:val="SourceText"/>
-                <w:rFonts w:ascii="Nimbus Sans" w:hAnsi="Nimbus Sans"/>
-                <w:sz w:val="22"/>
-                <w:szCs w:val="22"/>
-              </w:rPr>
-            </w:pPr>
-            <w:r>
-              <w:rPr/>
-            </w:r>
-          </w:p>
-        </w:tc>
-        <w:tc>
-          <w:tcPr>
-            <w:tcW w:w="812" w:type="dxa"/>
+            <w:tcW w:w="1797" w:type="dxa"/>
+            <w:tcBorders>
+              <w:bottom w:val="single" w:sz="4" w:space="0" w:color="999999"/>
+            </w:tcBorders>
+            <w:shd w:fill="EEEEEE" w:val="clear"/>
+          </w:tcPr>
+          <w:p>
+            <w:pPr>
+              <w:pStyle w:val="Normal"/>
+              <w:spacing w:before="0" w:after="160"/>
+              <w:rPr>
+                <w:rStyle w:val="SourceText"/>
+                <w:rFonts w:ascii="Nimbus Sans" w:hAnsi="Nimbus Sans"/>
+                <w:sz w:val="22"/>
+                <w:szCs w:val="22"/>
+              </w:rPr>
+            </w:pPr>
+            <w:r>
+              <w:rPr>
+                <w:rFonts w:ascii="Nimbus Sans" w:hAnsi="Nimbus Sans"/>
+                <w:sz w:val="22"/>
+                <w:szCs w:val="22"/>
+              </w:rPr>
+            </w:r>
+          </w:p>
+        </w:tc>
+        <w:tc>
+          <w:tcPr>
+            <w:tcW w:w="813" w:type="dxa"/>
             <w:tcBorders>
               <w:bottom w:val="single" w:sz="4" w:space="0" w:color="999999"/>
             </w:tcBorders>
@@ -3244,25 +3562,29 @@
         </w:tc>
         <w:tc>
           <w:tcPr>
-            <w:tcW w:w="1286" w:type="dxa"/>
-            <w:tcBorders>
-              <w:bottom w:val="single" w:sz="4" w:space="0" w:color="999999"/>
-            </w:tcBorders>
-            <w:shd w:fill="EEEEEE" w:val="clear"/>
-          </w:tcPr>
-          <w:p>
-            <w:pPr>
-              <w:pStyle w:val="Normal"/>
-              <w:spacing w:before="0" w:after="160"/>
-              <w:rPr>
-                <w:rStyle w:val="SourceText"/>
-                <w:rFonts w:ascii="Nimbus Sans" w:hAnsi="Nimbus Sans"/>
-                <w:sz w:val="22"/>
-                <w:szCs w:val="22"/>
-              </w:rPr>
-            </w:pPr>
-            <w:r>
-              <w:rPr/>
+            <w:tcW w:w="1285" w:type="dxa"/>
+            <w:tcBorders>
+              <w:bottom w:val="single" w:sz="4" w:space="0" w:color="999999"/>
+            </w:tcBorders>
+            <w:shd w:fill="EEEEEE" w:val="clear"/>
+          </w:tcPr>
+          <w:p>
+            <w:pPr>
+              <w:pStyle w:val="Normal"/>
+              <w:spacing w:before="0" w:after="160"/>
+              <w:rPr>
+                <w:rStyle w:val="SourceText"/>
+                <w:rFonts w:ascii="Nimbus Sans" w:hAnsi="Nimbus Sans"/>
+                <w:sz w:val="22"/>
+                <w:szCs w:val="22"/>
+              </w:rPr>
+            </w:pPr>
+            <w:r>
+              <w:rPr>
+                <w:rFonts w:ascii="Nimbus Sans" w:hAnsi="Nimbus Sans"/>
+                <w:sz w:val="22"/>
+                <w:szCs w:val="22"/>
+              </w:rPr>
             </w:r>
           </w:p>
         </w:tc>
@@ -3271,31 +3593,35 @@
         <w:trPr/>
         <w:tc>
           <w:tcPr>
-            <w:tcW w:w="1798" w:type="dxa"/>
-            <w:tcBorders>
-              <w:bottom w:val="single" w:sz="4" w:space="0" w:color="999999"/>
-            </w:tcBorders>
-            <w:shd w:fill="EEEEEE" w:val="clear"/>
-          </w:tcPr>
-          <w:p>
-            <w:pPr>
-              <w:pStyle w:val="Normal"/>
-              <w:spacing w:before="0" w:after="160"/>
-              <w:rPr>
-                <w:rStyle w:val="SourceText"/>
-                <w:rFonts w:ascii="Nimbus Sans" w:hAnsi="Nimbus Sans"/>
-                <w:sz w:val="22"/>
-                <w:szCs w:val="22"/>
-              </w:rPr>
-            </w:pPr>
-            <w:r>
-              <w:rPr/>
-            </w:r>
-          </w:p>
-        </w:tc>
-        <w:tc>
-          <w:tcPr>
-            <w:tcW w:w="812" w:type="dxa"/>
+            <w:tcW w:w="1797" w:type="dxa"/>
+            <w:tcBorders>
+              <w:bottom w:val="single" w:sz="4" w:space="0" w:color="999999"/>
+            </w:tcBorders>
+            <w:shd w:fill="EEEEEE" w:val="clear"/>
+          </w:tcPr>
+          <w:p>
+            <w:pPr>
+              <w:pStyle w:val="Normal"/>
+              <w:spacing w:before="0" w:after="160"/>
+              <w:rPr>
+                <w:rStyle w:val="SourceText"/>
+                <w:rFonts w:ascii="Nimbus Sans" w:hAnsi="Nimbus Sans"/>
+                <w:sz w:val="22"/>
+                <w:szCs w:val="22"/>
+              </w:rPr>
+            </w:pPr>
+            <w:r>
+              <w:rPr>
+                <w:rFonts w:ascii="Nimbus Sans" w:hAnsi="Nimbus Sans"/>
+                <w:sz w:val="22"/>
+                <w:szCs w:val="22"/>
+              </w:rPr>
+            </w:r>
+          </w:p>
+        </w:tc>
+        <w:tc>
+          <w:tcPr>
+            <w:tcW w:w="813" w:type="dxa"/>
             <w:tcBorders>
               <w:bottom w:val="single" w:sz="4" w:space="0" w:color="999999"/>
             </w:tcBorders>
@@ -3346,25 +3672,29 @@
         </w:tc>
         <w:tc>
           <w:tcPr>
-            <w:tcW w:w="1286" w:type="dxa"/>
-            <w:tcBorders>
-              <w:bottom w:val="single" w:sz="4" w:space="0" w:color="999999"/>
-            </w:tcBorders>
-            <w:shd w:fill="EEEEEE" w:val="clear"/>
-          </w:tcPr>
-          <w:p>
-            <w:pPr>
-              <w:pStyle w:val="Normal"/>
-              <w:spacing w:before="0" w:after="160"/>
-              <w:rPr>
-                <w:rStyle w:val="SourceText"/>
-                <w:rFonts w:ascii="Nimbus Sans" w:hAnsi="Nimbus Sans"/>
-                <w:sz w:val="22"/>
-                <w:szCs w:val="22"/>
-              </w:rPr>
-            </w:pPr>
-            <w:r>
-              <w:rPr/>
+            <w:tcW w:w="1285" w:type="dxa"/>
+            <w:tcBorders>
+              <w:bottom w:val="single" w:sz="4" w:space="0" w:color="999999"/>
+            </w:tcBorders>
+            <w:shd w:fill="EEEEEE" w:val="clear"/>
+          </w:tcPr>
+          <w:p>
+            <w:pPr>
+              <w:pStyle w:val="Normal"/>
+              <w:spacing w:before="0" w:after="160"/>
+              <w:rPr>
+                <w:rStyle w:val="SourceText"/>
+                <w:rFonts w:ascii="Nimbus Sans" w:hAnsi="Nimbus Sans"/>
+                <w:sz w:val="22"/>
+                <w:szCs w:val="22"/>
+              </w:rPr>
+            </w:pPr>
+            <w:r>
+              <w:rPr>
+                <w:rFonts w:ascii="Nimbus Sans" w:hAnsi="Nimbus Sans"/>
+                <w:sz w:val="22"/>
+                <w:szCs w:val="22"/>
+              </w:rPr>
             </w:r>
           </w:p>
         </w:tc>
@@ -3373,31 +3703,35 @@
         <w:trPr/>
         <w:tc>
           <w:tcPr>
-            <w:tcW w:w="1798" w:type="dxa"/>
-            <w:tcBorders>
-              <w:bottom w:val="single" w:sz="4" w:space="0" w:color="999999"/>
-            </w:tcBorders>
-            <w:shd w:fill="EEEEEE" w:val="clear"/>
-          </w:tcPr>
-          <w:p>
-            <w:pPr>
-              <w:pStyle w:val="Normal"/>
-              <w:spacing w:before="0" w:after="160"/>
-              <w:rPr>
-                <w:rStyle w:val="SourceText"/>
-                <w:rFonts w:ascii="Nimbus Sans" w:hAnsi="Nimbus Sans"/>
-                <w:sz w:val="22"/>
-                <w:szCs w:val="22"/>
-              </w:rPr>
-            </w:pPr>
-            <w:r>
-              <w:rPr/>
-            </w:r>
-          </w:p>
-        </w:tc>
-        <w:tc>
-          <w:tcPr>
-            <w:tcW w:w="812" w:type="dxa"/>
+            <w:tcW w:w="1797" w:type="dxa"/>
+            <w:tcBorders>
+              <w:bottom w:val="single" w:sz="4" w:space="0" w:color="999999"/>
+            </w:tcBorders>
+            <w:shd w:fill="EEEEEE" w:val="clear"/>
+          </w:tcPr>
+          <w:p>
+            <w:pPr>
+              <w:pStyle w:val="Normal"/>
+              <w:spacing w:before="0" w:after="160"/>
+              <w:rPr>
+                <w:rStyle w:val="SourceText"/>
+                <w:rFonts w:ascii="Nimbus Sans" w:hAnsi="Nimbus Sans"/>
+                <w:sz w:val="22"/>
+                <w:szCs w:val="22"/>
+              </w:rPr>
+            </w:pPr>
+            <w:r>
+              <w:rPr>
+                <w:rFonts w:ascii="Nimbus Sans" w:hAnsi="Nimbus Sans"/>
+                <w:sz w:val="22"/>
+                <w:szCs w:val="22"/>
+              </w:rPr>
+            </w:r>
+          </w:p>
+        </w:tc>
+        <w:tc>
+          <w:tcPr>
+            <w:tcW w:w="813" w:type="dxa"/>
             <w:tcBorders>
               <w:bottom w:val="single" w:sz="4" w:space="0" w:color="999999"/>
             </w:tcBorders>
@@ -3448,25 +3782,29 @@
         </w:tc>
         <w:tc>
           <w:tcPr>
-            <w:tcW w:w="1286" w:type="dxa"/>
-            <w:tcBorders>
-              <w:bottom w:val="single" w:sz="4" w:space="0" w:color="999999"/>
-            </w:tcBorders>
-            <w:shd w:fill="EEEEEE" w:val="clear"/>
-          </w:tcPr>
-          <w:p>
-            <w:pPr>
-              <w:pStyle w:val="Normal"/>
-              <w:spacing w:before="0" w:after="160"/>
-              <w:rPr>
-                <w:rStyle w:val="SourceText"/>
-                <w:rFonts w:ascii="Nimbus Sans" w:hAnsi="Nimbus Sans"/>
-                <w:sz w:val="22"/>
-                <w:szCs w:val="22"/>
-              </w:rPr>
-            </w:pPr>
-            <w:r>
-              <w:rPr/>
+            <w:tcW w:w="1285" w:type="dxa"/>
+            <w:tcBorders>
+              <w:bottom w:val="single" w:sz="4" w:space="0" w:color="999999"/>
+            </w:tcBorders>
+            <w:shd w:fill="EEEEEE" w:val="clear"/>
+          </w:tcPr>
+          <w:p>
+            <w:pPr>
+              <w:pStyle w:val="Normal"/>
+              <w:spacing w:before="0" w:after="160"/>
+              <w:rPr>
+                <w:rStyle w:val="SourceText"/>
+                <w:rFonts w:ascii="Nimbus Sans" w:hAnsi="Nimbus Sans"/>
+                <w:sz w:val="22"/>
+                <w:szCs w:val="22"/>
+              </w:rPr>
+            </w:pPr>
+            <w:r>
+              <w:rPr>
+                <w:rFonts w:ascii="Nimbus Sans" w:hAnsi="Nimbus Sans"/>
+                <w:sz w:val="22"/>
+                <w:szCs w:val="22"/>
+              </w:rPr>
             </w:r>
           </w:p>
         </w:tc>
@@ -3475,31 +3813,35 @@
         <w:trPr/>
         <w:tc>
           <w:tcPr>
-            <w:tcW w:w="1798" w:type="dxa"/>
-            <w:tcBorders>
-              <w:bottom w:val="single" w:sz="4" w:space="0" w:color="999999"/>
-            </w:tcBorders>
-            <w:shd w:fill="EEEEEE" w:val="clear"/>
-          </w:tcPr>
-          <w:p>
-            <w:pPr>
-              <w:pStyle w:val="Normal"/>
-              <w:spacing w:before="0" w:after="160"/>
-              <w:rPr>
-                <w:rStyle w:val="SourceText"/>
-                <w:rFonts w:ascii="Nimbus Sans" w:hAnsi="Nimbus Sans"/>
-                <w:sz w:val="22"/>
-                <w:szCs w:val="22"/>
-              </w:rPr>
-            </w:pPr>
-            <w:r>
-              <w:rPr/>
-            </w:r>
-          </w:p>
-        </w:tc>
-        <w:tc>
-          <w:tcPr>
-            <w:tcW w:w="812" w:type="dxa"/>
+            <w:tcW w:w="1797" w:type="dxa"/>
+            <w:tcBorders>
+              <w:bottom w:val="single" w:sz="4" w:space="0" w:color="999999"/>
+            </w:tcBorders>
+            <w:shd w:fill="EEEEEE" w:val="clear"/>
+          </w:tcPr>
+          <w:p>
+            <w:pPr>
+              <w:pStyle w:val="Normal"/>
+              <w:spacing w:before="0" w:after="160"/>
+              <w:rPr>
+                <w:rStyle w:val="SourceText"/>
+                <w:rFonts w:ascii="Nimbus Sans" w:hAnsi="Nimbus Sans"/>
+                <w:sz w:val="22"/>
+                <w:szCs w:val="22"/>
+              </w:rPr>
+            </w:pPr>
+            <w:r>
+              <w:rPr>
+                <w:rFonts w:ascii="Nimbus Sans" w:hAnsi="Nimbus Sans"/>
+                <w:sz w:val="22"/>
+                <w:szCs w:val="22"/>
+              </w:rPr>
+            </w:r>
+          </w:p>
+        </w:tc>
+        <w:tc>
+          <w:tcPr>
+            <w:tcW w:w="813" w:type="dxa"/>
             <w:tcBorders>
               <w:bottom w:val="single" w:sz="4" w:space="0" w:color="999999"/>
             </w:tcBorders>
@@ -3549,25 +3891,29 @@
         </w:tc>
         <w:tc>
           <w:tcPr>
-            <w:tcW w:w="1286" w:type="dxa"/>
-            <w:tcBorders>
-              <w:bottom w:val="single" w:sz="4" w:space="0" w:color="999999"/>
-            </w:tcBorders>
-            <w:shd w:fill="EEEEEE" w:val="clear"/>
-          </w:tcPr>
-          <w:p>
-            <w:pPr>
-              <w:pStyle w:val="Normal"/>
-              <w:spacing w:before="0" w:after="160"/>
-              <w:rPr>
-                <w:rStyle w:val="SourceText"/>
-                <w:rFonts w:ascii="Nimbus Sans" w:hAnsi="Nimbus Sans"/>
-                <w:sz w:val="22"/>
-                <w:szCs w:val="22"/>
-              </w:rPr>
-            </w:pPr>
-            <w:r>
-              <w:rPr/>
+            <w:tcW w:w="1285" w:type="dxa"/>
+            <w:tcBorders>
+              <w:bottom w:val="single" w:sz="4" w:space="0" w:color="999999"/>
+            </w:tcBorders>
+            <w:shd w:fill="EEEEEE" w:val="clear"/>
+          </w:tcPr>
+          <w:p>
+            <w:pPr>
+              <w:pStyle w:val="Normal"/>
+              <w:spacing w:before="0" w:after="160"/>
+              <w:rPr>
+                <w:rStyle w:val="SourceText"/>
+                <w:rFonts w:ascii="Nimbus Sans" w:hAnsi="Nimbus Sans"/>
+                <w:sz w:val="22"/>
+                <w:szCs w:val="22"/>
+              </w:rPr>
+            </w:pPr>
+            <w:r>
+              <w:rPr>
+                <w:rFonts w:ascii="Nimbus Sans" w:hAnsi="Nimbus Sans"/>
+                <w:sz w:val="22"/>
+                <w:szCs w:val="22"/>
+              </w:rPr>
             </w:r>
           </w:p>
         </w:tc>
@@ -3576,31 +3922,35 @@
         <w:trPr/>
         <w:tc>
           <w:tcPr>
-            <w:tcW w:w="1798" w:type="dxa"/>
-            <w:tcBorders>
-              <w:bottom w:val="single" w:sz="4" w:space="0" w:color="999999"/>
-            </w:tcBorders>
-            <w:shd w:fill="EEEEEE" w:val="clear"/>
-          </w:tcPr>
-          <w:p>
-            <w:pPr>
-              <w:pStyle w:val="Normal"/>
-              <w:spacing w:before="0" w:after="160"/>
-              <w:rPr>
-                <w:rStyle w:val="SourceText"/>
-                <w:rFonts w:ascii="Nimbus Sans" w:hAnsi="Nimbus Sans"/>
-                <w:sz w:val="22"/>
-                <w:szCs w:val="22"/>
-              </w:rPr>
-            </w:pPr>
-            <w:r>
-              <w:rPr/>
-            </w:r>
-          </w:p>
-        </w:tc>
-        <w:tc>
-          <w:tcPr>
-            <w:tcW w:w="812" w:type="dxa"/>
+            <w:tcW w:w="1797" w:type="dxa"/>
+            <w:tcBorders>
+              <w:bottom w:val="single" w:sz="4" w:space="0" w:color="999999"/>
+            </w:tcBorders>
+            <w:shd w:fill="EEEEEE" w:val="clear"/>
+          </w:tcPr>
+          <w:p>
+            <w:pPr>
+              <w:pStyle w:val="Normal"/>
+              <w:spacing w:before="0" w:after="160"/>
+              <w:rPr>
+                <w:rStyle w:val="SourceText"/>
+                <w:rFonts w:ascii="Nimbus Sans" w:hAnsi="Nimbus Sans"/>
+                <w:sz w:val="22"/>
+                <w:szCs w:val="22"/>
+              </w:rPr>
+            </w:pPr>
+            <w:r>
+              <w:rPr>
+                <w:rFonts w:ascii="Nimbus Sans" w:hAnsi="Nimbus Sans"/>
+                <w:sz w:val="22"/>
+                <w:szCs w:val="22"/>
+              </w:rPr>
+            </w:r>
+          </w:p>
+        </w:tc>
+        <w:tc>
+          <w:tcPr>
+            <w:tcW w:w="813" w:type="dxa"/>
             <w:tcBorders>
               <w:bottom w:val="single" w:sz="4" w:space="0" w:color="999999"/>
             </w:tcBorders>
@@ -3650,25 +4000,29 @@
         </w:tc>
         <w:tc>
           <w:tcPr>
-            <w:tcW w:w="1286" w:type="dxa"/>
-            <w:tcBorders>
-              <w:bottom w:val="single" w:sz="4" w:space="0" w:color="999999"/>
-            </w:tcBorders>
-            <w:shd w:fill="EEEEEE" w:val="clear"/>
-          </w:tcPr>
-          <w:p>
-            <w:pPr>
-              <w:pStyle w:val="Normal"/>
-              <w:spacing w:before="0" w:after="160"/>
-              <w:rPr>
-                <w:rStyle w:val="SourceText"/>
-                <w:rFonts w:ascii="Nimbus Sans" w:hAnsi="Nimbus Sans"/>
-                <w:sz w:val="22"/>
-                <w:szCs w:val="22"/>
-              </w:rPr>
-            </w:pPr>
-            <w:r>
-              <w:rPr/>
+            <w:tcW w:w="1285" w:type="dxa"/>
+            <w:tcBorders>
+              <w:bottom w:val="single" w:sz="4" w:space="0" w:color="999999"/>
+            </w:tcBorders>
+            <w:shd w:fill="EEEEEE" w:val="clear"/>
+          </w:tcPr>
+          <w:p>
+            <w:pPr>
+              <w:pStyle w:val="Normal"/>
+              <w:spacing w:before="0" w:after="160"/>
+              <w:rPr>
+                <w:rStyle w:val="SourceText"/>
+                <w:rFonts w:ascii="Nimbus Sans" w:hAnsi="Nimbus Sans"/>
+                <w:sz w:val="22"/>
+                <w:szCs w:val="22"/>
+              </w:rPr>
+            </w:pPr>
+            <w:r>
+              <w:rPr>
+                <w:rFonts w:ascii="Nimbus Sans" w:hAnsi="Nimbus Sans"/>
+                <w:sz w:val="22"/>
+                <w:szCs w:val="22"/>
+              </w:rPr>
             </w:r>
           </w:p>
         </w:tc>
@@ -3677,7 +4031,7 @@
         <w:trPr/>
         <w:tc>
           <w:tcPr>
-            <w:tcW w:w="1798" w:type="dxa"/>
+            <w:tcW w:w="1797" w:type="dxa"/>
             <w:tcBorders>
               <w:bottom w:val="single" w:sz="4" w:space="0" w:color="999999"/>
             </w:tcBorders>
@@ -3702,7 +4056,7 @@
         </w:tc>
         <w:tc>
           <w:tcPr>
-            <w:tcW w:w="812" w:type="dxa"/>
+            <w:tcW w:w="813" w:type="dxa"/>
             <w:tcBorders>
               <w:bottom w:val="single" w:sz="4" w:space="0" w:color="999999"/>
             </w:tcBorders>
@@ -3752,7 +4106,7 @@
         </w:tc>
         <w:tc>
           <w:tcPr>
-            <w:tcW w:w="1286" w:type="dxa"/>
+            <w:tcW w:w="1285" w:type="dxa"/>
             <w:tcBorders>
               <w:bottom w:val="single" w:sz="4" w:space="0" w:color="999999"/>
             </w:tcBorders>
@@ -3780,7 +4134,7 @@
         <w:trPr/>
         <w:tc>
           <w:tcPr>
-            <w:tcW w:w="1798" w:type="dxa"/>
+            <w:tcW w:w="1797" w:type="dxa"/>
             <w:tcBorders>
               <w:bottom w:val="single" w:sz="4" w:space="0" w:color="999999"/>
             </w:tcBorders>
@@ -3805,7 +4159,7 @@
         </w:tc>
         <w:tc>
           <w:tcPr>
-            <w:tcW w:w="812" w:type="dxa"/>
+            <w:tcW w:w="813" w:type="dxa"/>
             <w:tcBorders>
               <w:bottom w:val="single" w:sz="4" w:space="0" w:color="999999"/>
             </w:tcBorders>
@@ -3855,7 +4209,7 @@
         </w:tc>
         <w:tc>
           <w:tcPr>
-            <w:tcW w:w="1286" w:type="dxa"/>
+            <w:tcW w:w="1285" w:type="dxa"/>
             <w:tcBorders>
               <w:bottom w:val="single" w:sz="4" w:space="0" w:color="999999"/>
             </w:tcBorders>
@@ -3883,7 +4237,7 @@
         <w:trPr/>
         <w:tc>
           <w:tcPr>
-            <w:tcW w:w="1798" w:type="dxa"/>
+            <w:tcW w:w="1797" w:type="dxa"/>
             <w:tcBorders>
               <w:bottom w:val="single" w:sz="4" w:space="0" w:color="999999"/>
             </w:tcBorders>
@@ -3908,7 +4262,7 @@
         </w:tc>
         <w:tc>
           <w:tcPr>
-            <w:tcW w:w="812" w:type="dxa"/>
+            <w:tcW w:w="813" w:type="dxa"/>
             <w:tcBorders>
               <w:bottom w:val="single" w:sz="4" w:space="0" w:color="999999"/>
             </w:tcBorders>
@@ -3958,7 +4312,7 @@
         </w:tc>
         <w:tc>
           <w:tcPr>
-            <w:tcW w:w="1286" w:type="dxa"/>
+            <w:tcW w:w="1285" w:type="dxa"/>
             <w:tcBorders>
               <w:bottom w:val="single" w:sz="4" w:space="0" w:color="999999"/>
             </w:tcBorders>
@@ -3986,7 +4340,7 @@
         <w:trPr/>
         <w:tc>
           <w:tcPr>
-            <w:tcW w:w="1798" w:type="dxa"/>
+            <w:tcW w:w="1797" w:type="dxa"/>
             <w:tcBorders>
               <w:bottom w:val="single" w:sz="12" w:space="0" w:color="000000"/>
             </w:tcBorders>
@@ -4004,13 +4358,17 @@
               </w:rPr>
             </w:pPr>
             <w:r>
-              <w:rPr/>
-            </w:r>
-          </w:p>
-        </w:tc>
-        <w:tc>
-          <w:tcPr>
-            <w:tcW w:w="812" w:type="dxa"/>
+              <w:rPr>
+                <w:rFonts w:ascii="Nimbus Sans" w:hAnsi="Nimbus Sans"/>
+                <w:sz w:val="22"/>
+                <w:szCs w:val="22"/>
+              </w:rPr>
+            </w:r>
+          </w:p>
+        </w:tc>
+        <w:tc>
+          <w:tcPr>
+            <w:tcW w:w="813" w:type="dxa"/>
             <w:tcBorders>
               <w:bottom w:val="single" w:sz="12" w:space="0" w:color="000000"/>
             </w:tcBorders>
@@ -4028,7 +4386,11 @@
               </w:rPr>
             </w:pPr>
             <w:r>
-              <w:rPr/>
+              <w:rPr>
+                <w:rFonts w:ascii="Nimbus Sans" w:hAnsi="Nimbus Sans"/>
+                <w:sz w:val="22"/>
+                <w:szCs w:val="22"/>
+              </w:rPr>
             </w:r>
           </w:p>
         </w:tc>
@@ -4052,13 +4414,17 @@
               </w:rPr>
             </w:pPr>
             <w:r>
-              <w:rPr/>
-            </w:r>
-          </w:p>
-        </w:tc>
-        <w:tc>
-          <w:tcPr>
-            <w:tcW w:w="1286" w:type="dxa"/>
+              <w:rPr>
+                <w:rFonts w:ascii="Nimbus Sans" w:hAnsi="Nimbus Sans"/>
+                <w:sz w:val="22"/>
+                <w:szCs w:val="22"/>
+              </w:rPr>
+            </w:r>
+          </w:p>
+        </w:tc>
+        <w:tc>
+          <w:tcPr>
+            <w:tcW w:w="1285" w:type="dxa"/>
             <w:tcBorders>
               <w:bottom w:val="single" w:sz="12" w:space="0" w:color="000000"/>
             </w:tcBorders>
@@ -4076,7 +4442,11 @@
               </w:rPr>
             </w:pPr>
             <w:r>
-              <w:rPr/>
+              <w:rPr>
+                <w:rFonts w:ascii="Nimbus Sans" w:hAnsi="Nimbus Sans"/>
+                <w:sz w:val="22"/>
+                <w:szCs w:val="22"/>
+              </w:rPr>
             </w:r>
           </w:p>
         </w:tc>
@@ -4094,7 +4464,11 @@
         </w:rPr>
       </w:pPr>
       <w:r>
-        <w:rPr/>
+        <w:rPr>
+          <w:rFonts w:ascii="Nimbus Sans" w:hAnsi="Nimbus Sans"/>
+          <w:sz w:val="24"/>
+          <w:szCs w:val="24"/>
+        </w:rPr>
       </w:r>
     </w:p>
     <w:p>
@@ -4129,16 +4503,16 @@
         </w:tblCellMar>
       </w:tblPr>
       <w:tblGrid>
-        <w:gridCol w:w="1168"/>
-        <w:gridCol w:w="2702"/>
-        <w:gridCol w:w="3508"/>
+        <w:gridCol w:w="1167"/>
+        <w:gridCol w:w="2703"/>
+        <w:gridCol w:w="3507"/>
         <w:gridCol w:w="1648"/>
       </w:tblGrid>
       <w:tr>
         <w:trPr/>
         <w:tc>
           <w:tcPr>
-            <w:tcW w:w="1168" w:type="dxa"/>
+            <w:tcW w:w="1167" w:type="dxa"/>
             <w:tcBorders>
               <w:top w:val="single" w:sz="12" w:space="0" w:color="000000"/>
               <w:bottom w:val="single" w:sz="6" w:space="0" w:color="000000"/>
@@ -4166,7 +4540,7 @@
         </w:tc>
         <w:tc>
           <w:tcPr>
-            <w:tcW w:w="2702" w:type="dxa"/>
+            <w:tcW w:w="2703" w:type="dxa"/>
             <w:tcBorders>
               <w:top w:val="single" w:sz="12" w:space="0" w:color="000000"/>
               <w:bottom w:val="single" w:sz="6" w:space="0" w:color="000000"/>
@@ -4194,7 +4568,7 @@
         </w:tc>
         <w:tc>
           <w:tcPr>
-            <w:tcW w:w="3508" w:type="dxa"/>
+            <w:tcW w:w="3507" w:type="dxa"/>
             <w:tcBorders>
               <w:top w:val="single" w:sz="12" w:space="0" w:color="000000"/>
               <w:bottom w:val="single" w:sz="6" w:space="0" w:color="000000"/>
@@ -4253,7 +4627,7 @@
         <w:trPr/>
         <w:tc>
           <w:tcPr>
-            <w:tcW w:w="1168" w:type="dxa"/>
+            <w:tcW w:w="1167" w:type="dxa"/>
             <w:tcBorders>
               <w:bottom w:val="single" w:sz="4" w:space="0" w:color="999999"/>
             </w:tcBorders>
@@ -4278,7 +4652,7 @@
         </w:tc>
         <w:tc>
           <w:tcPr>
-            <w:tcW w:w="2702" w:type="dxa"/>
+            <w:tcW w:w="2703" w:type="dxa"/>
             <w:tcBorders>
               <w:bottom w:val="single" w:sz="4" w:space="0" w:color="999999"/>
             </w:tcBorders>
@@ -4303,7 +4677,7 @@
         </w:tc>
         <w:tc>
           <w:tcPr>
-            <w:tcW w:w="3508" w:type="dxa"/>
+            <w:tcW w:w="3507" w:type="dxa"/>
             <w:tcBorders>
               <w:bottom w:val="single" w:sz="4" w:space="0" w:color="999999"/>
             </w:tcBorders>
@@ -4356,7 +4730,7 @@
         <w:trPr/>
         <w:tc>
           <w:tcPr>
-            <w:tcW w:w="1168" w:type="dxa"/>
+            <w:tcW w:w="1167" w:type="dxa"/>
             <w:tcBorders>
               <w:bottom w:val="single" w:sz="4" w:space="0" w:color="999999"/>
             </w:tcBorders>
@@ -4381,7 +4755,7 @@
         </w:tc>
         <w:tc>
           <w:tcPr>
-            <w:tcW w:w="2702" w:type="dxa"/>
+            <w:tcW w:w="2703" w:type="dxa"/>
             <w:tcBorders>
               <w:bottom w:val="single" w:sz="4" w:space="0" w:color="999999"/>
             </w:tcBorders>
@@ -4406,7 +4780,7 @@
         </w:tc>
         <w:tc>
           <w:tcPr>
-            <w:tcW w:w="3508" w:type="dxa"/>
+            <w:tcW w:w="3507" w:type="dxa"/>
             <w:tcBorders>
               <w:bottom w:val="single" w:sz="4" w:space="0" w:color="999999"/>
             </w:tcBorders>
@@ -4459,7 +4833,7 @@
         <w:trPr/>
         <w:tc>
           <w:tcPr>
-            <w:tcW w:w="1168" w:type="dxa"/>
+            <w:tcW w:w="1167" w:type="dxa"/>
             <w:tcBorders>
               <w:bottom w:val="single" w:sz="4" w:space="0" w:color="999999"/>
             </w:tcBorders>
@@ -4484,7 +4858,7 @@
         </w:tc>
         <w:tc>
           <w:tcPr>
-            <w:tcW w:w="2702" w:type="dxa"/>
+            <w:tcW w:w="2703" w:type="dxa"/>
             <w:tcBorders>
               <w:bottom w:val="single" w:sz="4" w:space="0" w:color="999999"/>
             </w:tcBorders>
@@ -4509,7 +4883,7 @@
         </w:tc>
         <w:tc>
           <w:tcPr>
-            <w:tcW w:w="3508" w:type="dxa"/>
+            <w:tcW w:w="3507" w:type="dxa"/>
             <w:tcBorders>
               <w:bottom w:val="single" w:sz="4" w:space="0" w:color="999999"/>
             </w:tcBorders>
@@ -4552,7 +4926,11 @@
               </w:rPr>
             </w:pPr>
             <w:r>
-              <w:rPr/>
+              <w:rPr>
+                <w:rFonts w:ascii="Nimbus Sans" w:hAnsi="Nimbus Sans"/>
+                <w:sz w:val="22"/>
+                <w:szCs w:val="22"/>
+              </w:rPr>
             </w:r>
           </w:p>
         </w:tc>
@@ -4561,7 +4939,7 @@
         <w:trPr/>
         <w:tc>
           <w:tcPr>
-            <w:tcW w:w="1168" w:type="dxa"/>
+            <w:tcW w:w="1167" w:type="dxa"/>
             <w:tcBorders>
               <w:bottom w:val="single" w:sz="12" w:space="0" w:color="000000"/>
             </w:tcBorders>
@@ -4579,13 +4957,17 @@
               </w:rPr>
             </w:pPr>
             <w:r>
-              <w:rPr/>
-            </w:r>
-          </w:p>
-        </w:tc>
-        <w:tc>
-          <w:tcPr>
-            <w:tcW w:w="2702" w:type="dxa"/>
+              <w:rPr>
+                <w:rFonts w:ascii="Nimbus Sans" w:hAnsi="Nimbus Sans"/>
+                <w:sz w:val="22"/>
+                <w:szCs w:val="22"/>
+              </w:rPr>
+            </w:r>
+          </w:p>
+        </w:tc>
+        <w:tc>
+          <w:tcPr>
+            <w:tcW w:w="2703" w:type="dxa"/>
             <w:tcBorders>
               <w:bottom w:val="single" w:sz="12" w:space="0" w:color="000000"/>
             </w:tcBorders>
@@ -4603,13 +4985,17 @@
               </w:rPr>
             </w:pPr>
             <w:r>
-              <w:rPr/>
-            </w:r>
-          </w:p>
-        </w:tc>
-        <w:tc>
-          <w:tcPr>
-            <w:tcW w:w="3508" w:type="dxa"/>
+              <w:rPr>
+                <w:rFonts w:ascii="Nimbus Sans" w:hAnsi="Nimbus Sans"/>
+                <w:sz w:val="22"/>
+                <w:szCs w:val="22"/>
+              </w:rPr>
+            </w:r>
+          </w:p>
+        </w:tc>
+        <w:tc>
+          <w:tcPr>
+            <w:tcW w:w="3507" w:type="dxa"/>
             <w:tcBorders>
               <w:bottom w:val="single" w:sz="12" w:space="0" w:color="000000"/>
             </w:tcBorders>
@@ -4627,7 +5013,11 @@
               </w:rPr>
             </w:pPr>
             <w:r>
-              <w:rPr/>
+              <w:rPr>
+                <w:rFonts w:ascii="Nimbus Sans" w:hAnsi="Nimbus Sans"/>
+                <w:sz w:val="22"/>
+                <w:szCs w:val="22"/>
+              </w:rPr>
             </w:r>
           </w:p>
         </w:tc>
@@ -4651,7 +5041,11 @@
               </w:rPr>
             </w:pPr>
             <w:r>
-              <w:rPr/>
+              <w:rPr>
+                <w:rFonts w:ascii="Nimbus Sans" w:hAnsi="Nimbus Sans"/>
+                <w:sz w:val="22"/>
+                <w:szCs w:val="22"/>
+              </w:rPr>
             </w:r>
           </w:p>
         </w:tc>
@@ -4669,7 +5063,11 @@
         </w:rPr>
       </w:pPr>
       <w:r>
-        <w:rPr/>
+        <w:rPr>
+          <w:rFonts w:ascii="Nimbus Sans" w:hAnsi="Nimbus Sans"/>
+          <w:sz w:val="24"/>
+          <w:szCs w:val="24"/>
+        </w:rPr>
       </w:r>
     </w:p>
     <w:p>
@@ -4686,7 +5084,13 @@
         </w:rPr>
       </w:pPr>
       <w:r>
-        <w:rPr/>
+        <w:rPr>
+          <w:rFonts w:ascii="Nimbus Sans" w:hAnsi="Nimbus Sans"/>
+          <w:b/>
+          <w:bCs/>
+          <w:sz w:val="32"/>
+          <w:szCs w:val="32"/>
+        </w:rPr>
       </w:r>
     </w:p>
     <w:p>
@@ -4703,7 +5107,13 @@
         </w:rPr>
       </w:pPr>
       <w:r>
-        <w:rPr/>
+        <w:rPr>
+          <w:rFonts w:ascii="Nimbus Sans" w:hAnsi="Nimbus Sans"/>
+          <w:b/>
+          <w:bCs/>
+          <w:sz w:val="32"/>
+          <w:szCs w:val="32"/>
+        </w:rPr>
       </w:r>
     </w:p>
     <w:p>
@@ -4741,7 +5151,7 @@
         <w:gridCol w:w="1259"/>
         <w:gridCol w:w="3253"/>
         <w:gridCol w:w="2257"/>
-        <w:gridCol w:w="2257"/>
+        <w:gridCol w:w="2256"/>
       </w:tblGrid>
       <w:tr>
         <w:trPr/>
@@ -4831,7 +5241,7 @@
         </w:tc>
         <w:tc>
           <w:tcPr>
-            <w:tcW w:w="2257" w:type="dxa"/>
+            <w:tcW w:w="2256" w:type="dxa"/>
             <w:tcBorders>
               <w:top w:val="single" w:sz="12" w:space="0" w:color="000000"/>
               <w:bottom w:val="single" w:sz="6" w:space="0" w:color="000000"/>
@@ -4937,7 +5347,7 @@
         </w:tc>
         <w:tc>
           <w:tcPr>
-            <w:tcW w:w="2257" w:type="dxa"/>
+            <w:tcW w:w="2256" w:type="dxa"/>
             <w:tcBorders>
               <w:bottom w:val="single" w:sz="4" w:space="0" w:color="999999"/>
             </w:tcBorders>
@@ -5040,7 +5450,7 @@
         </w:tc>
         <w:tc>
           <w:tcPr>
-            <w:tcW w:w="2257" w:type="dxa"/>
+            <w:tcW w:w="2256" w:type="dxa"/>
             <w:tcBorders>
               <w:bottom w:val="single" w:sz="4" w:space="0" w:color="999999"/>
             </w:tcBorders>
@@ -5143,7 +5553,7 @@
         </w:tc>
         <w:tc>
           <w:tcPr>
-            <w:tcW w:w="2257" w:type="dxa"/>
+            <w:tcW w:w="2256" w:type="dxa"/>
             <w:tcBorders>
               <w:bottom w:val="single" w:sz="4" w:space="0" w:color="999999"/>
             </w:tcBorders>
@@ -5189,7 +5599,11 @@
               </w:rPr>
             </w:pPr>
             <w:r>
-              <w:rPr/>
+              <w:rPr>
+                <w:rFonts w:ascii="Nimbus Sans" w:hAnsi="Nimbus Sans"/>
+                <w:sz w:val="22"/>
+                <w:szCs w:val="22"/>
+              </w:rPr>
             </w:r>
           </w:p>
         </w:tc>
@@ -5213,7 +5627,11 @@
               </w:rPr>
             </w:pPr>
             <w:r>
-              <w:rPr/>
+              <w:rPr>
+                <w:rFonts w:ascii="Nimbus Sans" w:hAnsi="Nimbus Sans"/>
+                <w:sz w:val="22"/>
+                <w:szCs w:val="22"/>
+              </w:rPr>
             </w:r>
           </w:p>
         </w:tc>
@@ -5237,13 +5655,17 @@
               </w:rPr>
             </w:pPr>
             <w:r>
-              <w:rPr/>
-            </w:r>
-          </w:p>
-        </w:tc>
-        <w:tc>
-          <w:tcPr>
-            <w:tcW w:w="2257" w:type="dxa"/>
+              <w:rPr>
+                <w:rFonts w:ascii="Nimbus Sans" w:hAnsi="Nimbus Sans"/>
+                <w:sz w:val="22"/>
+                <w:szCs w:val="22"/>
+              </w:rPr>
+            </w:r>
+          </w:p>
+        </w:tc>
+        <w:tc>
+          <w:tcPr>
+            <w:tcW w:w="2256" w:type="dxa"/>
             <w:tcBorders>
               <w:bottom w:val="single" w:sz="12" w:space="0" w:color="000000"/>
             </w:tcBorders>
@@ -5261,7 +5683,11 @@
               </w:rPr>
             </w:pPr>
             <w:r>
-              <w:rPr/>
+              <w:rPr>
+                <w:rFonts w:ascii="Nimbus Sans" w:hAnsi="Nimbus Sans"/>
+                <w:sz w:val="22"/>
+                <w:szCs w:val="22"/>
+              </w:rPr>
             </w:r>
           </w:p>
         </w:tc>
@@ -5279,7 +5705,11 @@
         </w:rPr>
       </w:pPr>
       <w:r>
-        <w:rPr/>
+        <w:rPr>
+          <w:rFonts w:ascii="Nimbus Sans" w:hAnsi="Nimbus Sans"/>
+          <w:sz w:val="24"/>
+          <w:szCs w:val="24"/>
+        </w:rPr>
       </w:r>
     </w:p>
     <w:p>
@@ -5328,9 +5758,13 @@
         </w:rPr>
       </w:pPr>
       <w:r>
-        <w:rPr/>
+        <w:rPr>
+          <w:rFonts w:ascii="Nimbus Sans" w:hAnsi="Nimbus Sans"/>
+          <w:sz w:val="24"/>
+          <w:szCs w:val="24"/>
+        </w:rPr>
         <w:drawing>
-          <wp:anchor distT="0" distB="0" distL="0" distR="0" simplePos="0" relativeHeight="2" behindDoc="0" locked="0" layoutInCell="0" allowOverlap="1">
+          <wp:anchor behindDoc="0" distT="0" distB="0" distL="0" distR="0" simplePos="0" locked="0" layoutInCell="0" allowOverlap="1" relativeHeight="2">
             <wp:simplePos x="0" y="0"/>
             <wp:positionH relativeFrom="column">
               <wp:align>center</wp:align>
@@ -5341,7 +5775,7 @@
             <wp:extent cx="5731510" cy="3328035"/>
             <wp:effectExtent l="0" t="0" r="0" b="0"/>
             <wp:wrapSquare wrapText="largest"/>
-            <wp:docPr id="1" name="Image1"/>
+            <wp:docPr id="1" name="Image1" descr=""/>
             <wp:cNvGraphicFramePr>
               <a:graphicFrameLocks xmlns:a="http://schemas.openxmlformats.org/drawingml/2006/main" noChangeAspect="1"/>
             </wp:cNvGraphicFramePr>
@@ -5349,7 +5783,7 @@
               <a:graphicData uri="http://schemas.openxmlformats.org/drawingml/2006/picture">
                 <pic:pic xmlns:pic="http://schemas.openxmlformats.org/drawingml/2006/picture">
                   <pic:nvPicPr>
-                    <pic:cNvPr id="1" name="Image1"/>
+                    <pic:cNvPr id="1" name="Image1" descr=""/>
                     <pic:cNvPicPr>
                       <a:picLocks noChangeAspect="1" noChangeArrowheads="1"/>
                     </pic:cNvPicPr>
@@ -5368,7 +5802,6 @@
                     <a:prstGeom prst="rect">
                       <a:avLst/>
                     </a:prstGeom>
-                    <a:noFill/>
                   </pic:spPr>
                 </pic:pic>
               </a:graphicData>
@@ -5391,15 +5824,15 @@
         </w:tblCellMar>
       </w:tblPr>
       <w:tblGrid>
-        <w:gridCol w:w="900"/>
+        <w:gridCol w:w="899"/>
         <w:gridCol w:w="2160"/>
-        <w:gridCol w:w="5966"/>
+        <w:gridCol w:w="5967"/>
       </w:tblGrid>
       <w:tr>
         <w:trPr/>
         <w:tc>
           <w:tcPr>
-            <w:tcW w:w="900" w:type="dxa"/>
+            <w:tcW w:w="899" w:type="dxa"/>
             <w:tcBorders>
               <w:top w:val="single" w:sz="12" w:space="0" w:color="000000"/>
               <w:bottom w:val="single" w:sz="6" w:space="0" w:color="000000"/>
@@ -5455,7 +5888,7 @@
         </w:tc>
         <w:tc>
           <w:tcPr>
-            <w:tcW w:w="5966" w:type="dxa"/>
+            <w:tcW w:w="5967" w:type="dxa"/>
             <w:tcBorders>
               <w:top w:val="single" w:sz="12" w:space="0" w:color="000000"/>
               <w:bottom w:val="single" w:sz="6" w:space="0" w:color="000000"/>
@@ -5486,7 +5919,7 @@
         <w:trPr/>
         <w:tc>
           <w:tcPr>
-            <w:tcW w:w="900" w:type="dxa"/>
+            <w:tcW w:w="899" w:type="dxa"/>
             <w:tcBorders>
               <w:bottom w:val="single" w:sz="4" w:space="0" w:color="999999"/>
             </w:tcBorders>
@@ -5536,7 +5969,7 @@
         </w:tc>
         <w:tc>
           <w:tcPr>
-            <w:tcW w:w="5966" w:type="dxa"/>
+            <w:tcW w:w="5967" w:type="dxa"/>
             <w:tcBorders>
               <w:bottom w:val="single" w:sz="4" w:space="0" w:color="999999"/>
             </w:tcBorders>
@@ -5564,7 +5997,7 @@
         <w:trPr/>
         <w:tc>
           <w:tcPr>
-            <w:tcW w:w="900" w:type="dxa"/>
+            <w:tcW w:w="899" w:type="dxa"/>
             <w:tcBorders>
               <w:bottom w:val="single" w:sz="4" w:space="0" w:color="999999"/>
             </w:tcBorders>
@@ -5614,7 +6047,7 @@
         </w:tc>
         <w:tc>
           <w:tcPr>
-            <w:tcW w:w="5966" w:type="dxa"/>
+            <w:tcW w:w="5967" w:type="dxa"/>
             <w:tcBorders>
               <w:bottom w:val="single" w:sz="4" w:space="0" w:color="999999"/>
             </w:tcBorders>
@@ -5642,7 +6075,7 @@
         <w:trPr/>
         <w:tc>
           <w:tcPr>
-            <w:tcW w:w="900" w:type="dxa"/>
+            <w:tcW w:w="899" w:type="dxa"/>
             <w:tcBorders>
               <w:bottom w:val="single" w:sz="4" w:space="0" w:color="999999"/>
             </w:tcBorders>
@@ -5692,26 +6125,26 @@
         </w:tc>
         <w:tc>
           <w:tcPr>
-            <w:tcW w:w="5966" w:type="dxa"/>
-            <w:tcBorders>
-              <w:bottom w:val="single" w:sz="4" w:space="0" w:color="999999"/>
-            </w:tcBorders>
-            <w:shd w:fill="EEEEEE" w:val="clear"/>
-          </w:tcPr>
-          <w:p>
-            <w:pPr>
-              <w:pStyle w:val="Normal"/>
-              <w:spacing w:before="0" w:after="160"/>
-              <w:rPr/>
-            </w:pPr>
-            <w:r>
-              <w:rPr>
-                <w:rStyle w:val="SourceText"/>
-                <w:rFonts w:ascii="Nimbus Sans" w:hAnsi="Nimbus Sans"/>
-                <w:sz w:val="22"/>
-                <w:szCs w:val="22"/>
-              </w:rPr>
-              <w:t xml:space="preserve">Opgavebeskrivelsen kræver fejlhåndtering og drift over længere tid </w:t>
+            <w:tcW w:w="5967" w:type="dxa"/>
+            <w:tcBorders>
+              <w:bottom w:val="single" w:sz="4" w:space="0" w:color="999999"/>
+            </w:tcBorders>
+            <w:shd w:fill="EEEEEE" w:val="clear"/>
+          </w:tcPr>
+          <w:p>
+            <w:pPr>
+              <w:pStyle w:val="Normal"/>
+              <w:spacing w:before="0" w:after="160"/>
+              <w:rPr/>
+            </w:pPr>
+            <w:r>
+              <w:rPr>
+                <w:rStyle w:val="SourceText"/>
+                <w:rFonts w:ascii="Nimbus Sans" w:hAnsi="Nimbus Sans"/>
+                <w:sz w:val="22"/>
+                <w:szCs w:val="22"/>
+              </w:rPr>
+              <w:t>Opgavebeskrivelsen kræver fejlhåndtering og drift over længere tid</w:t>
             </w:r>
           </w:p>
         </w:tc>
@@ -5720,7 +6153,7 @@
         <w:trPr/>
         <w:tc>
           <w:tcPr>
-            <w:tcW w:w="900" w:type="dxa"/>
+            <w:tcW w:w="899" w:type="dxa"/>
             <w:tcBorders>
               <w:bottom w:val="single" w:sz="4" w:space="0" w:color="999999"/>
             </w:tcBorders>
@@ -5770,26 +6203,26 @@
         </w:tc>
         <w:tc>
           <w:tcPr>
-            <w:tcW w:w="5966" w:type="dxa"/>
-            <w:tcBorders>
-              <w:bottom w:val="single" w:sz="4" w:space="0" w:color="999999"/>
-            </w:tcBorders>
-            <w:shd w:fill="EEEEEE" w:val="clear"/>
-          </w:tcPr>
-          <w:p>
-            <w:pPr>
-              <w:pStyle w:val="Normal"/>
-              <w:spacing w:before="0" w:after="160"/>
-              <w:rPr/>
-            </w:pPr>
-            <w:r>
-              <w:rPr>
-                <w:rStyle w:val="SourceText"/>
-                <w:rFonts w:ascii="Nimbus Sans" w:hAnsi="Nimbus Sans"/>
-                <w:sz w:val="22"/>
-                <w:szCs w:val="22"/>
-              </w:rPr>
-              <w:t xml:space="preserve">Opgavebeskrivelsen kræver, at systemets tilstand kan følges </w:t>
+            <w:tcW w:w="5967" w:type="dxa"/>
+            <w:tcBorders>
+              <w:bottom w:val="single" w:sz="4" w:space="0" w:color="999999"/>
+            </w:tcBorders>
+            <w:shd w:fill="EEEEEE" w:val="clear"/>
+          </w:tcPr>
+          <w:p>
+            <w:pPr>
+              <w:pStyle w:val="Normal"/>
+              <w:spacing w:before="0" w:after="160"/>
+              <w:rPr/>
+            </w:pPr>
+            <w:r>
+              <w:rPr>
+                <w:rStyle w:val="SourceText"/>
+                <w:rFonts w:ascii="Nimbus Sans" w:hAnsi="Nimbus Sans"/>
+                <w:sz w:val="22"/>
+                <w:szCs w:val="22"/>
+              </w:rPr>
+              <w:t>Opgavebeskrivelsen kræver, at systemets tilstand kan følges</w:t>
             </w:r>
           </w:p>
         </w:tc>
@@ -5798,7 +6231,7 @@
         <w:trPr/>
         <w:tc>
           <w:tcPr>
-            <w:tcW w:w="900" w:type="dxa"/>
+            <w:tcW w:w="899" w:type="dxa"/>
             <w:tcBorders>
               <w:bottom w:val="single" w:sz="4" w:space="0" w:color="999999"/>
             </w:tcBorders>
@@ -5848,7 +6281,7 @@
         </w:tc>
         <w:tc>
           <w:tcPr>
-            <w:tcW w:w="5966" w:type="dxa"/>
+            <w:tcW w:w="5967" w:type="dxa"/>
             <w:tcBorders>
               <w:bottom w:val="single" w:sz="4" w:space="0" w:color="999999"/>
             </w:tcBorders>
@@ -5876,7 +6309,7 @@
         <w:trPr/>
         <w:tc>
           <w:tcPr>
-            <w:tcW w:w="900" w:type="dxa"/>
+            <w:tcW w:w="899" w:type="dxa"/>
             <w:tcBorders>
               <w:bottom w:val="single" w:sz="4" w:space="0" w:color="999999"/>
             </w:tcBorders>
@@ -5926,7 +6359,7 @@
         </w:tc>
         <w:tc>
           <w:tcPr>
-            <w:tcW w:w="5966" w:type="dxa"/>
+            <w:tcW w:w="5967" w:type="dxa"/>
             <w:tcBorders>
               <w:bottom w:val="single" w:sz="4" w:space="0" w:color="999999"/>
             </w:tcBorders>
@@ -5954,7 +6387,7 @@
         <w:trPr/>
         <w:tc>
           <w:tcPr>
-            <w:tcW w:w="900" w:type="dxa"/>
+            <w:tcW w:w="899" w:type="dxa"/>
             <w:tcBorders>
               <w:bottom w:val="single" w:sz="12" w:space="0" w:color="000000"/>
             </w:tcBorders>
@@ -5972,7 +6405,11 @@
               </w:rPr>
             </w:pPr>
             <w:r>
-              <w:rPr/>
+              <w:rPr>
+                <w:rFonts w:ascii="Nimbus Sans" w:hAnsi="Nimbus Sans"/>
+                <w:sz w:val="22"/>
+                <w:szCs w:val="22"/>
+              </w:rPr>
             </w:r>
           </w:p>
         </w:tc>
@@ -5996,13 +6433,17 @@
               </w:rPr>
             </w:pPr>
             <w:r>
-              <w:rPr/>
-            </w:r>
-          </w:p>
-        </w:tc>
-        <w:tc>
-          <w:tcPr>
-            <w:tcW w:w="5966" w:type="dxa"/>
+              <w:rPr>
+                <w:rFonts w:ascii="Nimbus Sans" w:hAnsi="Nimbus Sans"/>
+                <w:sz w:val="22"/>
+                <w:szCs w:val="22"/>
+              </w:rPr>
+            </w:r>
+          </w:p>
+        </w:tc>
+        <w:tc>
+          <w:tcPr>
+            <w:tcW w:w="5967" w:type="dxa"/>
             <w:tcBorders>
               <w:bottom w:val="single" w:sz="12" w:space="0" w:color="000000"/>
             </w:tcBorders>
@@ -6020,7 +6461,11 @@
               </w:rPr>
             </w:pPr>
             <w:r>
-              <w:rPr/>
+              <w:rPr>
+                <w:rFonts w:ascii="Nimbus Sans" w:hAnsi="Nimbus Sans"/>
+                <w:sz w:val="22"/>
+                <w:szCs w:val="22"/>
+              </w:rPr>
             </w:r>
           </w:p>
         </w:tc>
@@ -6038,7 +6483,11 @@
         </w:rPr>
       </w:pPr>
       <w:r>
-        <w:rPr/>
+        <w:rPr>
+          <w:rFonts w:ascii="Nimbus Sans" w:hAnsi="Nimbus Sans"/>
+          <w:sz w:val="24"/>
+          <w:szCs w:val="24"/>
+        </w:rPr>
       </w:r>
     </w:p>
     <w:p>
@@ -6073,9 +6522,9 @@
         </w:tblCellMar>
       </w:tblPr>
       <w:tblGrid>
-        <w:gridCol w:w="900"/>
+        <w:gridCol w:w="899"/>
         <w:gridCol w:w="3960"/>
-        <w:gridCol w:w="4166"/>
+        <w:gridCol w:w="4167"/>
       </w:tblGrid>
       <w:tr>
         <w:trPr>
@@ -6083,7 +6532,7 @@
         </w:trPr>
         <w:tc>
           <w:tcPr>
-            <w:tcW w:w="900" w:type="dxa"/>
+            <w:tcW w:w="899" w:type="dxa"/>
             <w:tcBorders>
               <w:top w:val="single" w:sz="12" w:space="0" w:color="000000"/>
               <w:bottom w:val="single" w:sz="6" w:space="0" w:color="000000"/>
@@ -6139,7 +6588,7 @@
         </w:tc>
         <w:tc>
           <w:tcPr>
-            <w:tcW w:w="4166" w:type="dxa"/>
+            <w:tcW w:w="4167" w:type="dxa"/>
             <w:tcBorders>
               <w:top w:val="single" w:sz="12" w:space="0" w:color="000000"/>
               <w:bottom w:val="single" w:sz="6" w:space="0" w:color="000000"/>
@@ -6170,7 +6619,7 @@
         <w:trPr/>
         <w:tc>
           <w:tcPr>
-            <w:tcW w:w="900" w:type="dxa"/>
+            <w:tcW w:w="899" w:type="dxa"/>
             <w:tcBorders>
               <w:bottom w:val="single" w:sz="4" w:space="0" w:color="999999"/>
             </w:tcBorders>
@@ -6220,7 +6669,7 @@
         </w:tc>
         <w:tc>
           <w:tcPr>
-            <w:tcW w:w="4166" w:type="dxa"/>
+            <w:tcW w:w="4167" w:type="dxa"/>
             <w:tcBorders>
               <w:bottom w:val="single" w:sz="4" w:space="0" w:color="999999"/>
             </w:tcBorders>
@@ -6248,7 +6697,7 @@
         <w:trPr/>
         <w:tc>
           <w:tcPr>
-            <w:tcW w:w="900" w:type="dxa"/>
+            <w:tcW w:w="899" w:type="dxa"/>
             <w:tcBorders>
               <w:bottom w:val="single" w:sz="4" w:space="0" w:color="999999"/>
             </w:tcBorders>
@@ -6298,7 +6747,7 @@
         </w:tc>
         <w:tc>
           <w:tcPr>
-            <w:tcW w:w="4166" w:type="dxa"/>
+            <w:tcW w:w="4167" w:type="dxa"/>
             <w:tcBorders>
               <w:bottom w:val="single" w:sz="4" w:space="0" w:color="999999"/>
             </w:tcBorders>
@@ -6326,7 +6775,7 @@
         <w:trPr/>
         <w:tc>
           <w:tcPr>
-            <w:tcW w:w="900" w:type="dxa"/>
+            <w:tcW w:w="899" w:type="dxa"/>
             <w:tcBorders>
               <w:bottom w:val="single" w:sz="4" w:space="0" w:color="999999"/>
             </w:tcBorders>
@@ -6376,26 +6825,26 @@
         </w:tc>
         <w:tc>
           <w:tcPr>
-            <w:tcW w:w="4166" w:type="dxa"/>
-            <w:tcBorders>
-              <w:bottom w:val="single" w:sz="4" w:space="0" w:color="999999"/>
-            </w:tcBorders>
-            <w:shd w:fill="EEEEEE" w:val="clear"/>
-          </w:tcPr>
-          <w:p>
-            <w:pPr>
-              <w:pStyle w:val="Normal"/>
-              <w:spacing w:before="0" w:after="160"/>
-              <w:rPr/>
-            </w:pPr>
-            <w:r>
-              <w:rPr>
-                <w:rStyle w:val="SourceText"/>
-                <w:rFonts w:ascii="Nimbus Sans" w:hAnsi="Nimbus Sans"/>
-                <w:sz w:val="22"/>
-                <w:szCs w:val="22"/>
-              </w:rPr>
-              <w:t xml:space="preserve">Dagens timepriser for DK1 hentes og vises. </w:t>
+            <w:tcW w:w="4167" w:type="dxa"/>
+            <w:tcBorders>
+              <w:bottom w:val="single" w:sz="4" w:space="0" w:color="999999"/>
+            </w:tcBorders>
+            <w:shd w:fill="EEEEEE" w:val="clear"/>
+          </w:tcPr>
+          <w:p>
+            <w:pPr>
+              <w:pStyle w:val="Normal"/>
+              <w:spacing w:before="0" w:after="160"/>
+              <w:rPr/>
+            </w:pPr>
+            <w:r>
+              <w:rPr>
+                <w:rStyle w:val="SourceText"/>
+                <w:rFonts w:ascii="Nimbus Sans" w:hAnsi="Nimbus Sans"/>
+                <w:sz w:val="22"/>
+                <w:szCs w:val="22"/>
+              </w:rPr>
+              <w:t>Dagens timepriser for DK1 hentes og vises.</w:t>
             </w:r>
           </w:p>
         </w:tc>
@@ -6404,7 +6853,7 @@
         <w:trPr/>
         <w:tc>
           <w:tcPr>
-            <w:tcW w:w="900" w:type="dxa"/>
+            <w:tcW w:w="899" w:type="dxa"/>
             <w:tcBorders>
               <w:bottom w:val="single" w:sz="4" w:space="0" w:color="999999"/>
             </w:tcBorders>
@@ -6454,7 +6903,7 @@
         </w:tc>
         <w:tc>
           <w:tcPr>
-            <w:tcW w:w="4166" w:type="dxa"/>
+            <w:tcW w:w="4167" w:type="dxa"/>
             <w:tcBorders>
               <w:bottom w:val="single" w:sz="4" w:space="0" w:color="999999"/>
             </w:tcBorders>
@@ -6482,7 +6931,7 @@
         <w:trPr/>
         <w:tc>
           <w:tcPr>
-            <w:tcW w:w="900" w:type="dxa"/>
+            <w:tcW w:w="899" w:type="dxa"/>
             <w:tcBorders>
               <w:bottom w:val="single" w:sz="4" w:space="0" w:color="999999"/>
             </w:tcBorders>
@@ -6532,7 +6981,7 @@
         </w:tc>
         <w:tc>
           <w:tcPr>
-            <w:tcW w:w="4166" w:type="dxa"/>
+            <w:tcW w:w="4167" w:type="dxa"/>
             <w:tcBorders>
               <w:bottom w:val="single" w:sz="4" w:space="0" w:color="999999"/>
             </w:tcBorders>
@@ -6560,7 +7009,7 @@
         <w:trPr/>
         <w:tc>
           <w:tcPr>
-            <w:tcW w:w="900" w:type="dxa"/>
+            <w:tcW w:w="899" w:type="dxa"/>
             <w:tcBorders>
               <w:bottom w:val="single" w:sz="4" w:space="0" w:color="999999"/>
             </w:tcBorders>
@@ -6610,7 +7059,7 @@
         </w:tc>
         <w:tc>
           <w:tcPr>
-            <w:tcW w:w="4166" w:type="dxa"/>
+            <w:tcW w:w="4167" w:type="dxa"/>
             <w:tcBorders>
               <w:bottom w:val="single" w:sz="4" w:space="0" w:color="999999"/>
             </w:tcBorders>
@@ -6638,7 +7087,7 @@
         <w:trPr/>
         <w:tc>
           <w:tcPr>
-            <w:tcW w:w="900" w:type="dxa"/>
+            <w:tcW w:w="899" w:type="dxa"/>
             <w:tcBorders>
               <w:bottom w:val="single" w:sz="4" w:space="0" w:color="999999"/>
             </w:tcBorders>
@@ -6688,7 +7137,7 @@
         </w:tc>
         <w:tc>
           <w:tcPr>
-            <w:tcW w:w="4166" w:type="dxa"/>
+            <w:tcW w:w="4167" w:type="dxa"/>
             <w:tcBorders>
               <w:bottom w:val="single" w:sz="4" w:space="0" w:color="999999"/>
             </w:tcBorders>
@@ -6716,7 +7165,7 @@
         <w:trPr/>
         <w:tc>
           <w:tcPr>
-            <w:tcW w:w="900" w:type="dxa"/>
+            <w:tcW w:w="899" w:type="dxa"/>
             <w:tcBorders>
               <w:bottom w:val="single" w:sz="4" w:space="0" w:color="999999"/>
             </w:tcBorders>
@@ -6766,7 +7215,7 @@
         </w:tc>
         <w:tc>
           <w:tcPr>
-            <w:tcW w:w="4166" w:type="dxa"/>
+            <w:tcW w:w="4167" w:type="dxa"/>
             <w:tcBorders>
               <w:bottom w:val="single" w:sz="4" w:space="0" w:color="999999"/>
             </w:tcBorders>
@@ -6794,7 +7243,7 @@
         <w:trPr/>
         <w:tc>
           <w:tcPr>
-            <w:tcW w:w="900" w:type="dxa"/>
+            <w:tcW w:w="899" w:type="dxa"/>
             <w:tcBorders>
               <w:bottom w:val="single" w:sz="4" w:space="0" w:color="999999"/>
             </w:tcBorders>
@@ -6844,7 +7293,7 @@
         </w:tc>
         <w:tc>
           <w:tcPr>
-            <w:tcW w:w="4166" w:type="dxa"/>
+            <w:tcW w:w="4167" w:type="dxa"/>
             <w:tcBorders>
               <w:bottom w:val="single" w:sz="4" w:space="0" w:color="999999"/>
             </w:tcBorders>
@@ -6872,7 +7321,7 @@
         <w:trPr/>
         <w:tc>
           <w:tcPr>
-            <w:tcW w:w="900" w:type="dxa"/>
+            <w:tcW w:w="899" w:type="dxa"/>
             <w:tcBorders>
               <w:bottom w:val="single" w:sz="4" w:space="0" w:color="999999"/>
             </w:tcBorders>
@@ -6922,7 +7371,7 @@
         </w:tc>
         <w:tc>
           <w:tcPr>
-            <w:tcW w:w="4166" w:type="dxa"/>
+            <w:tcW w:w="4167" w:type="dxa"/>
             <w:tcBorders>
               <w:bottom w:val="single" w:sz="4" w:space="0" w:color="999999"/>
             </w:tcBorders>
@@ -6950,7 +7399,7 @@
         <w:trPr/>
         <w:tc>
           <w:tcPr>
-            <w:tcW w:w="900" w:type="dxa"/>
+            <w:tcW w:w="899" w:type="dxa"/>
             <w:tcBorders>
               <w:bottom w:val="single" w:sz="4" w:space="0" w:color="999999"/>
             </w:tcBorders>
@@ -7000,7 +7449,7 @@
         </w:tc>
         <w:tc>
           <w:tcPr>
-            <w:tcW w:w="4166" w:type="dxa"/>
+            <w:tcW w:w="4167" w:type="dxa"/>
             <w:tcBorders>
               <w:bottom w:val="single" w:sz="4" w:space="0" w:color="999999"/>
             </w:tcBorders>
@@ -7028,7 +7477,7 @@
         <w:trPr/>
         <w:tc>
           <w:tcPr>
-            <w:tcW w:w="900" w:type="dxa"/>
+            <w:tcW w:w="899" w:type="dxa"/>
             <w:tcBorders>
               <w:bottom w:val="single" w:sz="4" w:space="0" w:color="999999"/>
             </w:tcBorders>
@@ -7078,7 +7527,7 @@
         </w:tc>
         <w:tc>
           <w:tcPr>
-            <w:tcW w:w="4166" w:type="dxa"/>
+            <w:tcW w:w="4167" w:type="dxa"/>
             <w:tcBorders>
               <w:bottom w:val="single" w:sz="4" w:space="0" w:color="999999"/>
             </w:tcBorders>
@@ -7106,7 +7555,7 @@
         <w:trPr/>
         <w:tc>
           <w:tcPr>
-            <w:tcW w:w="900" w:type="dxa"/>
+            <w:tcW w:w="899" w:type="dxa"/>
             <w:tcBorders>
               <w:bottom w:val="single" w:sz="4" w:space="0" w:color="999999"/>
             </w:tcBorders>
@@ -7156,7 +7605,7 @@
         </w:tc>
         <w:tc>
           <w:tcPr>
-            <w:tcW w:w="4166" w:type="dxa"/>
+            <w:tcW w:w="4167" w:type="dxa"/>
             <w:tcBorders>
               <w:bottom w:val="single" w:sz="4" w:space="0" w:color="999999"/>
             </w:tcBorders>
@@ -7184,7 +7633,7 @@
         <w:trPr/>
         <w:tc>
           <w:tcPr>
-            <w:tcW w:w="900" w:type="dxa"/>
+            <w:tcW w:w="899" w:type="dxa"/>
             <w:tcBorders>
               <w:bottom w:val="single" w:sz="4" w:space="0" w:color="999999"/>
             </w:tcBorders>
@@ -7234,7 +7683,7 @@
         </w:tc>
         <w:tc>
           <w:tcPr>
-            <w:tcW w:w="4166" w:type="dxa"/>
+            <w:tcW w:w="4167" w:type="dxa"/>
             <w:tcBorders>
               <w:bottom w:val="single" w:sz="4" w:space="0" w:color="999999"/>
             </w:tcBorders>
@@ -7262,7 +7711,7 @@
         <w:trPr/>
         <w:tc>
           <w:tcPr>
-            <w:tcW w:w="900" w:type="dxa"/>
+            <w:tcW w:w="899" w:type="dxa"/>
             <w:tcBorders>
               <w:bottom w:val="single" w:sz="4" w:space="0" w:color="999999"/>
             </w:tcBorders>
@@ -7312,7 +7761,7 @@
         </w:tc>
         <w:tc>
           <w:tcPr>
-            <w:tcW w:w="4166" w:type="dxa"/>
+            <w:tcW w:w="4167" w:type="dxa"/>
             <w:tcBorders>
               <w:bottom w:val="single" w:sz="4" w:space="0" w:color="999999"/>
             </w:tcBorders>
@@ -7340,7 +7789,7 @@
         <w:trPr/>
         <w:tc>
           <w:tcPr>
-            <w:tcW w:w="900" w:type="dxa"/>
+            <w:tcW w:w="899" w:type="dxa"/>
             <w:tcBorders>
               <w:bottom w:val="single" w:sz="4" w:space="0" w:color="999999"/>
             </w:tcBorders>
@@ -7390,7 +7839,7 @@
         </w:tc>
         <w:tc>
           <w:tcPr>
-            <w:tcW w:w="4166" w:type="dxa"/>
+            <w:tcW w:w="4167" w:type="dxa"/>
             <w:tcBorders>
               <w:bottom w:val="single" w:sz="4" w:space="0" w:color="999999"/>
             </w:tcBorders>
@@ -7418,7 +7867,7 @@
         <w:trPr/>
         <w:tc>
           <w:tcPr>
-            <w:tcW w:w="900" w:type="dxa"/>
+            <w:tcW w:w="899" w:type="dxa"/>
             <w:tcBorders>
               <w:bottom w:val="single" w:sz="4" w:space="0" w:color="999999"/>
             </w:tcBorders>
@@ -7468,7 +7917,7 @@
         </w:tc>
         <w:tc>
           <w:tcPr>
-            <w:tcW w:w="4166" w:type="dxa"/>
+            <w:tcW w:w="4167" w:type="dxa"/>
             <w:tcBorders>
               <w:bottom w:val="single" w:sz="4" w:space="0" w:color="999999"/>
             </w:tcBorders>
@@ -7496,7 +7945,7 @@
         <w:trPr/>
         <w:tc>
           <w:tcPr>
-            <w:tcW w:w="900" w:type="dxa"/>
+            <w:tcW w:w="899" w:type="dxa"/>
             <w:tcBorders>
               <w:bottom w:val="single" w:sz="12" w:space="0" w:color="000000"/>
             </w:tcBorders>
@@ -7514,7 +7963,11 @@
               </w:rPr>
             </w:pPr>
             <w:r>
-              <w:rPr/>
+              <w:rPr>
+                <w:rFonts w:ascii="Nimbus Sans" w:hAnsi="Nimbus Sans"/>
+                <w:sz w:val="22"/>
+                <w:szCs w:val="22"/>
+              </w:rPr>
             </w:r>
           </w:p>
         </w:tc>
@@ -7538,13 +7991,17 @@
               </w:rPr>
             </w:pPr>
             <w:r>
-              <w:rPr/>
-            </w:r>
-          </w:p>
-        </w:tc>
-        <w:tc>
-          <w:tcPr>
-            <w:tcW w:w="4166" w:type="dxa"/>
+              <w:rPr>
+                <w:rFonts w:ascii="Nimbus Sans" w:hAnsi="Nimbus Sans"/>
+                <w:sz w:val="22"/>
+                <w:szCs w:val="22"/>
+              </w:rPr>
+            </w:r>
+          </w:p>
+        </w:tc>
+        <w:tc>
+          <w:tcPr>
+            <w:tcW w:w="4167" w:type="dxa"/>
             <w:tcBorders>
               <w:bottom w:val="single" w:sz="12" w:space="0" w:color="000000"/>
             </w:tcBorders>
@@ -7562,7 +8019,11 @@
               </w:rPr>
             </w:pPr>
             <w:r>
-              <w:rPr/>
+              <w:rPr>
+                <w:rFonts w:ascii="Nimbus Sans" w:hAnsi="Nimbus Sans"/>
+                <w:sz w:val="22"/>
+                <w:szCs w:val="22"/>
+              </w:rPr>
             </w:r>
           </w:p>
         </w:tc>
@@ -7580,7 +8041,11 @@
         </w:rPr>
       </w:pPr>
       <w:r>
-        <w:rPr/>
+        <w:rPr>
+          <w:rFonts w:ascii="Nimbus Sans" w:hAnsi="Nimbus Sans"/>
+          <w:sz w:val="24"/>
+          <w:szCs w:val="24"/>
+        </w:rPr>
       </w:r>
     </w:p>
     <w:p>
@@ -7662,7 +8127,7 @@
 </file>
 
 <file path=word/header1.xml><?xml version="1.0" encoding="utf-8"?>
-<w:hdr xmlns:o="urn:schemas-microsoft-com:office:office" xmlns:r="http://schemas.openxmlformats.org/officeDocument/2006/relationships" xmlns:v="urn:schemas-microsoft-com:vml" xmlns:w="http://schemas.openxmlformats.org/wordprocessingml/2006/main" xmlns:w10="urn:schemas-microsoft-com:office:word" xmlns:wp="http://schemas.openxmlformats.org/drawingml/2006/wordprocessingDrawing" xmlns:pic="http://schemas.openxmlformats.org/drawingml/2006/picture" xmlns:wps="http://schemas.microsoft.com/office/word/2010/wordprocessingShape" xmlns:wpg="http://schemas.microsoft.com/office/word/2010/wordprocessingGroup" xmlns:mc="http://schemas.openxmlformats.org/markup-compatibility/2006" xmlns:wp14="http://schemas.microsoft.com/office/word/2010/wordprocessingDrawing" xmlns:w14="http://schemas.microsoft.com/office/word/2010/wordml" xmlns:w15="http://schemas.microsoft.com/office/word/2012/wordml" mc:Ignorable="w14 wp14 w15">
+<w:hdr xmlns:o="urn:schemas-microsoft-com:office:office" xmlns:r="http://schemas.openxmlformats.org/officeDocument/2006/relationships" xmlns:v="urn:schemas-microsoft-com:vml" xmlns:w="http://schemas.openxmlformats.org/wordprocessingml/2006/main" xmlns:w10="urn:schemas-microsoft-com:office:word" xmlns:wp="http://schemas.openxmlformats.org/drawingml/2006/wordprocessingDrawing" xmlns:wps="http://schemas.microsoft.com/office/word/2010/wordprocessingShape" xmlns:wpg="http://schemas.microsoft.com/office/word/2010/wordprocessingGroup" xmlns:mc="http://schemas.openxmlformats.org/markup-compatibility/2006" xmlns:wp14="http://schemas.microsoft.com/office/word/2010/wordprocessingDrawing" xmlns:w14="http://schemas.microsoft.com/office/word/2010/wordml" xmlns:w15="http://schemas.microsoft.com/office/word/2012/wordml" mc:Ignorable="w14 wp14 w15">
   <w:p>
     <w:pPr>
       <w:pStyle w:val="Header"/>
@@ -7676,7 +8141,7 @@
 </file>
 
 <file path=word/header2.xml><?xml version="1.0" encoding="utf-8"?>
-<w:hdr xmlns:o="urn:schemas-microsoft-com:office:office" xmlns:r="http://schemas.openxmlformats.org/officeDocument/2006/relationships" xmlns:v="urn:schemas-microsoft-com:vml" xmlns:w="http://schemas.openxmlformats.org/wordprocessingml/2006/main" xmlns:w10="urn:schemas-microsoft-com:office:word" xmlns:wp="http://schemas.openxmlformats.org/drawingml/2006/wordprocessingDrawing" xmlns:pic="http://schemas.openxmlformats.org/drawingml/2006/picture" xmlns:wps="http://schemas.microsoft.com/office/word/2010/wordprocessingShape" xmlns:wpg="http://schemas.microsoft.com/office/word/2010/wordprocessingGroup" xmlns:mc="http://schemas.openxmlformats.org/markup-compatibility/2006" xmlns:wp14="http://schemas.microsoft.com/office/word/2010/wordprocessingDrawing" xmlns:w14="http://schemas.microsoft.com/office/word/2010/wordml" xmlns:w15="http://schemas.microsoft.com/office/word/2012/wordml" mc:Ignorable="w14 wp14 w15">
+<w:hdr xmlns:o="urn:schemas-microsoft-com:office:office" xmlns:r="http://schemas.openxmlformats.org/officeDocument/2006/relationships" xmlns:v="urn:schemas-microsoft-com:vml" xmlns:w="http://schemas.openxmlformats.org/wordprocessingml/2006/main" xmlns:w10="urn:schemas-microsoft-com:office:word" xmlns:wp="http://schemas.openxmlformats.org/drawingml/2006/wordprocessingDrawing" xmlns:wps="http://schemas.microsoft.com/office/word/2010/wordprocessingShape" xmlns:wpg="http://schemas.microsoft.com/office/word/2010/wordprocessingGroup" xmlns:mc="http://schemas.openxmlformats.org/markup-compatibility/2006" xmlns:wp14="http://schemas.microsoft.com/office/word/2010/wordprocessingDrawing" xmlns:w14="http://schemas.microsoft.com/office/word/2010/wordml" xmlns:w15="http://schemas.microsoft.com/office/word/2012/wordml" mc:Ignorable="w14 wp14 w15">
   <w:p>
     <w:pPr>
       <w:pStyle w:val="Normal"/>
@@ -7711,7 +8176,7 @@
 </file>
 
 <file path=word/header3.xml><?xml version="1.0" encoding="utf-8"?>
-<w:hdr xmlns:o="urn:schemas-microsoft-com:office:office" xmlns:r="http://schemas.openxmlformats.org/officeDocument/2006/relationships" xmlns:v="urn:schemas-microsoft-com:vml" xmlns:w="http://schemas.openxmlformats.org/wordprocessingml/2006/main" xmlns:w10="urn:schemas-microsoft-com:office:word" xmlns:wp="http://schemas.openxmlformats.org/drawingml/2006/wordprocessingDrawing" xmlns:pic="http://schemas.openxmlformats.org/drawingml/2006/picture" xmlns:wps="http://schemas.microsoft.com/office/word/2010/wordprocessingShape" xmlns:wpg="http://schemas.microsoft.com/office/word/2010/wordprocessingGroup" xmlns:mc="http://schemas.openxmlformats.org/markup-compatibility/2006" xmlns:wp14="http://schemas.microsoft.com/office/word/2010/wordprocessingDrawing" xmlns:w14="http://schemas.microsoft.com/office/word/2010/wordml" xmlns:w15="http://schemas.microsoft.com/office/word/2012/wordml" mc:Ignorable="w14 wp14 w15">
+<w:hdr xmlns:o="urn:schemas-microsoft-com:office:office" xmlns:r="http://schemas.openxmlformats.org/officeDocument/2006/relationships" xmlns:v="urn:schemas-microsoft-com:vml" xmlns:w="http://schemas.openxmlformats.org/wordprocessingml/2006/main" xmlns:w10="urn:schemas-microsoft-com:office:word" xmlns:wp="http://schemas.openxmlformats.org/drawingml/2006/wordprocessingDrawing" xmlns:wps="http://schemas.microsoft.com/office/word/2010/wordprocessingShape" xmlns:wpg="http://schemas.microsoft.com/office/word/2010/wordprocessingGroup" xmlns:mc="http://schemas.openxmlformats.org/markup-compatibility/2006" xmlns:wp14="http://schemas.microsoft.com/office/word/2010/wordprocessingDrawing" xmlns:w14="http://schemas.microsoft.com/office/word/2010/wordml" xmlns:w15="http://schemas.microsoft.com/office/word/2012/wordml" mc:Ignorable="w14 wp14 w15">
   <w:p>
     <w:pPr>
       <w:pStyle w:val="Normal"/>
@@ -8412,7 +8877,7 @@
     </w:rPr>
   </w:style>
   <w:style w:type="paragraph" w:styleId="Heading1">
-    <w:name w:val="heading 1"/>
+    <w:name w:val="Heading 1"/>
     <w:basedOn w:val="Normal"/>
     <w:next w:val="Normal"/>
     <w:link w:val="Heading1Char"/>
@@ -8433,7 +8898,7 @@
     </w:rPr>
   </w:style>
   <w:style w:type="paragraph" w:styleId="Heading2">
-    <w:name w:val="heading 2"/>
+    <w:name w:val="Heading 2"/>
     <w:basedOn w:val="Normal"/>
     <w:next w:val="Normal"/>
     <w:link w:val="Heading2Char"/>
@@ -8456,7 +8921,7 @@
     </w:rPr>
   </w:style>
   <w:style w:type="paragraph" w:styleId="Heading3">
-    <w:name w:val="heading 3"/>
+    <w:name w:val="Heading 3"/>
     <w:basedOn w:val="Normal"/>
     <w:next w:val="Normal"/>
     <w:link w:val="Heading3Char"/>
@@ -8479,7 +8944,7 @@
     </w:rPr>
   </w:style>
   <w:style w:type="paragraph" w:styleId="Heading4">
-    <w:name w:val="heading 4"/>
+    <w:name w:val="Heading 4"/>
     <w:basedOn w:val="Normal"/>
     <w:next w:val="Normal"/>
     <w:link w:val="Heading4Char"/>
@@ -8502,7 +8967,7 @@
     </w:rPr>
   </w:style>
   <w:style w:type="paragraph" w:styleId="Heading5">
-    <w:name w:val="heading 5"/>
+    <w:name w:val="Heading 5"/>
     <w:basedOn w:val="Normal"/>
     <w:next w:val="Normal"/>
     <w:link w:val="Heading5Char"/>
@@ -8523,7 +8988,7 @@
     </w:rPr>
   </w:style>
   <w:style w:type="paragraph" w:styleId="Heading6">
-    <w:name w:val="heading 6"/>
+    <w:name w:val="Heading 6"/>
     <w:basedOn w:val="Normal"/>
     <w:next w:val="Normal"/>
     <w:link w:val="Heading6Char"/>
@@ -8546,7 +9011,7 @@
     </w:rPr>
   </w:style>
   <w:style w:type="paragraph" w:styleId="Heading7">
-    <w:name w:val="heading 7"/>
+    <w:name w:val="Heading 7"/>
     <w:basedOn w:val="Normal"/>
     <w:next w:val="Normal"/>
     <w:link w:val="Heading7Char"/>
@@ -8567,7 +9032,7 @@
     </w:rPr>
   </w:style>
   <w:style w:type="paragraph" w:styleId="Heading8">
-    <w:name w:val="heading 8"/>
+    <w:name w:val="Heading 8"/>
     <w:basedOn w:val="Normal"/>
     <w:next w:val="Normal"/>
     <w:link w:val="Heading8Char"/>
@@ -8590,7 +9055,7 @@
     </w:rPr>
   </w:style>
   <w:style w:type="paragraph" w:styleId="Heading9">
-    <w:name w:val="heading 9"/>
+    <w:name w:val="Heading 9"/>
     <w:basedOn w:val="Normal"/>
     <w:next w:val="Normal"/>
     <w:link w:val="Heading9Char"/>
@@ -8615,6 +9080,7 @@
     <w:uiPriority w:val="1"/>
     <w:semiHidden/>
     <w:unhideWhenUsed/>
+    <w:qFormat/>
     <w:rPr/>
   </w:style>
   <w:style w:type="character" w:styleId="Heading1Char" w:customStyle="1">
@@ -8622,6 +9088,7 @@
     <w:basedOn w:val="DefaultParagraphFont"/>
     <w:link w:val="Heading1"/>
     <w:uiPriority w:val="9"/>
+    <w:qFormat/>
     <w:rsid w:val="00aa5b02"/>
     <w:rPr>
       <w:rFonts w:ascii="Aptos Display" w:hAnsi="Aptos Display" w:eastAsia="" w:cs="" w:asciiTheme="majorHAnsi" w:cstheme="majorBidi" w:eastAsiaTheme="majorEastAsia" w:hAnsiTheme="majorHAnsi"/>
@@ -8636,6 +9103,7 @@
     <w:link w:val="Heading2"/>
     <w:uiPriority w:val="9"/>
     <w:semiHidden/>
+    <w:qFormat/>
     <w:rsid w:val="00aa5b02"/>
     <w:rPr>
       <w:rFonts w:ascii="Aptos Display" w:hAnsi="Aptos Display" w:eastAsia="" w:cs="" w:asciiTheme="majorHAnsi" w:cstheme="majorBidi" w:eastAsiaTheme="majorEastAsia" w:hAnsiTheme="majorHAnsi"/>
@@ -8650,6 +9118,7 @@
     <w:link w:val="Heading3"/>
     <w:uiPriority w:val="9"/>
     <w:semiHidden/>
+    <w:qFormat/>
     <w:rsid w:val="00aa5b02"/>
     <w:rPr>
       <w:rFonts w:eastAsia="" w:cs="" w:cstheme="majorBidi" w:eastAsiaTheme="majorEastAsia"/>
@@ -8664,6 +9133,7 @@
     <w:link w:val="Heading4"/>
     <w:uiPriority w:val="9"/>
     <w:semiHidden/>
+    <w:qFormat/>
     <w:rsid w:val="00aa5b02"/>
     <w:rPr>
       <w:rFonts w:eastAsia="" w:cs="" w:cstheme="majorBidi" w:eastAsiaTheme="majorEastAsia"/>
@@ -8678,6 +9148,7 @@
     <w:link w:val="Heading5"/>
     <w:uiPriority w:val="9"/>
     <w:semiHidden/>
+    <w:qFormat/>
     <w:rsid w:val="00aa5b02"/>
     <w:rPr>
       <w:rFonts w:eastAsia="" w:cs="" w:cstheme="majorBidi" w:eastAsiaTheme="majorEastAsia"/>
@@ -8690,6 +9161,7 @@
     <w:link w:val="Heading6"/>
     <w:uiPriority w:val="9"/>
     <w:semiHidden/>
+    <w:qFormat/>
     <w:rsid w:val="00aa5b02"/>
     <w:rPr>
       <w:rFonts w:eastAsia="" w:cs="" w:cstheme="majorBidi" w:eastAsiaTheme="majorEastAsia"/>
@@ -8704,6 +9176,7 @@
     <w:link w:val="Heading7"/>
     <w:uiPriority w:val="9"/>
     <w:semiHidden/>
+    <w:qFormat/>
     <w:rsid w:val="00aa5b02"/>
     <w:rPr>
       <w:rFonts w:eastAsia="" w:cs="" w:cstheme="majorBidi" w:eastAsiaTheme="majorEastAsia"/>
@@ -8716,6 +9189,7 @@
     <w:link w:val="Heading8"/>
     <w:uiPriority w:val="9"/>
     <w:semiHidden/>
+    <w:qFormat/>
     <w:rsid w:val="00aa5b02"/>
     <w:rPr>
       <w:rFonts w:eastAsia="" w:cs="" w:cstheme="majorBidi" w:eastAsiaTheme="majorEastAsia"/>
@@ -8730,6 +9204,7 @@
     <w:link w:val="Heading9"/>
     <w:uiPriority w:val="9"/>
     <w:semiHidden/>
+    <w:qFormat/>
     <w:rsid w:val="00aa5b02"/>
     <w:rPr>
       <w:rFonts w:eastAsia="" w:cs="" w:cstheme="majorBidi" w:eastAsiaTheme="majorEastAsia"/>
@@ -8741,6 +9216,7 @@
     <w:basedOn w:val="DefaultParagraphFont"/>
     <w:link w:val="Title"/>
     <w:uiPriority w:val="10"/>
+    <w:qFormat/>
     <w:rsid w:val="00aa5b02"/>
     <w:rPr>
       <w:rFonts w:ascii="Aptos Display" w:hAnsi="Aptos Display" w:eastAsia="" w:cs="" w:asciiTheme="majorHAnsi" w:cstheme="majorBidi" w:eastAsiaTheme="majorEastAsia" w:hAnsiTheme="majorHAnsi"/>
@@ -8755,6 +9231,7 @@
     <w:basedOn w:val="DefaultParagraphFont"/>
     <w:link w:val="Subtitle"/>
     <w:uiPriority w:val="11"/>
+    <w:qFormat/>
     <w:rsid w:val="00aa5b02"/>
     <w:rPr>
       <w:rFonts w:eastAsia="" w:cs="" w:cstheme="majorBidi" w:eastAsiaTheme="majorEastAsia"/>
@@ -8769,6 +9246,7 @@
     <w:basedOn w:val="DefaultParagraphFont"/>
     <w:link w:val="Quote"/>
     <w:uiPriority w:val="29"/>
+    <w:qFormat/>
     <w:rsid w:val="00aa5b02"/>
     <w:rPr>
       <w:i/>
@@ -8793,6 +9271,7 @@
     <w:basedOn w:val="DefaultParagraphFont"/>
     <w:link w:val="IntenseQuote"/>
     <w:uiPriority w:val="30"/>
+    <w:qFormat/>
     <w:rsid w:val="00aa5b02"/>
     <w:rPr>
       <w:i/>
@@ -8831,6 +9310,7 @@
     <w:uiPriority w:val="99"/>
     <w:semiHidden/>
     <w:unhideWhenUsed/>
+    <w:qFormat/>
     <w:rsid w:val="00aa5b02"/>
     <w:rPr>
       <w:color w:val="605E5C"/>
@@ -8842,6 +9322,7 @@
     <w:basedOn w:val="DefaultParagraphFont"/>
     <w:link w:val="Header"/>
     <w:uiPriority w:val="99"/>
+    <w:qFormat/>
     <w:rsid w:val="00ad388e"/>
     <w:rPr/>
   </w:style>
@@ -8850,17 +9331,20 @@
     <w:basedOn w:val="DefaultParagraphFont"/>
     <w:link w:val="Footer"/>
     <w:uiPriority w:val="99"/>
+    <w:qFormat/>
     <w:rsid w:val="00ad388e"/>
     <w:rPr/>
   </w:style>
   <w:style w:type="character" w:styleId="SourceText">
     <w:name w:val="Source Text"/>
+    <w:qFormat/>
     <w:rPr>
       <w:rFonts w:ascii="Liberation Mono" w:hAnsi="Liberation Mono" w:eastAsia="Liberation Mono" w:cs="Liberation Mono"/>
     </w:rPr>
   </w:style>
   <w:style w:type="character" w:styleId="Strong">
     <w:name w:val="Strong"/>
+    <w:qFormat/>
     <w:rPr>
       <w:b/>
       <w:bCs/>
@@ -8868,10 +9352,12 @@
   </w:style>
   <w:style w:type="character" w:styleId="NumberingSymbols">
     <w:name w:val="Numbering Symbols"/>
+    <w:qFormat/>
     <w:rPr/>
   </w:style>
   <w:style w:type="character" w:styleId="Emphasis">
     <w:name w:val="Emphasis"/>
+    <w:qFormat/>
     <w:rPr>
       <w:i/>
       <w:iCs/>
@@ -8879,6 +9365,7 @@
   </w:style>
   <w:style w:type="character" w:styleId="Bullets">
     <w:name w:val="Bullets"/>
+    <w:qFormat/>
     <w:rPr>
       <w:rFonts w:ascii="OpenSymbol" w:hAnsi="OpenSymbol" w:eastAsia="OpenSymbol" w:cs="OpenSymbol"/>
     </w:rPr>
@@ -8887,6 +9374,7 @@
     <w:name w:val="Heading"/>
     <w:basedOn w:val="Normal"/>
     <w:next w:val="BodyText"/>
+    <w:qFormat/>
     <w:pPr>
       <w:keepNext w:val="true"/>
       <w:spacing w:before="240" w:after="120"/>
@@ -8914,8 +9402,9 @@
     </w:rPr>
   </w:style>
   <w:style w:type="paragraph" w:styleId="Caption">
-    <w:name w:val="caption"/>
+    <w:name w:val="Caption"/>
     <w:basedOn w:val="Normal"/>
+    <w:qFormat/>
     <w:pPr>
       <w:suppressLineNumbers/>
       <w:spacing w:before="120" w:after="120"/>
@@ -8931,6 +9420,7 @@
   <w:style w:type="paragraph" w:styleId="Index">
     <w:name w:val="Index"/>
     <w:basedOn w:val="Normal"/>
+    <w:qFormat/>
     <w:pPr>
       <w:suppressLineNumbers/>
     </w:pPr>
@@ -9032,11 +9522,12 @@
   <w:style w:type="paragraph" w:styleId="HeaderandFooter">
     <w:name w:val="Header and Footer"/>
     <w:basedOn w:val="Normal"/>
+    <w:qFormat/>
     <w:pPr/>
     <w:rPr/>
   </w:style>
   <w:style w:type="paragraph" w:styleId="Header">
-    <w:name w:val="header"/>
+    <w:name w:val="Header"/>
     <w:basedOn w:val="Normal"/>
     <w:link w:val="HeaderChar"/>
     <w:uiPriority w:val="99"/>
@@ -9053,7 +9544,7 @@
     <w:rPr/>
   </w:style>
   <w:style w:type="paragraph" w:styleId="Footer">
-    <w:name w:val="footer"/>
+    <w:name w:val="Footer"/>
     <w:basedOn w:val="Normal"/>
     <w:link w:val="FooterChar"/>
     <w:uiPriority w:val="99"/>
@@ -9072,6 +9563,7 @@
   <w:style w:type="paragraph" w:styleId="PreformattedText">
     <w:name w:val="Preformatted Text"/>
     <w:basedOn w:val="Normal"/>
+    <w:qFormat/>
     <w:pPr>
       <w:spacing w:before="0" w:after="0"/>
     </w:pPr>
@@ -9083,6 +9575,7 @@
   </w:style>
   <w:style w:type="paragraph" w:styleId="DefaultDrawingStyle">
     <w:name w:val="Default Drawing Style"/>
+    <w:qFormat/>
     <w:pPr>
       <w:widowControl/>
       <w:suppressAutoHyphens w:val="true"/>
@@ -9112,6 +9605,7 @@
   <w:style w:type="paragraph" w:styleId="TableContents">
     <w:name w:val="Table Contents"/>
     <w:basedOn w:val="Normal"/>
+    <w:qFormat/>
     <w:pPr>
       <w:widowControl w:val="false"/>
       <w:suppressLineNumbers/>
@@ -9121,6 +9615,7 @@
   <w:style w:type="paragraph" w:styleId="TableHeading">
     <w:name w:val="Table Heading"/>
     <w:basedOn w:val="TableContents"/>
+    <w:qFormat/>
     <w:pPr>
       <w:suppressLineNumbers/>
       <w:jc w:val="center"/>
@@ -9135,6 +9630,7 @@
     <w:uiPriority w:val="99"/>
     <w:semiHidden/>
     <w:unhideWhenUsed/>
+    <w:qFormat/>
   </w:style>
   <w:style w:type="table" w:default="1" w:styleId="TableNormal">
     <w:name w:val="Normal Table"/>
@@ -9161,37 +9657,37 @@
         <a:srgbClr val="000000"/>
       </a:dk1>
       <a:lt1>
-        <a:srgbClr val="FFFFFF"/>
+        <a:srgbClr val="ffffff"/>
       </a:lt1>
       <a:dk2>
-        <a:srgbClr val="0E2841"/>
+        <a:srgbClr val="0e2841"/>
       </a:dk2>
       <a:lt2>
-        <a:srgbClr val="E8E8E8"/>
+        <a:srgbClr val="e8e8e8"/>
       </a:lt2>
       <a:accent1>
         <a:srgbClr val="156082"/>
       </a:accent1>
       <a:accent2>
-        <a:srgbClr val="E97132"/>
+        <a:srgbClr val="e97132"/>
       </a:accent2>
       <a:accent3>
-        <a:srgbClr val="196B24"/>
+        <a:srgbClr val="196b24"/>
       </a:accent3>
       <a:accent4>
-        <a:srgbClr val="0F9ED5"/>
+        <a:srgbClr val="0f9ed5"/>
       </a:accent4>
       <a:accent5>
-        <a:srgbClr val="A02B93"/>
+        <a:srgbClr val="a02b93"/>
       </a:accent5>
       <a:accent6>
-        <a:srgbClr val="4EA72E"/>
+        <a:srgbClr val="4ea72e"/>
       </a:accent6>
       <a:hlink>
         <a:srgbClr val="467886"/>
       </a:hlink>
       <a:folHlink>
-        <a:srgbClr val="96607D"/>
+        <a:srgbClr val="96607d"/>
       </a:folHlink>
     </a:clrScheme>
     <a:fontScheme name="Office">
@@ -9199,105 +9695,11 @@
         <a:latin typeface="Aptos Display" panose="02110004020202020204" pitchFamily="0" charset="1"/>
         <a:ea typeface=""/>
         <a:cs typeface=""/>
-        <a:font script="Jpan" typeface="游ゴシック Light"/>
-        <a:font script="Hang" typeface="맑은 고딕"/>
-        <a:font script="Hans" typeface="等线 Light"/>
-        <a:font script="Hant" typeface="新細明體"/>
-        <a:font script="Arab" typeface="Times New Roman"/>
-        <a:font script="Hebr" typeface="Times New Roman"/>
-        <a:font script="Thai" typeface="Angsana New"/>
-        <a:font script="Ethi" typeface="Nyala"/>
-        <a:font script="Beng" typeface="Vrinda"/>
-        <a:font script="Gujr" typeface="Shruti"/>
-        <a:font script="Khmr" typeface="MoolBoran"/>
-        <a:font script="Knda" typeface="Tunga"/>
-        <a:font script="Guru" typeface="Raavi"/>
-        <a:font script="Cans" typeface="Euphemia"/>
-        <a:font script="Cher" typeface="Plantagenet Cherokee"/>
-        <a:font script="Yiii" typeface="Microsoft Yi Baiti"/>
-        <a:font script="Tibt" typeface="Microsoft Himalaya"/>
-        <a:font script="Thaa" typeface="MV Boli"/>
-        <a:font script="Deva" typeface="Mangal"/>
-        <a:font script="Telu" typeface="Gautami"/>
-        <a:font script="Taml" typeface="Latha"/>
-        <a:font script="Syrc" typeface="Estrangelo Edessa"/>
-        <a:font script="Orya" typeface="Kalinga"/>
-        <a:font script="Mlym" typeface="Kartika"/>
-        <a:font script="Laoo" typeface="DokChampa"/>
-        <a:font script="Sinh" typeface="Iskoola Pota"/>
-        <a:font script="Mong" typeface="Mongolian Baiti"/>
-        <a:font script="Viet" typeface="Times New Roman"/>
-        <a:font script="Uigh" typeface="Microsoft Uighur"/>
-        <a:font script="Geor" typeface="Sylfaen"/>
-        <a:font script="Armn" typeface="Arial"/>
-        <a:font script="Bugi" typeface="Leelawadee UI"/>
-        <a:font script="Bopo" typeface="Microsoft JhengHei"/>
-        <a:font script="Java" typeface="Javanese Text"/>
-        <a:font script="Lisu" typeface="Segoe UI"/>
-        <a:font script="Mymr" typeface="Myanmar Text"/>
-        <a:font script="Nkoo" typeface="Ebrima"/>
-        <a:font script="Olck" typeface="Nirmala UI"/>
-        <a:font script="Osma" typeface="Ebrima"/>
-        <a:font script="Phag" typeface="Phagspa"/>
-        <a:font script="Syrn" typeface="Estrangelo Edessa"/>
-        <a:font script="Syrj" typeface="Estrangelo Edessa"/>
-        <a:font script="Syre" typeface="Estrangelo Edessa"/>
-        <a:font script="Sora" typeface="Nirmala UI"/>
-        <a:font script="Tale" typeface="Microsoft Tai Le"/>
-        <a:font script="Talu" typeface="Microsoft New Tai Lue"/>
-        <a:font script="Tfng" typeface="Ebrima"/>
       </a:majorFont>
       <a:minorFont>
         <a:latin typeface="Aptos" panose="02110004020202020204" pitchFamily="0" charset="1"/>
         <a:ea typeface=""/>
         <a:cs typeface=""/>
-        <a:font script="Jpan" typeface="游ゴシック"/>
-        <a:font script="Hang" typeface="맑은 고딕"/>
-        <a:font script="Hans" typeface="等线"/>
-        <a:font script="Hant" typeface="新細明體"/>
-        <a:font script="Arab" typeface="Arial"/>
-        <a:font script="Hebr" typeface="Arial"/>
-        <a:font script="Thai" typeface="Cordia New"/>
-        <a:font script="Ethi" typeface="Nyala"/>
-        <a:font script="Beng" typeface="Vrinda"/>
-        <a:font script="Gujr" typeface="Shruti"/>
-        <a:font script="Khmr" typeface="DaunPenh"/>
-        <a:font script="Knda" typeface="Tunga"/>
-        <a:font script="Guru" typeface="Raavi"/>
-        <a:font script="Cans" typeface="Euphemia"/>
-        <a:font script="Cher" typeface="Plantagenet Cherokee"/>
-        <a:font script="Yiii" typeface="Microsoft Yi Baiti"/>
-        <a:font script="Tibt" typeface="Microsoft Himalaya"/>
-        <a:font script="Thaa" typeface="MV Boli"/>
-        <a:font script="Deva" typeface="Mangal"/>
-        <a:font script="Telu" typeface="Gautami"/>
-        <a:font script="Taml" typeface="Latha"/>
-        <a:font script="Syrc" typeface="Estrangelo Edessa"/>
-        <a:font script="Orya" typeface="Kalinga"/>
-        <a:font script="Mlym" typeface="Kartika"/>
-        <a:font script="Laoo" typeface="DokChampa"/>
-        <a:font script="Sinh" typeface="Iskoola Pota"/>
-        <a:font script="Mong" typeface="Mongolian Baiti"/>
-        <a:font script="Viet" typeface="Arial"/>
-        <a:font script="Uigh" typeface="Microsoft Uighur"/>
-        <a:font script="Geor" typeface="Sylfaen"/>
-        <a:font script="Armn" typeface="Arial"/>
-        <a:font script="Bugi" typeface="Leelawadee UI"/>
-        <a:font script="Bopo" typeface="Microsoft JhengHei"/>
-        <a:font script="Java" typeface="Javanese Text"/>
-        <a:font script="Lisu" typeface="Segoe UI"/>
-        <a:font script="Mymr" typeface="Myanmar Text"/>
-        <a:font script="Nkoo" typeface="Ebrima"/>
-        <a:font script="Olck" typeface="Nirmala UI"/>
-        <a:font script="Osma" typeface="Ebrima"/>
-        <a:font script="Phag" typeface="Phagspa"/>
-        <a:font script="Syrn" typeface="Estrangelo Edessa"/>
-        <a:font script="Syrj" typeface="Estrangelo Edessa"/>
-        <a:font script="Syre" typeface="Estrangelo Edessa"/>
-        <a:font script="Sora" typeface="Nirmala UI"/>
-        <a:font script="Tale" typeface="Microsoft Tai Le"/>
-        <a:font script="Talu" typeface="Microsoft New Tai Lue"/>
-        <a:font script="Tfng" typeface="Ebrima"/>
       </a:minorFont>
     </a:fontScheme>
     <a:fmtScheme>

</xml_diff>

<commit_message>
update kravspec and problem fomulation
</commit_message>
<xml_diff>
--- a/documentation/KravSpec/H5AffugterKravspecifikation.docx
+++ b/documentation/KravSpec/H5AffugterKravspecifikation.docx
@@ -67,15 +67,7 @@
           <w:sz w:val="24"/>
           <w:szCs w:val="24"/>
         </w:rPr>
-        <w:t>Projekt</w:t>
-      </w:r>
-      <w:r>
-        <w:rPr>
-          <w:rFonts w:ascii="Liberation Sans" w:hAnsi="Liberation Sans"/>
-          <w:sz w:val="24"/>
-          <w:szCs w:val="24"/>
-        </w:rPr>
-        <w:t xml:space="preserve">ets mål er at udvikle et system, som automatisk kan tænde og slukke en affugter på baggrund af aktuelle elpriser og luftfugtigheden i et lokale. </w:t>
+        <w:t xml:space="preserve">Projektets mål er at udvikle et system, som automatisk kan tænde og slukke en affugter på baggrund af aktuelle elpriser og luftfugtigheden i et lokale. </w:t>
       </w:r>
     </w:p>
     <w:p>
@@ -89,79 +81,7 @@
           <w:sz w:val="24"/>
           <w:szCs w:val="24"/>
         </w:rPr>
-        <w:t>E</w:t>
-      </w:r>
-      <w:r>
-        <w:rPr>
-          <w:rFonts w:ascii="Liberation Sans" w:hAnsi="Liberation Sans"/>
-          <w:sz w:val="24"/>
-          <w:szCs w:val="24"/>
-        </w:rPr>
-        <w:t>n Raspberry Pi løbende aflæser resultaterne fra en luftfugtighedssensor. Samtid</w:t>
-      </w:r>
-      <w:r>
-        <w:rPr>
-          <w:rFonts w:ascii="Liberation Sans" w:hAnsi="Liberation Sans"/>
-          <w:sz w:val="24"/>
-          <w:szCs w:val="24"/>
-        </w:rPr>
-        <w:t>ig</w:t>
-      </w:r>
-      <w:r>
-        <w:rPr>
-          <w:rFonts w:ascii="Liberation Sans" w:hAnsi="Liberation Sans"/>
-          <w:sz w:val="24"/>
-          <w:szCs w:val="24"/>
-        </w:rPr>
-        <w:t xml:space="preserve"> henter Raspberry Pi’en aktuelle el-prisdata fra e</w:t>
-      </w:r>
-      <w:r>
-        <w:rPr>
-          <w:rFonts w:ascii="Liberation Sans" w:hAnsi="Liberation Sans"/>
-          <w:sz w:val="24"/>
-          <w:szCs w:val="24"/>
-        </w:rPr>
-        <w:t>n ekstern</w:t>
-      </w:r>
-      <w:r>
-        <w:rPr>
-          <w:rFonts w:ascii="Liberation Sans" w:hAnsi="Liberation Sans"/>
-          <w:sz w:val="24"/>
-          <w:szCs w:val="24"/>
-        </w:rPr>
-        <w:t xml:space="preserve"> API. Begge </w:t>
-      </w:r>
-      <w:r>
-        <w:rPr>
-          <w:rFonts w:ascii="Liberation Sans" w:hAnsi="Liberation Sans"/>
-          <w:sz w:val="24"/>
-          <w:szCs w:val="24"/>
-        </w:rPr>
-        <w:t xml:space="preserve">typer data </w:t>
-      </w:r>
-      <w:r>
-        <w:rPr>
-          <w:rFonts w:ascii="Liberation Sans" w:hAnsi="Liberation Sans"/>
-          <w:sz w:val="24"/>
-          <w:szCs w:val="24"/>
-        </w:rPr>
-        <w:t xml:space="preserve">gemmes i en database på Raspberry Pi’en </w:t>
-      </w:r>
-      <w:r>
-        <w:rPr>
-          <w:rFonts w:ascii="Liberation Sans" w:hAnsi="Liberation Sans"/>
-          <w:sz w:val="24"/>
-          <w:szCs w:val="24"/>
-        </w:rPr>
-        <w:t xml:space="preserve">og bruges </w:t>
-      </w:r>
-      <w:r>
-        <w:rPr>
-          <w:rFonts w:ascii="Liberation Sans" w:hAnsi="Liberation Sans"/>
-          <w:sz w:val="24"/>
-          <w:szCs w:val="24"/>
-        </w:rPr>
-        <w:t>som grundlag for beslutningen om at tænde eller slukke affugteren.</w:t>
+        <w:t>En Raspberry Pi løbende aflæser resultaterne fra en luftfugtighedssensor. Samtidig henter Raspberry Pi’en aktuelle el-prisdata fra en ekstern API. Begge typer data gemmes i en database på Raspberry Pi’en og bruges som grundlag for beslutningen om at tænde eller slukke affugteren.</w:t>
       </w:r>
     </w:p>
     <w:p>
@@ -194,17 +114,19 @@
           <w:sz w:val="24"/>
           <w:szCs w:val="24"/>
         </w:rPr>
-        <w:t xml:space="preserve">Projektets primære fokus er udviklingen af den automatiske styring af </w:t>
-      </w:r>
-      <w:r>
+        <w:t>Projektets primære fokus er udviklingen af den automatiske styring af en ikke-smart affugter (eeese Emil 2508) uden ændringer af selve apparatet. Systemets minimumsløsning består af en Raspberry Pi, en luftfugtighedssensor og en smart plug samt software, som henter elpriser, gemmer data i en lokal database,styrer affugteren via smart plug’en og viser systemets tilstand på en lokal webside.</w:t>
+      </w:r>
+    </w:p>
+    <w:p>
+      <w:pPr>
+        <w:pStyle w:val="Normal"/>
         <w:rPr>
           <w:rStyle w:val="SourceText"/>
           <w:rFonts w:ascii="Liberation Sans" w:hAnsi="Liberation Sans"/>
           <w:sz w:val="24"/>
           <w:szCs w:val="24"/>
         </w:rPr>
-        <w:t xml:space="preserve">en ikke-smart </w:t>
-      </w:r>
+      </w:pPr>
       <w:r>
         <w:rPr>
           <w:rStyle w:val="SourceText"/>
@@ -212,142 +134,7 @@
           <w:sz w:val="24"/>
           <w:szCs w:val="24"/>
         </w:rPr>
-        <w:t xml:space="preserve">affugter </w:t>
-      </w:r>
-      <w:r>
-        <w:rPr>
-          <w:rStyle w:val="SourceText"/>
-          <w:rFonts w:ascii="Liberation Sans" w:hAnsi="Liberation Sans"/>
-          <w:sz w:val="24"/>
-          <w:szCs w:val="24"/>
-        </w:rPr>
-        <w:t xml:space="preserve">(eeese Emil 2508) uden </w:t>
-      </w:r>
-      <w:r>
-        <w:rPr>
-          <w:rStyle w:val="SourceText"/>
-          <w:rFonts w:ascii="Liberation Sans" w:hAnsi="Liberation Sans"/>
-          <w:sz w:val="24"/>
-          <w:szCs w:val="24"/>
-        </w:rPr>
-        <w:t>æ</w:t>
-      </w:r>
-      <w:r>
-        <w:rPr>
-          <w:rStyle w:val="SourceText"/>
-          <w:rFonts w:ascii="Liberation Sans" w:hAnsi="Liberation Sans"/>
-          <w:sz w:val="24"/>
-          <w:szCs w:val="24"/>
-        </w:rPr>
-        <w:t>ndringer af selve apparatet</w:t>
-      </w:r>
-      <w:r>
-        <w:rPr>
-          <w:rStyle w:val="SourceText"/>
-          <w:rFonts w:ascii="Liberation Sans" w:hAnsi="Liberation Sans"/>
-          <w:sz w:val="24"/>
-          <w:szCs w:val="24"/>
-        </w:rPr>
-        <w:t xml:space="preserve">. Systemets minimumsløsning består af en </w:t>
-      </w:r>
-      <w:r>
-        <w:rPr>
-          <w:rStyle w:val="SourceText"/>
-          <w:rFonts w:ascii="Liberation Sans" w:hAnsi="Liberation Sans"/>
-          <w:sz w:val="24"/>
-          <w:szCs w:val="24"/>
-        </w:rPr>
-        <w:t>Raspberry Pi,</w:t>
-      </w:r>
-      <w:r>
-        <w:rPr>
-          <w:rStyle w:val="SourceText"/>
-          <w:rFonts w:ascii="Liberation Sans" w:hAnsi="Liberation Sans"/>
-          <w:sz w:val="24"/>
-          <w:szCs w:val="24"/>
-        </w:rPr>
-        <w:t xml:space="preserve"> en luftfugtighedssensor og en smart plug samt software, </w:t>
-      </w:r>
-      <w:r>
-        <w:rPr>
-          <w:rStyle w:val="SourceText"/>
-          <w:rFonts w:ascii="Liberation Sans" w:hAnsi="Liberation Sans"/>
-          <w:sz w:val="24"/>
-          <w:szCs w:val="24"/>
-        </w:rPr>
-        <w:t>som</w:t>
-      </w:r>
-      <w:r>
-        <w:rPr>
-          <w:rStyle w:val="SourceText"/>
-          <w:rFonts w:ascii="Liberation Sans" w:hAnsi="Liberation Sans"/>
-          <w:sz w:val="24"/>
-          <w:szCs w:val="24"/>
-        </w:rPr>
-        <w:t xml:space="preserve"> </w:t>
-      </w:r>
-      <w:r>
-        <w:rPr>
-          <w:rStyle w:val="SourceText"/>
-          <w:rFonts w:ascii="Liberation Sans" w:hAnsi="Liberation Sans"/>
-          <w:sz w:val="24"/>
-          <w:szCs w:val="24"/>
-        </w:rPr>
-        <w:t xml:space="preserve">henter </w:t>
-      </w:r>
-      <w:r>
-        <w:rPr>
-          <w:rStyle w:val="SourceText"/>
-          <w:rFonts w:ascii="Liberation Sans" w:hAnsi="Liberation Sans"/>
-          <w:sz w:val="24"/>
-          <w:szCs w:val="24"/>
-        </w:rPr>
-        <w:t xml:space="preserve">elpriser, </w:t>
-      </w:r>
-      <w:r>
-        <w:rPr>
-          <w:rStyle w:val="SourceText"/>
-          <w:rFonts w:ascii="Liberation Sans" w:hAnsi="Liberation Sans"/>
-          <w:sz w:val="24"/>
-          <w:szCs w:val="24"/>
-        </w:rPr>
-        <w:t>gemmer data i en lokal database,</w:t>
-      </w:r>
-      <w:r>
-        <w:rPr>
-          <w:rStyle w:val="SourceText"/>
-          <w:rFonts w:ascii="Liberation Sans" w:hAnsi="Liberation Sans"/>
-          <w:sz w:val="24"/>
-          <w:szCs w:val="24"/>
-        </w:rPr>
-        <w:t>styr</w:t>
-      </w:r>
-      <w:r>
-        <w:rPr>
-          <w:rStyle w:val="SourceText"/>
-          <w:rFonts w:ascii="Liberation Sans" w:hAnsi="Liberation Sans"/>
-          <w:sz w:val="24"/>
-          <w:szCs w:val="24"/>
-        </w:rPr>
-        <w:t>er a</w:t>
-      </w:r>
-      <w:r>
-        <w:rPr>
-          <w:rStyle w:val="SourceText"/>
-          <w:rFonts w:ascii="Liberation Sans" w:hAnsi="Liberation Sans"/>
-          <w:sz w:val="24"/>
-          <w:szCs w:val="24"/>
-        </w:rPr>
-        <w:t xml:space="preserve">ffugteren </w:t>
-      </w:r>
-      <w:r>
-        <w:rPr>
-          <w:rStyle w:val="SourceText"/>
-          <w:rFonts w:ascii="Liberation Sans" w:hAnsi="Liberation Sans"/>
-          <w:sz w:val="24"/>
-          <w:szCs w:val="24"/>
-        </w:rPr>
-        <w:t>via smart plug’en og viser systemets tilstand på en lokal webside.</w:t>
+        <w:t>Løsningen er ikke afhængig af en ekstern server. Styring, FastAPI-server og PostgreSQL-database kører på Raspberry Pi'en. Eneste eksterne afhængighed er elpris-API'et (K-003), hvis udfald håndteres af K-008 og K-011.</w:t>
       </w:r>
     </w:p>
     <w:p>
@@ -364,29 +151,7 @@
           <w:sz w:val="24"/>
           <w:szCs w:val="24"/>
         </w:rPr>
-        <w:t>1.3 Defin</w:t>
-      </w:r>
-      <w:r>
-        <w:rPr>
-          <w:rStyle w:val="SourceText"/>
-          <w:rFonts w:ascii="Liberation Sans" w:hAnsi="Liberation Sans"/>
-          <w:b/>
-          <w:bCs/>
-          <w:sz w:val="24"/>
-          <w:szCs w:val="24"/>
-        </w:rPr>
-        <w:t>i</w:t>
-      </w:r>
-      <w:r>
-        <w:rPr>
-          <w:rStyle w:val="SourceText"/>
-          <w:rFonts w:ascii="Liberation Sans" w:hAnsi="Liberation Sans"/>
-          <w:b/>
-          <w:bCs/>
-          <w:sz w:val="24"/>
-          <w:szCs w:val="24"/>
-        </w:rPr>
-        <w:t>tioner</w:t>
+        <w:t>1.3 Definitioner</w:t>
       </w:r>
     </w:p>
     <w:p>
@@ -594,7 +359,11 @@
         </w:rPr>
       </w:pPr>
       <w:r>
-        <w:rPr/>
+        <w:rPr>
+          <w:rFonts w:ascii="Liberation Sans" w:hAnsi="Liberation Sans"/>
+          <w:sz w:val="24"/>
+          <w:szCs w:val="24"/>
+        </w:rPr>
       </w:r>
     </w:p>
     <w:p>
@@ -650,25 +419,7 @@
           <w:sz w:val="24"/>
           <w:szCs w:val="24"/>
         </w:rPr>
-        <w:t xml:space="preserve">Brugeren ønsker at undgå skimmel i værelset ved at holde luftfugtigheden nede og samtidigt reducere udgiften til at drive affugteren. I dag kører affugteren typisk i timerne efter kl.17.00, hvor elprisen er højest, og som er mindst to til tre gange dyrere end døgnets billigste timer. Målet er derfor at flytte affugterens drift til døgnets billigste </w:t>
-      </w:r>
-      <w:r>
-        <w:rPr>
-          <w:rStyle w:val="SourceText"/>
-          <w:rFonts w:ascii="Liberation Sans" w:hAnsi="Liberation Sans"/>
-          <w:sz w:val="24"/>
-          <w:szCs w:val="24"/>
-        </w:rPr>
-        <w:t>kvarterer</w:t>
-      </w:r>
-      <w:r>
-        <w:rPr>
-          <w:rStyle w:val="SourceText"/>
-          <w:rFonts w:ascii="Liberation Sans" w:hAnsi="Liberation Sans"/>
-          <w:sz w:val="24"/>
-          <w:szCs w:val="24"/>
-        </w:rPr>
-        <w:t xml:space="preserve"> uden at gå på kompromis med luftfugtigheden.</w:t>
+        <w:t>Brugeren ønsker at undgå skimmel i værelset ved at holde luftfugtigheden nede og samtidigt reducere udgiften til at drive affugteren. I dag kører affugteren typisk i timerne efter kl.17.00, hvor elprisen er højest, og som er mindst to til tre gange dyrere end døgnets billigste timer. Målet er derfor at flytte affugterens drift til døgnets billigste kvarterer uden at gå på kompromis med luftfugtigheden.</w:t>
       </w:r>
     </w:p>
     <w:p>
@@ -740,61 +491,7 @@
           <w:sz w:val="24"/>
           <w:szCs w:val="24"/>
         </w:rPr>
-        <w:t xml:space="preserve">luftfugtigheden </w:t>
-      </w:r>
-      <w:r>
-        <w:rPr>
-          <w:rStyle w:val="SourceText"/>
-          <w:rFonts w:ascii="Liberation Sans" w:hAnsi="Liberation Sans"/>
-          <w:sz w:val="24"/>
-          <w:szCs w:val="24"/>
-        </w:rPr>
-        <w:t xml:space="preserve">uden for dark time </w:t>
-      </w:r>
-      <w:r>
-        <w:rPr>
-          <w:rStyle w:val="SourceText"/>
-          <w:rFonts w:ascii="Liberation Sans" w:hAnsi="Liberation Sans"/>
-          <w:sz w:val="24"/>
-          <w:szCs w:val="24"/>
-        </w:rPr>
-        <w:t xml:space="preserve">højst </w:t>
-      </w:r>
-      <w:r>
-        <w:rPr>
-          <w:rStyle w:val="SourceText"/>
-          <w:rFonts w:ascii="Liberation Sans" w:hAnsi="Liberation Sans"/>
-          <w:sz w:val="24"/>
-          <w:szCs w:val="24"/>
-        </w:rPr>
-        <w:t>overstiger</w:t>
-      </w:r>
-      <w:r>
-        <w:rPr>
-          <w:rStyle w:val="SourceText"/>
-          <w:rFonts w:ascii="Liberation Sans" w:hAnsi="Liberation Sans"/>
-          <w:sz w:val="24"/>
-          <w:szCs w:val="24"/>
-        </w:rPr>
-        <w:t xml:space="preserve"> den kritiske grænse </w:t>
-      </w:r>
-      <w:r>
-        <w:rPr>
-          <w:rStyle w:val="SourceText"/>
-          <w:rFonts w:ascii="Liberation Sans" w:hAnsi="Liberation Sans"/>
-          <w:sz w:val="24"/>
-          <w:szCs w:val="24"/>
-        </w:rPr>
-        <w:t>i 60 minutter ad gangen</w:t>
-      </w:r>
-      <w:r>
-        <w:rPr>
-          <w:rStyle w:val="SourceText"/>
-          <w:rFonts w:ascii="Liberation Sans" w:hAnsi="Liberation Sans"/>
-          <w:sz w:val="24"/>
-          <w:szCs w:val="24"/>
-        </w:rPr>
-        <w:t xml:space="preserve">, </w:t>
+        <w:t xml:space="preserve">luftfugtigheden uden for dark time højst overstiger den kritiske grænse i 60 minutter ad gangen, </w:t>
       </w:r>
     </w:p>
     <w:p>
@@ -819,25 +516,7 @@
           <w:sz w:val="24"/>
           <w:szCs w:val="24"/>
         </w:rPr>
-        <w:t xml:space="preserve">affugteren ved normal drift kun kører i døgnets billigste </w:t>
-      </w:r>
-      <w:r>
-        <w:rPr>
-          <w:rStyle w:val="SourceText"/>
-          <w:rFonts w:ascii="Liberation Sans" w:hAnsi="Liberation Sans"/>
-          <w:sz w:val="24"/>
-          <w:szCs w:val="24"/>
-        </w:rPr>
-        <w:t>kvarterer uden for dark time</w:t>
-      </w:r>
-      <w:r>
-        <w:rPr>
-          <w:rStyle w:val="SourceText"/>
-          <w:rFonts w:ascii="Liberation Sans" w:hAnsi="Liberation Sans"/>
-          <w:sz w:val="24"/>
-          <w:szCs w:val="24"/>
-        </w:rPr>
-        <w:t xml:space="preserve">, </w:t>
+        <w:t xml:space="preserve">affugteren ved normal drift kun kører i døgnets billigste kvarterer uden for dark time, </w:t>
       </w:r>
     </w:p>
     <w:p>
@@ -955,97 +634,7 @@
           <w:sz w:val="24"/>
           <w:szCs w:val="24"/>
         </w:rPr>
-        <w:t>Forudsætning: Affugteren (eeese Emil 2508) har ingen netværksfunktion og styres derfor udelukkende ved at afbryde o</w:t>
-      </w:r>
-      <w:r>
-        <w:rPr>
-          <w:rStyle w:val="SourceText"/>
-          <w:rFonts w:ascii="Liberation Sans" w:hAnsi="Liberation Sans"/>
-          <w:sz w:val="24"/>
-          <w:szCs w:val="24"/>
-        </w:rPr>
-        <w:t xml:space="preserve">g </w:t>
-      </w:r>
-      <w:r>
-        <w:rPr>
-          <w:rStyle w:val="SourceText"/>
-          <w:rFonts w:ascii="Liberation Sans" w:hAnsi="Liberation Sans"/>
-          <w:sz w:val="24"/>
-          <w:szCs w:val="24"/>
-        </w:rPr>
-        <w:t>genetablere strømmen via smart plug’en. Løsningen forudsætter, at affug</w:t>
-      </w:r>
-      <w:r>
-        <w:rPr>
-          <w:rStyle w:val="SourceText"/>
-          <w:rFonts w:ascii="Liberation Sans" w:hAnsi="Liberation Sans"/>
-          <w:sz w:val="24"/>
-          <w:szCs w:val="24"/>
-        </w:rPr>
-        <w:t>t</w:t>
-      </w:r>
-      <w:r>
-        <w:rPr>
-          <w:rStyle w:val="SourceText"/>
-          <w:rFonts w:ascii="Liberation Sans" w:hAnsi="Liberation Sans"/>
-          <w:sz w:val="24"/>
-          <w:szCs w:val="24"/>
-        </w:rPr>
-        <w:t xml:space="preserve">eren automatisk genoptager driften, når strømmen tilsluttes igen. </w:t>
-      </w:r>
-      <w:r>
-        <w:rPr>
-          <w:rStyle w:val="SourceText"/>
-          <w:rFonts w:ascii="Liberation Sans" w:hAnsi="Liberation Sans"/>
-          <w:sz w:val="24"/>
-          <w:szCs w:val="24"/>
-        </w:rPr>
-        <w:t>Ifølge brugsanvisningen kører affugteren i sa</w:t>
-      </w:r>
-      <w:r>
-        <w:rPr>
-          <w:rStyle w:val="SourceText"/>
-          <w:rFonts w:ascii="Liberation Sans" w:hAnsi="Liberation Sans"/>
-          <w:sz w:val="24"/>
-          <w:szCs w:val="24"/>
-        </w:rPr>
-        <w:t>m</w:t>
-      </w:r>
-      <w:r>
-        <w:rPr>
-          <w:rStyle w:val="SourceText"/>
-          <w:rFonts w:ascii="Liberation Sans" w:hAnsi="Liberation Sans"/>
-          <w:sz w:val="24"/>
-          <w:szCs w:val="24"/>
-        </w:rPr>
-        <w:t>me tilstand som før størmafbrydelsen (bilag 2, s. 12), og egenskabe</w:t>
-      </w:r>
-      <w:r>
-        <w:rPr>
-          <w:rStyle w:val="SourceText"/>
-          <w:rFonts w:ascii="Liberation Sans" w:hAnsi="Liberation Sans"/>
-          <w:sz w:val="24"/>
-          <w:szCs w:val="24"/>
-        </w:rPr>
-        <w:t xml:space="preserve">n </w:t>
-      </w:r>
-      <w:r>
-        <w:rPr>
-          <w:rStyle w:val="SourceText"/>
-          <w:rFonts w:ascii="Liberation Sans" w:hAnsi="Liberation Sans"/>
-          <w:sz w:val="24"/>
-          <w:szCs w:val="24"/>
-        </w:rPr>
-        <w:t xml:space="preserve">er </w:t>
-      </w:r>
-      <w:r>
-        <w:rPr>
-          <w:rStyle w:val="SourceText"/>
-          <w:rFonts w:ascii="Liberation Sans" w:hAnsi="Liberation Sans"/>
-          <w:sz w:val="24"/>
-          <w:szCs w:val="24"/>
-        </w:rPr>
-        <w:t>afprøvet af gruppen.</w:t>
+        <w:t>Forudsætning: Affugteren (eeese Emil 2508) har ingen netværksfunktion og styres derfor udelukkende ved at afbryde og genetablere strømmen via smart plug’en. Løsningen forudsætter, at affugteren automatisk genoptager driften, når strømmen tilsluttes igen. Ifølge brugsanvisningen kører affugteren i samme tilstand som før størmafbrydelsen (bilag 2, s. 12), og egenskaben er afprøvet af gruppen.</w:t>
       </w:r>
     </w:p>
     <w:p>
@@ -1587,16 +1176,7 @@
                 <w:sz w:val="22"/>
                 <w:szCs w:val="22"/>
               </w:rPr>
-              <w:t>Aktø</w:t>
-            </w:r>
-            <w:r>
-              <w:rPr>
-                <w:rFonts w:eastAsia="DejaVu Sans" w:cs="DejaVu Sans" w:ascii="Liberation Sans" w:hAnsi="Liberation Sans"/>
-                <w:b/>
-                <w:sz w:val="22"/>
-                <w:szCs w:val="22"/>
-              </w:rPr>
-              <w:t>r</w:t>
+              <w:t>Aktør</w:t>
             </w:r>
           </w:p>
         </w:tc>
@@ -1871,65 +1451,33 @@
                 <w:sz w:val="22"/>
                 <w:szCs w:val="22"/>
               </w:rPr>
-              <w:t>Ekster</w:t>
-            </w:r>
+              <w:t>Ekstern tjeneste</w:t>
+            </w:r>
+          </w:p>
+        </w:tc>
+        <w:tc>
+          <w:tcPr>
+            <w:tcW w:w="4977" w:type="dxa"/>
+            <w:tcBorders>
+              <w:bottom w:val="single" w:sz="4" w:space="0" w:color="999999"/>
+            </w:tcBorders>
+            <w:shd w:fill="EEEEEE" w:val="clear"/>
+          </w:tcPr>
+          <w:p>
+            <w:pPr>
+              <w:pStyle w:val="TableContents"/>
+              <w:spacing w:before="0" w:after="160"/>
+              <w:rPr>
+                <w:rFonts w:ascii="Liberation Sans" w:hAnsi="Liberation Sans"/>
+              </w:rPr>
+            </w:pPr>
             <w:r>
               <w:rPr>
                 <w:rFonts w:eastAsia="DejaVu Sans" w:cs="DejaVu Sans" w:ascii="Liberation Sans" w:hAnsi="Liberation Sans"/>
                 <w:sz w:val="22"/>
                 <w:szCs w:val="22"/>
               </w:rPr>
-              <w:t xml:space="preserve">n </w:t>
-            </w:r>
-            <w:r>
-              <w:rPr>
-                <w:rFonts w:eastAsia="DejaVu Sans" w:cs="DejaVu Sans" w:ascii="Liberation Sans" w:hAnsi="Liberation Sans"/>
-                <w:sz w:val="22"/>
-                <w:szCs w:val="22"/>
-              </w:rPr>
-              <w:t>tjeneste</w:t>
-            </w:r>
-          </w:p>
-        </w:tc>
-        <w:tc>
-          <w:tcPr>
-            <w:tcW w:w="4977" w:type="dxa"/>
-            <w:tcBorders>
-              <w:bottom w:val="single" w:sz="4" w:space="0" w:color="999999"/>
-            </w:tcBorders>
-            <w:shd w:fill="EEEEEE" w:val="clear"/>
-          </w:tcPr>
-          <w:p>
-            <w:pPr>
-              <w:pStyle w:val="TableContents"/>
-              <w:spacing w:before="0" w:after="160"/>
-              <w:rPr>
-                <w:rFonts w:ascii="Liberation Sans" w:hAnsi="Liberation Sans"/>
-              </w:rPr>
-            </w:pPr>
-            <w:r>
-              <w:rPr>
-                <w:rFonts w:eastAsia="DejaVu Sans" w:cs="DejaVu Sans" w:ascii="Liberation Sans" w:hAnsi="Liberation Sans"/>
-                <w:sz w:val="22"/>
-                <w:szCs w:val="22"/>
-              </w:rPr>
-              <w:t xml:space="preserve">Leverer dagens </w:t>
-            </w:r>
-            <w:r>
-              <w:rPr>
-                <w:rFonts w:eastAsia="DejaVu Sans" w:cs="DejaVu Sans" w:ascii="Liberation Sans" w:hAnsi="Liberation Sans"/>
-                <w:sz w:val="22"/>
-                <w:szCs w:val="22"/>
-              </w:rPr>
-              <w:t>kvarter</w:t>
-            </w:r>
-            <w:r>
-              <w:rPr>
-                <w:rFonts w:eastAsia="DejaVu Sans" w:cs="DejaVu Sans" w:ascii="Liberation Sans" w:hAnsi="Liberation Sans"/>
-                <w:sz w:val="22"/>
-                <w:szCs w:val="22"/>
-              </w:rPr>
-              <w:t>priser (K-003)</w:t>
+              <w:t>Leverer dagens kvarterpriser (K-003)</w:t>
             </w:r>
           </w:p>
         </w:tc>
@@ -2039,23 +1587,7 @@
                 <w:sz w:val="22"/>
                 <w:szCs w:val="22"/>
               </w:rPr>
-              <w:t>Affugter (ee</w:t>
-            </w:r>
-            <w:r>
-              <w:rPr>
-                <w:rFonts w:eastAsia="DejaVu Sans" w:cs="DejaVu Sans" w:ascii="Liberation Sans" w:hAnsi="Liberation Sans"/>
-                <w:sz w:val="22"/>
-                <w:szCs w:val="22"/>
-              </w:rPr>
-              <w:t>e</w:t>
-            </w:r>
-            <w:r>
-              <w:rPr>
-                <w:rFonts w:eastAsia="DejaVu Sans" w:cs="DejaVu Sans" w:ascii="Liberation Sans" w:hAnsi="Liberation Sans"/>
-                <w:sz w:val="22"/>
-                <w:szCs w:val="22"/>
-              </w:rPr>
-              <w:t>se Emil 2508)</w:t>
+              <w:t>Affugter (eeese Emil 2508)</w:t>
             </w:r>
           </w:p>
         </w:tc>
@@ -2270,25 +1802,7 @@
           <w:sz w:val="24"/>
           <w:szCs w:val="24"/>
         </w:rPr>
-        <w:t xml:space="preserve">Systemet styrer affugteren automatisk og sørger for, at strømforbruget så vidt muligt placeres i døgnets billigste </w:t>
-      </w:r>
-      <w:r>
-        <w:rPr>
-          <w:rStyle w:val="SourceText"/>
-          <w:rFonts w:ascii="Liberation Sans" w:hAnsi="Liberation Sans"/>
-          <w:sz w:val="24"/>
-          <w:szCs w:val="24"/>
-        </w:rPr>
-        <w:t>kvarterer</w:t>
-      </w:r>
-      <w:r>
-        <w:rPr>
-          <w:rStyle w:val="SourceText"/>
-          <w:rFonts w:ascii="Liberation Sans" w:hAnsi="Liberation Sans"/>
-          <w:sz w:val="24"/>
-          <w:szCs w:val="24"/>
-        </w:rPr>
-        <w:t xml:space="preserve">. Styringsmodellen anvender både den aktuelle luftfugtighed i lokalet og den aktuelle elpris for at afgøre, om smart plug’en skal være tændt eller slukket, og styrer på denne måde affugteren. </w:t>
+        <w:t xml:space="preserve">Systemet styrer affugteren automatisk og sørger for, at strømforbruget så vidt muligt placeres i døgnets billigste kvarterer. Styringsmodellen anvender både den aktuelle luftfugtighed i lokalet og den aktuelle elpris for at afgøre, om smart plug’en skal være tændt eller slukket, og styrer på denne måde affugteren. </w:t>
       </w:r>
     </w:p>
     <w:p>
@@ -2304,52 +1818,7 @@
           <w:sz w:val="24"/>
           <w:szCs w:val="24"/>
         </w:rPr>
-        <w:t xml:space="preserve">Når luftfugtigheden overstiger tændgrænsen, og det aktuelle kvarter </w:t>
-      </w:r>
-      <w:r>
-        <w:rPr>
-          <w:rStyle w:val="SourceText"/>
-          <w:rFonts w:ascii="Liberation Sans" w:hAnsi="Liberation Sans"/>
-          <w:sz w:val="24"/>
-          <w:szCs w:val="24"/>
-        </w:rPr>
-        <w:t>er billigt (se K-002)</w:t>
-      </w:r>
-      <w:r>
-        <w:rPr>
-          <w:rStyle w:val="SourceText"/>
-          <w:rFonts w:ascii="Liberation Sans" w:hAnsi="Liberation Sans"/>
-          <w:sz w:val="24"/>
-          <w:szCs w:val="24"/>
-        </w:rPr>
-        <w:t xml:space="preserve">, tændes affugteren. Den kører, indtil luftfugtigheden er under slukgrænsen, </w:t>
-      </w:r>
-      <w:r>
-        <w:rPr>
-          <w:rStyle w:val="SourceText"/>
-          <w:rFonts w:ascii="Liberation Sans" w:hAnsi="Liberation Sans"/>
-          <w:sz w:val="24"/>
-          <w:szCs w:val="24"/>
-        </w:rPr>
-        <w:t>eller kvarteret ikke længere er billigt</w:t>
-      </w:r>
-      <w:r>
-        <w:rPr>
-          <w:rStyle w:val="SourceText"/>
-          <w:rFonts w:ascii="Liberation Sans" w:hAnsi="Liberation Sans"/>
-          <w:sz w:val="24"/>
-          <w:szCs w:val="24"/>
-        </w:rPr>
-        <w:t xml:space="preserve">. Hvis luftfugtigheden overstiger den kritiske grænse, kører affugteren uanset elpris, indtil luftfugtigheden er under slukgrænsen. </w:t>
-      </w:r>
-      <w:r>
-        <w:rPr>
-          <w:rStyle w:val="SourceText"/>
-          <w:rFonts w:ascii="Liberation Sans" w:hAnsi="Liberation Sans"/>
-          <w:sz w:val="24"/>
-          <w:szCs w:val="24"/>
-        </w:rPr>
-        <w:t>Dette gælder dog ikke i de foruddefinerede tidsrum (K-018), hvor driften er begrænset.</w:t>
+        <w:t>Når luftfugtigheden overstiger tændgrænsen, og det aktuelle kvarter er billigt (se K-002), tændes affugteren. Den kører, indtil luftfugtigheden er under slukgrænsen, eller kvarteret ikke længere er billigt. Hvis luftfugtigheden overstiger den kritiske grænse, kører affugteren uanset elpris, indtil luftfugtigheden er under slukgrænsen. Dette gælder dog ikke i de foruddefinerede tidsrum (K-018), hvor driften er begrænset.</w:t>
       </w:r>
     </w:p>
     <w:p>
@@ -2365,25 +1834,7 @@
           <w:sz w:val="24"/>
           <w:szCs w:val="24"/>
         </w:rPr>
-        <w:t xml:space="preserve">For at beskytte kompressoren må </w:t>
-      </w:r>
-      <w:r>
-        <w:rPr>
-          <w:rStyle w:val="SourceText"/>
-          <w:rFonts w:ascii="Liberation Sans" w:hAnsi="Liberation Sans"/>
-          <w:sz w:val="24"/>
-          <w:szCs w:val="24"/>
-        </w:rPr>
-        <w:t>affugter</w:t>
-      </w:r>
-      <w:r>
-        <w:rPr>
-          <w:rStyle w:val="SourceText"/>
-          <w:rFonts w:ascii="Liberation Sans" w:hAnsi="Liberation Sans"/>
-          <w:sz w:val="24"/>
-          <w:szCs w:val="24"/>
-        </w:rPr>
-        <w:t>en tidligst tændes 15 minutter efter sidste slukning (se K-006). Ved normal slukning på tænd/sluk-knappen kører blæseren videre i nogle sekunder for at fjerne den varme luft inde i enheden (bilag 2, s. 9). Når strømmen afbrydes via smart plug’en, sker dette ikke. Brugsanvisningen angiver ikke et minimumsinterval, mens andre eeese-affugtere angiver ca. 3 minutter, før kompressoren arbejder igen. Gruppen har derfor valgt 15 minutter som sikkerhedsmargin. Minimumsintervallet gælder i alle driftstilstande, også ved kritisk luftfugtighed og ved fejl.</w:t>
+        <w:t>For at beskytte kompressoren må affugteren tidligst tændes 15 minutter efter sidste slukning (se K-006). Ved normal slukning på tænd/sluk-knappen kører blæseren videre i nogle sekunder for at fjerne den varme luft inde i enheden (bilag 2, s. 9). Når strømmen afbrydes via smart plug’en, sker dette ikke. Brugsanvisningen angiver ikke et minimumsinterval, mens andre eeese-affugtere angiver ca. 3 minutter, før kompressoren arbejder igen. Gruppen har derfor valgt 15 minutter som sikkerhedsmargin. Minimumsintervallet gælder i alle driftstilstande, også ved kritisk luftfugtighed og ved fejl.</w:t>
       </w:r>
     </w:p>
     <w:p>
@@ -2399,7 +1850,7 @@
           <w:sz w:val="24"/>
           <w:szCs w:val="24"/>
         </w:rPr>
-        <w:t xml:space="preserve">Systemet anvender tænd/sluk-regulering med hysterese. Affugteren kan kun tændes og slukkes via smart plug’en, og luftfugtigheden kan </w:t>
+        <w:t xml:space="preserve">Systemet anvender tænd/sluk-regulering med hysterese </w:t>
       </w:r>
       <w:r>
         <w:rPr>
@@ -2408,7 +1859,7 @@
           <w:sz w:val="24"/>
           <w:szCs w:val="24"/>
         </w:rPr>
-        <w:t xml:space="preserve">derfor </w:t>
+        <w:t>og ikke en gradueret regulering (fx PID)</w:t>
       </w:r>
       <w:r>
         <w:rPr>
@@ -2417,7 +1868,7 @@
           <w:sz w:val="24"/>
           <w:szCs w:val="24"/>
         </w:rPr>
-        <w:t>overstige den kritiske grænse i to situationer:</w:t>
+        <w:t>. Affugteren kan kun tændes og slukkes via smart plug’en, og luftfugtigheden kan derfor overstige den kritiske grænse i to situationer:</w:t>
       </w:r>
     </w:p>
     <w:p>
@@ -2449,61 +1900,7 @@
           <w:sz w:val="24"/>
           <w:szCs w:val="24"/>
         </w:rPr>
-        <w:t xml:space="preserve">2. </w:t>
-      </w:r>
-      <w:r>
-        <w:rPr>
-          <w:rStyle w:val="SourceText"/>
-          <w:rFonts w:ascii="Liberation Sans" w:hAnsi="Liberation Sans"/>
-          <w:sz w:val="24"/>
-          <w:szCs w:val="24"/>
-        </w:rPr>
-        <w:t>Dark time</w:t>
-      </w:r>
-      <w:r>
-        <w:rPr>
-          <w:rStyle w:val="SourceText"/>
-          <w:rFonts w:ascii="Liberation Sans" w:hAnsi="Liberation Sans"/>
-          <w:sz w:val="24"/>
-          <w:szCs w:val="24"/>
-        </w:rPr>
-        <w:t xml:space="preserve"> (K-018): i disse ti</w:t>
-      </w:r>
-      <w:r>
-        <w:rPr>
-          <w:rStyle w:val="SourceText"/>
-          <w:rFonts w:ascii="Liberation Sans" w:hAnsi="Liberation Sans"/>
-          <w:sz w:val="24"/>
-          <w:szCs w:val="24"/>
-        </w:rPr>
-        <w:t>d</w:t>
-      </w:r>
-      <w:r>
-        <w:rPr>
-          <w:rStyle w:val="SourceText"/>
-          <w:rFonts w:ascii="Liberation Sans" w:hAnsi="Liberation Sans"/>
-          <w:sz w:val="24"/>
-          <w:szCs w:val="24"/>
-        </w:rPr>
-        <w:t>srum er driften begrænset, også når luftfugtigheden overstiger den kritiske grænse. Luftfugtigheden kan derfor overstige den kritiske grænse i hele tidsrummet og sænkes først, når ti</w:t>
-      </w:r>
-      <w:r>
-        <w:rPr>
-          <w:rStyle w:val="SourceText"/>
-          <w:rFonts w:ascii="Liberation Sans" w:hAnsi="Liberation Sans"/>
-          <w:sz w:val="24"/>
-          <w:szCs w:val="24"/>
-        </w:rPr>
-        <w:t>d</w:t>
-      </w:r>
-      <w:r>
-        <w:rPr>
-          <w:rStyle w:val="SourceText"/>
-          <w:rFonts w:ascii="Liberation Sans" w:hAnsi="Liberation Sans"/>
-          <w:sz w:val="24"/>
-          <w:szCs w:val="24"/>
-        </w:rPr>
-        <w:t>srummet slutter.</w:t>
+        <w:t>2. Dark time (K-018): i disse tidsrum er driften begrænset, også når luftfugtigheden overstiger den kritiske grænse. Luftfugtigheden kan derfor overstige den kritiske grænse i hele tidsrummet og sænkes først, når tidsrummet slutter.</w:t>
       </w:r>
     </w:p>
     <w:p>
@@ -2866,70 +2263,7 @@
                 <w:sz w:val="22"/>
                 <w:szCs w:val="22"/>
               </w:rPr>
-              <w:t>Affugteren skal tændes, når luftfugtigheden overstiger tændgrænsen på [65] % RH, og de</w:t>
-            </w:r>
-            <w:r>
-              <w:rPr>
-                <w:rStyle w:val="SourceText"/>
-                <w:rFonts w:ascii="Liberation Sans" w:hAnsi="Liberation Sans"/>
-                <w:sz w:val="22"/>
-                <w:szCs w:val="22"/>
-              </w:rPr>
-              <w:t xml:space="preserve">t </w:t>
-            </w:r>
-            <w:r>
-              <w:rPr>
-                <w:rStyle w:val="SourceText"/>
-                <w:rFonts w:ascii="Liberation Sans" w:hAnsi="Liberation Sans"/>
-                <w:sz w:val="22"/>
-                <w:szCs w:val="22"/>
-              </w:rPr>
-              <w:t xml:space="preserve">aktuelle </w:t>
-            </w:r>
-            <w:r>
-              <w:rPr>
-                <w:rStyle w:val="SourceText"/>
-                <w:rFonts w:ascii="Liberation Sans" w:hAnsi="Liberation Sans"/>
-                <w:sz w:val="22"/>
-                <w:szCs w:val="22"/>
-              </w:rPr>
-              <w:t>kvarter er billigt</w:t>
-            </w:r>
-            <w:r>
-              <w:rPr>
-                <w:rStyle w:val="SourceText"/>
-                <w:rFonts w:ascii="Liberation Sans" w:hAnsi="Liberation Sans"/>
-                <w:sz w:val="22"/>
-                <w:szCs w:val="22"/>
-              </w:rPr>
-              <w:t xml:space="preserve"> (se K-002). En tændt affugter skal køre videre, indtil luftfugtigheden er under slukgrænsen på 50 % RH, eller d</w:t>
-            </w:r>
-            <w:r>
-              <w:rPr>
-                <w:rStyle w:val="SourceText"/>
-                <w:rFonts w:ascii="Liberation Sans" w:hAnsi="Liberation Sans"/>
-                <w:sz w:val="22"/>
-                <w:szCs w:val="22"/>
-              </w:rPr>
-              <w:t>et aktuelle kvarter ikke længere er bi</w:t>
-            </w:r>
-            <w:r>
-              <w:rPr>
-                <w:rStyle w:val="SourceText"/>
-                <w:rFonts w:ascii="Liberation Sans" w:hAnsi="Liberation Sans"/>
-                <w:sz w:val="22"/>
-                <w:szCs w:val="22"/>
-              </w:rPr>
-              <w:t>lli</w:t>
-            </w:r>
-            <w:r>
-              <w:rPr>
-                <w:rStyle w:val="SourceText"/>
-                <w:rFonts w:ascii="Liberation Sans" w:hAnsi="Liberation Sans"/>
-                <w:sz w:val="22"/>
-                <w:szCs w:val="22"/>
-              </w:rPr>
-              <w:t>gt.</w:t>
+              <w:t>Affugteren skal tændes, når luftfugtigheden overstiger tændgrænsen på [65] % RH, og det aktuelle kvarter er billigt (se K-002). En tændt affugter skal køre videre, indtil luftfugtigheden er under slukgrænsen på 50 % RH, eller det aktuelle kvarter ikke længere er billigt.</w:t>
             </w:r>
           </w:p>
         </w:tc>
@@ -3409,142 +2743,7 @@
           <w:lang w:val="da-DK" w:eastAsia="en-US" w:bidi="ar-SA"/>
           <w14:ligatures w14:val="standardContextual"/>
         </w:rPr>
-        <w:t>Use case 1: Normal drift i billig</w:t>
-      </w:r>
-      <w:r>
-        <w:rPr>
-          <w:rStyle w:val="SourceText"/>
-          <w:rFonts w:cs="" w:ascii="Liberation Sans" w:hAnsi="Liberation Sans" w:cstheme="minorBidi"/>
-          <w:b/>
-          <w:bCs/>
-          <w:color w:val="auto"/>
-          <w:kern w:val="2"/>
-          <w:sz w:val="24"/>
-          <w:szCs w:val="24"/>
-          <w:lang w:val="da-DK" w:eastAsia="en-US" w:bidi="ar-SA"/>
-          <w14:ligatures w14:val="standardContextual"/>
-        </w:rPr>
-        <w:t>t</w:t>
-      </w:r>
-      <w:r>
-        <w:rPr>
-          <w:rStyle w:val="SourceText"/>
-          <w:rFonts w:cs="" w:ascii="Liberation Sans" w:hAnsi="Liberation Sans" w:cstheme="minorBidi"/>
-          <w:b/>
-          <w:bCs/>
-          <w:color w:val="auto"/>
-          <w:kern w:val="2"/>
-          <w:sz w:val="24"/>
-          <w:szCs w:val="24"/>
-          <w:lang w:val="da-DK" w:eastAsia="en-US" w:bidi="ar-SA"/>
-          <w14:ligatures w14:val="standardContextual"/>
-        </w:rPr>
-        <w:t xml:space="preserve"> </w:t>
-      </w:r>
-      <w:r>
-        <w:rPr>
-          <w:rStyle w:val="SourceText"/>
-          <w:rFonts w:cs="" w:ascii="Liberation Sans" w:hAnsi="Liberation Sans" w:cstheme="minorBidi"/>
-          <w:b/>
-          <w:bCs/>
-          <w:color w:val="auto"/>
-          <w:kern w:val="2"/>
-          <w:sz w:val="24"/>
-          <w:szCs w:val="24"/>
-          <w:lang w:val="da-DK" w:eastAsia="en-US" w:bidi="ar-SA"/>
-          <w14:ligatures w14:val="standardContextual"/>
-        </w:rPr>
-        <w:t>k</w:t>
-      </w:r>
-      <w:r>
-        <w:rPr>
-          <w:rStyle w:val="SourceText"/>
-          <w:rFonts w:cs="" w:ascii="Liberation Sans" w:hAnsi="Liberation Sans" w:cstheme="minorBidi"/>
-          <w:b/>
-          <w:bCs/>
-          <w:color w:val="auto"/>
-          <w:kern w:val="2"/>
-          <w:sz w:val="24"/>
-          <w:szCs w:val="24"/>
-          <w:lang w:val="da-DK" w:eastAsia="en-US" w:bidi="ar-SA"/>
-          <w14:ligatures w14:val="standardContextual"/>
-        </w:rPr>
-        <w:t>v</w:t>
-      </w:r>
-      <w:r>
-        <w:rPr>
-          <w:rStyle w:val="SourceText"/>
-          <w:rFonts w:cs="" w:ascii="Liberation Sans" w:hAnsi="Liberation Sans" w:cstheme="minorBidi"/>
-          <w:b/>
-          <w:bCs/>
-          <w:color w:val="auto"/>
-          <w:kern w:val="2"/>
-          <w:sz w:val="24"/>
-          <w:szCs w:val="24"/>
-          <w:lang w:val="da-DK" w:eastAsia="en-US" w:bidi="ar-SA"/>
-          <w14:ligatures w14:val="standardContextual"/>
-        </w:rPr>
-        <w:t>a</w:t>
-      </w:r>
-      <w:r>
-        <w:rPr>
-          <w:rStyle w:val="SourceText"/>
-          <w:rFonts w:cs="" w:ascii="Liberation Sans" w:hAnsi="Liberation Sans" w:cstheme="minorBidi"/>
-          <w:b/>
-          <w:bCs/>
-          <w:color w:val="auto"/>
-          <w:kern w:val="2"/>
-          <w:sz w:val="24"/>
-          <w:szCs w:val="24"/>
-          <w:lang w:val="da-DK" w:eastAsia="en-US" w:bidi="ar-SA"/>
-          <w14:ligatures w14:val="standardContextual"/>
-        </w:rPr>
-        <w:t>r</w:t>
-      </w:r>
-      <w:r>
-        <w:rPr>
-          <w:rStyle w:val="SourceText"/>
-          <w:rFonts w:cs="" w:ascii="Liberation Sans" w:hAnsi="Liberation Sans" w:cstheme="minorBidi"/>
-          <w:b/>
-          <w:bCs/>
-          <w:color w:val="auto"/>
-          <w:kern w:val="2"/>
-          <w:sz w:val="24"/>
-          <w:szCs w:val="24"/>
-          <w:lang w:val="da-DK" w:eastAsia="en-US" w:bidi="ar-SA"/>
-          <w14:ligatures w14:val="standardContextual"/>
-        </w:rPr>
-        <w:t>t</w:t>
-      </w:r>
-      <w:r>
-        <w:rPr>
-          <w:rStyle w:val="SourceText"/>
-          <w:rFonts w:cs="" w:ascii="Liberation Sans" w:hAnsi="Liberation Sans" w:cstheme="minorBidi"/>
-          <w:b/>
-          <w:bCs/>
-          <w:color w:val="auto"/>
-          <w:kern w:val="2"/>
-          <w:sz w:val="24"/>
-          <w:szCs w:val="24"/>
-          <w:lang w:val="da-DK" w:eastAsia="en-US" w:bidi="ar-SA"/>
-          <w14:ligatures w14:val="standardContextual"/>
-        </w:rPr>
-        <w:t>e</w:t>
-      </w:r>
-      <w:r>
-        <w:rPr>
-          <w:rStyle w:val="SourceText"/>
-          <w:rFonts w:cs="" w:ascii="Liberation Sans" w:hAnsi="Liberation Sans" w:cstheme="minorBidi"/>
-          <w:b/>
-          <w:bCs/>
-          <w:color w:val="auto"/>
-          <w:kern w:val="2"/>
-          <w:sz w:val="24"/>
-          <w:szCs w:val="24"/>
-          <w:lang w:val="da-DK" w:eastAsia="en-US" w:bidi="ar-SA"/>
-          <w14:ligatures w14:val="standardContextual"/>
-        </w:rPr>
-        <w:t>r</w:t>
+        <w:t>Use case 1: Normal drift i billigt kvarter</w:t>
       </w:r>
       <w:r>
         <w:rPr>
@@ -3590,61 +2789,7 @@
           <w:sz w:val="24"/>
           <w:szCs w:val="24"/>
         </w:rPr>
-        <w:t>2. Systemet kontrollerer, at de</w:t>
-      </w:r>
-      <w:r>
-        <w:rPr>
-          <w:rStyle w:val="SourceText"/>
-          <w:rFonts w:ascii="Liberation Sans" w:hAnsi="Liberation Sans"/>
-          <w:sz w:val="24"/>
-          <w:szCs w:val="24"/>
-        </w:rPr>
-        <w:t>t</w:t>
-      </w:r>
-      <w:r>
-        <w:rPr>
-          <w:rStyle w:val="SourceText"/>
-          <w:rFonts w:ascii="Liberation Sans" w:hAnsi="Liberation Sans"/>
-          <w:sz w:val="24"/>
-          <w:szCs w:val="24"/>
-        </w:rPr>
-        <w:t xml:space="preserve"> aktuelle </w:t>
-      </w:r>
-      <w:r>
-        <w:rPr>
-          <w:rStyle w:val="SourceText"/>
-          <w:rFonts w:ascii="Liberation Sans" w:hAnsi="Liberation Sans"/>
-          <w:sz w:val="24"/>
-          <w:szCs w:val="24"/>
-        </w:rPr>
-        <w:t>kvarter</w:t>
-      </w:r>
-      <w:r>
-        <w:rPr>
-          <w:rStyle w:val="SourceText"/>
-          <w:rFonts w:ascii="Liberation Sans" w:hAnsi="Liberation Sans"/>
-          <w:sz w:val="24"/>
-          <w:szCs w:val="24"/>
-        </w:rPr>
-        <w:t xml:space="preserve"> </w:t>
-      </w:r>
-      <w:r>
-        <w:rPr>
-          <w:rStyle w:val="SourceText"/>
-          <w:rFonts w:ascii="Liberation Sans" w:hAnsi="Liberation Sans"/>
-          <w:sz w:val="24"/>
-          <w:szCs w:val="24"/>
-        </w:rPr>
-        <w:t>er billigt.</w:t>
-      </w:r>
-      <w:r>
-        <w:rPr>
-          <w:rStyle w:val="SourceText"/>
-          <w:rFonts w:ascii="Liberation Sans" w:hAnsi="Liberation Sans"/>
-          <w:sz w:val="24"/>
-          <w:szCs w:val="24"/>
-        </w:rPr>
-        <w:t xml:space="preserve"> </w:t>
+        <w:t xml:space="preserve">2. Systemet kontrollerer, at det aktuelle kvarter er billigt. </w:t>
       </w:r>
     </w:p>
     <w:p>
@@ -3692,25 +2837,7 @@
           <w:sz w:val="24"/>
           <w:szCs w:val="24"/>
         </w:rPr>
-        <w:t xml:space="preserve">Resultat: Luftfugtigheden er sænket, og strømmen er brugt i </w:t>
-      </w:r>
-      <w:r>
-        <w:rPr>
-          <w:rStyle w:val="SourceText"/>
-          <w:rFonts w:ascii="Liberation Sans" w:hAnsi="Liberation Sans"/>
-          <w:sz w:val="24"/>
-          <w:szCs w:val="24"/>
-        </w:rPr>
-        <w:t>billige kvarterer</w:t>
-      </w:r>
-      <w:r>
-        <w:rPr>
-          <w:rStyle w:val="SourceText"/>
-          <w:rFonts w:ascii="Liberation Sans" w:hAnsi="Liberation Sans"/>
-          <w:sz w:val="24"/>
-          <w:szCs w:val="24"/>
-        </w:rPr>
-        <w:t>.</w:t>
+        <w:t>Resultat: Luftfugtigheden er sænket, og strømmen er brugt i billige kvarterer.</w:t>
         <w:br/>
         <w:t>Relaterede krav: K-001, K-002, K-004, K-006, K-009</w:t>
       </w:r>
@@ -3764,24 +2891,7 @@
         <w:br/>
         <w:t>Aktører: Luftfugtighedssensor, smart plug</w:t>
         <w:br/>
-        <w:t xml:space="preserve">Forudsætning: Affugteren er slukket, minimumsintervallet er gået, </w:t>
-      </w:r>
-      <w:r>
-        <w:rPr>
-          <w:rStyle w:val="SourceText"/>
-          <w:rFonts w:ascii="Liberation Sans" w:hAnsi="Liberation Sans"/>
-          <w:sz w:val="24"/>
-          <w:szCs w:val="24"/>
-        </w:rPr>
-        <w:t>og det er ikke dark time.</w:t>
-      </w:r>
-      <w:r>
-        <w:rPr>
-          <w:rStyle w:val="SourceText"/>
-          <w:rFonts w:ascii="Liberation Sans" w:hAnsi="Liberation Sans"/>
-          <w:sz w:val="24"/>
-          <w:szCs w:val="24"/>
-        </w:rPr>
+        <w:t>Forudsætning: Affugteren er slukket, minimumsintervallet er gået, og det er ikke dark time.</w:t>
         <w:br/>
         <w:t>Forløb:</w:t>
       </w:r>
@@ -3799,25 +2909,7 @@
           <w:sz w:val="24"/>
           <w:szCs w:val="24"/>
         </w:rPr>
-        <w:t xml:space="preserve">1. Sensoren måler en luftfugtighed over </w:t>
-      </w:r>
-      <w:r>
-        <w:rPr>
-          <w:rStyle w:val="SourceText"/>
-          <w:rFonts w:ascii="Liberation Sans" w:hAnsi="Liberation Sans"/>
-          <w:sz w:val="24"/>
-          <w:szCs w:val="24"/>
-        </w:rPr>
-        <w:t>den</w:t>
-      </w:r>
-      <w:r>
-        <w:rPr>
-          <w:rStyle w:val="SourceText"/>
-          <w:rFonts w:ascii="Liberation Sans" w:hAnsi="Liberation Sans"/>
-          <w:sz w:val="24"/>
-          <w:szCs w:val="24"/>
-        </w:rPr>
-        <w:t xml:space="preserve"> kritiske grænse. </w:t>
+        <w:t xml:space="preserve">1. Sensoren måler en luftfugtighed over den kritiske grænse. </w:t>
       </w:r>
     </w:p>
     <w:p>
@@ -3833,43 +2925,7 @@
           <w:sz w:val="24"/>
           <w:szCs w:val="24"/>
         </w:rPr>
-        <w:t xml:space="preserve">2. Systemet </w:t>
-      </w:r>
-      <w:r>
-        <w:rPr>
-          <w:rStyle w:val="SourceText"/>
-          <w:rFonts w:ascii="Liberation Sans" w:hAnsi="Liberation Sans"/>
-          <w:sz w:val="24"/>
-          <w:szCs w:val="24"/>
-        </w:rPr>
-        <w:t>afgør, at affugteren</w:t>
-      </w:r>
-      <w:r>
-        <w:rPr>
-          <w:rStyle w:val="SourceText"/>
-          <w:rFonts w:ascii="Liberation Sans" w:hAnsi="Liberation Sans"/>
-          <w:sz w:val="24"/>
-          <w:szCs w:val="24"/>
-        </w:rPr>
-        <w:t xml:space="preserve"> skal tændes u</w:t>
-      </w:r>
-      <w:r>
-        <w:rPr>
-          <w:rStyle w:val="SourceText"/>
-          <w:rFonts w:ascii="Liberation Sans" w:hAnsi="Liberation Sans"/>
-          <w:sz w:val="24"/>
-          <w:szCs w:val="24"/>
-        </w:rPr>
-        <w:t>an</w:t>
-      </w:r>
-      <w:r>
-        <w:rPr>
-          <w:rStyle w:val="SourceText"/>
-          <w:rFonts w:ascii="Liberation Sans" w:hAnsi="Liberation Sans"/>
-          <w:sz w:val="24"/>
-          <w:szCs w:val="24"/>
-        </w:rPr>
-        <w:t xml:space="preserve">set elpris. </w:t>
+        <w:t xml:space="preserve">2. Systemet afgør, at affugteren skal tændes uanset elpris. </w:t>
       </w:r>
     </w:p>
     <w:p>
@@ -3934,7 +2990,11 @@
         </w:rPr>
       </w:pPr>
       <w:r>
-        <w:rPr/>
+        <w:rPr>
+          <w:rFonts w:ascii="Liberation Sans" w:hAnsi="Liberation Sans"/>
+          <w:sz w:val="24"/>
+          <w:szCs w:val="24"/>
+        </w:rPr>
       </w:r>
     </w:p>
     <w:p>
@@ -3956,142 +3016,7 @@
           <w:lang w:val="da-DK" w:eastAsia="en-US" w:bidi="ar-SA"/>
           <w14:ligatures w14:val="standardContextual"/>
         </w:rPr>
-        <w:t xml:space="preserve">Use case </w:t>
-      </w:r>
-      <w:r>
-        <w:rPr>
-          <w:rStyle w:val="SourceText"/>
-          <w:rFonts w:cs="" w:ascii="Liberation Sans" w:hAnsi="Liberation Sans" w:cstheme="minorBidi"/>
-          <w:b/>
-          <w:bCs/>
-          <w:color w:val="auto"/>
-          <w:kern w:val="2"/>
-          <w:sz w:val="24"/>
-          <w:szCs w:val="24"/>
-          <w:lang w:val="da-DK" w:eastAsia="en-US" w:bidi="ar-SA"/>
-          <w14:ligatures w14:val="standardContextual"/>
-        </w:rPr>
-        <w:t>3</w:t>
-      </w:r>
-      <w:r>
-        <w:rPr>
-          <w:rStyle w:val="SourceText"/>
-          <w:rFonts w:cs="" w:ascii="Liberation Sans" w:hAnsi="Liberation Sans" w:cstheme="minorBidi"/>
-          <w:b/>
-          <w:bCs/>
-          <w:color w:val="auto"/>
-          <w:kern w:val="2"/>
-          <w:sz w:val="24"/>
-          <w:szCs w:val="24"/>
-          <w:lang w:val="da-DK" w:eastAsia="en-US" w:bidi="ar-SA"/>
-          <w14:ligatures w14:val="standardContextual"/>
-        </w:rPr>
-        <w:t>: D</w:t>
-      </w:r>
-      <w:r>
-        <w:rPr>
-          <w:rStyle w:val="SourceText"/>
-          <w:rFonts w:cs="" w:ascii="Liberation Sans" w:hAnsi="Liberation Sans" w:cstheme="minorBidi"/>
-          <w:b/>
-          <w:bCs/>
-          <w:color w:val="auto"/>
-          <w:kern w:val="2"/>
-          <w:sz w:val="24"/>
-          <w:szCs w:val="24"/>
-          <w:lang w:val="da-DK" w:eastAsia="en-US" w:bidi="ar-SA"/>
-          <w14:ligatures w14:val="standardContextual"/>
-        </w:rPr>
-        <w:t>a</w:t>
-      </w:r>
-      <w:r>
-        <w:rPr>
-          <w:rStyle w:val="SourceText"/>
-          <w:rFonts w:cs="" w:ascii="Liberation Sans" w:hAnsi="Liberation Sans" w:cstheme="minorBidi"/>
-          <w:b/>
-          <w:bCs/>
-          <w:color w:val="auto"/>
-          <w:kern w:val="2"/>
-          <w:sz w:val="24"/>
-          <w:szCs w:val="24"/>
-          <w:lang w:val="da-DK" w:eastAsia="en-US" w:bidi="ar-SA"/>
-          <w14:ligatures w14:val="standardContextual"/>
-        </w:rPr>
-        <w:t>r</w:t>
-      </w:r>
-      <w:r>
-        <w:rPr>
-          <w:rStyle w:val="SourceText"/>
-          <w:rFonts w:cs="" w:ascii="Liberation Sans" w:hAnsi="Liberation Sans" w:cstheme="minorBidi"/>
-          <w:b/>
-          <w:bCs/>
-          <w:color w:val="auto"/>
-          <w:kern w:val="2"/>
-          <w:sz w:val="24"/>
-          <w:szCs w:val="24"/>
-          <w:lang w:val="da-DK" w:eastAsia="en-US" w:bidi="ar-SA"/>
-          <w14:ligatures w14:val="standardContextual"/>
-        </w:rPr>
-        <w:t xml:space="preserve">k </w:t>
-      </w:r>
-      <w:r>
-        <w:rPr>
-          <w:rStyle w:val="SourceText"/>
-          <w:rFonts w:cs="" w:ascii="Liberation Sans" w:hAnsi="Liberation Sans" w:cstheme="minorBidi"/>
-          <w:b/>
-          <w:bCs/>
-          <w:color w:val="auto"/>
-          <w:kern w:val="2"/>
-          <w:sz w:val="24"/>
-          <w:szCs w:val="24"/>
-          <w:lang w:val="da-DK" w:eastAsia="en-US" w:bidi="ar-SA"/>
-          <w14:ligatures w14:val="standardContextual"/>
-        </w:rPr>
-        <w:t>t</w:t>
-      </w:r>
-      <w:r>
-        <w:rPr>
-          <w:rStyle w:val="SourceText"/>
-          <w:rFonts w:cs="" w:ascii="Liberation Sans" w:hAnsi="Liberation Sans" w:cstheme="minorBidi"/>
-          <w:b/>
-          <w:bCs/>
-          <w:color w:val="auto"/>
-          <w:kern w:val="2"/>
-          <w:sz w:val="24"/>
-          <w:szCs w:val="24"/>
-          <w:lang w:val="da-DK" w:eastAsia="en-US" w:bidi="ar-SA"/>
-          <w14:ligatures w14:val="standardContextual"/>
-        </w:rPr>
-        <w:t>i</w:t>
-      </w:r>
-      <w:r>
-        <w:rPr>
-          <w:rStyle w:val="SourceText"/>
-          <w:rFonts w:cs="" w:ascii="Liberation Sans" w:hAnsi="Liberation Sans" w:cstheme="minorBidi"/>
-          <w:b/>
-          <w:bCs/>
-          <w:color w:val="auto"/>
-          <w:kern w:val="2"/>
-          <w:sz w:val="24"/>
-          <w:szCs w:val="24"/>
-          <w:lang w:val="da-DK" w:eastAsia="en-US" w:bidi="ar-SA"/>
-          <w14:ligatures w14:val="standardContextual"/>
-        </w:rPr>
-        <w:t>m</w:t>
-      </w:r>
-      <w:r>
-        <w:rPr>
-          <w:rStyle w:val="SourceText"/>
-          <w:rFonts w:cs="" w:ascii="Liberation Sans" w:hAnsi="Liberation Sans" w:cstheme="minorBidi"/>
-          <w:b/>
-          <w:bCs/>
-          <w:color w:val="auto"/>
-          <w:kern w:val="2"/>
-          <w:sz w:val="24"/>
-          <w:szCs w:val="24"/>
-          <w:lang w:val="da-DK" w:eastAsia="en-US" w:bidi="ar-SA"/>
-          <w14:ligatures w14:val="standardContextual"/>
-        </w:rPr>
-        <w:t>e</w:t>
+        <w:t>Use case 3: Dark time</w:t>
       </w:r>
     </w:p>
     <w:p>
@@ -4103,7 +3028,7 @@
       <w:r>
         <w:rPr>
           <w:rStyle w:val="SourceText"/>
-          <w:rFonts w:ascii="Liberation Sans" w:hAnsi="Liberation Sans" w:cstheme="minorBidi"/>
+          <w:rFonts w:cs="" w:ascii="Liberation Sans" w:hAnsi="Liberation Sans" w:cstheme="minorBidi"/>
           <w:color w:val="auto"/>
           <w:kern w:val="2"/>
           <w:sz w:val="24"/>
@@ -4121,24 +3046,7 @@
           <w:szCs w:val="24"/>
         </w:rPr>
         <w:br/>
-        <w:t xml:space="preserve">Forudsætning: Affugteren </w:t>
-      </w:r>
-      <w:r>
-        <w:rPr>
-          <w:rStyle w:val="SourceText"/>
-          <w:rFonts w:ascii="Liberation Sans" w:hAnsi="Liberation Sans"/>
-          <w:sz w:val="24"/>
-          <w:szCs w:val="24"/>
-        </w:rPr>
-        <w:t>kører kl. 21.55 pga, kritisk luftfugtighed,</w:t>
-      </w:r>
-      <w:r>
-        <w:rPr>
-          <w:rStyle w:val="SourceText"/>
-          <w:rFonts w:ascii="Liberation Sans" w:hAnsi="Liberation Sans"/>
-          <w:sz w:val="24"/>
-          <w:szCs w:val="24"/>
-        </w:rPr>
+        <w:t>Forudsætning: Affugteren kører kl. 21.55 pga, kritisk luftfugtighed,</w:t>
         <w:br/>
         <w:t>Forløb:</w:t>
       </w:r>
@@ -4156,25 +3064,7 @@
           <w:sz w:val="24"/>
           <w:szCs w:val="24"/>
         </w:rPr>
-        <w:t xml:space="preserve">1. </w:t>
-      </w:r>
-      <w:r>
-        <w:rPr>
-          <w:rStyle w:val="SourceText"/>
-          <w:rFonts w:ascii="Liberation Sans" w:hAnsi="Liberation Sans"/>
-          <w:sz w:val="24"/>
-          <w:szCs w:val="24"/>
-        </w:rPr>
-        <w:t>Klokken bliver 22.00</w:t>
-      </w:r>
-      <w:r>
-        <w:rPr>
-          <w:rStyle w:val="SourceText"/>
-          <w:rFonts w:ascii="Liberation Sans" w:hAnsi="Liberation Sans"/>
-          <w:sz w:val="24"/>
-          <w:szCs w:val="24"/>
-        </w:rPr>
-        <w:t xml:space="preserve">. </w:t>
+        <w:t xml:space="preserve">1. Klokken bliver 22.00. </w:t>
       </w:r>
     </w:p>
     <w:p>
@@ -4190,43 +3080,7 @@
           <w:sz w:val="24"/>
           <w:szCs w:val="24"/>
         </w:rPr>
-        <w:t xml:space="preserve">2. Systemet </w:t>
-      </w:r>
-      <w:r>
-        <w:rPr>
-          <w:rStyle w:val="SourceText"/>
-          <w:rFonts w:ascii="Liberation Sans" w:hAnsi="Liberation Sans"/>
-          <w:sz w:val="24"/>
-          <w:szCs w:val="24"/>
-        </w:rPr>
-        <w:t>slukker</w:t>
-      </w:r>
-      <w:r>
-        <w:rPr>
-          <w:rStyle w:val="SourceText"/>
-          <w:rFonts w:ascii="Liberation Sans" w:hAnsi="Liberation Sans"/>
-          <w:sz w:val="24"/>
-          <w:szCs w:val="24"/>
-        </w:rPr>
-        <w:t xml:space="preserve"> smart plug'en </w:t>
-      </w:r>
-      <w:r>
-        <w:rPr>
-          <w:rStyle w:val="SourceText"/>
-          <w:rFonts w:ascii="Liberation Sans" w:hAnsi="Liberation Sans"/>
-          <w:sz w:val="24"/>
-          <w:szCs w:val="24"/>
-        </w:rPr>
-        <w:t>(K-018)</w:t>
-      </w:r>
-      <w:r>
-        <w:rPr>
-          <w:rStyle w:val="SourceText"/>
-          <w:rFonts w:ascii="Liberation Sans" w:hAnsi="Liberation Sans"/>
-          <w:sz w:val="24"/>
-          <w:szCs w:val="24"/>
-        </w:rPr>
-        <w:t xml:space="preserve">. </w:t>
+        <w:t xml:space="preserve">2. Systemet slukker smart plug'en (K-018). </w:t>
       </w:r>
     </w:p>
     <w:p>
@@ -4242,43 +3096,7 @@
           <w:sz w:val="24"/>
           <w:szCs w:val="24"/>
         </w:rPr>
-        <w:t>3</w:t>
-      </w:r>
-      <w:r>
-        <w:rPr>
-          <w:rStyle w:val="SourceText"/>
-          <w:rFonts w:ascii="Liberation Sans" w:hAnsi="Liberation Sans"/>
-          <w:sz w:val="24"/>
-          <w:szCs w:val="24"/>
-        </w:rPr>
-        <w:t xml:space="preserve">. Luftfugtigheden </w:t>
-      </w:r>
-      <w:r>
-        <w:rPr>
-          <w:rStyle w:val="SourceText"/>
-          <w:rFonts w:ascii="Liberation Sans" w:hAnsi="Liberation Sans"/>
-          <w:sz w:val="24"/>
-          <w:szCs w:val="24"/>
-        </w:rPr>
-        <w:t>stiger over den kritiske grænse kl. 23.</w:t>
-      </w:r>
-      <w:r>
-        <w:rPr>
-          <w:rStyle w:val="SourceText"/>
-          <w:rFonts w:ascii="Liberation Sans" w:hAnsi="Liberation Sans"/>
-          <w:sz w:val="24"/>
-          <w:szCs w:val="24"/>
-        </w:rPr>
-        <w:t>00</w:t>
-      </w:r>
-      <w:r>
-        <w:rPr>
-          <w:rStyle w:val="SourceText"/>
-          <w:rFonts w:ascii="Liberation Sans" w:hAnsi="Liberation Sans"/>
-          <w:sz w:val="24"/>
-          <w:szCs w:val="24"/>
-        </w:rPr>
-        <w:t>, men affugteren forbliver slukket.</w:t>
+        <w:t>3. Luftfugtigheden stiger over den kritiske grænse kl. 23.00, men affugteren forbliver slukket.</w:t>
       </w:r>
     </w:p>
     <w:p>
@@ -4294,70 +3112,7 @@
           <w:sz w:val="24"/>
           <w:szCs w:val="24"/>
         </w:rPr>
-        <w:t xml:space="preserve">4. Kl </w:t>
-      </w:r>
-      <w:r>
-        <w:rPr>
-          <w:rStyle w:val="SourceText"/>
-          <w:rFonts w:ascii="Liberation Sans" w:hAnsi="Liberation Sans"/>
-          <w:sz w:val="24"/>
-          <w:szCs w:val="24"/>
-        </w:rPr>
-        <w:t>0</w:t>
-      </w:r>
-      <w:r>
-        <w:rPr>
-          <w:rStyle w:val="SourceText"/>
-          <w:rFonts w:ascii="Liberation Sans" w:hAnsi="Liberation Sans"/>
-          <w:sz w:val="24"/>
-          <w:szCs w:val="24"/>
-        </w:rPr>
-        <w:t xml:space="preserve">6.00 gælder den almindelige </w:t>
-      </w:r>
-      <w:r>
-        <w:rPr>
-          <w:rStyle w:val="SourceText"/>
-          <w:rFonts w:ascii="Liberation Sans" w:hAnsi="Liberation Sans"/>
-          <w:sz w:val="24"/>
-          <w:szCs w:val="24"/>
-        </w:rPr>
-        <w:t xml:space="preserve">regler </w:t>
-      </w:r>
-      <w:r>
-        <w:rPr>
-          <w:rStyle w:val="SourceText"/>
-          <w:rFonts w:ascii="Liberation Sans" w:hAnsi="Liberation Sans"/>
-          <w:sz w:val="24"/>
-          <w:szCs w:val="24"/>
-        </w:rPr>
-        <w:t>i</w:t>
-      </w:r>
-      <w:r>
-        <w:rPr>
-          <w:rStyle w:val="SourceText"/>
-          <w:rFonts w:ascii="Liberation Sans" w:hAnsi="Liberation Sans"/>
-          <w:sz w:val="24"/>
-          <w:szCs w:val="24"/>
-        </w:rPr>
-        <w:t>ge</w:t>
-      </w:r>
-      <w:r>
-        <w:rPr>
-          <w:rStyle w:val="SourceText"/>
-          <w:rFonts w:ascii="Liberation Sans" w:hAnsi="Liberation Sans"/>
-          <w:sz w:val="24"/>
-          <w:szCs w:val="24"/>
-        </w:rPr>
-        <w:t>n (K-005)</w:t>
-      </w:r>
-      <w:r>
-        <w:rPr>
-          <w:rStyle w:val="SourceText"/>
-          <w:rFonts w:ascii="Liberation Sans" w:hAnsi="Liberation Sans"/>
-          <w:sz w:val="24"/>
-          <w:szCs w:val="24"/>
-        </w:rPr>
-        <w:t xml:space="preserve">. </w:t>
+        <w:t xml:space="preserve">4. Kl 06.00 gælder den almindelige regler igen (K-005). </w:t>
       </w:r>
     </w:p>
     <w:p>
@@ -4373,36 +3128,9 @@
           <w:sz w:val="24"/>
           <w:szCs w:val="24"/>
         </w:rPr>
-        <w:t xml:space="preserve">Resultat: </w:t>
-      </w:r>
-      <w:r>
-        <w:rPr>
-          <w:rStyle w:val="SourceText"/>
-          <w:rFonts w:ascii="Liberation Sans" w:hAnsi="Liberation Sans"/>
-          <w:sz w:val="24"/>
-          <w:szCs w:val="24"/>
-        </w:rPr>
-        <w:t>Dark time overholdes, selvom luftfugtigheden overstiger den kritiske grænse</w:t>
-      </w:r>
-      <w:r>
-        <w:rPr>
-          <w:rStyle w:val="SourceText"/>
-          <w:rFonts w:ascii="Liberation Sans" w:hAnsi="Liberation Sans"/>
-          <w:sz w:val="24"/>
-          <w:szCs w:val="24"/>
-        </w:rPr>
-        <w:t>.</w:t>
+        <w:t>Resultat: Dark time overholdes, selvom luftfugtigheden overstiger den kritiske grænse.</w:t>
         <w:br/>
-        <w:t>Relaterede krav: K-005, K-006, K-0</w:t>
-      </w:r>
-      <w:r>
-        <w:rPr>
-          <w:rStyle w:val="SourceText"/>
-          <w:rFonts w:ascii="Liberation Sans" w:hAnsi="Liberation Sans"/>
-          <w:sz w:val="24"/>
-          <w:szCs w:val="24"/>
-        </w:rPr>
-        <w:t>18</w:t>
+        <w:t>Relaterede krav: K-005, K-006, K-018</w:t>
       </w:r>
     </w:p>
     <w:p>
@@ -4417,7 +3145,11 @@
         </w:rPr>
       </w:pPr>
       <w:r>
-        <w:rPr/>
+        <w:rPr>
+          <w:rFonts w:ascii="Liberation Sans" w:hAnsi="Liberation Sans"/>
+          <w:sz w:val="24"/>
+          <w:szCs w:val="24"/>
+        </w:rPr>
       </w:r>
     </w:p>
     <w:p>
@@ -4481,8 +3213,8 @@
       </w:tblPr>
       <w:tblGrid>
         <w:gridCol w:w="360"/>
-        <w:gridCol w:w="4230"/>
-        <w:gridCol w:w="3600"/>
+        <w:gridCol w:w="4229"/>
+        <w:gridCol w:w="3601"/>
         <w:gridCol w:w="836"/>
       </w:tblGrid>
       <w:tr>
@@ -4518,7 +3250,7 @@
         </w:tc>
         <w:tc>
           <w:tcPr>
-            <w:tcW w:w="4230" w:type="dxa"/>
+            <w:tcW w:w="4229" w:type="dxa"/>
             <w:tcBorders>
               <w:top w:val="single" w:sz="12" w:space="0" w:color="000000"/>
               <w:bottom w:val="single" w:sz="6" w:space="0" w:color="000000"/>
@@ -4545,7 +3277,7 @@
         </w:tc>
         <w:tc>
           <w:tcPr>
-            <w:tcW w:w="3600" w:type="dxa"/>
+            <w:tcW w:w="3601" w:type="dxa"/>
             <w:tcBorders>
               <w:top w:val="single" w:sz="12" w:space="0" w:color="000000"/>
               <w:bottom w:val="single" w:sz="6" w:space="0" w:color="000000"/>
@@ -4626,7 +3358,7 @@
         </w:tc>
         <w:tc>
           <w:tcPr>
-            <w:tcW w:w="4230" w:type="dxa"/>
+            <w:tcW w:w="4229" w:type="dxa"/>
             <w:tcBorders>
               <w:bottom w:val="single" w:sz="4" w:space="0" w:color="999999"/>
             </w:tcBorders>
@@ -4650,7 +3382,7 @@
         </w:tc>
         <w:tc>
           <w:tcPr>
-            <w:tcW w:w="3600" w:type="dxa"/>
+            <w:tcW w:w="3601" w:type="dxa"/>
             <w:tcBorders>
               <w:bottom w:val="single" w:sz="4" w:space="0" w:color="999999"/>
             </w:tcBorders>
@@ -4725,7 +3457,7 @@
         </w:tc>
         <w:tc>
           <w:tcPr>
-            <w:tcW w:w="4230" w:type="dxa"/>
+            <w:tcW w:w="4229" w:type="dxa"/>
             <w:tcBorders>
               <w:bottom w:val="single" w:sz="4" w:space="0" w:color="999999"/>
             </w:tcBorders>
@@ -4749,7 +3481,7 @@
         </w:tc>
         <w:tc>
           <w:tcPr>
-            <w:tcW w:w="3600" w:type="dxa"/>
+            <w:tcW w:w="3601" w:type="dxa"/>
             <w:tcBorders>
               <w:bottom w:val="single" w:sz="4" w:space="0" w:color="999999"/>
             </w:tcBorders>
@@ -4824,7 +3556,7 @@
         </w:tc>
         <w:tc>
           <w:tcPr>
-            <w:tcW w:w="4230" w:type="dxa"/>
+            <w:tcW w:w="4229" w:type="dxa"/>
             <w:tcBorders>
               <w:bottom w:val="single" w:sz="4" w:space="0" w:color="999999"/>
             </w:tcBorders>
@@ -4848,7 +3580,7 @@
         </w:tc>
         <w:tc>
           <w:tcPr>
-            <w:tcW w:w="3600" w:type="dxa"/>
+            <w:tcW w:w="3601" w:type="dxa"/>
             <w:tcBorders>
               <w:bottom w:val="single" w:sz="4" w:space="0" w:color="999999"/>
             </w:tcBorders>
@@ -4923,7 +3655,7 @@
         </w:tc>
         <w:tc>
           <w:tcPr>
-            <w:tcW w:w="4230" w:type="dxa"/>
+            <w:tcW w:w="4229" w:type="dxa"/>
             <w:tcBorders>
               <w:bottom w:val="single" w:sz="4" w:space="0" w:color="999999"/>
             </w:tcBorders>
@@ -4947,7 +3679,7 @@
         </w:tc>
         <w:tc>
           <w:tcPr>
-            <w:tcW w:w="3600" w:type="dxa"/>
+            <w:tcW w:w="3601" w:type="dxa"/>
             <w:tcBorders>
               <w:bottom w:val="single" w:sz="4" w:space="0" w:color="999999"/>
             </w:tcBorders>
@@ -5022,7 +3754,7 @@
         </w:tc>
         <w:tc>
           <w:tcPr>
-            <w:tcW w:w="4230" w:type="dxa"/>
+            <w:tcW w:w="4229" w:type="dxa"/>
             <w:tcBorders>
               <w:bottom w:val="single" w:sz="4" w:space="0" w:color="999999"/>
             </w:tcBorders>
@@ -5046,7 +3778,7 @@
         </w:tc>
         <w:tc>
           <w:tcPr>
-            <w:tcW w:w="3600" w:type="dxa"/>
+            <w:tcW w:w="3601" w:type="dxa"/>
             <w:tcBorders>
               <w:bottom w:val="single" w:sz="4" w:space="0" w:color="999999"/>
             </w:tcBorders>
@@ -5121,7 +3853,7 @@
         </w:tc>
         <w:tc>
           <w:tcPr>
-            <w:tcW w:w="4230" w:type="dxa"/>
+            <w:tcW w:w="4229" w:type="dxa"/>
             <w:tcBorders>
               <w:bottom w:val="single" w:sz="4" w:space="0" w:color="999999"/>
             </w:tcBorders>
@@ -5145,7 +3877,7 @@
         </w:tc>
         <w:tc>
           <w:tcPr>
-            <w:tcW w:w="3600" w:type="dxa"/>
+            <w:tcW w:w="3601" w:type="dxa"/>
             <w:tcBorders>
               <w:bottom w:val="single" w:sz="4" w:space="0" w:color="999999"/>
             </w:tcBorders>
@@ -5220,7 +3952,7 @@
         </w:tc>
         <w:tc>
           <w:tcPr>
-            <w:tcW w:w="4230" w:type="dxa"/>
+            <w:tcW w:w="4229" w:type="dxa"/>
             <w:tcBorders>
               <w:bottom w:val="single" w:sz="4" w:space="0" w:color="999999"/>
             </w:tcBorders>
@@ -5244,7 +3976,7 @@
         </w:tc>
         <w:tc>
           <w:tcPr>
-            <w:tcW w:w="3600" w:type="dxa"/>
+            <w:tcW w:w="3601" w:type="dxa"/>
             <w:tcBorders>
               <w:bottom w:val="single" w:sz="4" w:space="0" w:color="999999"/>
             </w:tcBorders>
@@ -5319,7 +4051,7 @@
         </w:tc>
         <w:tc>
           <w:tcPr>
-            <w:tcW w:w="4230" w:type="dxa"/>
+            <w:tcW w:w="4229" w:type="dxa"/>
             <w:tcBorders>
               <w:bottom w:val="single" w:sz="4" w:space="0" w:color="999999"/>
             </w:tcBorders>
@@ -5343,7 +4075,7 @@
         </w:tc>
         <w:tc>
           <w:tcPr>
-            <w:tcW w:w="3600" w:type="dxa"/>
+            <w:tcW w:w="3601" w:type="dxa"/>
             <w:tcBorders>
               <w:bottom w:val="single" w:sz="4" w:space="0" w:color="999999"/>
             </w:tcBorders>
@@ -5418,7 +4150,7 @@
         </w:tc>
         <w:tc>
           <w:tcPr>
-            <w:tcW w:w="4230" w:type="dxa"/>
+            <w:tcW w:w="4229" w:type="dxa"/>
             <w:tcBorders>
               <w:bottom w:val="single" w:sz="4" w:space="0" w:color="999999"/>
             </w:tcBorders>
@@ -5442,7 +4174,7 @@
         </w:tc>
         <w:tc>
           <w:tcPr>
-            <w:tcW w:w="3600" w:type="dxa"/>
+            <w:tcW w:w="3601" w:type="dxa"/>
             <w:tcBorders>
               <w:bottom w:val="single" w:sz="4" w:space="0" w:color="999999"/>
             </w:tcBorders>
@@ -5517,7 +4249,7 @@
         </w:tc>
         <w:tc>
           <w:tcPr>
-            <w:tcW w:w="4230" w:type="dxa"/>
+            <w:tcW w:w="4229" w:type="dxa"/>
             <w:tcBorders>
               <w:bottom w:val="single" w:sz="4" w:space="0" w:color="999999"/>
             </w:tcBorders>
@@ -5541,7 +4273,7 @@
         </w:tc>
         <w:tc>
           <w:tcPr>
-            <w:tcW w:w="3600" w:type="dxa"/>
+            <w:tcW w:w="3601" w:type="dxa"/>
             <w:tcBorders>
               <w:bottom w:val="single" w:sz="4" w:space="0" w:color="999999"/>
             </w:tcBorders>
@@ -5615,7 +4347,7 @@
         </w:tc>
         <w:tc>
           <w:tcPr>
-            <w:tcW w:w="4230" w:type="dxa"/>
+            <w:tcW w:w="4229" w:type="dxa"/>
             <w:tcBorders>
               <w:bottom w:val="single" w:sz="12" w:space="0" w:color="000000"/>
             </w:tcBorders>
@@ -5638,7 +4370,7 @@
         </w:tc>
         <w:tc>
           <w:tcPr>
-            <w:tcW w:w="3600" w:type="dxa"/>
+            <w:tcW w:w="3601" w:type="dxa"/>
             <w:tcBorders>
               <w:bottom w:val="single" w:sz="12" w:space="0" w:color="000000"/>
             </w:tcBorders>
@@ -5696,7 +4428,11 @@
         </w:rPr>
       </w:pPr>
       <w:r>
-        <w:rPr/>
+        <w:rPr>
+          <w:rFonts w:ascii="Liberation Sans" w:hAnsi="Liberation Sans"/>
+          <w:sz w:val="24"/>
+          <w:szCs w:val="24"/>
+        </w:rPr>
       </w:r>
     </w:p>
     <w:p>
@@ -6226,25 +4962,7 @@
                 <w:sz w:val="22"/>
                 <w:szCs w:val="22"/>
               </w:rPr>
-              <w:t>Hvis der ikke findes gyldige elpriser for hver</w:t>
-            </w:r>
-            <w:r>
-              <w:rPr>
-                <w:rStyle w:val="SourceText"/>
-                <w:rFonts w:ascii="Liberation Sans" w:hAnsi="Liberation Sans"/>
-                <w:sz w:val="22"/>
-                <w:szCs w:val="22"/>
-              </w:rPr>
-              <w:t>t af døgnets 96 kvarterer</w:t>
-            </w:r>
-            <w:r>
-              <w:rPr>
-                <w:rStyle w:val="SourceText"/>
-                <w:rFonts w:ascii="Liberation Sans" w:hAnsi="Liberation Sans"/>
-                <w:sz w:val="22"/>
-                <w:szCs w:val="22"/>
-              </w:rPr>
-              <w:t>, skal affugteren kun tændes, når luftfugtigheden overstiger den kritiske grænse, og køre, indtil den er under slukgrænsen.</w:t>
+              <w:t>Hvis der ikke findes gyldige elpriser for hvert af døgnets 96 kvarterer, skal affugteren kun tændes, når luftfugtigheden overstiger den kritiske grænse, og køre, indtil den er under slukgrænsen.</w:t>
             </w:r>
           </w:p>
         </w:tc>
@@ -6352,34 +5070,7 @@
                 <w:sz w:val="22"/>
                 <w:szCs w:val="22"/>
               </w:rPr>
-              <w:t>Hvis sensoren ikke leverer en måling, eller målingen ligger uden for 0–100 % RH, skal systemet ignorere målingen. Ved [</w:t>
-            </w:r>
-            <w:r>
-              <w:rPr>
-                <w:rStyle w:val="SourceText"/>
-                <w:rFonts w:ascii="Liberation Sans" w:hAnsi="Liberation Sans"/>
-                <w:sz w:val="22"/>
-                <w:szCs w:val="22"/>
-              </w:rPr>
-              <w:t xml:space="preserve">5 </w:t>
-            </w:r>
-            <w:r>
-              <w:rPr>
-                <w:rStyle w:val="SourceText"/>
-                <w:rFonts w:ascii="Liberation Sans" w:hAnsi="Liberation Sans"/>
-                <w:sz w:val="22"/>
-                <w:szCs w:val="22"/>
-              </w:rPr>
-              <w:t xml:space="preserve">fejlmålinger i træk skal systemet </w:t>
-            </w:r>
-            <w:r>
-              <w:rPr>
-                <w:rStyle w:val="SourceText"/>
-                <w:rFonts w:ascii="Liberation Sans" w:hAnsi="Liberation Sans"/>
-                <w:sz w:val="22"/>
-                <w:szCs w:val="22"/>
-              </w:rPr>
-              <w:t xml:space="preserve">forsøge igen efter 15 minutter. </w:t>
+              <w:t>Hvis sensoren ikke leverer en måling, eller målingen ligger uden for 0–100 % RH, skal systemet ignorere målingen. Ved [5 fejlmålinger i træk skal systemet forsøge igen efter 15 minutter.</w:t>
             </w:r>
           </w:p>
         </w:tc>
@@ -6487,16 +5178,7 @@
                 <w:sz w:val="22"/>
                 <w:szCs w:val="22"/>
               </w:rPr>
-              <w:t xml:space="preserve">Hvis smart plug'en ikke svarer, skal systemet prøve igen med et fast interval og vise en fejl </w:t>
-            </w:r>
-            <w:r>
-              <w:rPr>
-                <w:rStyle w:val="SourceText"/>
-                <w:rFonts w:ascii="Liberation Sans" w:hAnsi="Liberation Sans"/>
-                <w:sz w:val="22"/>
-                <w:szCs w:val="22"/>
-              </w:rPr>
-              <w:t>på website.</w:t>
+              <w:t>Hvis smart plug'en ikke svarer, skal systemet prøve igen med et fast interval og vise en fejl på website.</w:t>
             </w:r>
           </w:p>
         </w:tc>
@@ -7323,8 +6005,8 @@
       <w:tblGrid>
         <w:gridCol w:w="1166"/>
         <w:gridCol w:w="2704"/>
-        <w:gridCol w:w="3507"/>
-        <w:gridCol w:w="1649"/>
+        <w:gridCol w:w="3506"/>
+        <w:gridCol w:w="1650"/>
       </w:tblGrid>
       <w:tr>
         <w:trPr/>
@@ -7386,7 +6068,7 @@
         </w:tc>
         <w:tc>
           <w:tcPr>
-            <w:tcW w:w="3507" w:type="dxa"/>
+            <w:tcW w:w="3506" w:type="dxa"/>
             <w:tcBorders>
               <w:top w:val="single" w:sz="12" w:space="0" w:color="000000"/>
               <w:bottom w:val="single" w:sz="6" w:space="0" w:color="000000"/>
@@ -7414,7 +6096,7 @@
         </w:tc>
         <w:tc>
           <w:tcPr>
-            <w:tcW w:w="1649" w:type="dxa"/>
+            <w:tcW w:w="1650" w:type="dxa"/>
             <w:tcBorders>
               <w:top w:val="single" w:sz="12" w:space="0" w:color="000000"/>
               <w:bottom w:val="single" w:sz="6" w:space="0" w:color="000000"/>
@@ -7436,29 +6118,7 @@
                 <w:sz w:val="22"/>
                 <w:szCs w:val="22"/>
               </w:rPr>
-              <w:t>H</w:t>
-            </w:r>
-            <w:r>
-              <w:rPr>
-                <w:rStyle w:val="SourceText"/>
-                <w:rFonts w:ascii="Liberation Sans" w:hAnsi="Liberation Sans"/>
-                <w:b/>
-                <w:bCs/>
-                <w:sz w:val="22"/>
-                <w:szCs w:val="22"/>
-              </w:rPr>
-              <w:t>v</w:t>
-            </w:r>
-            <w:r>
-              <w:rPr>
-                <w:rStyle w:val="SourceText"/>
-                <w:rFonts w:ascii="Liberation Sans" w:hAnsi="Liberation Sans"/>
-                <w:b/>
-                <w:bCs/>
-                <w:sz w:val="22"/>
-                <w:szCs w:val="22"/>
-              </w:rPr>
-              <w:t>or længe?</w:t>
+              <w:t>Hvor længe?</w:t>
             </w:r>
           </w:p>
         </w:tc>
@@ -7517,7 +6177,7 @@
         </w:tc>
         <w:tc>
           <w:tcPr>
-            <w:tcW w:w="3507" w:type="dxa"/>
+            <w:tcW w:w="3506" w:type="dxa"/>
             <w:tcBorders>
               <w:bottom w:val="single" w:sz="4" w:space="0" w:color="999999"/>
             </w:tcBorders>
@@ -7542,7 +6202,7 @@
         </w:tc>
         <w:tc>
           <w:tcPr>
-            <w:tcW w:w="1649" w:type="dxa"/>
+            <w:tcW w:w="1650" w:type="dxa"/>
             <w:tcBorders>
               <w:bottom w:val="single" w:sz="4" w:space="0" w:color="999999"/>
             </w:tcBorders>
@@ -7589,16 +6249,7 @@
                 <w:sz w:val="22"/>
                 <w:szCs w:val="22"/>
               </w:rPr>
-              <w:t>K-00</w:t>
-            </w:r>
-            <w:r>
-              <w:rPr>
-                <w:rStyle w:val="SourceText"/>
-                <w:rFonts w:ascii="Liberation Sans" w:hAnsi="Liberation Sans"/>
-                <w:sz w:val="22"/>
-                <w:szCs w:val="22"/>
-              </w:rPr>
-              <w:t>9</w:t>
+              <w:t>K-009</w:t>
             </w:r>
           </w:p>
         </w:tc>
@@ -7629,50 +6280,32 @@
         </w:tc>
         <w:tc>
           <w:tcPr>
-            <w:tcW w:w="3507" w:type="dxa"/>
-            <w:tcBorders>
-              <w:bottom w:val="single" w:sz="4" w:space="0" w:color="999999"/>
-            </w:tcBorders>
-            <w:shd w:fill="EEEEEE" w:val="clear"/>
-          </w:tcPr>
-          <w:p>
-            <w:pPr>
-              <w:pStyle w:val="Normal"/>
-              <w:spacing w:before="0" w:after="160"/>
-              <w:rPr/>
-            </w:pPr>
-            <w:r>
-              <w:rPr>
-                <w:rStyle w:val="SourceText"/>
-                <w:rFonts w:ascii="Liberation Sans" w:hAnsi="Liberation Sans"/>
-                <w:sz w:val="22"/>
-                <w:szCs w:val="22"/>
-              </w:rPr>
-              <w:t>Dokumenterer,at K-004, K-005, K-006 og K-0</w:t>
-            </w:r>
-            <w:r>
-              <w:rPr>
-                <w:rStyle w:val="SourceText"/>
-                <w:rFonts w:ascii="Liberation Sans" w:hAnsi="Liberation Sans"/>
-                <w:sz w:val="22"/>
-                <w:szCs w:val="22"/>
-              </w:rPr>
-              <w:t>18</w:t>
-            </w:r>
-            <w:r>
-              <w:rPr>
-                <w:rStyle w:val="SourceText"/>
-                <w:rFonts w:ascii="Liberation Sans" w:hAnsi="Liberation Sans"/>
-                <w:sz w:val="22"/>
-                <w:szCs w:val="22"/>
-              </w:rPr>
-              <w:t xml:space="preserve"> overholdes</w:t>
-            </w:r>
-          </w:p>
-        </w:tc>
-        <w:tc>
-          <w:tcPr>
-            <w:tcW w:w="1649" w:type="dxa"/>
+            <w:tcW w:w="3506" w:type="dxa"/>
+            <w:tcBorders>
+              <w:bottom w:val="single" w:sz="4" w:space="0" w:color="999999"/>
+            </w:tcBorders>
+            <w:shd w:fill="EEEEEE" w:val="clear"/>
+          </w:tcPr>
+          <w:p>
+            <w:pPr>
+              <w:pStyle w:val="Normal"/>
+              <w:spacing w:before="0" w:after="160"/>
+              <w:rPr/>
+            </w:pPr>
+            <w:r>
+              <w:rPr>
+                <w:rStyle w:val="SourceText"/>
+                <w:rFonts w:ascii="Liberation Sans" w:hAnsi="Liberation Sans"/>
+                <w:sz w:val="22"/>
+                <w:szCs w:val="22"/>
+              </w:rPr>
+              <w:t>Dokumenterer,at K-004, K-005, K-006 og K-018 overholdes</w:t>
+            </w:r>
+          </w:p>
+        </w:tc>
+        <w:tc>
+          <w:tcPr>
+            <w:tcW w:w="1650" w:type="dxa"/>
             <w:tcBorders>
               <w:bottom w:val="single" w:sz="4" w:space="0" w:color="999999"/>
             </w:tcBorders>
@@ -7755,50 +6388,32 @@
         </w:tc>
         <w:tc>
           <w:tcPr>
-            <w:tcW w:w="3507" w:type="dxa"/>
-            <w:tcBorders>
-              <w:bottom w:val="single" w:sz="4" w:space="0" w:color="999999"/>
-            </w:tcBorders>
-            <w:shd w:fill="EEEEEE" w:val="clear"/>
-          </w:tcPr>
-          <w:p>
-            <w:pPr>
-              <w:pStyle w:val="Normal"/>
-              <w:spacing w:before="0" w:after="160"/>
-              <w:rPr/>
-            </w:pPr>
-            <w:r>
-              <w:rPr>
-                <w:rStyle w:val="SourceText"/>
-                <w:rFonts w:ascii="Liberation Sans" w:hAnsi="Liberation Sans"/>
-                <w:sz w:val="22"/>
-                <w:szCs w:val="22"/>
-              </w:rPr>
-              <w:t xml:space="preserve">Viser udviklingen, data </w:t>
-            </w:r>
-            <w:r>
-              <w:rPr>
-                <w:rStyle w:val="SourceText"/>
-                <w:rFonts w:ascii="Liberation Sans" w:hAnsi="Liberation Sans"/>
-                <w:sz w:val="22"/>
-                <w:szCs w:val="22"/>
-              </w:rPr>
-              <w:t xml:space="preserve">til </w:t>
-            </w:r>
-            <w:r>
-              <w:rPr>
-                <w:rStyle w:val="SourceText"/>
-                <w:rFonts w:ascii="Liberation Sans" w:hAnsi="Liberation Sans"/>
-                <w:sz w:val="22"/>
-                <w:szCs w:val="22"/>
-              </w:rPr>
-              <w:t>visulisering</w:t>
-            </w:r>
-          </w:p>
-        </w:tc>
-        <w:tc>
-          <w:tcPr>
-            <w:tcW w:w="1649" w:type="dxa"/>
+            <w:tcW w:w="3506" w:type="dxa"/>
+            <w:tcBorders>
+              <w:bottom w:val="single" w:sz="4" w:space="0" w:color="999999"/>
+            </w:tcBorders>
+            <w:shd w:fill="EEEEEE" w:val="clear"/>
+          </w:tcPr>
+          <w:p>
+            <w:pPr>
+              <w:pStyle w:val="Normal"/>
+              <w:spacing w:before="0" w:after="160"/>
+              <w:rPr/>
+            </w:pPr>
+            <w:r>
+              <w:rPr>
+                <w:rStyle w:val="SourceText"/>
+                <w:rFonts w:ascii="Liberation Sans" w:hAnsi="Liberation Sans"/>
+                <w:sz w:val="22"/>
+                <w:szCs w:val="22"/>
+              </w:rPr>
+              <w:t>Viser udviklingen, data til visulisering</w:t>
+            </w:r>
+          </w:p>
+        </w:tc>
+        <w:tc>
+          <w:tcPr>
+            <w:tcW w:w="1650" w:type="dxa"/>
             <w:tcBorders>
               <w:bottom w:val="single" w:sz="4" w:space="0" w:color="999999"/>
             </w:tcBorders>
@@ -7882,7 +6497,7 @@
         </w:tc>
         <w:tc>
           <w:tcPr>
-            <w:tcW w:w="3507" w:type="dxa"/>
+            <w:tcW w:w="3506" w:type="dxa"/>
             <w:tcBorders>
               <w:bottom w:val="single" w:sz="12" w:space="0" w:color="000000"/>
             </w:tcBorders>
@@ -7909,7 +6524,7 @@
         </w:tc>
         <w:tc>
           <w:tcPr>
-            <w:tcW w:w="1649" w:type="dxa"/>
+            <w:tcW w:w="1650" w:type="dxa"/>
             <w:tcBorders>
               <w:bottom w:val="single" w:sz="12" w:space="0" w:color="000000"/>
             </w:tcBorders>
@@ -8117,29 +6732,7 @@
                 <w:sz w:val="22"/>
                 <w:szCs w:val="22"/>
               </w:rPr>
-              <w:t>Proto</w:t>
-            </w:r>
-            <w:r>
-              <w:rPr>
-                <w:rStyle w:val="SourceText"/>
-                <w:rFonts w:ascii="Liberation Sans" w:hAnsi="Liberation Sans"/>
-                <w:b/>
-                <w:bCs/>
-                <w:sz w:val="22"/>
-                <w:szCs w:val="22"/>
-              </w:rPr>
-              <w:t>k</w:t>
-            </w:r>
-            <w:r>
-              <w:rPr>
-                <w:rStyle w:val="SourceText"/>
-                <w:rFonts w:ascii="Liberation Sans" w:hAnsi="Liberation Sans"/>
-                <w:b/>
-                <w:bCs/>
-                <w:sz w:val="22"/>
-                <w:szCs w:val="22"/>
-              </w:rPr>
-              <w:t>ol</w:t>
+              <w:t>Protokol</w:t>
             </w:r>
           </w:p>
         </w:tc>
@@ -8584,7 +7177,9 @@
               </w:rPr>
             </w:pPr>
             <w:r>
-              <w:rPr/>
+              <w:rPr>
+                <w:rFonts w:ascii="Liberation Sans" w:hAnsi="Liberation Sans"/>
+              </w:rPr>
             </w:r>
           </w:p>
         </w:tc>
@@ -8606,7 +7201,9 @@
               </w:rPr>
             </w:pPr>
             <w:r>
-              <w:rPr/>
+              <w:rPr>
+                <w:rFonts w:ascii="Liberation Sans" w:hAnsi="Liberation Sans"/>
+              </w:rPr>
             </w:r>
           </w:p>
         </w:tc>
@@ -8628,7 +7225,9 @@
               </w:rPr>
             </w:pPr>
             <w:r>
-              <w:rPr/>
+              <w:rPr>
+                <w:rFonts w:ascii="Liberation Sans" w:hAnsi="Liberation Sans"/>
+              </w:rPr>
             </w:r>
           </w:p>
         </w:tc>
@@ -8650,7 +7249,9 @@
               </w:rPr>
             </w:pPr>
             <w:r>
-              <w:rPr/>
+              <w:rPr>
+                <w:rFonts w:ascii="Liberation Sans" w:hAnsi="Liberation Sans"/>
+              </w:rPr>
             </w:r>
           </w:p>
         </w:tc>
@@ -8786,15 +7387,15 @@
         </w:tblCellMar>
       </w:tblPr>
       <w:tblGrid>
-        <w:gridCol w:w="898"/>
+        <w:gridCol w:w="897"/>
         <w:gridCol w:w="2160"/>
-        <w:gridCol w:w="5968"/>
+        <w:gridCol w:w="5969"/>
       </w:tblGrid>
       <w:tr>
         <w:trPr/>
         <w:tc>
           <w:tcPr>
-            <w:tcW w:w="898" w:type="dxa"/>
+            <w:tcW w:w="897" w:type="dxa"/>
             <w:tcBorders>
               <w:top w:val="single" w:sz="12" w:space="0" w:color="000000"/>
               <w:bottom w:val="single" w:sz="6" w:space="0" w:color="000000"/>
@@ -8850,7 +7451,7 @@
         </w:tc>
         <w:tc>
           <w:tcPr>
-            <w:tcW w:w="5968" w:type="dxa"/>
+            <w:tcW w:w="5969" w:type="dxa"/>
             <w:tcBorders>
               <w:top w:val="single" w:sz="12" w:space="0" w:color="000000"/>
               <w:bottom w:val="single" w:sz="6" w:space="0" w:color="000000"/>
@@ -8881,7 +7482,7 @@
         <w:trPr/>
         <w:tc>
           <w:tcPr>
-            <w:tcW w:w="898" w:type="dxa"/>
+            <w:tcW w:w="897" w:type="dxa"/>
             <w:tcBorders>
               <w:bottom w:val="single" w:sz="4" w:space="0" w:color="999999"/>
             </w:tcBorders>
@@ -8925,59 +7526,32 @@
                 <w:sz w:val="22"/>
                 <w:szCs w:val="22"/>
               </w:rPr>
-              <w:t xml:space="preserve">K-001, K-002, K-003, K-004, K-005, K-006, K-007, </w:t>
-            </w:r>
-            <w:r>
-              <w:rPr>
-                <w:rStyle w:val="SourceText"/>
-                <w:rFonts w:ascii="Liberation Sans" w:hAnsi="Liberation Sans"/>
-                <w:sz w:val="22"/>
-                <w:szCs w:val="22"/>
-              </w:rPr>
-              <w:t>K-018</w:t>
-            </w:r>
-          </w:p>
-        </w:tc>
-        <w:tc>
-          <w:tcPr>
-            <w:tcW w:w="5968" w:type="dxa"/>
-            <w:tcBorders>
-              <w:bottom w:val="single" w:sz="4" w:space="0" w:color="999999"/>
-            </w:tcBorders>
-            <w:shd w:fill="EEEEEE" w:val="clear"/>
-          </w:tcPr>
-          <w:p>
-            <w:pPr>
-              <w:pStyle w:val="Normal"/>
-              <w:spacing w:before="0" w:after="160"/>
-              <w:rPr/>
-            </w:pPr>
-            <w:r>
-              <w:rPr>
-                <w:rStyle w:val="SourceText"/>
-                <w:rFonts w:ascii="Liberation Sans" w:hAnsi="Liberation Sans"/>
-                <w:sz w:val="22"/>
-                <w:szCs w:val="22"/>
-              </w:rPr>
-              <w:t>Kern</w:t>
-            </w:r>
-            <w:r>
-              <w:rPr>
-                <w:rStyle w:val="SourceText"/>
-                <w:rFonts w:ascii="Liberation Sans" w:hAnsi="Liberation Sans"/>
-                <w:sz w:val="22"/>
-                <w:szCs w:val="22"/>
-              </w:rPr>
-              <w:t xml:space="preserve">en </w:t>
-            </w:r>
-            <w:r>
-              <w:rPr>
-                <w:rStyle w:val="SourceText"/>
-                <w:rFonts w:ascii="Liberation Sans" w:hAnsi="Liberation Sans"/>
-                <w:sz w:val="22"/>
-                <w:szCs w:val="22"/>
-              </w:rPr>
-              <w:t>i styringen: måling, elpris, beslutning og styring af affugteren.</w:t>
+              <w:t>K-001, K-002, K-003, K-004, K-005, K-006, K-007, K-018</w:t>
+            </w:r>
+          </w:p>
+        </w:tc>
+        <w:tc>
+          <w:tcPr>
+            <w:tcW w:w="5969" w:type="dxa"/>
+            <w:tcBorders>
+              <w:bottom w:val="single" w:sz="4" w:space="0" w:color="999999"/>
+            </w:tcBorders>
+            <w:shd w:fill="EEEEEE" w:val="clear"/>
+          </w:tcPr>
+          <w:p>
+            <w:pPr>
+              <w:pStyle w:val="Normal"/>
+              <w:spacing w:before="0" w:after="160"/>
+              <w:rPr/>
+            </w:pPr>
+            <w:r>
+              <w:rPr>
+                <w:rStyle w:val="SourceText"/>
+                <w:rFonts w:ascii="Liberation Sans" w:hAnsi="Liberation Sans"/>
+                <w:sz w:val="22"/>
+                <w:szCs w:val="22"/>
+              </w:rPr>
+              <w:t>Kernen i styringen: måling, elpris, beslutning og styring af affugteren.</w:t>
             </w:r>
           </w:p>
         </w:tc>
@@ -8986,7 +7560,7 @@
         <w:trPr/>
         <w:tc>
           <w:tcPr>
-            <w:tcW w:w="898" w:type="dxa"/>
+            <w:tcW w:w="897" w:type="dxa"/>
             <w:tcBorders>
               <w:bottom w:val="single" w:sz="4" w:space="0" w:color="999999"/>
             </w:tcBorders>
@@ -9036,7 +7610,7 @@
         </w:tc>
         <w:tc>
           <w:tcPr>
-            <w:tcW w:w="5968" w:type="dxa"/>
+            <w:tcW w:w="5969" w:type="dxa"/>
             <w:tcBorders>
               <w:bottom w:val="single" w:sz="4" w:space="0" w:color="999999"/>
             </w:tcBorders>
@@ -9064,7 +7638,7 @@
         <w:trPr/>
         <w:tc>
           <w:tcPr>
-            <w:tcW w:w="898" w:type="dxa"/>
+            <w:tcW w:w="897" w:type="dxa"/>
             <w:tcBorders>
               <w:bottom w:val="single" w:sz="4" w:space="0" w:color="999999"/>
             </w:tcBorders>
@@ -9114,7 +7688,7 @@
         </w:tc>
         <w:tc>
           <w:tcPr>
-            <w:tcW w:w="5968" w:type="dxa"/>
+            <w:tcW w:w="5969" w:type="dxa"/>
             <w:tcBorders>
               <w:bottom w:val="single" w:sz="4" w:space="0" w:color="999999"/>
             </w:tcBorders>
@@ -9142,7 +7716,7 @@
         <w:trPr/>
         <w:tc>
           <w:tcPr>
-            <w:tcW w:w="898" w:type="dxa"/>
+            <w:tcW w:w="897" w:type="dxa"/>
             <w:tcBorders>
               <w:bottom w:val="single" w:sz="4" w:space="0" w:color="999999"/>
             </w:tcBorders>
@@ -9192,7 +7766,7 @@
         </w:tc>
         <w:tc>
           <w:tcPr>
-            <w:tcW w:w="5968" w:type="dxa"/>
+            <w:tcW w:w="5969" w:type="dxa"/>
             <w:tcBorders>
               <w:bottom w:val="single" w:sz="4" w:space="0" w:color="999999"/>
             </w:tcBorders>
@@ -9220,7 +7794,7 @@
         <w:trPr/>
         <w:tc>
           <w:tcPr>
-            <w:tcW w:w="898" w:type="dxa"/>
+            <w:tcW w:w="897" w:type="dxa"/>
             <w:tcBorders>
               <w:bottom w:val="single" w:sz="4" w:space="0" w:color="999999"/>
             </w:tcBorders>
@@ -9270,7 +7844,7 @@
         </w:tc>
         <w:tc>
           <w:tcPr>
-            <w:tcW w:w="5968" w:type="dxa"/>
+            <w:tcW w:w="5969" w:type="dxa"/>
             <w:tcBorders>
               <w:bottom w:val="single" w:sz="4" w:space="0" w:color="999999"/>
             </w:tcBorders>
@@ -9298,7 +7872,7 @@
         <w:trPr/>
         <w:tc>
           <w:tcPr>
-            <w:tcW w:w="898" w:type="dxa"/>
+            <w:tcW w:w="897" w:type="dxa"/>
             <w:tcBorders>
               <w:bottom w:val="single" w:sz="4" w:space="0" w:color="999999"/>
             </w:tcBorders>
@@ -9348,7 +7922,7 @@
         </w:tc>
         <w:tc>
           <w:tcPr>
-            <w:tcW w:w="5968" w:type="dxa"/>
+            <w:tcW w:w="5969" w:type="dxa"/>
             <w:tcBorders>
               <w:bottom w:val="single" w:sz="4" w:space="0" w:color="999999"/>
             </w:tcBorders>
@@ -9376,7 +7950,7 @@
         <w:trPr/>
         <w:tc>
           <w:tcPr>
-            <w:tcW w:w="898" w:type="dxa"/>
+            <w:tcW w:w="897" w:type="dxa"/>
             <w:tcBorders>
               <w:bottom w:val="single" w:sz="12" w:space="0" w:color="000000"/>
             </w:tcBorders>
@@ -9430,7 +8004,7 @@
         </w:tc>
         <w:tc>
           <w:tcPr>
-            <w:tcW w:w="5968" w:type="dxa"/>
+            <w:tcW w:w="5969" w:type="dxa"/>
             <w:tcBorders>
               <w:bottom w:val="single" w:sz="12" w:space="0" w:color="000000"/>
             </w:tcBorders>
@@ -9507,9 +8081,9 @@
         </w:tblCellMar>
       </w:tblPr>
       <w:tblGrid>
-        <w:gridCol w:w="898"/>
+        <w:gridCol w:w="897"/>
         <w:gridCol w:w="3960"/>
-        <w:gridCol w:w="4168"/>
+        <w:gridCol w:w="4169"/>
       </w:tblGrid>
       <w:tr>
         <w:trPr>
@@ -9517,7 +8091,7 @@
         </w:trPr>
         <w:tc>
           <w:tcPr>
-            <w:tcW w:w="898" w:type="dxa"/>
+            <w:tcW w:w="897" w:type="dxa"/>
             <w:tcBorders>
               <w:top w:val="single" w:sz="12" w:space="0" w:color="000000"/>
               <w:bottom w:val="single" w:sz="6" w:space="0" w:color="000000"/>
@@ -9573,7 +8147,7 @@
         </w:tc>
         <w:tc>
           <w:tcPr>
-            <w:tcW w:w="4168" w:type="dxa"/>
+            <w:tcW w:w="4169" w:type="dxa"/>
             <w:tcBorders>
               <w:top w:val="single" w:sz="12" w:space="0" w:color="000000"/>
               <w:bottom w:val="single" w:sz="6" w:space="0" w:color="000000"/>
@@ -9604,7 +8178,7 @@
         <w:trPr/>
         <w:tc>
           <w:tcPr>
-            <w:tcW w:w="898" w:type="dxa"/>
+            <w:tcW w:w="897" w:type="dxa"/>
             <w:tcBorders>
               <w:bottom w:val="single" w:sz="4" w:space="0" w:color="999999"/>
             </w:tcBorders>
@@ -9654,7 +8228,7 @@
         </w:tc>
         <w:tc>
           <w:tcPr>
-            <w:tcW w:w="4168" w:type="dxa"/>
+            <w:tcW w:w="4169" w:type="dxa"/>
             <w:tcBorders>
               <w:bottom w:val="single" w:sz="4" w:space="0" w:color="999999"/>
             </w:tcBorders>
@@ -9682,7 +8256,7 @@
         <w:trPr/>
         <w:tc>
           <w:tcPr>
-            <w:tcW w:w="898" w:type="dxa"/>
+            <w:tcW w:w="897" w:type="dxa"/>
             <w:tcBorders>
               <w:bottom w:val="single" w:sz="4" w:space="0" w:color="999999"/>
             </w:tcBorders>
@@ -9726,49 +8300,13 @@
                 <w:sz w:val="22"/>
                 <w:szCs w:val="22"/>
               </w:rPr>
-              <w:t xml:space="preserve">Systemet får </w:t>
-            </w:r>
-            <w:r>
-              <w:rPr>
-                <w:rStyle w:val="SourceText"/>
-                <w:rFonts w:ascii="Liberation Sans" w:hAnsi="Liberation Sans"/>
-                <w:sz w:val="22"/>
-                <w:szCs w:val="22"/>
-              </w:rPr>
-              <w:t xml:space="preserve">96 </w:t>
-            </w:r>
-            <w:r>
-              <w:rPr>
-                <w:rStyle w:val="SourceText"/>
-                <w:rFonts w:ascii="Liberation Sans" w:hAnsi="Liberation Sans"/>
-                <w:sz w:val="22"/>
-                <w:szCs w:val="22"/>
-              </w:rPr>
-              <w:t>kendt</w:t>
-            </w:r>
-            <w:r>
-              <w:rPr>
-                <w:rStyle w:val="SourceText"/>
-                <w:rFonts w:ascii="Liberation Sans" w:hAnsi="Liberation Sans"/>
-                <w:sz w:val="22"/>
-                <w:szCs w:val="22"/>
-              </w:rPr>
-              <w:t xml:space="preserve">e </w:t>
-            </w:r>
-            <w:r>
-              <w:rPr>
-                <w:rStyle w:val="SourceText"/>
-                <w:rFonts w:ascii="Liberation Sans" w:hAnsi="Liberation Sans"/>
-                <w:sz w:val="22"/>
-                <w:szCs w:val="22"/>
-              </w:rPr>
-              <w:t>testpriser.</w:t>
-            </w:r>
-          </w:p>
-        </w:tc>
-        <w:tc>
-          <w:tcPr>
-            <w:tcW w:w="4168" w:type="dxa"/>
+              <w:t>Systemet får 96 kendte testpriser.</w:t>
+            </w:r>
+          </w:p>
+        </w:tc>
+        <w:tc>
+          <w:tcPr>
+            <w:tcW w:w="4169" w:type="dxa"/>
             <w:tcBorders>
               <w:bottom w:val="single" w:sz="4" w:space="0" w:color="999999"/>
             </w:tcBorders>
@@ -9796,7 +8334,7 @@
         <w:trPr/>
         <w:tc>
           <w:tcPr>
-            <w:tcW w:w="898" w:type="dxa"/>
+            <w:tcW w:w="897" w:type="dxa"/>
             <w:tcBorders>
               <w:bottom w:val="single" w:sz="4" w:space="0" w:color="999999"/>
             </w:tcBorders>
@@ -9840,58 +8378,13 @@
                 <w:sz w:val="22"/>
                 <w:szCs w:val="22"/>
               </w:rPr>
-              <w:t xml:space="preserve">Systemet startes med internetforbindelse og URL til </w:t>
-            </w:r>
-            <w:r>
-              <w:rPr>
-                <w:rStyle w:val="SourceText"/>
-                <w:rFonts w:ascii="Liberation Sans" w:hAnsi="Liberation Sans"/>
-                <w:sz w:val="22"/>
-                <w:szCs w:val="22"/>
-              </w:rPr>
-              <w:t xml:space="preserve">den </w:t>
-            </w:r>
-            <w:r>
-              <w:rPr>
-                <w:rStyle w:val="SourceText"/>
-                <w:rFonts w:ascii="Liberation Sans" w:hAnsi="Liberation Sans"/>
-                <w:sz w:val="22"/>
-                <w:szCs w:val="22"/>
-              </w:rPr>
-              <w:t>ekser</w:t>
-            </w:r>
-            <w:r>
-              <w:rPr>
-                <w:rStyle w:val="SourceText"/>
-                <w:rFonts w:ascii="Liberation Sans" w:hAnsi="Liberation Sans"/>
-                <w:sz w:val="22"/>
-                <w:szCs w:val="22"/>
-              </w:rPr>
-              <w:t xml:space="preserve">ne </w:t>
-            </w:r>
-            <w:r>
-              <w:rPr>
-                <w:rStyle w:val="SourceText"/>
-                <w:rFonts w:ascii="Liberation Sans" w:hAnsi="Liberation Sans"/>
-                <w:sz w:val="22"/>
-                <w:szCs w:val="22"/>
-              </w:rPr>
-              <w:t>AP</w:t>
-            </w:r>
-            <w:r>
-              <w:rPr>
-                <w:rStyle w:val="SourceText"/>
-                <w:rFonts w:ascii="Liberation Sans" w:hAnsi="Liberation Sans"/>
-                <w:sz w:val="22"/>
-                <w:szCs w:val="22"/>
-              </w:rPr>
-              <w:t>I</w:t>
-            </w:r>
-          </w:p>
-        </w:tc>
-        <w:tc>
-          <w:tcPr>
-            <w:tcW w:w="4168" w:type="dxa"/>
+              <w:t>Systemet startes med internetforbindelse og URL til den ekserne API</w:t>
+            </w:r>
+          </w:p>
+        </w:tc>
+        <w:tc>
+          <w:tcPr>
+            <w:tcW w:w="4169" w:type="dxa"/>
             <w:tcBorders>
               <w:bottom w:val="single" w:sz="4" w:space="0" w:color="999999"/>
             </w:tcBorders>
@@ -9919,7 +8412,7 @@
         <w:trPr/>
         <w:tc>
           <w:tcPr>
-            <w:tcW w:w="898" w:type="dxa"/>
+            <w:tcW w:w="897" w:type="dxa"/>
             <w:tcBorders>
               <w:bottom w:val="single" w:sz="4" w:space="0" w:color="999999"/>
             </w:tcBorders>
@@ -9963,76 +8456,13 @@
                 <w:sz w:val="22"/>
                 <w:szCs w:val="22"/>
               </w:rPr>
-              <w:t xml:space="preserve">Luftfugtigheden hæves over tændgrænsen, (a) i </w:t>
-            </w:r>
-            <w:r>
-              <w:rPr>
-                <w:rStyle w:val="SourceText"/>
-                <w:rFonts w:ascii="Liberation Sans" w:hAnsi="Liberation Sans"/>
-                <w:sz w:val="22"/>
-                <w:szCs w:val="22"/>
-              </w:rPr>
-              <w:t>et</w:t>
-            </w:r>
-            <w:r>
-              <w:rPr>
-                <w:rStyle w:val="SourceText"/>
-                <w:rFonts w:ascii="Liberation Sans" w:hAnsi="Liberation Sans"/>
-                <w:sz w:val="22"/>
-                <w:szCs w:val="22"/>
-              </w:rPr>
-              <w:t xml:space="preserve"> billig</w:t>
-            </w:r>
-            <w:r>
-              <w:rPr>
-                <w:rStyle w:val="SourceText"/>
-                <w:rFonts w:ascii="Liberation Sans" w:hAnsi="Liberation Sans"/>
-                <w:sz w:val="22"/>
-                <w:szCs w:val="22"/>
-              </w:rPr>
-              <w:t>t</w:t>
-            </w:r>
-            <w:r>
-              <w:rPr>
-                <w:rStyle w:val="SourceText"/>
-                <w:rFonts w:ascii="Liberation Sans" w:hAnsi="Liberation Sans"/>
-                <w:sz w:val="22"/>
-                <w:szCs w:val="22"/>
-              </w:rPr>
-              <w:t xml:space="preserve"> </w:t>
-            </w:r>
-            <w:r>
-              <w:rPr>
-                <w:rStyle w:val="SourceText"/>
-                <w:rFonts w:ascii="Liberation Sans" w:hAnsi="Liberation Sans"/>
-                <w:sz w:val="22"/>
-                <w:szCs w:val="22"/>
-              </w:rPr>
-              <w:t>kvarter</w:t>
-            </w:r>
-            <w:r>
-              <w:rPr>
-                <w:rStyle w:val="SourceText"/>
-                <w:rFonts w:ascii="Liberation Sans" w:hAnsi="Liberation Sans"/>
-                <w:sz w:val="22"/>
-                <w:szCs w:val="22"/>
-              </w:rPr>
-              <w:t xml:space="preserve"> og (b) </w:t>
-            </w:r>
-            <w:r>
-              <w:rPr>
-                <w:rStyle w:val="SourceText"/>
-                <w:rFonts w:ascii="Liberation Sans" w:hAnsi="Liberation Sans"/>
-                <w:sz w:val="22"/>
-                <w:szCs w:val="22"/>
-              </w:rPr>
-              <w:t>i et kvarter, der ikke er billigt.</w:t>
-            </w:r>
-          </w:p>
-        </w:tc>
-        <w:tc>
-          <w:tcPr>
-            <w:tcW w:w="4168" w:type="dxa"/>
+              <w:t>Luftfugtigheden hæves over tændgrænsen, (a) i et billigt kvarter og (b) i et kvarter, der ikke er billigt.</w:t>
+            </w:r>
+          </w:p>
+        </w:tc>
+        <w:tc>
+          <w:tcPr>
+            <w:tcW w:w="4169" w:type="dxa"/>
             <w:tcBorders>
               <w:bottom w:val="single" w:sz="4" w:space="0" w:color="999999"/>
             </w:tcBorders>
@@ -10060,7 +8490,7 @@
         <w:trPr/>
         <w:tc>
           <w:tcPr>
-            <w:tcW w:w="898" w:type="dxa"/>
+            <w:tcW w:w="897" w:type="dxa"/>
             <w:tcBorders>
               <w:bottom w:val="single" w:sz="4" w:space="0" w:color="999999"/>
             </w:tcBorders>
@@ -10104,31 +8534,13 @@
                 <w:sz w:val="22"/>
                 <w:szCs w:val="22"/>
               </w:rPr>
-              <w:t xml:space="preserve">Luftfugtigheden hæves over den kritiske grænse </w:t>
-            </w:r>
-            <w:r>
-              <w:rPr>
-                <w:rStyle w:val="SourceText"/>
-                <w:rFonts w:ascii="Liberation Sans" w:hAnsi="Liberation Sans"/>
-                <w:sz w:val="22"/>
-                <w:szCs w:val="22"/>
-              </w:rPr>
-              <w:t>i et kvarter, der ikke er billigt, uden for dark time</w:t>
-            </w:r>
-            <w:r>
-              <w:rPr>
-                <w:rStyle w:val="SourceText"/>
-                <w:rFonts w:ascii="Liberation Sans" w:hAnsi="Liberation Sans"/>
-                <w:sz w:val="22"/>
-                <w:szCs w:val="22"/>
-              </w:rPr>
-              <w:t>.</w:t>
-            </w:r>
-          </w:p>
-        </w:tc>
-        <w:tc>
-          <w:tcPr>
-            <w:tcW w:w="4168" w:type="dxa"/>
+              <w:t>Luftfugtigheden hæves over den kritiske grænse i et kvarter, der ikke er billigt, uden for dark time.</w:t>
+            </w:r>
+          </w:p>
+        </w:tc>
+        <w:tc>
+          <w:tcPr>
+            <w:tcW w:w="4169" w:type="dxa"/>
             <w:tcBorders>
               <w:bottom w:val="single" w:sz="4" w:space="0" w:color="999999"/>
             </w:tcBorders>
@@ -10156,7 +8568,7 @@
         <w:trPr/>
         <w:tc>
           <w:tcPr>
-            <w:tcW w:w="898" w:type="dxa"/>
+            <w:tcW w:w="897" w:type="dxa"/>
             <w:tcBorders>
               <w:bottom w:val="single" w:sz="4" w:space="0" w:color="999999"/>
             </w:tcBorders>
@@ -10206,7 +8618,7 @@
         </w:tc>
         <w:tc>
           <w:tcPr>
-            <w:tcW w:w="4168" w:type="dxa"/>
+            <w:tcW w:w="4169" w:type="dxa"/>
             <w:tcBorders>
               <w:bottom w:val="single" w:sz="4" w:space="0" w:color="999999"/>
             </w:tcBorders>
@@ -10234,7 +8646,7 @@
         <w:trPr/>
         <w:tc>
           <w:tcPr>
-            <w:tcW w:w="898" w:type="dxa"/>
+            <w:tcW w:w="897" w:type="dxa"/>
             <w:tcBorders>
               <w:bottom w:val="single" w:sz="4" w:space="0" w:color="999999"/>
             </w:tcBorders>
@@ -10284,7 +8696,7 @@
         </w:tc>
         <w:tc>
           <w:tcPr>
-            <w:tcW w:w="4168" w:type="dxa"/>
+            <w:tcW w:w="4169" w:type="dxa"/>
             <w:tcBorders>
               <w:bottom w:val="single" w:sz="4" w:space="0" w:color="999999"/>
             </w:tcBorders>
@@ -10312,7 +8724,7 @@
         <w:trPr/>
         <w:tc>
           <w:tcPr>
-            <w:tcW w:w="898" w:type="dxa"/>
+            <w:tcW w:w="897" w:type="dxa"/>
             <w:tcBorders>
               <w:bottom w:val="single" w:sz="4" w:space="0" w:color="999999"/>
             </w:tcBorders>
@@ -10362,7 +8774,7 @@
         </w:tc>
         <w:tc>
           <w:tcPr>
-            <w:tcW w:w="4168" w:type="dxa"/>
+            <w:tcW w:w="4169" w:type="dxa"/>
             <w:tcBorders>
               <w:bottom w:val="single" w:sz="4" w:space="0" w:color="999999"/>
             </w:tcBorders>
@@ -10390,7 +8802,7 @@
         <w:trPr/>
         <w:tc>
           <w:tcPr>
-            <w:tcW w:w="898" w:type="dxa"/>
+            <w:tcW w:w="897" w:type="dxa"/>
             <w:tcBorders>
               <w:bottom w:val="single" w:sz="4" w:space="0" w:color="999999"/>
             </w:tcBorders>
@@ -10440,7 +8852,7 @@
         </w:tc>
         <w:tc>
           <w:tcPr>
-            <w:tcW w:w="4168" w:type="dxa"/>
+            <w:tcW w:w="4169" w:type="dxa"/>
             <w:tcBorders>
               <w:bottom w:val="single" w:sz="4" w:space="0" w:color="999999"/>
             </w:tcBorders>
@@ -10468,7 +8880,7 @@
         <w:trPr/>
         <w:tc>
           <w:tcPr>
-            <w:tcW w:w="898" w:type="dxa"/>
+            <w:tcW w:w="897" w:type="dxa"/>
             <w:tcBorders>
               <w:bottom w:val="single" w:sz="4" w:space="0" w:color="999999"/>
             </w:tcBorders>
@@ -10518,7 +8930,7 @@
         </w:tc>
         <w:tc>
           <w:tcPr>
-            <w:tcW w:w="4168" w:type="dxa"/>
+            <w:tcW w:w="4169" w:type="dxa"/>
             <w:tcBorders>
               <w:bottom w:val="single" w:sz="4" w:space="0" w:color="999999"/>
             </w:tcBorders>
@@ -10546,7 +8958,7 @@
         <w:trPr/>
         <w:tc>
           <w:tcPr>
-            <w:tcW w:w="898" w:type="dxa"/>
+            <w:tcW w:w="897" w:type="dxa"/>
             <w:tcBorders>
               <w:bottom w:val="single" w:sz="4" w:space="0" w:color="999999"/>
             </w:tcBorders>
@@ -10596,7 +9008,7 @@
         </w:tc>
         <w:tc>
           <w:tcPr>
-            <w:tcW w:w="4168" w:type="dxa"/>
+            <w:tcW w:w="4169" w:type="dxa"/>
             <w:tcBorders>
               <w:bottom w:val="single" w:sz="4" w:space="0" w:color="999999"/>
             </w:tcBorders>
@@ -10624,7 +9036,7 @@
         <w:trPr/>
         <w:tc>
           <w:tcPr>
-            <w:tcW w:w="898" w:type="dxa"/>
+            <w:tcW w:w="897" w:type="dxa"/>
             <w:tcBorders>
               <w:bottom w:val="single" w:sz="4" w:space="0" w:color="999999"/>
             </w:tcBorders>
@@ -10674,7 +9086,7 @@
         </w:tc>
         <w:tc>
           <w:tcPr>
-            <w:tcW w:w="4168" w:type="dxa"/>
+            <w:tcW w:w="4169" w:type="dxa"/>
             <w:tcBorders>
               <w:bottom w:val="single" w:sz="4" w:space="0" w:color="999999"/>
             </w:tcBorders>
@@ -10702,7 +9114,7 @@
         <w:trPr/>
         <w:tc>
           <w:tcPr>
-            <w:tcW w:w="898" w:type="dxa"/>
+            <w:tcW w:w="897" w:type="dxa"/>
             <w:tcBorders>
               <w:bottom w:val="single" w:sz="4" w:space="0" w:color="999999"/>
             </w:tcBorders>
@@ -10752,7 +9164,7 @@
         </w:tc>
         <w:tc>
           <w:tcPr>
-            <w:tcW w:w="4168" w:type="dxa"/>
+            <w:tcW w:w="4169" w:type="dxa"/>
             <w:tcBorders>
               <w:bottom w:val="single" w:sz="4" w:space="0" w:color="999999"/>
             </w:tcBorders>
@@ -10780,7 +9192,7 @@
         <w:trPr/>
         <w:tc>
           <w:tcPr>
-            <w:tcW w:w="898" w:type="dxa"/>
+            <w:tcW w:w="897" w:type="dxa"/>
             <w:tcBorders>
               <w:bottom w:val="single" w:sz="4" w:space="0" w:color="999999"/>
             </w:tcBorders>
@@ -10830,7 +9242,7 @@
         </w:tc>
         <w:tc>
           <w:tcPr>
-            <w:tcW w:w="4168" w:type="dxa"/>
+            <w:tcW w:w="4169" w:type="dxa"/>
             <w:tcBorders>
               <w:bottom w:val="single" w:sz="4" w:space="0" w:color="999999"/>
             </w:tcBorders>
@@ -10858,7 +9270,7 @@
         <w:trPr/>
         <w:tc>
           <w:tcPr>
-            <w:tcW w:w="898" w:type="dxa"/>
+            <w:tcW w:w="897" w:type="dxa"/>
             <w:tcBorders>
               <w:bottom w:val="single" w:sz="4" w:space="0" w:color="999999"/>
             </w:tcBorders>
@@ -10908,7 +9320,7 @@
         </w:tc>
         <w:tc>
           <w:tcPr>
-            <w:tcW w:w="4168" w:type="dxa"/>
+            <w:tcW w:w="4169" w:type="dxa"/>
             <w:tcBorders>
               <w:bottom w:val="single" w:sz="4" w:space="0" w:color="999999"/>
             </w:tcBorders>
@@ -10936,7 +9348,7 @@
         <w:trPr/>
         <w:tc>
           <w:tcPr>
-            <w:tcW w:w="898" w:type="dxa"/>
+            <w:tcW w:w="897" w:type="dxa"/>
             <w:tcBorders>
               <w:bottom w:val="single" w:sz="4" w:space="0" w:color="999999"/>
             </w:tcBorders>
@@ -10986,7 +9398,7 @@
         </w:tc>
         <w:tc>
           <w:tcPr>
-            <w:tcW w:w="4168" w:type="dxa"/>
+            <w:tcW w:w="4169" w:type="dxa"/>
             <w:tcBorders>
               <w:bottom w:val="single" w:sz="4" w:space="0" w:color="999999"/>
             </w:tcBorders>
@@ -11014,7 +9426,7 @@
         <w:trPr/>
         <w:tc>
           <w:tcPr>
-            <w:tcW w:w="898" w:type="dxa"/>
+            <w:tcW w:w="897" w:type="dxa"/>
             <w:tcBorders>
               <w:bottom w:val="single" w:sz="4" w:space="0" w:color="999999"/>
             </w:tcBorders>
@@ -11064,7 +9476,7 @@
         </w:tc>
         <w:tc>
           <w:tcPr>
-            <w:tcW w:w="4168" w:type="dxa"/>
+            <w:tcW w:w="4169" w:type="dxa"/>
             <w:tcBorders>
               <w:bottom w:val="single" w:sz="4" w:space="0" w:color="999999"/>
             </w:tcBorders>
@@ -11092,7 +9504,7 @@
         <w:trPr/>
         <w:tc>
           <w:tcPr>
-            <w:tcW w:w="898" w:type="dxa"/>
+            <w:tcW w:w="897" w:type="dxa"/>
             <w:tcBorders>
               <w:bottom w:val="single" w:sz="4" w:space="0" w:color="999999"/>
             </w:tcBorders>
@@ -11140,7 +9552,7 @@
         </w:tc>
         <w:tc>
           <w:tcPr>
-            <w:tcW w:w="4168" w:type="dxa"/>
+            <w:tcW w:w="4169" w:type="dxa"/>
             <w:tcBorders>
               <w:bottom w:val="single" w:sz="4" w:space="0" w:color="999999"/>
             </w:tcBorders>
@@ -11168,7 +9580,7 @@
         <w:trPr/>
         <w:tc>
           <w:tcPr>
-            <w:tcW w:w="898" w:type="dxa"/>
+            <w:tcW w:w="897" w:type="dxa"/>
             <w:tcBorders>
               <w:bottom w:val="single" w:sz="12" w:space="0" w:color="000000"/>
             </w:tcBorders>
@@ -11222,7 +9634,7 @@
         </w:tc>
         <w:tc>
           <w:tcPr>
-            <w:tcW w:w="4168" w:type="dxa"/>
+            <w:tcW w:w="4169" w:type="dxa"/>
             <w:tcBorders>
               <w:bottom w:val="single" w:sz="12" w:space="0" w:color="000000"/>
             </w:tcBorders>
@@ -11297,25 +9709,7 @@
           <w:sz w:val="24"/>
           <w:szCs w:val="24"/>
         </w:rPr>
-        <w:t>Bilag 1: Kravanalyse – kravkandidater og forl</w:t>
-      </w:r>
-      <w:r>
-        <w:rPr>
-          <w:rStyle w:val="SourceText"/>
-          <w:rFonts w:ascii="Liberation Sans" w:hAnsi="Liberation Sans"/>
-          <w:sz w:val="24"/>
-          <w:szCs w:val="24"/>
-        </w:rPr>
-        <w:t>e</w:t>
-      </w:r>
-      <w:r>
-        <w:rPr>
-          <w:rStyle w:val="SourceText"/>
-          <w:rFonts w:ascii="Liberation Sans" w:hAnsi="Liberation Sans"/>
-          <w:sz w:val="24"/>
-          <w:szCs w:val="24"/>
-        </w:rPr>
-        <w:t>øbige krav</w:t>
+        <w:t>Bilag 1: Kravanalyse – kravkandidater og forleøbige krav</w:t>
       </w:r>
     </w:p>
     <w:p>
@@ -12600,8 +10994,8 @@
       <w:iCs/>
     </w:rPr>
   </w:style>
-  <w:style w:type="character" w:styleId="Bulletsuser">
-    <w:name w:val="Bullets (user)"/>
+  <w:style w:type="character" w:styleId="Bullets">
+    <w:name w:val="Bullets"/>
     <w:qFormat/>
     <w:rPr>
       <w:rFonts w:ascii="OpenSymbol" w:hAnsi="OpenSymbol" w:eastAsia="OpenSymbol" w:cs="OpenSymbol"/>

</xml_diff>

<commit_message>
update kravspec with sikkerhedstilstand
</commit_message>
<xml_diff>
--- a/documentation/KravSpec/H5AffugterKravspecifikation.docx
+++ b/documentation/KravSpec/H5AffugterKravspecifikation.docx
@@ -178,8 +178,13 @@
           <w:szCs w:val="24"/>
         </w:rPr>
         <w:t>Relativ luftfugtighed i procent.</w:t>
-        <w:br/>
-      </w:r>
+      </w:r>
+    </w:p>
+    <w:p>
+      <w:pPr>
+        <w:pStyle w:val="Normal"/>
+        <w:rPr/>
+      </w:pPr>
       <w:r>
         <w:rPr>
           <w:rStyle w:val="SourceText"/>
@@ -199,8 +204,13 @@
           <w:szCs w:val="24"/>
         </w:rPr>
         <w:t>Elprisen for et kvarter (15 minutter). Døgnet har 96 kvarterpriser.</w:t>
-        <w:br/>
-      </w:r>
+      </w:r>
+    </w:p>
+    <w:p>
+      <w:pPr>
+        <w:pStyle w:val="Normal"/>
+        <w:rPr/>
+      </w:pPr>
       <w:r>
         <w:rPr>
           <w:rStyle w:val="SourceText"/>
@@ -220,8 +230,13 @@
           <w:szCs w:val="24"/>
         </w:rPr>
         <w:t>Den pris, som afgrænser de billigste 25 % af døgnets 96 kvarterpriser.</w:t>
-        <w:br/>
-      </w:r>
+      </w:r>
+    </w:p>
+    <w:p>
+      <w:pPr>
+        <w:pStyle w:val="Normal"/>
+        <w:rPr/>
+      </w:pPr>
       <w:r>
         <w:rPr>
           <w:rStyle w:val="SourceText"/>
@@ -241,8 +256,13 @@
           <w:szCs w:val="24"/>
         </w:rPr>
         <w:t>Et kvarter, hvor elprisen er på eller under dagens prisgrænse.</w:t>
-        <w:br/>
-      </w:r>
+      </w:r>
+    </w:p>
+    <w:p>
+      <w:pPr>
+        <w:pStyle w:val="Normal"/>
+        <w:rPr/>
+      </w:pPr>
       <w:r>
         <w:rPr>
           <w:rStyle w:val="SourceText"/>
@@ -262,8 +282,13 @@
           <w:szCs w:val="24"/>
         </w:rPr>
         <w:t>Den luftfugtighed, over hvilken affugteren tændes i et billigt kvarter.</w:t>
-        <w:br/>
-      </w:r>
+      </w:r>
+    </w:p>
+    <w:p>
+      <w:pPr>
+        <w:pStyle w:val="Normal"/>
+        <w:rPr/>
+      </w:pPr>
       <w:r>
         <w:rPr>
           <w:rStyle w:val="SourceText"/>
@@ -283,8 +308,13 @@
           <w:szCs w:val="24"/>
         </w:rPr>
         <w:t>Den luftfugtighed, under hvilken affugteren slukkes.</w:t>
-        <w:br/>
-      </w:r>
+      </w:r>
+    </w:p>
+    <w:p>
+      <w:pPr>
+        <w:pStyle w:val="Normal"/>
+        <w:rPr/>
+      </w:pPr>
       <w:r>
         <w:rPr>
           <w:rStyle w:val="SourceText"/>
@@ -304,8 +334,13 @@
           <w:szCs w:val="24"/>
         </w:rPr>
         <w:t>Den luftfugtighed, over hvilken affugteren tændes uanset elpris.</w:t>
-        <w:br/>
-      </w:r>
+      </w:r>
+    </w:p>
+    <w:p>
+      <w:pPr>
+        <w:pStyle w:val="Normal"/>
+        <w:rPr/>
+      </w:pPr>
       <w:r>
         <w:rPr>
           <w:rStyle w:val="SourceText"/>
@@ -325,8 +360,13 @@
           <w:szCs w:val="24"/>
         </w:rPr>
         <w:t>Den mindste tid (15 minutter) fra en slukning, til affugteren må tændes igen.</w:t>
-        <w:br/>
-      </w:r>
+      </w:r>
+    </w:p>
+    <w:p>
+      <w:pPr>
+        <w:pStyle w:val="Normal"/>
+        <w:rPr/>
+      </w:pPr>
       <w:r>
         <w:rPr>
           <w:rStyle w:val="SourceText"/>
@@ -346,6 +386,61 @@
           <w:szCs w:val="24"/>
         </w:rPr>
         <w:t xml:space="preserve"> Det foruddefinerede tidsrum kl. 22.00–06.00, hvor affugteren er slukket.</w:t>
+      </w:r>
+    </w:p>
+    <w:p>
+      <w:pPr>
+        <w:pStyle w:val="Normal"/>
+        <w:rPr/>
+      </w:pPr>
+      <w:r>
+        <w:rPr>
+          <w:rStyle w:val="Strong"/>
+          <w:rFonts w:ascii="Liberation Sans" w:hAnsi="Liberation Sans"/>
+          <w:sz w:val="24"/>
+          <w:szCs w:val="24"/>
+        </w:rPr>
+        <w:t>Sikkerhedstilstand:</w:t>
+      </w:r>
+      <w:r>
+        <w:rPr>
+          <w:rStyle w:val="SourceText"/>
+          <w:rFonts w:ascii="Liberation Sans" w:hAnsi="Liberation Sans"/>
+          <w:sz w:val="24"/>
+          <w:szCs w:val="24"/>
+        </w:rPr>
+        <w:t xml:space="preserve"> </w:t>
+      </w:r>
+      <w:r>
+        <w:rPr>
+          <w:rStyle w:val="SourceText"/>
+          <w:rFonts w:ascii="Liberation Sans" w:hAnsi="Liberation Sans" w:cstheme="minorBidi"/>
+          <w:color w:val="auto"/>
+          <w:kern w:val="2"/>
+          <w:sz w:val="24"/>
+          <w:szCs w:val="24"/>
+          <w:lang w:val="da-DK" w:eastAsia="en-US" w:bidi="ar-SA"/>
+          <w14:ligatures w14:val="standardContextual"/>
+        </w:rPr>
+        <w:t>Tilstand, når der ikke findes gyldige elpriser, heller ikke gemte. Affugteren styres udelukkende efter luftfugtigheden: den tændes ved den kritiske grænse og slukkes ved slukgrænsen (K-011).</w:t>
+      </w:r>
+    </w:p>
+    <w:p>
+      <w:pPr>
+        <w:pStyle w:val="Normal"/>
+        <w:rPr>
+          <w:rStyle w:val="SourceText"/>
+          <w:rFonts w:ascii="Liberation Sans" w:hAnsi="Liberation Sans"/>
+          <w:sz w:val="24"/>
+          <w:szCs w:val="24"/>
+        </w:rPr>
+      </w:pPr>
+      <w:r>
+        <w:rPr>
+          <w:rFonts w:ascii="Liberation Sans" w:hAnsi="Liberation Sans"/>
+          <w:sz w:val="24"/>
+          <w:szCs w:val="24"/>
+        </w:rPr>
       </w:r>
     </w:p>
     <w:p>
@@ -1818,7 +1913,25 @@
           <w:sz w:val="24"/>
           <w:szCs w:val="24"/>
         </w:rPr>
-        <w:t>Når luftfugtigheden overstiger tændgrænsen, og det aktuelle kvarter er billigt (se K-002), tændes affugteren. Den kører, indtil luftfugtigheden er under slukgrænsen, eller kvarteret ikke længere er billigt. Hvis luftfugtigheden overstiger den kritiske grænse, kører affugteren uanset elpris, indtil luftfugtigheden er under slukgrænsen. Dette gælder dog ikke i de foruddefinerede tidsrum (K-018), hvor driften er begrænset.</w:t>
+        <w:t xml:space="preserve">Når luftfugtigheden overstiger tændgrænsen, og det aktuelle kvarter er billigt (se K-002), tændes affugteren. Den kører, indtil luftfugtigheden er under slukgrænsen, eller kvarteret ikke længere er billigt. Hvis luftfugtigheden overstiger den kritiske grænse, kører affugteren uanset elpris, indtil luftfugtigheden er under slukgrænsen. </w:t>
+      </w:r>
+      <w:r>
+        <w:rPr>
+          <w:rStyle w:val="SourceText"/>
+          <w:rFonts w:ascii="Liberation Sans" w:hAnsi="Liberation Sans"/>
+          <w:sz w:val="24"/>
+          <w:szCs w:val="24"/>
+        </w:rPr>
+        <w:t xml:space="preserve">Findes der ingen gyldige elpriser, går systemet i sikkerhedstilstand, hvor affugteren udelukkende styres efter luftfugtigheden (K-011). </w:t>
+      </w:r>
+      <w:r>
+        <w:rPr>
+          <w:rStyle w:val="SourceText"/>
+          <w:rFonts w:ascii="Liberation Sans" w:hAnsi="Liberation Sans"/>
+          <w:sz w:val="24"/>
+          <w:szCs w:val="24"/>
+        </w:rPr>
+        <w:t>Dette gælder dog ikke i de foruddefinerede tidsrum (K-018), hvor driften er begrænset.</w:t>
       </w:r>
     </w:p>
     <w:p>
@@ -1850,25 +1963,7 @@
           <w:sz w:val="24"/>
           <w:szCs w:val="24"/>
         </w:rPr>
-        <w:t xml:space="preserve">Systemet anvender tænd/sluk-regulering med hysterese </w:t>
-      </w:r>
-      <w:r>
-        <w:rPr>
-          <w:rStyle w:val="SourceText"/>
-          <w:rFonts w:ascii="Liberation Sans" w:hAnsi="Liberation Sans"/>
-          <w:sz w:val="24"/>
-          <w:szCs w:val="24"/>
-        </w:rPr>
-        <w:t>og ikke en gradueret regulering (fx PID)</w:t>
-      </w:r>
-      <w:r>
-        <w:rPr>
-          <w:rStyle w:val="SourceText"/>
-          <w:rFonts w:ascii="Liberation Sans" w:hAnsi="Liberation Sans"/>
-          <w:sz w:val="24"/>
-          <w:szCs w:val="24"/>
-        </w:rPr>
-        <w:t>. Affugteren kan kun tændes og slukkes via smart plug’en, og luftfugtigheden kan derfor overstige den kritiske grænse i to situationer:</w:t>
+        <w:t>Systemet anvender tænd/sluk-regulering med hysterese og ikke en gradueret regulering (fx PID). Affugteren kan kun tændes og slukkes via smart plug’en, og luftfugtigheden kan derfor overstige den kritiske grænse i to situationer:</w:t>
       </w:r>
     </w:p>
     <w:p>
@@ -2489,7 +2584,21 @@
                 <w:rStyle w:val="SourceText"/>
                 <w:rFonts w:ascii="Liberation Sans" w:hAnsi="Liberation Sans"/>
               </w:rPr>
-              <w:t>Systemet skal på en lokal webside vise aktuel luftfugtighed, om affugteren er tændt eller slukket, aktuel driftstilstand (normal, kritisk, dark time, sensorfejl, uden elpriser), dagens billigste kvarterer og aktive fejl.</w:t>
+              <w:t xml:space="preserve">Systemet skal på en lokal webside vise aktuel luftfugtighed, om affugteren er tændt eller slukket, aktuel driftstilstand (normal, kritisk, dark time, sensorfejl, </w:t>
+            </w:r>
+            <w:r>
+              <w:rPr>
+                <w:rStyle w:val="SourceText"/>
+                <w:rFonts w:ascii="Liberation Sans" w:hAnsi="Liberation Sans"/>
+              </w:rPr>
+              <w:t>sikkerhedstilstand</w:t>
+            </w:r>
+            <w:r>
+              <w:rPr>
+                <w:rStyle w:val="SourceText"/>
+                <w:rFonts w:ascii="Liberation Sans" w:hAnsi="Liberation Sans"/>
+              </w:rPr>
+              <w:t>), dagens billigste kvarterer og aktive fejl.</w:t>
             </w:r>
           </w:p>
         </w:tc>
@@ -3213,8 +3322,8 @@
       </w:tblPr>
       <w:tblGrid>
         <w:gridCol w:w="360"/>
-        <w:gridCol w:w="4229"/>
-        <w:gridCol w:w="3601"/>
+        <w:gridCol w:w="4228"/>
+        <w:gridCol w:w="3602"/>
         <w:gridCol w:w="836"/>
       </w:tblGrid>
       <w:tr>
@@ -3250,7 +3359,7 @@
         </w:tc>
         <w:tc>
           <w:tcPr>
-            <w:tcW w:w="4229" w:type="dxa"/>
+            <w:tcW w:w="4228" w:type="dxa"/>
             <w:tcBorders>
               <w:top w:val="single" w:sz="12" w:space="0" w:color="000000"/>
               <w:bottom w:val="single" w:sz="6" w:space="0" w:color="000000"/>
@@ -3277,7 +3386,7 @@
         </w:tc>
         <w:tc>
           <w:tcPr>
-            <w:tcW w:w="3601" w:type="dxa"/>
+            <w:tcW w:w="3602" w:type="dxa"/>
             <w:tcBorders>
               <w:top w:val="single" w:sz="12" w:space="0" w:color="000000"/>
               <w:bottom w:val="single" w:sz="6" w:space="0" w:color="000000"/>
@@ -3358,7 +3467,7 @@
         </w:tc>
         <w:tc>
           <w:tcPr>
-            <w:tcW w:w="4229" w:type="dxa"/>
+            <w:tcW w:w="4228" w:type="dxa"/>
             <w:tcBorders>
               <w:bottom w:val="single" w:sz="4" w:space="0" w:color="999999"/>
             </w:tcBorders>
@@ -3382,7 +3491,7 @@
         </w:tc>
         <w:tc>
           <w:tcPr>
-            <w:tcW w:w="3601" w:type="dxa"/>
+            <w:tcW w:w="3602" w:type="dxa"/>
             <w:tcBorders>
               <w:bottom w:val="single" w:sz="4" w:space="0" w:color="999999"/>
             </w:tcBorders>
@@ -3457,7 +3566,7 @@
         </w:tc>
         <w:tc>
           <w:tcPr>
-            <w:tcW w:w="4229" w:type="dxa"/>
+            <w:tcW w:w="4228" w:type="dxa"/>
             <w:tcBorders>
               <w:bottom w:val="single" w:sz="4" w:space="0" w:color="999999"/>
             </w:tcBorders>
@@ -3481,7 +3590,7 @@
         </w:tc>
         <w:tc>
           <w:tcPr>
-            <w:tcW w:w="3601" w:type="dxa"/>
+            <w:tcW w:w="3602" w:type="dxa"/>
             <w:tcBorders>
               <w:bottom w:val="single" w:sz="4" w:space="0" w:color="999999"/>
             </w:tcBorders>
@@ -3556,7 +3665,7 @@
         </w:tc>
         <w:tc>
           <w:tcPr>
-            <w:tcW w:w="4229" w:type="dxa"/>
+            <w:tcW w:w="4228" w:type="dxa"/>
             <w:tcBorders>
               <w:bottom w:val="single" w:sz="4" w:space="0" w:color="999999"/>
             </w:tcBorders>
@@ -3580,7 +3689,7 @@
         </w:tc>
         <w:tc>
           <w:tcPr>
-            <w:tcW w:w="3601" w:type="dxa"/>
+            <w:tcW w:w="3602" w:type="dxa"/>
             <w:tcBorders>
               <w:bottom w:val="single" w:sz="4" w:space="0" w:color="999999"/>
             </w:tcBorders>
@@ -3655,7 +3764,7 @@
         </w:tc>
         <w:tc>
           <w:tcPr>
-            <w:tcW w:w="4229" w:type="dxa"/>
+            <w:tcW w:w="4228" w:type="dxa"/>
             <w:tcBorders>
               <w:bottom w:val="single" w:sz="4" w:space="0" w:color="999999"/>
             </w:tcBorders>
@@ -3679,7 +3788,7 @@
         </w:tc>
         <w:tc>
           <w:tcPr>
-            <w:tcW w:w="3601" w:type="dxa"/>
+            <w:tcW w:w="3602" w:type="dxa"/>
             <w:tcBorders>
               <w:bottom w:val="single" w:sz="4" w:space="0" w:color="999999"/>
             </w:tcBorders>
@@ -3754,7 +3863,7 @@
         </w:tc>
         <w:tc>
           <w:tcPr>
-            <w:tcW w:w="4229" w:type="dxa"/>
+            <w:tcW w:w="4228" w:type="dxa"/>
             <w:tcBorders>
               <w:bottom w:val="single" w:sz="4" w:space="0" w:color="999999"/>
             </w:tcBorders>
@@ -3778,7 +3887,7 @@
         </w:tc>
         <w:tc>
           <w:tcPr>
-            <w:tcW w:w="3601" w:type="dxa"/>
+            <w:tcW w:w="3602" w:type="dxa"/>
             <w:tcBorders>
               <w:bottom w:val="single" w:sz="4" w:space="0" w:color="999999"/>
             </w:tcBorders>
@@ -3853,7 +3962,7 @@
         </w:tc>
         <w:tc>
           <w:tcPr>
-            <w:tcW w:w="4229" w:type="dxa"/>
+            <w:tcW w:w="4228" w:type="dxa"/>
             <w:tcBorders>
               <w:bottom w:val="single" w:sz="4" w:space="0" w:color="999999"/>
             </w:tcBorders>
@@ -3863,6 +3972,40 @@
             <w:pPr>
               <w:pStyle w:val="TableContents"/>
               <w:spacing w:before="0" w:after="160"/>
+              <w:rPr/>
+            </w:pPr>
+            <w:r>
+              <w:rPr>
+                <w:rFonts w:eastAsia="DejaVu Sans" w:cs="DejaVu Sans" w:ascii="Liberation Sans" w:hAnsi="Liberation Sans"/>
+              </w:rPr>
+              <w:t>Der findes ingen gy</w:t>
+            </w:r>
+            <w:r>
+              <w:rPr>
+                <w:rFonts w:eastAsia="DejaVu Sans" w:cs="DejaVu Sans" w:ascii="Liberation Sans" w:hAnsi="Liberation Sans"/>
+                <w:color w:val="auto"/>
+                <w:kern w:val="2"/>
+                <w:sz w:val="22"/>
+                <w:szCs w:val="22"/>
+                <w:lang w:val="da-DK" w:eastAsia="en-US" w:bidi="ar-SA"/>
+                <w14:ligatures w14:val="standardContextual"/>
+              </w:rPr>
+              <w:t>ldige elpriser, heller ikke gemte (sikkerhedstilstand)</w:t>
+            </w:r>
+          </w:p>
+        </w:tc>
+        <w:tc>
+          <w:tcPr>
+            <w:tcW w:w="3602" w:type="dxa"/>
+            <w:tcBorders>
+              <w:bottom w:val="single" w:sz="4" w:space="0" w:color="999999"/>
+            </w:tcBorders>
+            <w:shd w:fill="EEEEEE" w:val="clear"/>
+          </w:tcPr>
+          <w:p>
+            <w:pPr>
+              <w:pStyle w:val="TableContents"/>
+              <w:spacing w:before="0" w:after="160"/>
               <w:rPr>
                 <w:rFonts w:ascii="Liberation Sans" w:hAnsi="Liberation Sans" w:eastAsia="DejaVu Sans" w:cs="DejaVu Sans"/>
               </w:rPr>
@@ -3871,13 +4014,13 @@
               <w:rPr>
                 <w:rFonts w:eastAsia="DejaVu Sans" w:cs="DejaVu Sans" w:ascii="Liberation Sans" w:hAnsi="Liberation Sans"/>
               </w:rPr>
-              <w:t>Der findes ingen gyldige elpriser, heller ikke gemte</w:t>
-            </w:r>
-          </w:p>
-        </w:tc>
-        <w:tc>
-          <w:tcPr>
-            <w:tcW w:w="3601" w:type="dxa"/>
+              <w:t>Affugteren slukkes / forbliver slukket. Kritisk luftfugtighed håndteres af regel 4–5</w:t>
+            </w:r>
+          </w:p>
+        </w:tc>
+        <w:tc>
+          <w:tcPr>
+            <w:tcW w:w="836" w:type="dxa"/>
             <w:tcBorders>
               <w:bottom w:val="single" w:sz="4" w:space="0" w:color="999999"/>
             </w:tcBorders>
@@ -3887,33 +4030,7 @@
             <w:pPr>
               <w:pStyle w:val="TableContents"/>
               <w:spacing w:before="0" w:after="160"/>
-              <w:rPr>
-                <w:rFonts w:ascii="Liberation Sans" w:hAnsi="Liberation Sans" w:eastAsia="DejaVu Sans" w:cs="DejaVu Sans"/>
-              </w:rPr>
-            </w:pPr>
-            <w:r>
-              <w:rPr>
-                <w:rFonts w:eastAsia="DejaVu Sans" w:cs="DejaVu Sans" w:ascii="Liberation Sans" w:hAnsi="Liberation Sans"/>
-              </w:rPr>
-              <w:t>Affugteren slukkes / forbliver slukket</w:t>
-            </w:r>
-          </w:p>
-        </w:tc>
-        <w:tc>
-          <w:tcPr>
-            <w:tcW w:w="836" w:type="dxa"/>
-            <w:tcBorders>
-              <w:bottom w:val="single" w:sz="4" w:space="0" w:color="999999"/>
-            </w:tcBorders>
-            <w:shd w:fill="EEEEEE" w:val="clear"/>
-          </w:tcPr>
-          <w:p>
-            <w:pPr>
-              <w:pStyle w:val="TableContents"/>
-              <w:spacing w:before="0" w:after="160"/>
-              <w:rPr>
-                <w:rFonts w:ascii="Liberation Sans" w:hAnsi="Liberation Sans" w:eastAsia="DejaVu Sans" w:cs="DejaVu Sans"/>
-              </w:rPr>
+              <w:rPr/>
             </w:pPr>
             <w:r>
               <w:rPr>
@@ -3952,7 +4069,7 @@
         </w:tc>
         <w:tc>
           <w:tcPr>
-            <w:tcW w:w="4229" w:type="dxa"/>
+            <w:tcW w:w="4228" w:type="dxa"/>
             <w:tcBorders>
               <w:bottom w:val="single" w:sz="4" w:space="0" w:color="999999"/>
             </w:tcBorders>
@@ -3976,7 +4093,7 @@
         </w:tc>
         <w:tc>
           <w:tcPr>
-            <w:tcW w:w="3601" w:type="dxa"/>
+            <w:tcW w:w="3602" w:type="dxa"/>
             <w:tcBorders>
               <w:bottom w:val="single" w:sz="4" w:space="0" w:color="999999"/>
             </w:tcBorders>
@@ -4051,7 +4168,7 @@
         </w:tc>
         <w:tc>
           <w:tcPr>
-            <w:tcW w:w="4229" w:type="dxa"/>
+            <w:tcW w:w="4228" w:type="dxa"/>
             <w:tcBorders>
               <w:bottom w:val="single" w:sz="4" w:space="0" w:color="999999"/>
             </w:tcBorders>
@@ -4075,7 +4192,7 @@
         </w:tc>
         <w:tc>
           <w:tcPr>
-            <w:tcW w:w="3601" w:type="dxa"/>
+            <w:tcW w:w="3602" w:type="dxa"/>
             <w:tcBorders>
               <w:bottom w:val="single" w:sz="4" w:space="0" w:color="999999"/>
             </w:tcBorders>
@@ -4150,7 +4267,7 @@
         </w:tc>
         <w:tc>
           <w:tcPr>
-            <w:tcW w:w="4229" w:type="dxa"/>
+            <w:tcW w:w="4228" w:type="dxa"/>
             <w:tcBorders>
               <w:bottom w:val="single" w:sz="4" w:space="0" w:color="999999"/>
             </w:tcBorders>
@@ -4174,7 +4291,7 @@
         </w:tc>
         <w:tc>
           <w:tcPr>
-            <w:tcW w:w="3601" w:type="dxa"/>
+            <w:tcW w:w="3602" w:type="dxa"/>
             <w:tcBorders>
               <w:bottom w:val="single" w:sz="4" w:space="0" w:color="999999"/>
             </w:tcBorders>
@@ -4249,7 +4366,7 @@
         </w:tc>
         <w:tc>
           <w:tcPr>
-            <w:tcW w:w="4229" w:type="dxa"/>
+            <w:tcW w:w="4228" w:type="dxa"/>
             <w:tcBorders>
               <w:bottom w:val="single" w:sz="4" w:space="0" w:color="999999"/>
             </w:tcBorders>
@@ -4273,7 +4390,7 @@
         </w:tc>
         <w:tc>
           <w:tcPr>
-            <w:tcW w:w="3601" w:type="dxa"/>
+            <w:tcW w:w="3602" w:type="dxa"/>
             <w:tcBorders>
               <w:bottom w:val="single" w:sz="4" w:space="0" w:color="999999"/>
             </w:tcBorders>
@@ -4347,7 +4464,7 @@
         </w:tc>
         <w:tc>
           <w:tcPr>
-            <w:tcW w:w="4229" w:type="dxa"/>
+            <w:tcW w:w="4228" w:type="dxa"/>
             <w:tcBorders>
               <w:bottom w:val="single" w:sz="12" w:space="0" w:color="000000"/>
             </w:tcBorders>
@@ -4370,7 +4487,7 @@
         </w:tc>
         <w:tc>
           <w:tcPr>
-            <w:tcW w:w="3601" w:type="dxa"/>
+            <w:tcW w:w="3602" w:type="dxa"/>
             <w:tcBorders>
               <w:bottom w:val="single" w:sz="12" w:space="0" w:color="000000"/>
             </w:tcBorders>
@@ -4512,7 +4629,43 @@
           <w:sz w:val="24"/>
           <w:szCs w:val="24"/>
         </w:rPr>
-        <w:t>Da de kritiske regler gennemgås før regel 6, kan affugteren fortsat tændes ved kritisk luftfugtighed, selvom der ikke findes elpriser.</w:t>
+        <w:t xml:space="preserve">Da de kritiske regler gennemgås før regel 6, kan affugteren </w:t>
+      </w:r>
+      <w:r>
+        <w:rPr>
+          <w:rStyle w:val="SourceText"/>
+          <w:rFonts w:ascii="Liberation Sans" w:hAnsi="Liberation Sans"/>
+          <w:sz w:val="24"/>
+          <w:szCs w:val="24"/>
+        </w:rPr>
+        <w:t xml:space="preserve">i sikkerhedstilstand </w:t>
+      </w:r>
+      <w:r>
+        <w:rPr>
+          <w:rStyle w:val="SourceText"/>
+          <w:rFonts w:ascii="Liberation Sans" w:hAnsi="Liberation Sans"/>
+          <w:sz w:val="24"/>
+          <w:szCs w:val="24"/>
+        </w:rPr>
+        <w:t xml:space="preserve"> fortsat tændes ved kritisk </w:t>
+      </w:r>
+      <w:r>
+        <w:rPr>
+          <w:rStyle w:val="SourceText"/>
+          <w:rFonts w:ascii="Liberation Sans" w:hAnsi="Liberation Sans"/>
+          <w:sz w:val="24"/>
+          <w:szCs w:val="24"/>
+        </w:rPr>
+        <w:t>grænsen og køre til slukgrænsen</w:t>
+      </w:r>
+      <w:r>
+        <w:rPr>
+          <w:rStyle w:val="SourceText"/>
+          <w:rFonts w:ascii="Liberation Sans" w:hAnsi="Liberation Sans"/>
+          <w:sz w:val="24"/>
+          <w:szCs w:val="24"/>
+        </w:rPr>
+        <w:t>, selvom der ikke findes elpriser.</w:t>
       </w:r>
     </w:p>
     <w:p>
@@ -4962,7 +5115,70 @@
                 <w:sz w:val="22"/>
                 <w:szCs w:val="22"/>
               </w:rPr>
-              <w:t>Hvis der ikke findes gyldige elpriser for hvert af døgnets 96 kvarterer, skal affugteren kun tændes, når luftfugtigheden overstiger den kritiske grænse, og køre, indtil den er under slukgrænsen.</w:t>
+              <w:t xml:space="preserve">Hvis der ikke findes gyldige elpriser for hvert af døgnets 96 kvarterer, </w:t>
+            </w:r>
+            <w:r>
+              <w:rPr>
+                <w:rStyle w:val="SourceText"/>
+                <w:rFonts w:ascii="Liberation Sans" w:hAnsi="Liberation Sans"/>
+                <w:sz w:val="22"/>
+                <w:szCs w:val="22"/>
+              </w:rPr>
+              <w:t xml:space="preserve">heller ikke gemte, </w:t>
+            </w:r>
+            <w:r>
+              <w:rPr>
+                <w:rStyle w:val="SourceText"/>
+                <w:rFonts w:ascii="Liberation Sans" w:hAnsi="Liberation Sans"/>
+                <w:sz w:val="22"/>
+                <w:szCs w:val="22"/>
+              </w:rPr>
+              <w:t xml:space="preserve">skal </w:t>
+            </w:r>
+            <w:r>
+              <w:rPr>
+                <w:rStyle w:val="SourceText"/>
+                <w:rFonts w:ascii="Liberation Sans" w:hAnsi="Liberation Sans"/>
+                <w:sz w:val="22"/>
+                <w:szCs w:val="22"/>
+              </w:rPr>
+              <w:t xml:space="preserve">systemet går i sikkerhedstilstand. I så fald tændes </w:t>
+            </w:r>
+            <w:r>
+              <w:rPr>
+                <w:rStyle w:val="SourceText"/>
+                <w:rFonts w:ascii="Liberation Sans" w:hAnsi="Liberation Sans"/>
+                <w:sz w:val="22"/>
+                <w:szCs w:val="22"/>
+              </w:rPr>
+              <w:t>affugteren kun, når luftfugtigheden overstiger den kritiske grænse, og køre</w:t>
+            </w:r>
+            <w:r>
+              <w:rPr>
+                <w:rStyle w:val="SourceText"/>
+                <w:rFonts w:ascii="Liberation Sans" w:hAnsi="Liberation Sans"/>
+                <w:sz w:val="22"/>
+                <w:szCs w:val="22"/>
+              </w:rPr>
+              <w:t>r</w:t>
+            </w:r>
+            <w:r>
+              <w:rPr>
+                <w:rStyle w:val="SourceText"/>
+                <w:rFonts w:ascii="Liberation Sans" w:hAnsi="Liberation Sans"/>
+                <w:sz w:val="22"/>
+                <w:szCs w:val="22"/>
+              </w:rPr>
+              <w:t xml:space="preserve">, indtil den er under slukgrænsen. </w:t>
+            </w:r>
+            <w:r>
+              <w:rPr>
+                <w:rStyle w:val="SourceText"/>
+                <w:rFonts w:ascii="Liberation Sans" w:hAnsi="Liberation Sans"/>
+                <w:sz w:val="22"/>
+                <w:szCs w:val="22"/>
+              </w:rPr>
+              <w:t>Når gyldige elpriser igen kan hentes, forlader systemet sikkerhedstilstand, og de almindelige styringsregler gælder.</w:t>
             </w:r>
           </w:p>
         </w:tc>
@@ -8082,8 +8298,8 @@
       </w:tblPr>
       <w:tblGrid>
         <w:gridCol w:w="897"/>
-        <w:gridCol w:w="3960"/>
-        <w:gridCol w:w="4169"/>
+        <w:gridCol w:w="3959"/>
+        <w:gridCol w:w="4170"/>
       </w:tblGrid>
       <w:tr>
         <w:trPr>
@@ -8119,7 +8335,7 @@
         </w:tc>
         <w:tc>
           <w:tcPr>
-            <w:tcW w:w="3960" w:type="dxa"/>
+            <w:tcW w:w="3959" w:type="dxa"/>
             <w:tcBorders>
               <w:top w:val="single" w:sz="12" w:space="0" w:color="000000"/>
               <w:bottom w:val="single" w:sz="6" w:space="0" w:color="000000"/>
@@ -8147,7 +8363,7 @@
         </w:tc>
         <w:tc>
           <w:tcPr>
-            <w:tcW w:w="4169" w:type="dxa"/>
+            <w:tcW w:w="4170" w:type="dxa"/>
             <w:tcBorders>
               <w:top w:val="single" w:sz="12" w:space="0" w:color="000000"/>
               <w:bottom w:val="single" w:sz="6" w:space="0" w:color="000000"/>
@@ -8203,7 +8419,7 @@
         </w:tc>
         <w:tc>
           <w:tcPr>
-            <w:tcW w:w="3960" w:type="dxa"/>
+            <w:tcW w:w="3959" w:type="dxa"/>
             <w:tcBorders>
               <w:bottom w:val="single" w:sz="4" w:space="0" w:color="999999"/>
             </w:tcBorders>
@@ -8228,7 +8444,7 @@
         </w:tc>
         <w:tc>
           <w:tcPr>
-            <w:tcW w:w="4169" w:type="dxa"/>
+            <w:tcW w:w="4170" w:type="dxa"/>
             <w:tcBorders>
               <w:bottom w:val="single" w:sz="4" w:space="0" w:color="999999"/>
             </w:tcBorders>
@@ -8281,7 +8497,7 @@
         </w:tc>
         <w:tc>
           <w:tcPr>
-            <w:tcW w:w="3960" w:type="dxa"/>
+            <w:tcW w:w="3959" w:type="dxa"/>
             <w:tcBorders>
               <w:bottom w:val="single" w:sz="4" w:space="0" w:color="999999"/>
             </w:tcBorders>
@@ -8306,7 +8522,7 @@
         </w:tc>
         <w:tc>
           <w:tcPr>
-            <w:tcW w:w="4169" w:type="dxa"/>
+            <w:tcW w:w="4170" w:type="dxa"/>
             <w:tcBorders>
               <w:bottom w:val="single" w:sz="4" w:space="0" w:color="999999"/>
             </w:tcBorders>
@@ -8359,7 +8575,7 @@
         </w:tc>
         <w:tc>
           <w:tcPr>
-            <w:tcW w:w="3960" w:type="dxa"/>
+            <w:tcW w:w="3959" w:type="dxa"/>
             <w:tcBorders>
               <w:bottom w:val="single" w:sz="4" w:space="0" w:color="999999"/>
             </w:tcBorders>
@@ -8384,7 +8600,7 @@
         </w:tc>
         <w:tc>
           <w:tcPr>
-            <w:tcW w:w="4169" w:type="dxa"/>
+            <w:tcW w:w="4170" w:type="dxa"/>
             <w:tcBorders>
               <w:bottom w:val="single" w:sz="4" w:space="0" w:color="999999"/>
             </w:tcBorders>
@@ -8437,7 +8653,7 @@
         </w:tc>
         <w:tc>
           <w:tcPr>
-            <w:tcW w:w="3960" w:type="dxa"/>
+            <w:tcW w:w="3959" w:type="dxa"/>
             <w:tcBorders>
               <w:bottom w:val="single" w:sz="4" w:space="0" w:color="999999"/>
             </w:tcBorders>
@@ -8462,7 +8678,7 @@
         </w:tc>
         <w:tc>
           <w:tcPr>
-            <w:tcW w:w="4169" w:type="dxa"/>
+            <w:tcW w:w="4170" w:type="dxa"/>
             <w:tcBorders>
               <w:bottom w:val="single" w:sz="4" w:space="0" w:color="999999"/>
             </w:tcBorders>
@@ -8515,7 +8731,7 @@
         </w:tc>
         <w:tc>
           <w:tcPr>
-            <w:tcW w:w="3960" w:type="dxa"/>
+            <w:tcW w:w="3959" w:type="dxa"/>
             <w:tcBorders>
               <w:bottom w:val="single" w:sz="4" w:space="0" w:color="999999"/>
             </w:tcBorders>
@@ -8540,7 +8756,7 @@
         </w:tc>
         <w:tc>
           <w:tcPr>
-            <w:tcW w:w="4169" w:type="dxa"/>
+            <w:tcW w:w="4170" w:type="dxa"/>
             <w:tcBorders>
               <w:bottom w:val="single" w:sz="4" w:space="0" w:color="999999"/>
             </w:tcBorders>
@@ -8593,7 +8809,7 @@
         </w:tc>
         <w:tc>
           <w:tcPr>
-            <w:tcW w:w="3960" w:type="dxa"/>
+            <w:tcW w:w="3959" w:type="dxa"/>
             <w:tcBorders>
               <w:bottom w:val="single" w:sz="4" w:space="0" w:color="999999"/>
             </w:tcBorders>
@@ -8618,7 +8834,7 @@
         </w:tc>
         <w:tc>
           <w:tcPr>
-            <w:tcW w:w="4169" w:type="dxa"/>
+            <w:tcW w:w="4170" w:type="dxa"/>
             <w:tcBorders>
               <w:bottom w:val="single" w:sz="4" w:space="0" w:color="999999"/>
             </w:tcBorders>
@@ -8671,7 +8887,7 @@
         </w:tc>
         <w:tc>
           <w:tcPr>
-            <w:tcW w:w="3960" w:type="dxa"/>
+            <w:tcW w:w="3959" w:type="dxa"/>
             <w:tcBorders>
               <w:bottom w:val="single" w:sz="4" w:space="0" w:color="999999"/>
             </w:tcBorders>
@@ -8696,7 +8912,7 @@
         </w:tc>
         <w:tc>
           <w:tcPr>
-            <w:tcW w:w="4169" w:type="dxa"/>
+            <w:tcW w:w="4170" w:type="dxa"/>
             <w:tcBorders>
               <w:bottom w:val="single" w:sz="4" w:space="0" w:color="999999"/>
             </w:tcBorders>
@@ -8749,7 +8965,7 @@
         </w:tc>
         <w:tc>
           <w:tcPr>
-            <w:tcW w:w="3960" w:type="dxa"/>
+            <w:tcW w:w="3959" w:type="dxa"/>
             <w:tcBorders>
               <w:bottom w:val="single" w:sz="4" w:space="0" w:color="999999"/>
             </w:tcBorders>
@@ -8774,7 +8990,7 @@
         </w:tc>
         <w:tc>
           <w:tcPr>
-            <w:tcW w:w="4169" w:type="dxa"/>
+            <w:tcW w:w="4170" w:type="dxa"/>
             <w:tcBorders>
               <w:bottom w:val="single" w:sz="4" w:space="0" w:color="999999"/>
             </w:tcBorders>
@@ -8827,7 +9043,7 @@
         </w:tc>
         <w:tc>
           <w:tcPr>
-            <w:tcW w:w="3960" w:type="dxa"/>
+            <w:tcW w:w="3959" w:type="dxa"/>
             <w:tcBorders>
               <w:bottom w:val="single" w:sz="4" w:space="0" w:color="999999"/>
             </w:tcBorders>
@@ -8852,7 +9068,7 @@
         </w:tc>
         <w:tc>
           <w:tcPr>
-            <w:tcW w:w="4169" w:type="dxa"/>
+            <w:tcW w:w="4170" w:type="dxa"/>
             <w:tcBorders>
               <w:bottom w:val="single" w:sz="4" w:space="0" w:color="999999"/>
             </w:tcBorders>
@@ -8905,7 +9121,7 @@
         </w:tc>
         <w:tc>
           <w:tcPr>
-            <w:tcW w:w="3960" w:type="dxa"/>
+            <w:tcW w:w="3959" w:type="dxa"/>
             <w:tcBorders>
               <w:bottom w:val="single" w:sz="4" w:space="0" w:color="999999"/>
             </w:tcBorders>
@@ -8930,7 +9146,7 @@
         </w:tc>
         <w:tc>
           <w:tcPr>
-            <w:tcW w:w="4169" w:type="dxa"/>
+            <w:tcW w:w="4170" w:type="dxa"/>
             <w:tcBorders>
               <w:bottom w:val="single" w:sz="4" w:space="0" w:color="999999"/>
             </w:tcBorders>
@@ -8983,7 +9199,7 @@
         </w:tc>
         <w:tc>
           <w:tcPr>
-            <w:tcW w:w="3960" w:type="dxa"/>
+            <w:tcW w:w="3959" w:type="dxa"/>
             <w:tcBorders>
               <w:bottom w:val="single" w:sz="4" w:space="0" w:color="999999"/>
             </w:tcBorders>
@@ -9008,26 +9224,71 @@
         </w:tc>
         <w:tc>
           <w:tcPr>
-            <w:tcW w:w="4169" w:type="dxa"/>
-            <w:tcBorders>
-              <w:bottom w:val="single" w:sz="4" w:space="0" w:color="999999"/>
-            </w:tcBorders>
-            <w:shd w:fill="EEEEEE" w:val="clear"/>
-          </w:tcPr>
-          <w:p>
-            <w:pPr>
-              <w:pStyle w:val="Normal"/>
-              <w:spacing w:before="0" w:after="160"/>
-              <w:rPr/>
-            </w:pPr>
-            <w:r>
-              <w:rPr>
-                <w:rStyle w:val="SourceText"/>
-                <w:rFonts w:ascii="Liberation Sans" w:hAnsi="Liberation Sans"/>
-                <w:sz w:val="22"/>
-                <w:szCs w:val="22"/>
-              </w:rPr>
-              <w:t>Affugteren tændes kun over den kritiske grænse, og websiden viser fejlen.</w:t>
+            <w:tcW w:w="4170" w:type="dxa"/>
+            <w:tcBorders>
+              <w:bottom w:val="single" w:sz="4" w:space="0" w:color="999999"/>
+            </w:tcBorders>
+            <w:shd w:fill="EEEEEE" w:val="clear"/>
+          </w:tcPr>
+          <w:p>
+            <w:pPr>
+              <w:pStyle w:val="Normal"/>
+              <w:spacing w:before="0" w:after="160"/>
+              <w:rPr/>
+            </w:pPr>
+            <w:r>
+              <w:rPr>
+                <w:rStyle w:val="SourceText"/>
+                <w:rFonts w:ascii="Liberation Sans" w:hAnsi="Liberation Sans"/>
+                <w:sz w:val="22"/>
+                <w:szCs w:val="22"/>
+              </w:rPr>
+              <w:t xml:space="preserve">Sikkerhedstilstand: </w:t>
+            </w:r>
+            <w:r>
+              <w:rPr>
+                <w:rStyle w:val="SourceText"/>
+                <w:rFonts w:ascii="Liberation Sans" w:hAnsi="Liberation Sans"/>
+                <w:sz w:val="22"/>
+                <w:szCs w:val="22"/>
+              </w:rPr>
+              <w:t xml:space="preserve">kritisk grænse </w:t>
+            </w:r>
+            <w:r>
+              <w:rPr>
+                <w:rStyle w:val="SourceText"/>
+                <w:rFonts w:ascii="Liberation Sans" w:hAnsi="Liberation Sans"/>
+                <w:sz w:val="22"/>
+                <w:szCs w:val="22"/>
+              </w:rPr>
+              <w:t>og slukgrænse gælder</w:t>
+            </w:r>
+            <w:r>
+              <w:rPr>
+                <w:rStyle w:val="SourceText"/>
+                <w:rFonts w:ascii="Liberation Sans" w:hAnsi="Liberation Sans"/>
+                <w:sz w:val="22"/>
+                <w:szCs w:val="22"/>
+              </w:rPr>
+              <w:t xml:space="preserve">, </w:t>
+            </w:r>
+            <w:r>
+              <w:rPr>
+                <w:rStyle w:val="SourceText"/>
+                <w:rFonts w:ascii="Liberation Sans" w:hAnsi="Liberation Sans"/>
+                <w:sz w:val="22"/>
+                <w:szCs w:val="22"/>
+              </w:rPr>
+              <w:t xml:space="preserve">vises på </w:t>
+            </w:r>
+            <w:r>
+              <w:rPr>
+                <w:rStyle w:val="SourceText"/>
+                <w:rFonts w:ascii="Liberation Sans" w:hAnsi="Liberation Sans"/>
+                <w:sz w:val="22"/>
+                <w:szCs w:val="22"/>
+              </w:rPr>
+              <w:t>websiden.</w:t>
             </w:r>
           </w:p>
         </w:tc>
@@ -9061,7 +9322,7 @@
         </w:tc>
         <w:tc>
           <w:tcPr>
-            <w:tcW w:w="3960" w:type="dxa"/>
+            <w:tcW w:w="3959" w:type="dxa"/>
             <w:tcBorders>
               <w:bottom w:val="single" w:sz="4" w:space="0" w:color="999999"/>
             </w:tcBorders>
@@ -9086,7 +9347,7 @@
         </w:tc>
         <w:tc>
           <w:tcPr>
-            <w:tcW w:w="4169" w:type="dxa"/>
+            <w:tcW w:w="4170" w:type="dxa"/>
             <w:tcBorders>
               <w:bottom w:val="single" w:sz="4" w:space="0" w:color="999999"/>
             </w:tcBorders>
@@ -9139,7 +9400,7 @@
         </w:tc>
         <w:tc>
           <w:tcPr>
-            <w:tcW w:w="3960" w:type="dxa"/>
+            <w:tcW w:w="3959" w:type="dxa"/>
             <w:tcBorders>
               <w:bottom w:val="single" w:sz="4" w:space="0" w:color="999999"/>
             </w:tcBorders>
@@ -9164,7 +9425,7 @@
         </w:tc>
         <w:tc>
           <w:tcPr>
-            <w:tcW w:w="4169" w:type="dxa"/>
+            <w:tcW w:w="4170" w:type="dxa"/>
             <w:tcBorders>
               <w:bottom w:val="single" w:sz="4" w:space="0" w:color="999999"/>
             </w:tcBorders>
@@ -9217,7 +9478,7 @@
         </w:tc>
         <w:tc>
           <w:tcPr>
-            <w:tcW w:w="3960" w:type="dxa"/>
+            <w:tcW w:w="3959" w:type="dxa"/>
             <w:tcBorders>
               <w:bottom w:val="single" w:sz="4" w:space="0" w:color="999999"/>
             </w:tcBorders>
@@ -9242,7 +9503,7 @@
         </w:tc>
         <w:tc>
           <w:tcPr>
-            <w:tcW w:w="4169" w:type="dxa"/>
+            <w:tcW w:w="4170" w:type="dxa"/>
             <w:tcBorders>
               <w:bottom w:val="single" w:sz="4" w:space="0" w:color="999999"/>
             </w:tcBorders>
@@ -9295,7 +9556,7 @@
         </w:tc>
         <w:tc>
           <w:tcPr>
-            <w:tcW w:w="3960" w:type="dxa"/>
+            <w:tcW w:w="3959" w:type="dxa"/>
             <w:tcBorders>
               <w:bottom w:val="single" w:sz="4" w:space="0" w:color="999999"/>
             </w:tcBorders>
@@ -9320,7 +9581,7 @@
         </w:tc>
         <w:tc>
           <w:tcPr>
-            <w:tcW w:w="4169" w:type="dxa"/>
+            <w:tcW w:w="4170" w:type="dxa"/>
             <w:tcBorders>
               <w:bottom w:val="single" w:sz="4" w:space="0" w:color="999999"/>
             </w:tcBorders>
@@ -9373,7 +9634,7 @@
         </w:tc>
         <w:tc>
           <w:tcPr>
-            <w:tcW w:w="3960" w:type="dxa"/>
+            <w:tcW w:w="3959" w:type="dxa"/>
             <w:tcBorders>
               <w:bottom w:val="single" w:sz="4" w:space="0" w:color="999999"/>
             </w:tcBorders>
@@ -9398,7 +9659,7 @@
         </w:tc>
         <w:tc>
           <w:tcPr>
-            <w:tcW w:w="4169" w:type="dxa"/>
+            <w:tcW w:w="4170" w:type="dxa"/>
             <w:tcBorders>
               <w:bottom w:val="single" w:sz="4" w:space="0" w:color="999999"/>
             </w:tcBorders>
@@ -9451,7 +9712,7 @@
         </w:tc>
         <w:tc>
           <w:tcPr>
-            <w:tcW w:w="3960" w:type="dxa"/>
+            <w:tcW w:w="3959" w:type="dxa"/>
             <w:tcBorders>
               <w:bottom w:val="single" w:sz="4" w:space="0" w:color="999999"/>
             </w:tcBorders>
@@ -9476,7 +9737,7 @@
         </w:tc>
         <w:tc>
           <w:tcPr>
-            <w:tcW w:w="4169" w:type="dxa"/>
+            <w:tcW w:w="4170" w:type="dxa"/>
             <w:tcBorders>
               <w:bottom w:val="single" w:sz="4" w:space="0" w:color="999999"/>
             </w:tcBorders>
@@ -9527,7 +9788,7 @@
         </w:tc>
         <w:tc>
           <w:tcPr>
-            <w:tcW w:w="3960" w:type="dxa"/>
+            <w:tcW w:w="3959" w:type="dxa"/>
             <w:tcBorders>
               <w:bottom w:val="single" w:sz="4" w:space="0" w:color="999999"/>
             </w:tcBorders>
@@ -9552,7 +9813,7 @@
         </w:tc>
         <w:tc>
           <w:tcPr>
-            <w:tcW w:w="4169" w:type="dxa"/>
+            <w:tcW w:w="4170" w:type="dxa"/>
             <w:tcBorders>
               <w:bottom w:val="single" w:sz="4" w:space="0" w:color="999999"/>
             </w:tcBorders>
@@ -9607,7 +9868,7 @@
         </w:tc>
         <w:tc>
           <w:tcPr>
-            <w:tcW w:w="3960" w:type="dxa"/>
+            <w:tcW w:w="3959" w:type="dxa"/>
             <w:tcBorders>
               <w:bottom w:val="single" w:sz="12" w:space="0" w:color="000000"/>
             </w:tcBorders>
@@ -9634,7 +9895,7 @@
         </w:tc>
         <w:tc>
           <w:tcPr>
-            <w:tcW w:w="4169" w:type="dxa"/>
+            <w:tcW w:w="4170" w:type="dxa"/>
             <w:tcBorders>
               <w:bottom w:val="single" w:sz="12" w:space="0" w:color="000000"/>
             </w:tcBorders>
@@ -10994,8 +11255,8 @@
       <w:iCs/>
     </w:rPr>
   </w:style>
-  <w:style w:type="character" w:styleId="Bullets">
-    <w:name w:val="Bullets"/>
+  <w:style w:type="character" w:styleId="Bulletsuser">
+    <w:name w:val="Bullets (user)"/>
     <w:qFormat/>
     <w:rPr>
       <w:rFonts w:ascii="OpenSymbol" w:hAnsi="OpenSymbol" w:eastAsia="OpenSymbol" w:cs="OpenSymbol"/>

</xml_diff>

<commit_message>
lille rettelse af sikkerhedstilstandsbeskrivelse
</commit_message>
<xml_diff>
--- a/documentation/KravSpec/H5AffugterKravspecifikation.docx
+++ b/documentation/KravSpec/H5AffugterKravspecifikation.docx
@@ -1,6 +1,6 @@
 
 <file path=word/document.xml><?xml version="1.0" encoding="utf-8"?>
-<w:document xmlns:o="urn:schemas-microsoft-com:office:office" xmlns:r="http://schemas.openxmlformats.org/officeDocument/2006/relationships" xmlns:v="urn:schemas-microsoft-com:vml" xmlns:w="http://schemas.openxmlformats.org/wordprocessingml/2006/main" xmlns:w10="urn:schemas-microsoft-com:office:word" xmlns:wp="http://schemas.openxmlformats.org/drawingml/2006/wordprocessingDrawing" xmlns:pic="http://schemas.openxmlformats.org/drawingml/2006/picture" xmlns:wps="http://schemas.microsoft.com/office/word/2010/wordprocessingShape" xmlns:wpg="http://schemas.microsoft.com/office/word/2010/wordprocessingGroup" xmlns:mc="http://schemas.openxmlformats.org/markup-compatibility/2006" xmlns:wp14="http://schemas.microsoft.com/office/word/2010/wordprocessingDrawing" xmlns:w14="http://schemas.microsoft.com/office/word/2010/wordml" xmlns:w15="http://schemas.microsoft.com/office/word/2012/wordml" mc:Ignorable="w14 wp14 w15">
+<w:document xmlns:o="urn:schemas-microsoft-com:office:office" xmlns:r="http://schemas.openxmlformats.org/officeDocument/2006/relationships" xmlns:v="urn:schemas-microsoft-com:vml" xmlns:w="http://schemas.openxmlformats.org/wordprocessingml/2006/main" xmlns:w10="urn:schemas-microsoft-com:office:word" xmlns:wp="http://schemas.openxmlformats.org/drawingml/2006/wordprocessingDrawing" xmlns:wps="http://schemas.microsoft.com/office/word/2010/wordprocessingShape" xmlns:wpg="http://schemas.microsoft.com/office/word/2010/wordprocessingGroup" xmlns:mc="http://schemas.openxmlformats.org/markup-compatibility/2006" xmlns:wp14="http://schemas.microsoft.com/office/word/2010/wordprocessingDrawing" xmlns:w14="http://schemas.microsoft.com/office/word/2010/wordml" xmlns:w15="http://schemas.microsoft.com/office/word/2012/wordml" mc:Ignorable="w14 wp14 w15">
   <w:body>
     <w:p>
       <w:pPr>
@@ -414,7 +414,7 @@
       <w:r>
         <w:rPr>
           <w:rStyle w:val="SourceText"/>
-          <w:rFonts w:ascii="Liberation Sans" w:hAnsi="Liberation Sans" w:cstheme="minorBidi"/>
+          <w:rFonts w:cs="" w:ascii="Liberation Sans" w:hAnsi="Liberation Sans" w:cstheme="minorBidi"/>
           <w:color w:val="auto"/>
           <w:kern w:val="2"/>
           <w:sz w:val="24"/>
@@ -1913,25 +1913,7 @@
           <w:sz w:val="24"/>
           <w:szCs w:val="24"/>
         </w:rPr>
-        <w:t xml:space="preserve">Når luftfugtigheden overstiger tændgrænsen, og det aktuelle kvarter er billigt (se K-002), tændes affugteren. Den kører, indtil luftfugtigheden er under slukgrænsen, eller kvarteret ikke længere er billigt. Hvis luftfugtigheden overstiger den kritiske grænse, kører affugteren uanset elpris, indtil luftfugtigheden er under slukgrænsen. </w:t>
-      </w:r>
-      <w:r>
-        <w:rPr>
-          <w:rStyle w:val="SourceText"/>
-          <w:rFonts w:ascii="Liberation Sans" w:hAnsi="Liberation Sans"/>
-          <w:sz w:val="24"/>
-          <w:szCs w:val="24"/>
-        </w:rPr>
-        <w:t xml:space="preserve">Findes der ingen gyldige elpriser, går systemet i sikkerhedstilstand, hvor affugteren udelukkende styres efter luftfugtigheden (K-011). </w:t>
-      </w:r>
-      <w:r>
-        <w:rPr>
-          <w:rStyle w:val="SourceText"/>
-          <w:rFonts w:ascii="Liberation Sans" w:hAnsi="Liberation Sans"/>
-          <w:sz w:val="24"/>
-          <w:szCs w:val="24"/>
-        </w:rPr>
-        <w:t>Dette gælder dog ikke i de foruddefinerede tidsrum (K-018), hvor driften er begrænset.</w:t>
+        <w:t>Når luftfugtigheden overstiger tændgrænsen, og det aktuelle kvarter er billigt (se K-002), tændes affugteren. Den kører, indtil luftfugtigheden er under slukgrænsen, eller kvarteret ikke længere er billigt. Hvis luftfugtigheden overstiger den kritiske grænse, kører affugteren uanset elpris, indtil luftfugtigheden er under slukgrænsen. Findes der ingen gyldige elpriser, går systemet i sikkerhedstilstand, hvor affugteren udelukkende styres efter luftfugtigheden (K-011). Dette gælder dog ikke i de foruddefinerede tidsrum (K-018), hvor driften er begrænset.</w:t>
       </w:r>
     </w:p>
     <w:p>
@@ -2584,21 +2566,7 @@
                 <w:rStyle w:val="SourceText"/>
                 <w:rFonts w:ascii="Liberation Sans" w:hAnsi="Liberation Sans"/>
               </w:rPr>
-              <w:t xml:space="preserve">Systemet skal på en lokal webside vise aktuel luftfugtighed, om affugteren er tændt eller slukket, aktuel driftstilstand (normal, kritisk, dark time, sensorfejl, </w:t>
-            </w:r>
-            <w:r>
-              <w:rPr>
-                <w:rStyle w:val="SourceText"/>
-                <w:rFonts w:ascii="Liberation Sans" w:hAnsi="Liberation Sans"/>
-              </w:rPr>
-              <w:t>sikkerhedstilstand</w:t>
-            </w:r>
-            <w:r>
-              <w:rPr>
-                <w:rStyle w:val="SourceText"/>
-                <w:rFonts w:ascii="Liberation Sans" w:hAnsi="Liberation Sans"/>
-              </w:rPr>
-              <w:t>), dagens billigste kvarterer og aktive fejl.</w:t>
+              <w:t>Systemet skal på en lokal webside vise aktuel luftfugtighed, om affugteren er tændt eller slukket, aktuel driftstilstand (normal, kritisk, dark time, sensorfejl, sikkerhedstilstand), dagens billigste kvarterer og aktive fejl.</w:t>
             </w:r>
           </w:p>
         </w:tc>
@@ -3322,9 +3290,9 @@
       </w:tblPr>
       <w:tblGrid>
         <w:gridCol w:w="360"/>
-        <w:gridCol w:w="4228"/>
-        <w:gridCol w:w="3602"/>
-        <w:gridCol w:w="836"/>
+        <w:gridCol w:w="4227"/>
+        <w:gridCol w:w="3603"/>
+        <w:gridCol w:w="835"/>
       </w:tblGrid>
       <w:tr>
         <w:trPr>
@@ -3359,7 +3327,7 @@
         </w:tc>
         <w:tc>
           <w:tcPr>
-            <w:tcW w:w="4228" w:type="dxa"/>
+            <w:tcW w:w="4227" w:type="dxa"/>
             <w:tcBorders>
               <w:top w:val="single" w:sz="12" w:space="0" w:color="000000"/>
               <w:bottom w:val="single" w:sz="6" w:space="0" w:color="000000"/>
@@ -3386,7 +3354,7 @@
         </w:tc>
         <w:tc>
           <w:tcPr>
-            <w:tcW w:w="3602" w:type="dxa"/>
+            <w:tcW w:w="3603" w:type="dxa"/>
             <w:tcBorders>
               <w:top w:val="single" w:sz="12" w:space="0" w:color="000000"/>
               <w:bottom w:val="single" w:sz="6" w:space="0" w:color="000000"/>
@@ -3413,7 +3381,7 @@
         </w:tc>
         <w:tc>
           <w:tcPr>
-            <w:tcW w:w="836" w:type="dxa"/>
+            <w:tcW w:w="835" w:type="dxa"/>
             <w:tcBorders>
               <w:top w:val="single" w:sz="12" w:space="0" w:color="000000"/>
               <w:bottom w:val="single" w:sz="6" w:space="0" w:color="000000"/>
@@ -3467,7 +3435,7 @@
         </w:tc>
         <w:tc>
           <w:tcPr>
-            <w:tcW w:w="4228" w:type="dxa"/>
+            <w:tcW w:w="4227" w:type="dxa"/>
             <w:tcBorders>
               <w:bottom w:val="single" w:sz="4" w:space="0" w:color="999999"/>
             </w:tcBorders>
@@ -3491,7 +3459,7 @@
         </w:tc>
         <w:tc>
           <w:tcPr>
-            <w:tcW w:w="3602" w:type="dxa"/>
+            <w:tcW w:w="3603" w:type="dxa"/>
             <w:tcBorders>
               <w:bottom w:val="single" w:sz="4" w:space="0" w:color="999999"/>
             </w:tcBorders>
@@ -3515,7 +3483,7 @@
         </w:tc>
         <w:tc>
           <w:tcPr>
-            <w:tcW w:w="836" w:type="dxa"/>
+            <w:tcW w:w="835" w:type="dxa"/>
             <w:tcBorders>
               <w:bottom w:val="single" w:sz="4" w:space="0" w:color="999999"/>
             </w:tcBorders>
@@ -3566,7 +3534,7 @@
         </w:tc>
         <w:tc>
           <w:tcPr>
-            <w:tcW w:w="4228" w:type="dxa"/>
+            <w:tcW w:w="4227" w:type="dxa"/>
             <w:tcBorders>
               <w:bottom w:val="single" w:sz="4" w:space="0" w:color="999999"/>
             </w:tcBorders>
@@ -3590,7 +3558,7 @@
         </w:tc>
         <w:tc>
           <w:tcPr>
-            <w:tcW w:w="3602" w:type="dxa"/>
+            <w:tcW w:w="3603" w:type="dxa"/>
             <w:tcBorders>
               <w:bottom w:val="single" w:sz="4" w:space="0" w:color="999999"/>
             </w:tcBorders>
@@ -3614,7 +3582,7 @@
         </w:tc>
         <w:tc>
           <w:tcPr>
-            <w:tcW w:w="836" w:type="dxa"/>
+            <w:tcW w:w="835" w:type="dxa"/>
             <w:tcBorders>
               <w:bottom w:val="single" w:sz="4" w:space="0" w:color="999999"/>
             </w:tcBorders>
@@ -3665,7 +3633,7 @@
         </w:tc>
         <w:tc>
           <w:tcPr>
-            <w:tcW w:w="4228" w:type="dxa"/>
+            <w:tcW w:w="4227" w:type="dxa"/>
             <w:tcBorders>
               <w:bottom w:val="single" w:sz="4" w:space="0" w:color="999999"/>
             </w:tcBorders>
@@ -3689,7 +3657,7 @@
         </w:tc>
         <w:tc>
           <w:tcPr>
-            <w:tcW w:w="3602" w:type="dxa"/>
+            <w:tcW w:w="3603" w:type="dxa"/>
             <w:tcBorders>
               <w:bottom w:val="single" w:sz="4" w:space="0" w:color="999999"/>
             </w:tcBorders>
@@ -3713,7 +3681,7 @@
         </w:tc>
         <w:tc>
           <w:tcPr>
-            <w:tcW w:w="836" w:type="dxa"/>
+            <w:tcW w:w="835" w:type="dxa"/>
             <w:tcBorders>
               <w:bottom w:val="single" w:sz="4" w:space="0" w:color="999999"/>
             </w:tcBorders>
@@ -3764,7 +3732,7 @@
         </w:tc>
         <w:tc>
           <w:tcPr>
-            <w:tcW w:w="4228" w:type="dxa"/>
+            <w:tcW w:w="4227" w:type="dxa"/>
             <w:tcBorders>
               <w:bottom w:val="single" w:sz="4" w:space="0" w:color="999999"/>
             </w:tcBorders>
@@ -3788,7 +3756,7 @@
         </w:tc>
         <w:tc>
           <w:tcPr>
-            <w:tcW w:w="3602" w:type="dxa"/>
+            <w:tcW w:w="3603" w:type="dxa"/>
             <w:tcBorders>
               <w:bottom w:val="single" w:sz="4" w:space="0" w:color="999999"/>
             </w:tcBorders>
@@ -3812,7 +3780,7 @@
         </w:tc>
         <w:tc>
           <w:tcPr>
-            <w:tcW w:w="836" w:type="dxa"/>
+            <w:tcW w:w="835" w:type="dxa"/>
             <w:tcBorders>
               <w:bottom w:val="single" w:sz="4" w:space="0" w:color="999999"/>
             </w:tcBorders>
@@ -3863,7 +3831,7 @@
         </w:tc>
         <w:tc>
           <w:tcPr>
-            <w:tcW w:w="4228" w:type="dxa"/>
+            <w:tcW w:w="4227" w:type="dxa"/>
             <w:tcBorders>
               <w:bottom w:val="single" w:sz="4" w:space="0" w:color="999999"/>
             </w:tcBorders>
@@ -3887,7 +3855,7 @@
         </w:tc>
         <w:tc>
           <w:tcPr>
-            <w:tcW w:w="3602" w:type="dxa"/>
+            <w:tcW w:w="3603" w:type="dxa"/>
             <w:tcBorders>
               <w:bottom w:val="single" w:sz="4" w:space="0" w:color="999999"/>
             </w:tcBorders>
@@ -3911,7 +3879,7 @@
         </w:tc>
         <w:tc>
           <w:tcPr>
-            <w:tcW w:w="836" w:type="dxa"/>
+            <w:tcW w:w="835" w:type="dxa"/>
             <w:tcBorders>
               <w:bottom w:val="single" w:sz="4" w:space="0" w:color="999999"/>
             </w:tcBorders>
@@ -3962,7 +3930,7 @@
         </w:tc>
         <w:tc>
           <w:tcPr>
-            <w:tcW w:w="4228" w:type="dxa"/>
+            <w:tcW w:w="4227" w:type="dxa"/>
             <w:tcBorders>
               <w:bottom w:val="single" w:sz="4" w:space="0" w:color="999999"/>
             </w:tcBorders>
@@ -3996,7 +3964,7 @@
         </w:tc>
         <w:tc>
           <w:tcPr>
-            <w:tcW w:w="3602" w:type="dxa"/>
+            <w:tcW w:w="3603" w:type="dxa"/>
             <w:tcBorders>
               <w:bottom w:val="single" w:sz="4" w:space="0" w:color="999999"/>
             </w:tcBorders>
@@ -4014,13 +3982,13 @@
               <w:rPr>
                 <w:rFonts w:eastAsia="DejaVu Sans" w:cs="DejaVu Sans" w:ascii="Liberation Sans" w:hAnsi="Liberation Sans"/>
               </w:rPr>
-              <w:t>Affugteren slukkes / forbliver slukket. Kritisk luftfugtighed håndteres af regel 4–5</w:t>
-            </w:r>
-          </w:p>
-        </w:tc>
-        <w:tc>
-          <w:tcPr>
-            <w:tcW w:w="836" w:type="dxa"/>
+              <w:t>Kritisk luftfugtighed håndteres af regel 4–5</w:t>
+            </w:r>
+          </w:p>
+        </w:tc>
+        <w:tc>
+          <w:tcPr>
+            <w:tcW w:w="835" w:type="dxa"/>
             <w:tcBorders>
               <w:bottom w:val="single" w:sz="4" w:space="0" w:color="999999"/>
             </w:tcBorders>
@@ -4069,7 +4037,7 @@
         </w:tc>
         <w:tc>
           <w:tcPr>
-            <w:tcW w:w="4228" w:type="dxa"/>
+            <w:tcW w:w="4227" w:type="dxa"/>
             <w:tcBorders>
               <w:bottom w:val="single" w:sz="4" w:space="0" w:color="999999"/>
             </w:tcBorders>
@@ -4093,7 +4061,7 @@
         </w:tc>
         <w:tc>
           <w:tcPr>
-            <w:tcW w:w="3602" w:type="dxa"/>
+            <w:tcW w:w="3603" w:type="dxa"/>
             <w:tcBorders>
               <w:bottom w:val="single" w:sz="4" w:space="0" w:color="999999"/>
             </w:tcBorders>
@@ -4117,7 +4085,7 @@
         </w:tc>
         <w:tc>
           <w:tcPr>
-            <w:tcW w:w="836" w:type="dxa"/>
+            <w:tcW w:w="835" w:type="dxa"/>
             <w:tcBorders>
               <w:bottom w:val="single" w:sz="4" w:space="0" w:color="999999"/>
             </w:tcBorders>
@@ -4168,7 +4136,7 @@
         </w:tc>
         <w:tc>
           <w:tcPr>
-            <w:tcW w:w="4228" w:type="dxa"/>
+            <w:tcW w:w="4227" w:type="dxa"/>
             <w:tcBorders>
               <w:bottom w:val="single" w:sz="4" w:space="0" w:color="999999"/>
             </w:tcBorders>
@@ -4192,7 +4160,7 @@
         </w:tc>
         <w:tc>
           <w:tcPr>
-            <w:tcW w:w="3602" w:type="dxa"/>
+            <w:tcW w:w="3603" w:type="dxa"/>
             <w:tcBorders>
               <w:bottom w:val="single" w:sz="4" w:space="0" w:color="999999"/>
             </w:tcBorders>
@@ -4216,7 +4184,7 @@
         </w:tc>
         <w:tc>
           <w:tcPr>
-            <w:tcW w:w="836" w:type="dxa"/>
+            <w:tcW w:w="835" w:type="dxa"/>
             <w:tcBorders>
               <w:bottom w:val="single" w:sz="4" w:space="0" w:color="999999"/>
             </w:tcBorders>
@@ -4267,7 +4235,7 @@
         </w:tc>
         <w:tc>
           <w:tcPr>
-            <w:tcW w:w="4228" w:type="dxa"/>
+            <w:tcW w:w="4227" w:type="dxa"/>
             <w:tcBorders>
               <w:bottom w:val="single" w:sz="4" w:space="0" w:color="999999"/>
             </w:tcBorders>
@@ -4291,7 +4259,7 @@
         </w:tc>
         <w:tc>
           <w:tcPr>
-            <w:tcW w:w="3602" w:type="dxa"/>
+            <w:tcW w:w="3603" w:type="dxa"/>
             <w:tcBorders>
               <w:bottom w:val="single" w:sz="4" w:space="0" w:color="999999"/>
             </w:tcBorders>
@@ -4315,7 +4283,7 @@
         </w:tc>
         <w:tc>
           <w:tcPr>
-            <w:tcW w:w="836" w:type="dxa"/>
+            <w:tcW w:w="835" w:type="dxa"/>
             <w:tcBorders>
               <w:bottom w:val="single" w:sz="4" w:space="0" w:color="999999"/>
             </w:tcBorders>
@@ -4366,7 +4334,7 @@
         </w:tc>
         <w:tc>
           <w:tcPr>
-            <w:tcW w:w="4228" w:type="dxa"/>
+            <w:tcW w:w="4227" w:type="dxa"/>
             <w:tcBorders>
               <w:bottom w:val="single" w:sz="4" w:space="0" w:color="999999"/>
             </w:tcBorders>
@@ -4390,7 +4358,7 @@
         </w:tc>
         <w:tc>
           <w:tcPr>
-            <w:tcW w:w="3602" w:type="dxa"/>
+            <w:tcW w:w="3603" w:type="dxa"/>
             <w:tcBorders>
               <w:bottom w:val="single" w:sz="4" w:space="0" w:color="999999"/>
             </w:tcBorders>
@@ -4414,7 +4382,7 @@
         </w:tc>
         <w:tc>
           <w:tcPr>
-            <w:tcW w:w="836" w:type="dxa"/>
+            <w:tcW w:w="835" w:type="dxa"/>
             <w:tcBorders>
               <w:bottom w:val="single" w:sz="4" w:space="0" w:color="999999"/>
             </w:tcBorders>
@@ -4464,7 +4432,7 @@
         </w:tc>
         <w:tc>
           <w:tcPr>
-            <w:tcW w:w="4228" w:type="dxa"/>
+            <w:tcW w:w="4227" w:type="dxa"/>
             <w:tcBorders>
               <w:bottom w:val="single" w:sz="12" w:space="0" w:color="000000"/>
             </w:tcBorders>
@@ -4487,7 +4455,7 @@
         </w:tc>
         <w:tc>
           <w:tcPr>
-            <w:tcW w:w="3602" w:type="dxa"/>
+            <w:tcW w:w="3603" w:type="dxa"/>
             <w:tcBorders>
               <w:bottom w:val="single" w:sz="12" w:space="0" w:color="000000"/>
             </w:tcBorders>
@@ -4510,7 +4478,7 @@
         </w:tc>
         <w:tc>
           <w:tcPr>
-            <w:tcW w:w="836" w:type="dxa"/>
+            <w:tcW w:w="835" w:type="dxa"/>
             <w:tcBorders>
               <w:bottom w:val="single" w:sz="12" w:space="0" w:color="000000"/>
             </w:tcBorders>
@@ -4629,43 +4597,7 @@
           <w:sz w:val="24"/>
           <w:szCs w:val="24"/>
         </w:rPr>
-        <w:t xml:space="preserve">Da de kritiske regler gennemgås før regel 6, kan affugteren </w:t>
-      </w:r>
-      <w:r>
-        <w:rPr>
-          <w:rStyle w:val="SourceText"/>
-          <w:rFonts w:ascii="Liberation Sans" w:hAnsi="Liberation Sans"/>
-          <w:sz w:val="24"/>
-          <w:szCs w:val="24"/>
-        </w:rPr>
-        <w:t xml:space="preserve">i sikkerhedstilstand </w:t>
-      </w:r>
-      <w:r>
-        <w:rPr>
-          <w:rStyle w:val="SourceText"/>
-          <w:rFonts w:ascii="Liberation Sans" w:hAnsi="Liberation Sans"/>
-          <w:sz w:val="24"/>
-          <w:szCs w:val="24"/>
-        </w:rPr>
-        <w:t xml:space="preserve"> fortsat tændes ved kritisk </w:t>
-      </w:r>
-      <w:r>
-        <w:rPr>
-          <w:rStyle w:val="SourceText"/>
-          <w:rFonts w:ascii="Liberation Sans" w:hAnsi="Liberation Sans"/>
-          <w:sz w:val="24"/>
-          <w:szCs w:val="24"/>
-        </w:rPr>
-        <w:t>grænsen og køre til slukgrænsen</w:t>
-      </w:r>
-      <w:r>
-        <w:rPr>
-          <w:rStyle w:val="SourceText"/>
-          <w:rFonts w:ascii="Liberation Sans" w:hAnsi="Liberation Sans"/>
-          <w:sz w:val="24"/>
-          <w:szCs w:val="24"/>
-        </w:rPr>
-        <w:t>, selvom der ikke findes elpriser.</w:t>
+        <w:t>Da de kritiske regler gennemgås før regel 6, kan affugteren i sikkerhedstilstand  fortsat tændes ved kritisk grænsen og køre til slukgrænsen, selvom der ikke findes elpriser.</w:t>
       </w:r>
     </w:p>
     <w:p>
@@ -4719,7 +4651,7 @@
         <w:gridCol w:w="1797"/>
         <w:gridCol w:w="813"/>
         <w:gridCol w:w="5041"/>
-        <w:gridCol w:w="1285"/>
+        <w:gridCol w:w="1284"/>
       </w:tblGrid>
       <w:tr>
         <w:trPr/>
@@ -4809,7 +4741,7 @@
         </w:tc>
         <w:tc>
           <w:tcPr>
-            <w:tcW w:w="1285" w:type="dxa"/>
+            <w:tcW w:w="1284" w:type="dxa"/>
             <w:tcBorders>
               <w:top w:val="single" w:sz="12" w:space="0" w:color="000000"/>
               <w:bottom w:val="single" w:sz="6" w:space="0" w:color="000000"/>
@@ -4915,7 +4847,7 @@
         </w:tc>
         <w:tc>
           <w:tcPr>
-            <w:tcW w:w="1285" w:type="dxa"/>
+            <w:tcW w:w="1284" w:type="dxa"/>
             <w:tcBorders>
               <w:bottom w:val="single" w:sz="4" w:space="0" w:color="999999"/>
             </w:tcBorders>
@@ -5018,7 +4950,7 @@
         </w:tc>
         <w:tc>
           <w:tcPr>
-            <w:tcW w:w="1285" w:type="dxa"/>
+            <w:tcW w:w="1284" w:type="dxa"/>
             <w:tcBorders>
               <w:bottom w:val="single" w:sz="4" w:space="0" w:color="999999"/>
             </w:tcBorders>
@@ -5115,76 +5047,13 @@
                 <w:sz w:val="22"/>
                 <w:szCs w:val="22"/>
               </w:rPr>
-              <w:t xml:space="preserve">Hvis der ikke findes gyldige elpriser for hvert af døgnets 96 kvarterer, </w:t>
-            </w:r>
-            <w:r>
-              <w:rPr>
-                <w:rStyle w:val="SourceText"/>
-                <w:rFonts w:ascii="Liberation Sans" w:hAnsi="Liberation Sans"/>
-                <w:sz w:val="22"/>
-                <w:szCs w:val="22"/>
-              </w:rPr>
-              <w:t xml:space="preserve">heller ikke gemte, </w:t>
-            </w:r>
-            <w:r>
-              <w:rPr>
-                <w:rStyle w:val="SourceText"/>
-                <w:rFonts w:ascii="Liberation Sans" w:hAnsi="Liberation Sans"/>
-                <w:sz w:val="22"/>
-                <w:szCs w:val="22"/>
-              </w:rPr>
-              <w:t xml:space="preserve">skal </w:t>
-            </w:r>
-            <w:r>
-              <w:rPr>
-                <w:rStyle w:val="SourceText"/>
-                <w:rFonts w:ascii="Liberation Sans" w:hAnsi="Liberation Sans"/>
-                <w:sz w:val="22"/>
-                <w:szCs w:val="22"/>
-              </w:rPr>
-              <w:t xml:space="preserve">systemet går i sikkerhedstilstand. I så fald tændes </w:t>
-            </w:r>
-            <w:r>
-              <w:rPr>
-                <w:rStyle w:val="SourceText"/>
-                <w:rFonts w:ascii="Liberation Sans" w:hAnsi="Liberation Sans"/>
-                <w:sz w:val="22"/>
-                <w:szCs w:val="22"/>
-              </w:rPr>
-              <w:t>affugteren kun, når luftfugtigheden overstiger den kritiske grænse, og køre</w:t>
-            </w:r>
-            <w:r>
-              <w:rPr>
-                <w:rStyle w:val="SourceText"/>
-                <w:rFonts w:ascii="Liberation Sans" w:hAnsi="Liberation Sans"/>
-                <w:sz w:val="22"/>
-                <w:szCs w:val="22"/>
-              </w:rPr>
-              <w:t>r</w:t>
-            </w:r>
-            <w:r>
-              <w:rPr>
-                <w:rStyle w:val="SourceText"/>
-                <w:rFonts w:ascii="Liberation Sans" w:hAnsi="Liberation Sans"/>
-                <w:sz w:val="22"/>
-                <w:szCs w:val="22"/>
-              </w:rPr>
-              <w:t xml:space="preserve">, indtil den er under slukgrænsen. </w:t>
-            </w:r>
-            <w:r>
-              <w:rPr>
-                <w:rStyle w:val="SourceText"/>
-                <w:rFonts w:ascii="Liberation Sans" w:hAnsi="Liberation Sans"/>
-                <w:sz w:val="22"/>
-                <w:szCs w:val="22"/>
-              </w:rPr>
-              <w:t>Når gyldige elpriser igen kan hentes, forlader systemet sikkerhedstilstand, og de almindelige styringsregler gælder.</w:t>
-            </w:r>
-          </w:p>
-        </w:tc>
-        <w:tc>
-          <w:tcPr>
-            <w:tcW w:w="1285" w:type="dxa"/>
+              <w:t>Hvis der ikke findes gyldige elpriser for hvert af døgnets 96 kvarterer, heller ikke gemte, skal systemet går i sikkerhedstilstand. I så fald tændes affugteren kun, når luftfugtigheden overstiger den kritiske grænse, og kører, indtil den er under slukgrænsen. Når gyldige elpriser igen kan hentes, forlader systemet sikkerhedstilstand, og de almindelige styringsregler gælder.</w:t>
+            </w:r>
+          </w:p>
+        </w:tc>
+        <w:tc>
+          <w:tcPr>
+            <w:tcW w:w="1284" w:type="dxa"/>
             <w:tcBorders>
               <w:bottom w:val="single" w:sz="4" w:space="0" w:color="999999"/>
             </w:tcBorders>
@@ -5292,7 +5161,7 @@
         </w:tc>
         <w:tc>
           <w:tcPr>
-            <w:tcW w:w="1285" w:type="dxa"/>
+            <w:tcW w:w="1284" w:type="dxa"/>
             <w:tcBorders>
               <w:bottom w:val="single" w:sz="4" w:space="0" w:color="999999"/>
             </w:tcBorders>
@@ -5400,7 +5269,7 @@
         </w:tc>
         <w:tc>
           <w:tcPr>
-            <w:tcW w:w="1285" w:type="dxa"/>
+            <w:tcW w:w="1284" w:type="dxa"/>
             <w:tcBorders>
               <w:bottom w:val="single" w:sz="4" w:space="0" w:color="999999"/>
             </w:tcBorders>
@@ -5508,7 +5377,7 @@
         </w:tc>
         <w:tc>
           <w:tcPr>
-            <w:tcW w:w="1285" w:type="dxa"/>
+            <w:tcW w:w="1284" w:type="dxa"/>
             <w:tcBorders>
               <w:bottom w:val="single" w:sz="4" w:space="0" w:color="999999"/>
             </w:tcBorders>
@@ -5615,7 +5484,7 @@
         </w:tc>
         <w:tc>
           <w:tcPr>
-            <w:tcW w:w="1285" w:type="dxa"/>
+            <w:tcW w:w="1284" w:type="dxa"/>
             <w:tcBorders>
               <w:bottom w:val="single" w:sz="4" w:space="0" w:color="999999"/>
             </w:tcBorders>
@@ -5722,7 +5591,7 @@
         </w:tc>
         <w:tc>
           <w:tcPr>
-            <w:tcW w:w="1285" w:type="dxa"/>
+            <w:tcW w:w="1284" w:type="dxa"/>
             <w:tcBorders>
               <w:bottom w:val="single" w:sz="4" w:space="0" w:color="999999"/>
             </w:tcBorders>
@@ -5827,7 +5696,7 @@
         </w:tc>
         <w:tc>
           <w:tcPr>
-            <w:tcW w:w="1285" w:type="dxa"/>
+            <w:tcW w:w="1284" w:type="dxa"/>
             <w:tcBorders>
               <w:bottom w:val="single" w:sz="4" w:space="0" w:color="999999"/>
             </w:tcBorders>
@@ -5930,7 +5799,7 @@
         </w:tc>
         <w:tc>
           <w:tcPr>
-            <w:tcW w:w="1285" w:type="dxa"/>
+            <w:tcW w:w="1284" w:type="dxa"/>
             <w:tcBorders>
               <w:bottom w:val="single" w:sz="4" w:space="0" w:color="999999"/>
             </w:tcBorders>
@@ -6033,7 +5902,7 @@
         </w:tc>
         <w:tc>
           <w:tcPr>
-            <w:tcW w:w="1285" w:type="dxa"/>
+            <w:tcW w:w="1284" w:type="dxa"/>
             <w:tcBorders>
               <w:bottom w:val="single" w:sz="4" w:space="0" w:color="999999"/>
             </w:tcBorders>
@@ -6142,7 +6011,7 @@
         </w:tc>
         <w:tc>
           <w:tcPr>
-            <w:tcW w:w="1285" w:type="dxa"/>
+            <w:tcW w:w="1284" w:type="dxa"/>
             <w:tcBorders>
               <w:bottom w:val="single" w:sz="12" w:space="0" w:color="000000"/>
             </w:tcBorders>
@@ -6222,7 +6091,7 @@
         <w:gridCol w:w="1166"/>
         <w:gridCol w:w="2704"/>
         <w:gridCol w:w="3506"/>
-        <w:gridCol w:w="1650"/>
+        <w:gridCol w:w="1649"/>
       </w:tblGrid>
       <w:tr>
         <w:trPr/>
@@ -6312,7 +6181,7 @@
         </w:tc>
         <w:tc>
           <w:tcPr>
-            <w:tcW w:w="1650" w:type="dxa"/>
+            <w:tcW w:w="1649" w:type="dxa"/>
             <w:tcBorders>
               <w:top w:val="single" w:sz="12" w:space="0" w:color="000000"/>
               <w:bottom w:val="single" w:sz="6" w:space="0" w:color="000000"/>
@@ -6418,7 +6287,7 @@
         </w:tc>
         <w:tc>
           <w:tcPr>
-            <w:tcW w:w="1650" w:type="dxa"/>
+            <w:tcW w:w="1649" w:type="dxa"/>
             <w:tcBorders>
               <w:bottom w:val="single" w:sz="4" w:space="0" w:color="999999"/>
             </w:tcBorders>
@@ -6521,7 +6390,7 @@
         </w:tc>
         <w:tc>
           <w:tcPr>
-            <w:tcW w:w="1650" w:type="dxa"/>
+            <w:tcW w:w="1649" w:type="dxa"/>
             <w:tcBorders>
               <w:bottom w:val="single" w:sz="4" w:space="0" w:color="999999"/>
             </w:tcBorders>
@@ -6629,7 +6498,7 @@
         </w:tc>
         <w:tc>
           <w:tcPr>
-            <w:tcW w:w="1650" w:type="dxa"/>
+            <w:tcW w:w="1649" w:type="dxa"/>
             <w:tcBorders>
               <w:bottom w:val="single" w:sz="4" w:space="0" w:color="999999"/>
             </w:tcBorders>
@@ -6740,7 +6609,7 @@
         </w:tc>
         <w:tc>
           <w:tcPr>
-            <w:tcW w:w="1650" w:type="dxa"/>
+            <w:tcW w:w="1649" w:type="dxa"/>
             <w:tcBorders>
               <w:bottom w:val="single" w:sz="12" w:space="0" w:color="000000"/>
             </w:tcBorders>
@@ -6864,7 +6733,7 @@
         <w:gridCol w:w="1259"/>
         <w:gridCol w:w="3253"/>
         <w:gridCol w:w="2257"/>
-        <w:gridCol w:w="2257"/>
+        <w:gridCol w:w="2256"/>
       </w:tblGrid>
       <w:tr>
         <w:trPr/>
@@ -6954,7 +6823,7 @@
         </w:tc>
         <w:tc>
           <w:tcPr>
-            <w:tcW w:w="2257" w:type="dxa"/>
+            <w:tcW w:w="2256" w:type="dxa"/>
             <w:tcBorders>
               <w:top w:val="single" w:sz="12" w:space="0" w:color="000000"/>
               <w:bottom w:val="single" w:sz="6" w:space="0" w:color="000000"/>
@@ -7060,7 +6929,7 @@
         </w:tc>
         <w:tc>
           <w:tcPr>
-            <w:tcW w:w="2257" w:type="dxa"/>
+            <w:tcW w:w="2256" w:type="dxa"/>
             <w:tcBorders>
               <w:bottom w:val="single" w:sz="4" w:space="0" w:color="999999"/>
             </w:tcBorders>
@@ -7159,7 +7028,7 @@
         </w:tc>
         <w:tc>
           <w:tcPr>
-            <w:tcW w:w="2257" w:type="dxa"/>
+            <w:tcW w:w="2256" w:type="dxa"/>
             <w:tcBorders>
               <w:bottom w:val="single" w:sz="4" w:space="0" w:color="999999"/>
             </w:tcBorders>
@@ -7256,7 +7125,7 @@
         </w:tc>
         <w:tc>
           <w:tcPr>
-            <w:tcW w:w="2257" w:type="dxa"/>
+            <w:tcW w:w="2256" w:type="dxa"/>
             <w:tcBorders>
               <w:bottom w:val="single" w:sz="4" w:space="0" w:color="999999"/>
             </w:tcBorders>
@@ -7351,7 +7220,7 @@
         </w:tc>
         <w:tc>
           <w:tcPr>
-            <w:tcW w:w="2257" w:type="dxa"/>
+            <w:tcW w:w="2256" w:type="dxa"/>
             <w:tcBorders>
               <w:bottom w:val="single" w:sz="4" w:space="0" w:color="999999"/>
             </w:tcBorders>
@@ -7449,7 +7318,7 @@
         </w:tc>
         <w:tc>
           <w:tcPr>
-            <w:tcW w:w="2257" w:type="dxa"/>
+            <w:tcW w:w="2256" w:type="dxa"/>
             <w:tcBorders>
               <w:bottom w:val="single" w:sz="4" w:space="0" w:color="999999"/>
             </w:tcBorders>
@@ -7542,7 +7411,7 @@
           <w:szCs w:val="24"/>
         </w:rPr>
         <w:drawing>
-          <wp:anchor distT="0" distB="0" distL="0" distR="0" simplePos="0" relativeHeight="2" behindDoc="0" locked="0" layoutInCell="0" allowOverlap="1">
+          <wp:anchor behindDoc="0" distT="0" distB="0" distL="0" distR="0" simplePos="0" locked="0" layoutInCell="0" allowOverlap="1" relativeHeight="2">
             <wp:simplePos x="0" y="0"/>
             <wp:positionH relativeFrom="column">
               <wp:align>center</wp:align>
@@ -7553,7 +7422,7 @@
             <wp:extent cx="5731510" cy="3328035"/>
             <wp:effectExtent l="0" t="0" r="0" b="0"/>
             <wp:wrapSquare wrapText="largest"/>
-            <wp:docPr id="1" name="Image1"/>
+            <wp:docPr id="1" name="Image1" descr=""/>
             <wp:cNvGraphicFramePr>
               <a:graphicFrameLocks xmlns:a="http://schemas.openxmlformats.org/drawingml/2006/main" noChangeAspect="1"/>
             </wp:cNvGraphicFramePr>
@@ -7561,7 +7430,7 @@
               <a:graphicData uri="http://schemas.openxmlformats.org/drawingml/2006/picture">
                 <pic:pic xmlns:pic="http://schemas.openxmlformats.org/drawingml/2006/picture">
                   <pic:nvPicPr>
-                    <pic:cNvPr id="1" name="Image1"/>
+                    <pic:cNvPr id="1" name="Image1" descr=""/>
                     <pic:cNvPicPr>
                       <a:picLocks noChangeAspect="1" noChangeArrowheads="1"/>
                     </pic:cNvPicPr>
@@ -7580,7 +7449,6 @@
                     <a:prstGeom prst="rect">
                       <a:avLst/>
                     </a:prstGeom>
-                    <a:noFill/>
                   </pic:spPr>
                 </pic:pic>
               </a:graphicData>
@@ -8298,8 +8166,8 @@
       </w:tblPr>
       <w:tblGrid>
         <w:gridCol w:w="897"/>
-        <w:gridCol w:w="3959"/>
-        <w:gridCol w:w="4170"/>
+        <w:gridCol w:w="3958"/>
+        <w:gridCol w:w="4171"/>
       </w:tblGrid>
       <w:tr>
         <w:trPr>
@@ -8335,7 +8203,7 @@
         </w:tc>
         <w:tc>
           <w:tcPr>
-            <w:tcW w:w="3959" w:type="dxa"/>
+            <w:tcW w:w="3958" w:type="dxa"/>
             <w:tcBorders>
               <w:top w:val="single" w:sz="12" w:space="0" w:color="000000"/>
               <w:bottom w:val="single" w:sz="6" w:space="0" w:color="000000"/>
@@ -8363,7 +8231,7 @@
         </w:tc>
         <w:tc>
           <w:tcPr>
-            <w:tcW w:w="4170" w:type="dxa"/>
+            <w:tcW w:w="4171" w:type="dxa"/>
             <w:tcBorders>
               <w:top w:val="single" w:sz="12" w:space="0" w:color="000000"/>
               <w:bottom w:val="single" w:sz="6" w:space="0" w:color="000000"/>
@@ -8419,7 +8287,7 @@
         </w:tc>
         <w:tc>
           <w:tcPr>
-            <w:tcW w:w="3959" w:type="dxa"/>
+            <w:tcW w:w="3958" w:type="dxa"/>
             <w:tcBorders>
               <w:bottom w:val="single" w:sz="4" w:space="0" w:color="999999"/>
             </w:tcBorders>
@@ -8444,7 +8312,7 @@
         </w:tc>
         <w:tc>
           <w:tcPr>
-            <w:tcW w:w="4170" w:type="dxa"/>
+            <w:tcW w:w="4171" w:type="dxa"/>
             <w:tcBorders>
               <w:bottom w:val="single" w:sz="4" w:space="0" w:color="999999"/>
             </w:tcBorders>
@@ -8497,7 +8365,7 @@
         </w:tc>
         <w:tc>
           <w:tcPr>
-            <w:tcW w:w="3959" w:type="dxa"/>
+            <w:tcW w:w="3958" w:type="dxa"/>
             <w:tcBorders>
               <w:bottom w:val="single" w:sz="4" w:space="0" w:color="999999"/>
             </w:tcBorders>
@@ -8522,7 +8390,7 @@
         </w:tc>
         <w:tc>
           <w:tcPr>
-            <w:tcW w:w="4170" w:type="dxa"/>
+            <w:tcW w:w="4171" w:type="dxa"/>
             <w:tcBorders>
               <w:bottom w:val="single" w:sz="4" w:space="0" w:color="999999"/>
             </w:tcBorders>
@@ -8575,7 +8443,7 @@
         </w:tc>
         <w:tc>
           <w:tcPr>
-            <w:tcW w:w="3959" w:type="dxa"/>
+            <w:tcW w:w="3958" w:type="dxa"/>
             <w:tcBorders>
               <w:bottom w:val="single" w:sz="4" w:space="0" w:color="999999"/>
             </w:tcBorders>
@@ -8600,7 +8468,7 @@
         </w:tc>
         <w:tc>
           <w:tcPr>
-            <w:tcW w:w="4170" w:type="dxa"/>
+            <w:tcW w:w="4171" w:type="dxa"/>
             <w:tcBorders>
               <w:bottom w:val="single" w:sz="4" w:space="0" w:color="999999"/>
             </w:tcBorders>
@@ -8653,7 +8521,7 @@
         </w:tc>
         <w:tc>
           <w:tcPr>
-            <w:tcW w:w="3959" w:type="dxa"/>
+            <w:tcW w:w="3958" w:type="dxa"/>
             <w:tcBorders>
               <w:bottom w:val="single" w:sz="4" w:space="0" w:color="999999"/>
             </w:tcBorders>
@@ -8678,7 +8546,7 @@
         </w:tc>
         <w:tc>
           <w:tcPr>
-            <w:tcW w:w="4170" w:type="dxa"/>
+            <w:tcW w:w="4171" w:type="dxa"/>
             <w:tcBorders>
               <w:bottom w:val="single" w:sz="4" w:space="0" w:color="999999"/>
             </w:tcBorders>
@@ -8731,7 +8599,7 @@
         </w:tc>
         <w:tc>
           <w:tcPr>
-            <w:tcW w:w="3959" w:type="dxa"/>
+            <w:tcW w:w="3958" w:type="dxa"/>
             <w:tcBorders>
               <w:bottom w:val="single" w:sz="4" w:space="0" w:color="999999"/>
             </w:tcBorders>
@@ -8756,7 +8624,7 @@
         </w:tc>
         <w:tc>
           <w:tcPr>
-            <w:tcW w:w="4170" w:type="dxa"/>
+            <w:tcW w:w="4171" w:type="dxa"/>
             <w:tcBorders>
               <w:bottom w:val="single" w:sz="4" w:space="0" w:color="999999"/>
             </w:tcBorders>
@@ -8809,7 +8677,7 @@
         </w:tc>
         <w:tc>
           <w:tcPr>
-            <w:tcW w:w="3959" w:type="dxa"/>
+            <w:tcW w:w="3958" w:type="dxa"/>
             <w:tcBorders>
               <w:bottom w:val="single" w:sz="4" w:space="0" w:color="999999"/>
             </w:tcBorders>
@@ -8834,7 +8702,7 @@
         </w:tc>
         <w:tc>
           <w:tcPr>
-            <w:tcW w:w="4170" w:type="dxa"/>
+            <w:tcW w:w="4171" w:type="dxa"/>
             <w:tcBorders>
               <w:bottom w:val="single" w:sz="4" w:space="0" w:color="999999"/>
             </w:tcBorders>
@@ -8887,7 +8755,7 @@
         </w:tc>
         <w:tc>
           <w:tcPr>
-            <w:tcW w:w="3959" w:type="dxa"/>
+            <w:tcW w:w="3958" w:type="dxa"/>
             <w:tcBorders>
               <w:bottom w:val="single" w:sz="4" w:space="0" w:color="999999"/>
             </w:tcBorders>
@@ -8912,7 +8780,7 @@
         </w:tc>
         <w:tc>
           <w:tcPr>
-            <w:tcW w:w="4170" w:type="dxa"/>
+            <w:tcW w:w="4171" w:type="dxa"/>
             <w:tcBorders>
               <w:bottom w:val="single" w:sz="4" w:space="0" w:color="999999"/>
             </w:tcBorders>
@@ -8965,7 +8833,7 @@
         </w:tc>
         <w:tc>
           <w:tcPr>
-            <w:tcW w:w="3959" w:type="dxa"/>
+            <w:tcW w:w="3958" w:type="dxa"/>
             <w:tcBorders>
               <w:bottom w:val="single" w:sz="4" w:space="0" w:color="999999"/>
             </w:tcBorders>
@@ -8990,7 +8858,7 @@
         </w:tc>
         <w:tc>
           <w:tcPr>
-            <w:tcW w:w="4170" w:type="dxa"/>
+            <w:tcW w:w="4171" w:type="dxa"/>
             <w:tcBorders>
               <w:bottom w:val="single" w:sz="4" w:space="0" w:color="999999"/>
             </w:tcBorders>
@@ -9043,7 +8911,7 @@
         </w:tc>
         <w:tc>
           <w:tcPr>
-            <w:tcW w:w="3959" w:type="dxa"/>
+            <w:tcW w:w="3958" w:type="dxa"/>
             <w:tcBorders>
               <w:bottom w:val="single" w:sz="4" w:space="0" w:color="999999"/>
             </w:tcBorders>
@@ -9068,7 +8936,7 @@
         </w:tc>
         <w:tc>
           <w:tcPr>
-            <w:tcW w:w="4170" w:type="dxa"/>
+            <w:tcW w:w="4171" w:type="dxa"/>
             <w:tcBorders>
               <w:bottom w:val="single" w:sz="4" w:space="0" w:color="999999"/>
             </w:tcBorders>
@@ -9121,7 +8989,7 @@
         </w:tc>
         <w:tc>
           <w:tcPr>
-            <w:tcW w:w="3959" w:type="dxa"/>
+            <w:tcW w:w="3958" w:type="dxa"/>
             <w:tcBorders>
               <w:bottom w:val="single" w:sz="4" w:space="0" w:color="999999"/>
             </w:tcBorders>
@@ -9146,7 +9014,7 @@
         </w:tc>
         <w:tc>
           <w:tcPr>
-            <w:tcW w:w="4170" w:type="dxa"/>
+            <w:tcW w:w="4171" w:type="dxa"/>
             <w:tcBorders>
               <w:bottom w:val="single" w:sz="4" w:space="0" w:color="999999"/>
             </w:tcBorders>
@@ -9199,7 +9067,7 @@
         </w:tc>
         <w:tc>
           <w:tcPr>
-            <w:tcW w:w="3959" w:type="dxa"/>
+            <w:tcW w:w="3958" w:type="dxa"/>
             <w:tcBorders>
               <w:bottom w:val="single" w:sz="4" w:space="0" w:color="999999"/>
             </w:tcBorders>
@@ -9224,71 +9092,26 @@
         </w:tc>
         <w:tc>
           <w:tcPr>
-            <w:tcW w:w="4170" w:type="dxa"/>
-            <w:tcBorders>
-              <w:bottom w:val="single" w:sz="4" w:space="0" w:color="999999"/>
-            </w:tcBorders>
-            <w:shd w:fill="EEEEEE" w:val="clear"/>
-          </w:tcPr>
-          <w:p>
-            <w:pPr>
-              <w:pStyle w:val="Normal"/>
-              <w:spacing w:before="0" w:after="160"/>
-              <w:rPr/>
-            </w:pPr>
-            <w:r>
-              <w:rPr>
-                <w:rStyle w:val="SourceText"/>
-                <w:rFonts w:ascii="Liberation Sans" w:hAnsi="Liberation Sans"/>
-                <w:sz w:val="22"/>
-                <w:szCs w:val="22"/>
-              </w:rPr>
-              <w:t xml:space="preserve">Sikkerhedstilstand: </w:t>
-            </w:r>
-            <w:r>
-              <w:rPr>
-                <w:rStyle w:val="SourceText"/>
-                <w:rFonts w:ascii="Liberation Sans" w:hAnsi="Liberation Sans"/>
-                <w:sz w:val="22"/>
-                <w:szCs w:val="22"/>
-              </w:rPr>
-              <w:t xml:space="preserve">kritisk grænse </w:t>
-            </w:r>
-            <w:r>
-              <w:rPr>
-                <w:rStyle w:val="SourceText"/>
-                <w:rFonts w:ascii="Liberation Sans" w:hAnsi="Liberation Sans"/>
-                <w:sz w:val="22"/>
-                <w:szCs w:val="22"/>
-              </w:rPr>
-              <w:t>og slukgrænse gælder</w:t>
-            </w:r>
-            <w:r>
-              <w:rPr>
-                <w:rStyle w:val="SourceText"/>
-                <w:rFonts w:ascii="Liberation Sans" w:hAnsi="Liberation Sans"/>
-                <w:sz w:val="22"/>
-                <w:szCs w:val="22"/>
-              </w:rPr>
-              <w:t xml:space="preserve">, </w:t>
-            </w:r>
-            <w:r>
-              <w:rPr>
-                <w:rStyle w:val="SourceText"/>
-                <w:rFonts w:ascii="Liberation Sans" w:hAnsi="Liberation Sans"/>
-                <w:sz w:val="22"/>
-                <w:szCs w:val="22"/>
-              </w:rPr>
-              <w:t xml:space="preserve">vises på </w:t>
-            </w:r>
-            <w:r>
-              <w:rPr>
-                <w:rStyle w:val="SourceText"/>
-                <w:rFonts w:ascii="Liberation Sans" w:hAnsi="Liberation Sans"/>
-                <w:sz w:val="22"/>
-                <w:szCs w:val="22"/>
-              </w:rPr>
-              <w:t>websiden.</w:t>
+            <w:tcW w:w="4171" w:type="dxa"/>
+            <w:tcBorders>
+              <w:bottom w:val="single" w:sz="4" w:space="0" w:color="999999"/>
+            </w:tcBorders>
+            <w:shd w:fill="EEEEEE" w:val="clear"/>
+          </w:tcPr>
+          <w:p>
+            <w:pPr>
+              <w:pStyle w:val="Normal"/>
+              <w:spacing w:before="0" w:after="160"/>
+              <w:rPr/>
+            </w:pPr>
+            <w:r>
+              <w:rPr>
+                <w:rStyle w:val="SourceText"/>
+                <w:rFonts w:ascii="Liberation Sans" w:hAnsi="Liberation Sans"/>
+                <w:sz w:val="22"/>
+                <w:szCs w:val="22"/>
+              </w:rPr>
+              <w:t>Sikkerhedstilstand: kritisk grænse og slukgrænse gælder, vises på websiden.</w:t>
             </w:r>
           </w:p>
         </w:tc>
@@ -9322,7 +9145,7 @@
         </w:tc>
         <w:tc>
           <w:tcPr>
-            <w:tcW w:w="3959" w:type="dxa"/>
+            <w:tcW w:w="3958" w:type="dxa"/>
             <w:tcBorders>
               <w:bottom w:val="single" w:sz="4" w:space="0" w:color="999999"/>
             </w:tcBorders>
@@ -9347,7 +9170,7 @@
         </w:tc>
         <w:tc>
           <w:tcPr>
-            <w:tcW w:w="4170" w:type="dxa"/>
+            <w:tcW w:w="4171" w:type="dxa"/>
             <w:tcBorders>
               <w:bottom w:val="single" w:sz="4" w:space="0" w:color="999999"/>
             </w:tcBorders>
@@ -9400,7 +9223,7 @@
         </w:tc>
         <w:tc>
           <w:tcPr>
-            <w:tcW w:w="3959" w:type="dxa"/>
+            <w:tcW w:w="3958" w:type="dxa"/>
             <w:tcBorders>
               <w:bottom w:val="single" w:sz="4" w:space="0" w:color="999999"/>
             </w:tcBorders>
@@ -9425,7 +9248,7 @@
         </w:tc>
         <w:tc>
           <w:tcPr>
-            <w:tcW w:w="4170" w:type="dxa"/>
+            <w:tcW w:w="4171" w:type="dxa"/>
             <w:tcBorders>
               <w:bottom w:val="single" w:sz="4" w:space="0" w:color="999999"/>
             </w:tcBorders>
@@ -9478,7 +9301,7 @@
         </w:tc>
         <w:tc>
           <w:tcPr>
-            <w:tcW w:w="3959" w:type="dxa"/>
+            <w:tcW w:w="3958" w:type="dxa"/>
             <w:tcBorders>
               <w:bottom w:val="single" w:sz="4" w:space="0" w:color="999999"/>
             </w:tcBorders>
@@ -9503,7 +9326,7 @@
         </w:tc>
         <w:tc>
           <w:tcPr>
-            <w:tcW w:w="4170" w:type="dxa"/>
+            <w:tcW w:w="4171" w:type="dxa"/>
             <w:tcBorders>
               <w:bottom w:val="single" w:sz="4" w:space="0" w:color="999999"/>
             </w:tcBorders>
@@ -9556,7 +9379,7 @@
         </w:tc>
         <w:tc>
           <w:tcPr>
-            <w:tcW w:w="3959" w:type="dxa"/>
+            <w:tcW w:w="3958" w:type="dxa"/>
             <w:tcBorders>
               <w:bottom w:val="single" w:sz="4" w:space="0" w:color="999999"/>
             </w:tcBorders>
@@ -9581,7 +9404,7 @@
         </w:tc>
         <w:tc>
           <w:tcPr>
-            <w:tcW w:w="4170" w:type="dxa"/>
+            <w:tcW w:w="4171" w:type="dxa"/>
             <w:tcBorders>
               <w:bottom w:val="single" w:sz="4" w:space="0" w:color="999999"/>
             </w:tcBorders>
@@ -9634,7 +9457,7 @@
         </w:tc>
         <w:tc>
           <w:tcPr>
-            <w:tcW w:w="3959" w:type="dxa"/>
+            <w:tcW w:w="3958" w:type="dxa"/>
             <w:tcBorders>
               <w:bottom w:val="single" w:sz="4" w:space="0" w:color="999999"/>
             </w:tcBorders>
@@ -9659,7 +9482,7 @@
         </w:tc>
         <w:tc>
           <w:tcPr>
-            <w:tcW w:w="4170" w:type="dxa"/>
+            <w:tcW w:w="4171" w:type="dxa"/>
             <w:tcBorders>
               <w:bottom w:val="single" w:sz="4" w:space="0" w:color="999999"/>
             </w:tcBorders>
@@ -9712,7 +9535,7 @@
         </w:tc>
         <w:tc>
           <w:tcPr>
-            <w:tcW w:w="3959" w:type="dxa"/>
+            <w:tcW w:w="3958" w:type="dxa"/>
             <w:tcBorders>
               <w:bottom w:val="single" w:sz="4" w:space="0" w:color="999999"/>
             </w:tcBorders>
@@ -9737,7 +9560,7 @@
         </w:tc>
         <w:tc>
           <w:tcPr>
-            <w:tcW w:w="4170" w:type="dxa"/>
+            <w:tcW w:w="4171" w:type="dxa"/>
             <w:tcBorders>
               <w:bottom w:val="single" w:sz="4" w:space="0" w:color="999999"/>
             </w:tcBorders>
@@ -9788,7 +9611,7 @@
         </w:tc>
         <w:tc>
           <w:tcPr>
-            <w:tcW w:w="3959" w:type="dxa"/>
+            <w:tcW w:w="3958" w:type="dxa"/>
             <w:tcBorders>
               <w:bottom w:val="single" w:sz="4" w:space="0" w:color="999999"/>
             </w:tcBorders>
@@ -9813,7 +9636,7 @@
         </w:tc>
         <w:tc>
           <w:tcPr>
-            <w:tcW w:w="4170" w:type="dxa"/>
+            <w:tcW w:w="4171" w:type="dxa"/>
             <w:tcBorders>
               <w:bottom w:val="single" w:sz="4" w:space="0" w:color="999999"/>
             </w:tcBorders>
@@ -9868,7 +9691,7 @@
         </w:tc>
         <w:tc>
           <w:tcPr>
-            <w:tcW w:w="3959" w:type="dxa"/>
+            <w:tcW w:w="3958" w:type="dxa"/>
             <w:tcBorders>
               <w:bottom w:val="single" w:sz="12" w:space="0" w:color="000000"/>
             </w:tcBorders>
@@ -9895,7 +9718,7 @@
         </w:tc>
         <w:tc>
           <w:tcPr>
-            <w:tcW w:w="4170" w:type="dxa"/>
+            <w:tcW w:w="4171" w:type="dxa"/>
             <w:tcBorders>
               <w:bottom w:val="single" w:sz="12" w:space="0" w:color="000000"/>
             </w:tcBorders>
@@ -10019,7 +9842,7 @@
 </file>
 
 <file path=word/header1.xml><?xml version="1.0" encoding="utf-8"?>
-<w:hdr xmlns:o="urn:schemas-microsoft-com:office:office" xmlns:r="http://schemas.openxmlformats.org/officeDocument/2006/relationships" xmlns:v="urn:schemas-microsoft-com:vml" xmlns:w="http://schemas.openxmlformats.org/wordprocessingml/2006/main" xmlns:w10="urn:schemas-microsoft-com:office:word" xmlns:wp="http://schemas.openxmlformats.org/drawingml/2006/wordprocessingDrawing" xmlns:pic="http://schemas.openxmlformats.org/drawingml/2006/picture" xmlns:wps="http://schemas.microsoft.com/office/word/2010/wordprocessingShape" xmlns:wpg="http://schemas.microsoft.com/office/word/2010/wordprocessingGroup" xmlns:mc="http://schemas.openxmlformats.org/markup-compatibility/2006" xmlns:wp14="http://schemas.microsoft.com/office/word/2010/wordprocessingDrawing" xmlns:w14="http://schemas.microsoft.com/office/word/2010/wordml" xmlns:w15="http://schemas.microsoft.com/office/word/2012/wordml" mc:Ignorable="w14 wp14 w15">
+<w:hdr xmlns:o="urn:schemas-microsoft-com:office:office" xmlns:r="http://schemas.openxmlformats.org/officeDocument/2006/relationships" xmlns:v="urn:schemas-microsoft-com:vml" xmlns:w="http://schemas.openxmlformats.org/wordprocessingml/2006/main" xmlns:w10="urn:schemas-microsoft-com:office:word" xmlns:wp="http://schemas.openxmlformats.org/drawingml/2006/wordprocessingDrawing" xmlns:wps="http://schemas.microsoft.com/office/word/2010/wordprocessingShape" xmlns:wpg="http://schemas.microsoft.com/office/word/2010/wordprocessingGroup" xmlns:mc="http://schemas.openxmlformats.org/markup-compatibility/2006" xmlns:wp14="http://schemas.microsoft.com/office/word/2010/wordprocessingDrawing" xmlns:w14="http://schemas.microsoft.com/office/word/2010/wordml" xmlns:w15="http://schemas.microsoft.com/office/word/2012/wordml" mc:Ignorable="w14 wp14 w15">
   <w:p>
     <w:pPr>
       <w:pStyle w:val="Header"/>
@@ -10033,7 +9856,7 @@
 </file>
 
 <file path=word/header2.xml><?xml version="1.0" encoding="utf-8"?>
-<w:hdr xmlns:o="urn:schemas-microsoft-com:office:office" xmlns:r="http://schemas.openxmlformats.org/officeDocument/2006/relationships" xmlns:v="urn:schemas-microsoft-com:vml" xmlns:w="http://schemas.openxmlformats.org/wordprocessingml/2006/main" xmlns:w10="urn:schemas-microsoft-com:office:word" xmlns:wp="http://schemas.openxmlformats.org/drawingml/2006/wordprocessingDrawing" xmlns:pic="http://schemas.openxmlformats.org/drawingml/2006/picture" xmlns:wps="http://schemas.microsoft.com/office/word/2010/wordprocessingShape" xmlns:wpg="http://schemas.microsoft.com/office/word/2010/wordprocessingGroup" xmlns:mc="http://schemas.openxmlformats.org/markup-compatibility/2006" xmlns:wp14="http://schemas.microsoft.com/office/word/2010/wordprocessingDrawing" xmlns:w14="http://schemas.microsoft.com/office/word/2010/wordml" xmlns:w15="http://schemas.microsoft.com/office/word/2012/wordml" mc:Ignorable="w14 wp14 w15">
+<w:hdr xmlns:o="urn:schemas-microsoft-com:office:office" xmlns:r="http://schemas.openxmlformats.org/officeDocument/2006/relationships" xmlns:v="urn:schemas-microsoft-com:vml" xmlns:w="http://schemas.openxmlformats.org/wordprocessingml/2006/main" xmlns:w10="urn:schemas-microsoft-com:office:word" xmlns:wp="http://schemas.openxmlformats.org/drawingml/2006/wordprocessingDrawing" xmlns:wps="http://schemas.microsoft.com/office/word/2010/wordprocessingShape" xmlns:wpg="http://schemas.microsoft.com/office/word/2010/wordprocessingGroup" xmlns:mc="http://schemas.openxmlformats.org/markup-compatibility/2006" xmlns:wp14="http://schemas.microsoft.com/office/word/2010/wordprocessingDrawing" xmlns:w14="http://schemas.microsoft.com/office/word/2010/wordml" xmlns:w15="http://schemas.microsoft.com/office/word/2012/wordml" mc:Ignorable="w14 wp14 w15">
   <w:p>
     <w:pPr>
       <w:pStyle w:val="Normal"/>
@@ -10068,7 +9891,7 @@
 </file>
 
 <file path=word/header3.xml><?xml version="1.0" encoding="utf-8"?>
-<w:hdr xmlns:o="urn:schemas-microsoft-com:office:office" xmlns:r="http://schemas.openxmlformats.org/officeDocument/2006/relationships" xmlns:v="urn:schemas-microsoft-com:vml" xmlns:w="http://schemas.openxmlformats.org/wordprocessingml/2006/main" xmlns:w10="urn:schemas-microsoft-com:office:word" xmlns:wp="http://schemas.openxmlformats.org/drawingml/2006/wordprocessingDrawing" xmlns:pic="http://schemas.openxmlformats.org/drawingml/2006/picture" xmlns:wps="http://schemas.microsoft.com/office/word/2010/wordprocessingShape" xmlns:wpg="http://schemas.microsoft.com/office/word/2010/wordprocessingGroup" xmlns:mc="http://schemas.openxmlformats.org/markup-compatibility/2006" xmlns:wp14="http://schemas.microsoft.com/office/word/2010/wordprocessingDrawing" xmlns:w14="http://schemas.microsoft.com/office/word/2010/wordml" xmlns:w15="http://schemas.microsoft.com/office/word/2012/wordml" mc:Ignorable="w14 wp14 w15">
+<w:hdr xmlns:o="urn:schemas-microsoft-com:office:office" xmlns:r="http://schemas.openxmlformats.org/officeDocument/2006/relationships" xmlns:v="urn:schemas-microsoft-com:vml" xmlns:w="http://schemas.openxmlformats.org/wordprocessingml/2006/main" xmlns:w10="urn:schemas-microsoft-com:office:word" xmlns:wp="http://schemas.openxmlformats.org/drawingml/2006/wordprocessingDrawing" xmlns:wps="http://schemas.microsoft.com/office/word/2010/wordprocessingShape" xmlns:wpg="http://schemas.microsoft.com/office/word/2010/wordprocessingGroup" xmlns:mc="http://schemas.openxmlformats.org/markup-compatibility/2006" xmlns:wp14="http://schemas.microsoft.com/office/word/2010/wordprocessingDrawing" xmlns:w14="http://schemas.microsoft.com/office/word/2010/wordml" xmlns:w15="http://schemas.microsoft.com/office/word/2012/wordml" mc:Ignorable="w14 wp14 w15">
   <w:p>
     <w:pPr>
       <w:pStyle w:val="Normal"/>
@@ -10769,7 +10592,7 @@
     </w:rPr>
   </w:style>
   <w:style w:type="paragraph" w:styleId="Heading1">
-    <w:name w:val="heading 1"/>
+    <w:name w:val="Heading 1"/>
     <w:basedOn w:val="Normal"/>
     <w:next w:val="Normal"/>
     <w:link w:val="Heading1Char"/>
@@ -10790,7 +10613,7 @@
     </w:rPr>
   </w:style>
   <w:style w:type="paragraph" w:styleId="Heading2">
-    <w:name w:val="heading 2"/>
+    <w:name w:val="Heading 2"/>
     <w:basedOn w:val="Normal"/>
     <w:next w:val="Normal"/>
     <w:link w:val="Heading2Char"/>
@@ -10813,7 +10636,7 @@
     </w:rPr>
   </w:style>
   <w:style w:type="paragraph" w:styleId="Heading3">
-    <w:name w:val="heading 3"/>
+    <w:name w:val="Heading 3"/>
     <w:basedOn w:val="Normal"/>
     <w:next w:val="Normal"/>
     <w:link w:val="Heading3Char"/>
@@ -10836,7 +10659,7 @@
     </w:rPr>
   </w:style>
   <w:style w:type="paragraph" w:styleId="Heading4">
-    <w:name w:val="heading 4"/>
+    <w:name w:val="Heading 4"/>
     <w:basedOn w:val="Normal"/>
     <w:next w:val="Normal"/>
     <w:link w:val="Heading4Char"/>
@@ -10859,7 +10682,7 @@
     </w:rPr>
   </w:style>
   <w:style w:type="paragraph" w:styleId="Heading5">
-    <w:name w:val="heading 5"/>
+    <w:name w:val="Heading 5"/>
     <w:basedOn w:val="Normal"/>
     <w:next w:val="Normal"/>
     <w:link w:val="Heading5Char"/>
@@ -10880,7 +10703,7 @@
     </w:rPr>
   </w:style>
   <w:style w:type="paragraph" w:styleId="Heading6">
-    <w:name w:val="heading 6"/>
+    <w:name w:val="Heading 6"/>
     <w:basedOn w:val="Normal"/>
     <w:next w:val="Normal"/>
     <w:link w:val="Heading6Char"/>
@@ -10903,7 +10726,7 @@
     </w:rPr>
   </w:style>
   <w:style w:type="paragraph" w:styleId="Heading7">
-    <w:name w:val="heading 7"/>
+    <w:name w:val="Heading 7"/>
     <w:basedOn w:val="Normal"/>
     <w:next w:val="Normal"/>
     <w:link w:val="Heading7Char"/>
@@ -10924,7 +10747,7 @@
     </w:rPr>
   </w:style>
   <w:style w:type="paragraph" w:styleId="Heading8">
-    <w:name w:val="heading 8"/>
+    <w:name w:val="Heading 8"/>
     <w:basedOn w:val="Normal"/>
     <w:next w:val="Normal"/>
     <w:link w:val="Heading8Char"/>
@@ -10947,7 +10770,7 @@
     </w:rPr>
   </w:style>
   <w:style w:type="paragraph" w:styleId="Heading9">
-    <w:name w:val="heading 9"/>
+    <w:name w:val="Heading 9"/>
     <w:basedOn w:val="Normal"/>
     <w:next w:val="Normal"/>
     <w:link w:val="Heading9Char"/>
@@ -11255,8 +11078,8 @@
       <w:iCs/>
     </w:rPr>
   </w:style>
-  <w:style w:type="character" w:styleId="Bulletsuser">
-    <w:name w:val="Bullets (user)"/>
+  <w:style w:type="character" w:styleId="Bullets">
+    <w:name w:val="Bullets"/>
     <w:qFormat/>
     <w:rPr>
       <w:rFonts w:ascii="OpenSymbol" w:hAnsi="OpenSymbol" w:eastAsia="OpenSymbol" w:cs="OpenSymbol"/>
@@ -11294,7 +11117,7 @@
     </w:rPr>
   </w:style>
   <w:style w:type="paragraph" w:styleId="Caption">
-    <w:name w:val="caption"/>
+    <w:name w:val="Caption"/>
     <w:basedOn w:val="Normal"/>
     <w:qFormat/>
     <w:pPr>
@@ -11419,7 +11242,7 @@
     <w:rPr/>
   </w:style>
   <w:style w:type="paragraph" w:styleId="Header">
-    <w:name w:val="header"/>
+    <w:name w:val="Header"/>
     <w:basedOn w:val="Normal"/>
     <w:link w:val="HeaderChar"/>
     <w:uiPriority w:val="99"/>
@@ -11436,7 +11259,7 @@
     <w:rPr/>
   </w:style>
   <w:style w:type="paragraph" w:styleId="Footer">
-    <w:name w:val="footer"/>
+    <w:name w:val="Footer"/>
     <w:basedOn w:val="Normal"/>
     <w:link w:val="FooterChar"/>
     <w:uiPriority w:val="99"/>
@@ -11549,37 +11372,37 @@
         <a:srgbClr val="000000"/>
       </a:dk1>
       <a:lt1>
-        <a:srgbClr val="FFFFFF"/>
+        <a:srgbClr val="ffffff"/>
       </a:lt1>
       <a:dk2>
-        <a:srgbClr val="0E2841"/>
+        <a:srgbClr val="0e2841"/>
       </a:dk2>
       <a:lt2>
-        <a:srgbClr val="E8E8E8"/>
+        <a:srgbClr val="e8e8e8"/>
       </a:lt2>
       <a:accent1>
         <a:srgbClr val="156082"/>
       </a:accent1>
       <a:accent2>
-        <a:srgbClr val="E97132"/>
+        <a:srgbClr val="e97132"/>
       </a:accent2>
       <a:accent3>
-        <a:srgbClr val="196B24"/>
+        <a:srgbClr val="196b24"/>
       </a:accent3>
       <a:accent4>
-        <a:srgbClr val="0F9ED5"/>
+        <a:srgbClr val="0f9ed5"/>
       </a:accent4>
       <a:accent5>
-        <a:srgbClr val="A02B93"/>
+        <a:srgbClr val="a02b93"/>
       </a:accent5>
       <a:accent6>
-        <a:srgbClr val="4EA72E"/>
+        <a:srgbClr val="4ea72e"/>
       </a:accent6>
       <a:hlink>
         <a:srgbClr val="467886"/>
       </a:hlink>
       <a:folHlink>
-        <a:srgbClr val="96607D"/>
+        <a:srgbClr val="96607d"/>
       </a:folHlink>
     </a:clrScheme>
     <a:fontScheme name="Office">

</xml_diff>